<commit_message>
Mode calendrier por la sélection des JA et ajout de Défiscalisation
</commit_message>
<xml_diff>
--- a/NIJAC_Documentation_Utilisateur.docx
+++ b/NIJAC_Documentation_Utilisateur.docx
@@ -3988,7 +3988,21 @@
                 <w:rStyle w:val="Lienhypertexte"/>
                 <w:noProof/>
               </w:rPr>
-              <w:t>E012 – Déclaration de disponibilité JA</w:t>
+              <w:t>E012 – Déclaration de dispo</w:t>
+            </w:r>
+            <w:r>
+              <w:rPr>
+                <w:rStyle w:val="Lienhypertexte"/>
+                <w:noProof/>
+              </w:rPr>
+              <w:t>n</w:t>
+            </w:r>
+            <w:r>
+              <w:rPr>
+                <w:rStyle w:val="Lienhypertexte"/>
+                <w:noProof/>
+              </w:rPr>
+              <w:t>ibilité JA</w:t>
             </w:r>
             <w:r>
               <w:rPr>
@@ -6561,6 +6575,7 @@
             </w:tcMar>
           </w:tcPr>
           <w:p>
+            <w:proofErr w:type="spellStart"/>
             <w:r>
               <w:rPr>
                 <w:color w:val="555555"/>
@@ -6569,6 +6584,7 @@
               </w:rPr>
               <w:t>index.php</w:t>
             </w:r>
+            <w:proofErr w:type="spellEnd"/>
           </w:p>
         </w:tc>
       </w:tr>
@@ -6648,6 +6664,7 @@
             </w:tcMar>
           </w:tcPr>
           <w:p>
+            <w:proofErr w:type="spellStart"/>
             <w:r>
               <w:rPr>
                 <w:color w:val="555555"/>
@@ -6656,6 +6673,7 @@
               </w:rPr>
               <w:t>admin_menu.php</w:t>
             </w:r>
+            <w:proofErr w:type="spellEnd"/>
           </w:p>
         </w:tc>
       </w:tr>
@@ -6735,6 +6753,7 @@
             </w:tcMar>
           </w:tcPr>
           <w:p>
+            <w:proofErr w:type="spellStart"/>
             <w:r>
               <w:rPr>
                 <w:color w:val="555555"/>
@@ -6743,6 +6762,7 @@
               </w:rPr>
               <w:t>competition.php</w:t>
             </w:r>
+            <w:proofErr w:type="spellEnd"/>
           </w:p>
         </w:tc>
       </w:tr>
@@ -6822,6 +6842,7 @@
             </w:tcMar>
           </w:tcPr>
           <w:p>
+            <w:proofErr w:type="spellStart"/>
             <w:r>
               <w:rPr>
                 <w:color w:val="555555"/>
@@ -6830,6 +6851,7 @@
               </w:rPr>
               <w:t>correspondant.php</w:t>
             </w:r>
+            <w:proofErr w:type="spellEnd"/>
           </w:p>
         </w:tc>
       </w:tr>
@@ -6909,6 +6931,7 @@
             </w:tcMar>
           </w:tcPr>
           <w:p>
+            <w:proofErr w:type="spellStart"/>
             <w:r>
               <w:rPr>
                 <w:color w:val="555555"/>
@@ -6917,6 +6940,7 @@
               </w:rPr>
               <w:t>salle.php</w:t>
             </w:r>
+            <w:proofErr w:type="spellEnd"/>
           </w:p>
         </w:tc>
       </w:tr>
@@ -6996,6 +7020,7 @@
             </w:tcMar>
           </w:tcPr>
           <w:p>
+            <w:proofErr w:type="spellStart"/>
             <w:r>
               <w:rPr>
                 <w:color w:val="555555"/>
@@ -7004,6 +7029,7 @@
               </w:rPr>
               <w:t>communes.php</w:t>
             </w:r>
+            <w:proofErr w:type="spellEnd"/>
           </w:p>
         </w:tc>
       </w:tr>
@@ -7083,6 +7109,7 @@
             </w:tcMar>
           </w:tcPr>
           <w:p>
+            <w:proofErr w:type="spellStart"/>
             <w:r>
               <w:rPr>
                 <w:color w:val="555555"/>
@@ -7091,6 +7118,7 @@
               </w:rPr>
               <w:t>jugearbitre.php</w:t>
             </w:r>
+            <w:proofErr w:type="spellEnd"/>
           </w:p>
         </w:tc>
       </w:tr>
@@ -7170,6 +7198,7 @@
             </w:tcMar>
           </w:tcPr>
           <w:p>
+            <w:proofErr w:type="spellStart"/>
             <w:r>
               <w:rPr>
                 <w:color w:val="555555"/>
@@ -7178,6 +7207,7 @@
               </w:rPr>
               <w:t>club.php</w:t>
             </w:r>
+            <w:proofErr w:type="spellEnd"/>
           </w:p>
         </w:tc>
       </w:tr>
@@ -7257,6 +7287,7 @@
             </w:tcMar>
           </w:tcPr>
           <w:p>
+            <w:proofErr w:type="spellStart"/>
             <w:r>
               <w:rPr>
                 <w:color w:val="555555"/>
@@ -7265,6 +7296,7 @@
               </w:rPr>
               <w:t>utilisateur.php</w:t>
             </w:r>
+            <w:proofErr w:type="spellEnd"/>
           </w:p>
         </w:tc>
       </w:tr>
@@ -7344,6 +7376,7 @@
             </w:tcMar>
           </w:tcPr>
           <w:p>
+            <w:proofErr w:type="spellStart"/>
             <w:r>
               <w:rPr>
                 <w:color w:val="555555"/>
@@ -7352,6 +7385,7 @@
               </w:rPr>
               <w:t>division.php</w:t>
             </w:r>
+            <w:proofErr w:type="spellEnd"/>
           </w:p>
         </w:tc>
       </w:tr>
@@ -7431,6 +7465,7 @@
             </w:tcMar>
           </w:tcPr>
           <w:p>
+            <w:proofErr w:type="spellStart"/>
             <w:r>
               <w:rPr>
                 <w:color w:val="555555"/>
@@ -7439,6 +7474,7 @@
               </w:rPr>
               <w:t>import_rencontres.php</w:t>
             </w:r>
+            <w:proofErr w:type="spellEnd"/>
           </w:p>
         </w:tc>
       </w:tr>
@@ -7518,6 +7554,7 @@
             </w:tcMar>
           </w:tcPr>
           <w:p>
+            <w:proofErr w:type="spellStart"/>
             <w:r>
               <w:rPr>
                 <w:color w:val="555555"/>
@@ -7526,6 +7563,7 @@
               </w:rPr>
               <w:t>disponibilite_ja.php</w:t>
             </w:r>
+            <w:proofErr w:type="spellEnd"/>
           </w:p>
         </w:tc>
       </w:tr>
@@ -7605,6 +7643,7 @@
             </w:tcMar>
           </w:tcPr>
           <w:p>
+            <w:proofErr w:type="spellStart"/>
             <w:r>
               <w:rPr>
                 <w:color w:val="555555"/>
@@ -7613,6 +7652,7 @@
               </w:rPr>
               <w:t>encours.php</w:t>
             </w:r>
+            <w:proofErr w:type="spellEnd"/>
           </w:p>
         </w:tc>
       </w:tr>
@@ -7698,8 +7738,18 @@
                 <w:sz w:val="18"/>
                 <w:szCs w:val="18"/>
               </w:rPr>
-              <w:t>Nominateur/menu.php</w:t>
-            </w:r>
+              <w:t>Nominateur/</w:t>
+            </w:r>
+            <w:proofErr w:type="spellStart"/>
+            <w:r>
+              <w:rPr>
+                <w:color w:val="555555"/>
+                <w:sz w:val="18"/>
+                <w:szCs w:val="18"/>
+              </w:rPr>
+              <w:t>menu.php</w:t>
+            </w:r>
+            <w:proofErr w:type="spellEnd"/>
           </w:p>
         </w:tc>
       </w:tr>
@@ -7785,8 +7835,18 @@
                 <w:sz w:val="18"/>
                 <w:szCs w:val="18"/>
               </w:rPr>
-              <w:t>Nominateur/disponibilites.php</w:t>
-            </w:r>
+              <w:t>Nominateur/</w:t>
+            </w:r>
+            <w:proofErr w:type="spellStart"/>
+            <w:r>
+              <w:rPr>
+                <w:color w:val="555555"/>
+                <w:sz w:val="18"/>
+                <w:szCs w:val="18"/>
+              </w:rPr>
+              <w:t>disponibilites.php</w:t>
+            </w:r>
+            <w:proofErr w:type="spellEnd"/>
           </w:p>
         </w:tc>
       </w:tr>
@@ -7872,8 +7932,18 @@
                 <w:sz w:val="18"/>
                 <w:szCs w:val="18"/>
               </w:rPr>
-              <w:t>Nominateur/nomination.php</w:t>
-            </w:r>
+              <w:t>Nominateur/</w:t>
+            </w:r>
+            <w:proofErr w:type="spellStart"/>
+            <w:r>
+              <w:rPr>
+                <w:color w:val="555555"/>
+                <w:sz w:val="18"/>
+                <w:szCs w:val="18"/>
+              </w:rPr>
+              <w:t>nomination.php</w:t>
+            </w:r>
+            <w:proofErr w:type="spellEnd"/>
           </w:p>
         </w:tc>
       </w:tr>
@@ -7959,8 +8029,18 @@
                 <w:sz w:val="18"/>
                 <w:szCs w:val="18"/>
               </w:rPr>
-              <w:t>Nominateur/convocation_ja.php</w:t>
-            </w:r>
+              <w:t>Nominateur/</w:t>
+            </w:r>
+            <w:proofErr w:type="spellStart"/>
+            <w:r>
+              <w:rPr>
+                <w:color w:val="555555"/>
+                <w:sz w:val="18"/>
+                <w:szCs w:val="18"/>
+              </w:rPr>
+              <w:t>convocation_ja.php</w:t>
+            </w:r>
+            <w:proofErr w:type="spellEnd"/>
           </w:p>
         </w:tc>
       </w:tr>
@@ -8152,6 +8232,7 @@
             </w:tcMar>
           </w:tcPr>
           <w:p>
+            <w:proofErr w:type="spellStart"/>
             <w:r>
               <w:rPr>
                 <w:sz w:val="20"/>
@@ -8159,6 +8240,7 @@
               </w:rPr>
               <w:t>index.php</w:t>
             </w:r>
+            <w:proofErr w:type="spellEnd"/>
           </w:p>
         </w:tc>
       </w:tr>
@@ -8344,7 +8426,25 @@
           <w:iCs/>
           <w:color w:val="555555"/>
         </w:rPr>
-        <w:t>Les mots de passe sont stockés de manière sécurisée (hachage bcrypt). En cas de compte inactif, la connexion est refusée même si le mot de passe est correct.</w:t>
+        <w:t xml:space="preserve">Les mots de passe sont stockés de manière sécurisée (hachage </w:t>
+      </w:r>
+      <w:proofErr w:type="spellStart"/>
+      <w:r>
+        <w:rPr>
+          <w:i/>
+          <w:iCs/>
+          <w:color w:val="555555"/>
+        </w:rPr>
+        <w:t>bcrypt</w:t>
+      </w:r>
+      <w:proofErr w:type="spellEnd"/>
+      <w:r>
+        <w:rPr>
+          <w:i/>
+          <w:iCs/>
+          <w:color w:val="555555"/>
+        </w:rPr>
+        <w:t>). En cas de compte inactif, la connexion est refusée même si le mot de passe est correct.</w:t>
       </w:r>
     </w:p>
     <w:p>
@@ -8380,8 +8480,18 @@
           <w:iCs/>
           <w:color w:val="555555"/>
         </w:rPr>
-        <w:t>MDP : Change-On_Install</w:t>
-      </w:r>
+        <w:t>MDP : Change-</w:t>
+      </w:r>
+      <w:proofErr w:type="spellStart"/>
+      <w:r>
+        <w:rPr>
+          <w:i/>
+          <w:iCs/>
+          <w:color w:val="555555"/>
+        </w:rPr>
+        <w:t>On_Install</w:t>
+      </w:r>
+      <w:proofErr w:type="spellEnd"/>
     </w:p>
     <w:p>
       <w:pPr>
@@ -8398,7 +8508,25 @@
           <w:iCs/>
           <w:color w:val="555555"/>
         </w:rPr>
-        <w:t>L’utilisateur devra modifier celui-ci des sa première connexion, un message s’affiche sur chaque écran pour le rappeler.</w:t>
+        <w:t xml:space="preserve">L’utilisateur devra modifier celui-ci </w:t>
+      </w:r>
+      <w:proofErr w:type="spellStart"/>
+      <w:r>
+        <w:rPr>
+          <w:i/>
+          <w:iCs/>
+          <w:color w:val="555555"/>
+        </w:rPr>
+        <w:t>des</w:t>
+      </w:r>
+      <w:proofErr w:type="spellEnd"/>
+      <w:r>
+        <w:rPr>
+          <w:i/>
+          <w:iCs/>
+          <w:color w:val="555555"/>
+        </w:rPr>
+        <w:t xml:space="preserve"> sa première connexion, un message s’affiche sur chaque écran pour le rappeler.</w:t>
       </w:r>
     </w:p>
     <w:p>
@@ -8695,6 +8823,7 @@
             </w:tcMar>
           </w:tcPr>
           <w:p>
+            <w:proofErr w:type="spellStart"/>
             <w:r>
               <w:rPr>
                 <w:sz w:val="20"/>
@@ -8702,6 +8831,7 @@
               </w:rPr>
               <w:t>admin_menu.php</w:t>
             </w:r>
+            <w:proofErr w:type="spellEnd"/>
           </w:p>
         </w:tc>
       </w:tr>
@@ -9319,6 +9449,7 @@
             </w:tcMar>
           </w:tcPr>
           <w:p>
+            <w:proofErr w:type="spellStart"/>
             <w:r>
               <w:rPr>
                 <w:sz w:val="20"/>
@@ -9326,6 +9457,7 @@
               </w:rPr>
               <w:t>competition.php</w:t>
             </w:r>
+            <w:proofErr w:type="spellEnd"/>
           </w:p>
         </w:tc>
       </w:tr>
@@ -9767,6 +9899,7 @@
             </w:tcMar>
           </w:tcPr>
           <w:p>
+            <w:proofErr w:type="spellStart"/>
             <w:r>
               <w:rPr>
                 <w:sz w:val="20"/>
@@ -9774,6 +9907,7 @@
               </w:rPr>
               <w:t>correspondant.php</w:t>
             </w:r>
+            <w:proofErr w:type="spellEnd"/>
           </w:p>
         </w:tc>
       </w:tr>
@@ -10383,6 +10517,7 @@
             </w:tcMar>
           </w:tcPr>
           <w:p>
+            <w:proofErr w:type="spellStart"/>
             <w:r>
               <w:rPr>
                 <w:sz w:val="20"/>
@@ -10390,6 +10525,7 @@
               </w:rPr>
               <w:t>salle.php</w:t>
             </w:r>
+            <w:proofErr w:type="spellEnd"/>
           </w:p>
         </w:tc>
       </w:tr>
@@ -10534,7 +10670,15 @@
         <w:spacing w:before="40" w:after="40"/>
       </w:pPr>
       <w:r>
-        <w:t>Code postal / Ville : sélection depuis la base communes (autocomplétion)</w:t>
+        <w:t>Code postal / Ville : sélection depuis la base communes (</w:t>
+      </w:r>
+      <w:proofErr w:type="spellStart"/>
+      <w:r>
+        <w:t>autocomplétion</w:t>
+      </w:r>
+      <w:proofErr w:type="spellEnd"/>
+      <w:r>
+        <w:t>)</w:t>
       </w:r>
     </w:p>
     <w:p>
@@ -10883,6 +11027,7 @@
             </w:tcMar>
           </w:tcPr>
           <w:p>
+            <w:proofErr w:type="spellStart"/>
             <w:r>
               <w:rPr>
                 <w:sz w:val="20"/>
@@ -10890,6 +11035,7 @@
               </w:rPr>
               <w:t>communes.php</w:t>
             </w:r>
+            <w:proofErr w:type="spellEnd"/>
           </w:p>
         </w:tc>
       </w:tr>
@@ -11080,7 +11226,25 @@
           <w:iCs/>
           <w:color w:val="555555"/>
         </w:rPr>
-        <w:t>La table est une copy de la table des communes de INSEE.</w:t>
+        <w:t xml:space="preserve">La table est une </w:t>
+      </w:r>
+      <w:proofErr w:type="spellStart"/>
+      <w:r>
+        <w:rPr>
+          <w:i/>
+          <w:iCs/>
+          <w:color w:val="555555"/>
+        </w:rPr>
+        <w:t>copy</w:t>
+      </w:r>
+      <w:proofErr w:type="spellEnd"/>
+      <w:r>
+        <w:rPr>
+          <w:i/>
+          <w:iCs/>
+          <w:color w:val="555555"/>
+        </w:rPr>
+        <w:t xml:space="preserve"> de la table des communes de INSEE.</w:t>
       </w:r>
     </w:p>
     <w:p>
@@ -11430,6 +11594,7 @@
             </w:tcMar>
           </w:tcPr>
           <w:p>
+            <w:proofErr w:type="spellStart"/>
             <w:r>
               <w:rPr>
                 <w:sz w:val="20"/>
@@ -11437,6 +11602,7 @@
               </w:rPr>
               <w:t>jugearbitre.php</w:t>
             </w:r>
+            <w:proofErr w:type="spellEnd"/>
           </w:p>
         </w:tc>
       </w:tr>
@@ -11639,8 +11805,13 @@
         <w:spacing w:before="40" w:after="40"/>
       </w:pPr>
       <w:r>
-        <w:t>Code postal + Ville : avec résolution automatique depuis la base communes</w:t>
-      </w:r>
+        <w:t xml:space="preserve">Code postal + Ville : avec résolution automatique depuis </w:t>
+      </w:r>
+      <w:proofErr w:type="gramStart"/>
+      <w:r>
+        <w:t>la base communes</w:t>
+      </w:r>
+      <w:proofErr w:type="gramEnd"/>
     </w:p>
     <w:p>
       <w:pPr>
@@ -11780,7 +11951,25 @@
           <w:iCs/>
           <w:color w:val="555555"/>
         </w:rPr>
-        <w:t xml:space="preserve">Les Erreurs sur la ville, due le plus souvent à des rattachement de commune. </w:t>
+        <w:t xml:space="preserve">Les Erreurs sur la ville, due le plus souvent à </w:t>
+      </w:r>
+      <w:proofErr w:type="gramStart"/>
+      <w:r>
+        <w:rPr>
+          <w:i/>
+          <w:iCs/>
+          <w:color w:val="555555"/>
+        </w:rPr>
+        <w:t>des rattachement</w:t>
+      </w:r>
+      <w:proofErr w:type="gramEnd"/>
+      <w:r>
+        <w:rPr>
+          <w:i/>
+          <w:iCs/>
+          <w:color w:val="555555"/>
+        </w:rPr>
+        <w:t xml:space="preserve"> de commune. </w:t>
       </w:r>
     </w:p>
     <w:p>
@@ -12118,6 +12307,7 @@
             </w:tcMar>
           </w:tcPr>
           <w:p>
+            <w:proofErr w:type="spellStart"/>
             <w:r>
               <w:rPr>
                 <w:sz w:val="20"/>
@@ -12125,6 +12315,7 @@
               </w:rPr>
               <w:t>club.php</w:t>
             </w:r>
+            <w:proofErr w:type="spellEnd"/>
           </w:p>
         </w:tc>
       </w:tr>
@@ -12207,7 +12398,15 @@
         <w:spacing w:before="60" w:after="60"/>
       </w:pPr>
       <w:r>
-        <w:t>Gestion de la liste des clubs affiliés à la ligue. Supporte l'import depuis un fichier Excel au format FFTT (édition 204, comité D76). L'import effectue un upsert : mise à jour si le club existe déjà, création sinon.</w:t>
+        <w:t xml:space="preserve">Gestion de la liste des clubs affiliés à la ligue. Supporte l'import depuis un fichier Excel au format FFTT (édition 204, comité D76). L'import effectue un </w:t>
+      </w:r>
+      <w:proofErr w:type="spellStart"/>
+      <w:r>
+        <w:t>upsert</w:t>
+      </w:r>
+      <w:proofErr w:type="spellEnd"/>
+      <w:r>
+        <w:t xml:space="preserve"> : mise à jour si le club existe déjà, création sinon.</w:t>
       </w:r>
     </w:p>
     <w:p>
@@ -12269,7 +12468,15 @@
         <w:spacing w:before="40" w:after="40"/>
       </w:pPr>
       <w:r>
-        <w:t>Tableau des clubs : N° FFTT (Id_Club), Nom du club</w:t>
+        <w:t>Tableau des clubs : N° FFTT (</w:t>
+      </w:r>
+      <w:proofErr w:type="spellStart"/>
+      <w:r>
+        <w:t>Id_Club</w:t>
+      </w:r>
+      <w:proofErr w:type="spellEnd"/>
+      <w:r>
+        <w:t>), Nom du club</w:t>
       </w:r>
     </w:p>
     <w:p>
@@ -12579,6 +12786,7 @@
             </w:tcMar>
           </w:tcPr>
           <w:p>
+            <w:proofErr w:type="spellStart"/>
             <w:r>
               <w:rPr>
                 <w:sz w:val="20"/>
@@ -12586,6 +12794,7 @@
               </w:rPr>
               <w:t>utilisateur.php</w:t>
             </w:r>
+            <w:proofErr w:type="spellEnd"/>
           </w:p>
         </w:tc>
       </w:tr>
@@ -12668,7 +12877,15 @@
         <w:spacing w:before="60" w:after="60"/>
       </w:pPr>
       <w:r>
-        <w:t>Création et administration des comptes utilisateurs de l'application. Chaque compte possède un rôle (Administrateur, Nominateur ou Consultation) qui détermine les fonctionnalités accessibles. Les mots de passe sont stockés de manière sécurisée (hachage bcrypt).</w:t>
+        <w:t xml:space="preserve">Création et administration des comptes utilisateurs de l'application. Chaque compte possède un rôle (Administrateur, Nominateur ou Consultation) qui détermine les fonctionnalités accessibles. Les mots de passe sont stockés de manière sécurisée (hachage </w:t>
+      </w:r>
+      <w:proofErr w:type="spellStart"/>
+      <w:r>
+        <w:t>bcrypt</w:t>
+      </w:r>
+      <w:proofErr w:type="spellEnd"/>
+      <w:r>
+        <w:t>).</w:t>
       </w:r>
     </w:p>
     <w:p>
@@ -12756,7 +12973,15 @@
         <w:spacing w:before="40" w:after="40"/>
       </w:pPr>
       <w:r>
-        <w:t>Mot de passe : champ de saisie (laissé vide = pas de modification)</w:t>
+        <w:t xml:space="preserve">Mot de passe : champ de saisie (laissé </w:t>
+      </w:r>
+      <w:proofErr w:type="spellStart"/>
+      <w:r>
+        <w:t>vide</w:t>
+      </w:r>
+      <w:proofErr w:type="spellEnd"/>
+      <w:r>
+        <w:t xml:space="preserve"> = pas de modification)</w:t>
       </w:r>
     </w:p>
     <w:p>
@@ -13092,6 +13317,7 @@
             </w:tcMar>
           </w:tcPr>
           <w:p>
+            <w:proofErr w:type="spellStart"/>
             <w:r>
               <w:rPr>
                 <w:sz w:val="20"/>
@@ -13099,6 +13325,7 @@
               </w:rPr>
               <w:t>division.php</w:t>
             </w:r>
+            <w:proofErr w:type="spellEnd"/>
           </w:p>
         </w:tc>
       </w:tr>
@@ -13561,6 +13788,7 @@
             </w:tcMar>
           </w:tcPr>
           <w:p>
+            <w:proofErr w:type="spellStart"/>
             <w:r>
               <w:rPr>
                 <w:sz w:val="20"/>
@@ -13568,6 +13796,7 @@
               </w:rPr>
               <w:t>import_rencontres.php</w:t>
             </w:r>
+            <w:proofErr w:type="spellEnd"/>
           </w:p>
         </w:tc>
       </w:tr>
@@ -14109,6 +14338,7 @@
             </w:tcMar>
           </w:tcPr>
           <w:p>
+            <w:proofErr w:type="spellStart"/>
             <w:r>
               <w:rPr>
                 <w:sz w:val="20"/>
@@ -14116,6 +14346,7 @@
               </w:rPr>
               <w:t>disponibilite_ja.php</w:t>
             </w:r>
+            <w:proofErr w:type="spellEnd"/>
           </w:p>
         </w:tc>
       </w:tr>
@@ -14172,7 +14403,23 @@
                 <w:sz w:val="20"/>
                 <w:szCs w:val="20"/>
               </w:rPr>
-              <w:t>Public – accessible via lien tokenisé envoyé par email</w:t>
+              <w:t xml:space="preserve">Public – accessible via lien </w:t>
+            </w:r>
+            <w:proofErr w:type="spellStart"/>
+            <w:r>
+              <w:rPr>
+                <w:sz w:val="20"/>
+                <w:szCs w:val="20"/>
+              </w:rPr>
+              <w:t>tokenisé</w:t>
+            </w:r>
+            <w:proofErr w:type="spellEnd"/>
+            <w:r>
+              <w:rPr>
+                <w:sz w:val="20"/>
+                <w:szCs w:val="20"/>
+              </w:rPr>
+              <w:t xml:space="preserve"> envoyé par email</w:t>
             </w:r>
           </w:p>
         </w:tc>
@@ -14198,7 +14445,15 @@
         <w:spacing w:before="60" w:after="60"/>
       </w:pPr>
       <w:r>
-        <w:t>Page publique (sans connexion requise) permettant à chaque Juge-Arbitre de déclarer ses disponibilités pour les journées de la saison en cours. Elle est accessible via un lien personnalisé (token obfusqué) envoyé par email au JA ou directement depuis l'interface nominateur.</w:t>
+        <w:t>Page publique (sans connexion requise) permettant à chaque Juge-Arbitre de déclarer ses disponibilités pour les journées de la saison en cours. Elle est accessible via un lien personnalisé (</w:t>
+      </w:r>
+      <w:proofErr w:type="spellStart"/>
+      <w:r>
+        <w:t>token</w:t>
+      </w:r>
+      <w:proofErr w:type="spellEnd"/>
+      <w:r>
+        <w:t xml:space="preserve"> obfusqué) envoyé par email au JA ou directement depuis l'interface nominateur.</w:t>
       </w:r>
     </w:p>
     <w:p>
@@ -14334,6 +14589,506 @@
         <w:t>Copie d'écran</w:t>
       </w:r>
       <w:bookmarkEnd w:id="63"/>
+    </w:p>
+    <w:p>
+      <w:pPr>
+        <w:spacing w:before="100" w:after="100"/>
+      </w:pPr>
+    </w:p>
+    <w:tbl>
+      <w:tblPr>
+        <w:tblW w:w="9430" w:type="dxa"/>
+        <w:tblBorders>
+          <w:top w:val="single" w:sz="4" w:space="0" w:color="auto"/>
+          <w:left w:val="single" w:sz="4" w:space="0" w:color="auto"/>
+          <w:bottom w:val="single" w:sz="4" w:space="0" w:color="auto"/>
+          <w:right w:val="single" w:sz="4" w:space="0" w:color="auto"/>
+          <w:insideH w:val="single" w:sz="4" w:space="0" w:color="auto"/>
+          <w:insideV w:val="single" w:sz="4" w:space="0" w:color="auto"/>
+        </w:tblBorders>
+        <w:tblCellMar>
+          <w:left w:w="10" w:type="dxa"/>
+          <w:right w:w="10" w:type="dxa"/>
+        </w:tblCellMar>
+        <w:tblLook w:val="0000" w:firstRow="0" w:lastRow="0" w:firstColumn="0" w:lastColumn="0" w:noHBand="0" w:noVBand="0"/>
+      </w:tblPr>
+      <w:tblGrid>
+        <w:gridCol w:w="9430"/>
+      </w:tblGrid>
+      <w:tr>
+        <w:tc>
+          <w:tcPr>
+            <w:tcW w:w="9430" w:type="dxa"/>
+            <w:tcBorders>
+              <w:top w:val="single" w:sz="4" w:space="0" w:color="AAAACC"/>
+              <w:left w:val="single" w:sz="4" w:space="0" w:color="AAAACC"/>
+              <w:bottom w:val="single" w:sz="4" w:space="0" w:color="AAAACC"/>
+              <w:right w:val="single" w:sz="4" w:space="0" w:color="AAAACC"/>
+            </w:tcBorders>
+            <w:shd w:val="clear" w:color="auto" w:fill="F5F5FF"/>
+            <w:tcMar>
+              <w:top w:w="200" w:type="dxa"/>
+              <w:left w:w="200" w:type="dxa"/>
+              <w:bottom w:w="200" w:type="dxa"/>
+              <w:right w:w="200" w:type="dxa"/>
+            </w:tcMar>
+            <w:vAlign w:val="center"/>
+          </w:tcPr>
+          <w:p>
+            <w:pPr>
+              <w:spacing w:before="400" w:after="400"/>
+              <w:jc w:val="center"/>
+            </w:pPr>
+            <w:r>
+              <w:drawing>
+                <wp:inline distT="0" distB="0" distL="0" distR="0" wp14:anchorId="70A27913" wp14:editId="240BD453">
+                  <wp:extent cx="5731510" cy="4543425"/>
+                  <wp:effectExtent l="0" t="0" r="2540" b="9525"/>
+                  <wp:docPr id="5" name="Image 5"/>
+                  <wp:cNvGraphicFramePr>
+                    <a:graphicFrameLocks xmlns:a="http://schemas.openxmlformats.org/drawingml/2006/main" noChangeAspect="1"/>
+                  </wp:cNvGraphicFramePr>
+                  <a:graphic xmlns:a="http://schemas.openxmlformats.org/drawingml/2006/main">
+                    <a:graphicData uri="http://schemas.openxmlformats.org/drawingml/2006/picture">
+                      <pic:pic xmlns:pic="http://schemas.openxmlformats.org/drawingml/2006/picture">
+                        <pic:nvPicPr>
+                          <pic:cNvPr id="1" name=""/>
+                          <pic:cNvPicPr/>
+                        </pic:nvPicPr>
+                        <pic:blipFill>
+                          <a:blip r:embed="rId27"/>
+                          <a:stretch>
+                            <a:fillRect/>
+                          </a:stretch>
+                        </pic:blipFill>
+                        <pic:spPr>
+                          <a:xfrm>
+                            <a:off x="0" y="0"/>
+                            <a:ext cx="5731510" cy="4543425"/>
+                          </a:xfrm>
+                          <a:prstGeom prst="rect">
+                            <a:avLst/>
+                          </a:prstGeom>
+                        </pic:spPr>
+                      </pic:pic>
+                    </a:graphicData>
+                  </a:graphic>
+                </wp:inline>
+              </w:drawing>
+            </w:r>
+          </w:p>
+        </w:tc>
+      </w:tr>
+    </w:tbl>
+    <w:p>
+      <w:r>
+        <w:drawing>
+          <wp:inline distT="0" distB="0" distL="0" distR="0" wp14:anchorId="21C7EE90" wp14:editId="6827BAF1">
+            <wp:extent cx="3569818" cy="1637386"/>
+            <wp:effectExtent l="0" t="0" r="0" b="1270"/>
+            <wp:docPr id="25" name="Image 25"/>
+            <wp:cNvGraphicFramePr>
+              <a:graphicFrameLocks xmlns:a="http://schemas.openxmlformats.org/drawingml/2006/main" noChangeAspect="1"/>
+            </wp:cNvGraphicFramePr>
+            <a:graphic xmlns:a="http://schemas.openxmlformats.org/drawingml/2006/main">
+              <a:graphicData uri="http://schemas.openxmlformats.org/drawingml/2006/picture">
+                <pic:pic xmlns:pic="http://schemas.openxmlformats.org/drawingml/2006/picture">
+                  <pic:nvPicPr>
+                    <pic:cNvPr id="1" name=""/>
+                    <pic:cNvPicPr/>
+                  </pic:nvPicPr>
+                  <pic:blipFill>
+                    <a:blip r:embed="rId28"/>
+                    <a:stretch>
+                      <a:fillRect/>
+                    </a:stretch>
+                  </pic:blipFill>
+                  <pic:spPr>
+                    <a:xfrm>
+                      <a:off x="0" y="0"/>
+                      <a:ext cx="3603679" cy="1652917"/>
+                    </a:xfrm>
+                    <a:prstGeom prst="rect">
+                      <a:avLst/>
+                    </a:prstGeom>
+                  </pic:spPr>
+                </pic:pic>
+              </a:graphicData>
+            </a:graphic>
+          </wp:inline>
+        </w:drawing>
+      </w:r>
+    </w:p>
+    <w:p>
+      <w:r>
+        <w:lastRenderedPageBreak/>
+        <w:drawing>
+          <wp:inline distT="0" distB="0" distL="0" distR="0" wp14:anchorId="379E0AC5" wp14:editId="3E9FEAE0">
+            <wp:extent cx="2435962" cy="2469619"/>
+            <wp:effectExtent l="0" t="0" r="2540" b="6985"/>
+            <wp:docPr id="30" name="Image 30"/>
+            <wp:cNvGraphicFramePr>
+              <a:graphicFrameLocks xmlns:a="http://schemas.openxmlformats.org/drawingml/2006/main" noChangeAspect="1"/>
+            </wp:cNvGraphicFramePr>
+            <a:graphic xmlns:a="http://schemas.openxmlformats.org/drawingml/2006/main">
+              <a:graphicData uri="http://schemas.openxmlformats.org/drawingml/2006/picture">
+                <pic:pic xmlns:pic="http://schemas.openxmlformats.org/drawingml/2006/picture">
+                  <pic:nvPicPr>
+                    <pic:cNvPr id="1" name=""/>
+                    <pic:cNvPicPr/>
+                  </pic:nvPicPr>
+                  <pic:blipFill>
+                    <a:blip r:embed="rId29"/>
+                    <a:stretch>
+                      <a:fillRect/>
+                    </a:stretch>
+                  </pic:blipFill>
+                  <pic:spPr>
+                    <a:xfrm>
+                      <a:off x="0" y="0"/>
+                      <a:ext cx="2445741" cy="2479533"/>
+                    </a:xfrm>
+                    <a:prstGeom prst="rect">
+                      <a:avLst/>
+                    </a:prstGeom>
+                  </pic:spPr>
+                </pic:pic>
+              </a:graphicData>
+            </a:graphic>
+          </wp:inline>
+        </w:drawing>
+      </w:r>
+    </w:p>
+    <w:p>
+      <w:pPr>
+        <w:pStyle w:val="Titre2"/>
+        <w:pBdr>
+          <w:bottom w:val="single" w:sz="4" w:space="0" w:color="2557A7"/>
+        </w:pBdr>
+      </w:pPr>
+    </w:p>
+    <w:p>
+      <w:pPr>
+        <w:rPr>
+          <w:b/>
+          <w:bCs/>
+          <w:color w:val="1A3A6B"/>
+          <w:sz w:val="26"/>
+          <w:szCs w:val="26"/>
+        </w:rPr>
+      </w:pPr>
+      <w:r>
+        <w:br w:type="page"/>
+      </w:r>
+    </w:p>
+    <w:p>
+      <w:pPr>
+        <w:pStyle w:val="Titre2"/>
+        <w:pBdr>
+          <w:bottom w:val="single" w:sz="4" w:space="0" w:color="2557A7"/>
+        </w:pBdr>
+      </w:pPr>
+      <w:bookmarkStart w:id="64" w:name="_Toc232147299"/>
+      <w:r>
+        <w:lastRenderedPageBreak/>
+        <w:t>E013 – En cours de développement</w:t>
+      </w:r>
+      <w:bookmarkEnd w:id="64"/>
+    </w:p>
+    <w:p>
+      <w:pPr>
+        <w:spacing w:before="100" w:after="100"/>
+      </w:pPr>
+    </w:p>
+    <w:tbl>
+      <w:tblPr>
+        <w:tblW w:w="9026" w:type="dxa"/>
+        <w:tblBorders>
+          <w:top w:val="single" w:sz="4" w:space="0" w:color="auto"/>
+          <w:left w:val="single" w:sz="4" w:space="0" w:color="auto"/>
+          <w:bottom w:val="single" w:sz="4" w:space="0" w:color="auto"/>
+          <w:right w:val="single" w:sz="4" w:space="0" w:color="auto"/>
+          <w:insideH w:val="single" w:sz="4" w:space="0" w:color="auto"/>
+          <w:insideV w:val="single" w:sz="4" w:space="0" w:color="auto"/>
+        </w:tblBorders>
+        <w:tblCellMar>
+          <w:left w:w="10" w:type="dxa"/>
+          <w:right w:w="10" w:type="dxa"/>
+        </w:tblCellMar>
+        <w:tblLook w:val="0000" w:firstRow="0" w:lastRow="0" w:firstColumn="0" w:lastColumn="0" w:noHBand="0" w:noVBand="0"/>
+      </w:tblPr>
+      <w:tblGrid>
+        <w:gridCol w:w="2500"/>
+        <w:gridCol w:w="6526"/>
+      </w:tblGrid>
+      <w:tr>
+        <w:tc>
+          <w:tcPr>
+            <w:tcW w:w="2500" w:type="dxa"/>
+            <w:tcBorders>
+              <w:top w:val="single" w:sz="4" w:space="0" w:color="C8D4E8"/>
+              <w:left w:val="single" w:sz="4" w:space="0" w:color="C8D4E8"/>
+              <w:bottom w:val="single" w:sz="4" w:space="0" w:color="C8D4E8"/>
+              <w:right w:val="single" w:sz="4" w:space="0" w:color="C8D4E8"/>
+            </w:tcBorders>
+            <w:shd w:val="clear" w:color="auto" w:fill="E8EEF7"/>
+            <w:tcMar>
+              <w:top w:w="60" w:type="dxa"/>
+              <w:left w:w="120" w:type="dxa"/>
+              <w:bottom w:w="60" w:type="dxa"/>
+              <w:right w:w="120" w:type="dxa"/>
+            </w:tcMar>
+          </w:tcPr>
+          <w:p>
+            <w:r>
+              <w:rPr>
+                <w:b/>
+                <w:bCs/>
+                <w:color w:val="1A3A6B"/>
+                <w:sz w:val="20"/>
+                <w:szCs w:val="20"/>
+              </w:rPr>
+              <w:t>N° écran</w:t>
+            </w:r>
+          </w:p>
+        </w:tc>
+        <w:tc>
+          <w:tcPr>
+            <w:tcW w:w="6526" w:type="dxa"/>
+            <w:tcBorders>
+              <w:top w:val="single" w:sz="4" w:space="0" w:color="C8D4E8"/>
+              <w:left w:val="single" w:sz="4" w:space="0" w:color="C8D4E8"/>
+              <w:bottom w:val="single" w:sz="4" w:space="0" w:color="C8D4E8"/>
+              <w:right w:val="single" w:sz="4" w:space="0" w:color="C8D4E8"/>
+            </w:tcBorders>
+            <w:tcMar>
+              <w:top w:w="60" w:type="dxa"/>
+              <w:left w:w="120" w:type="dxa"/>
+              <w:bottom w:w="60" w:type="dxa"/>
+              <w:right w:w="120" w:type="dxa"/>
+            </w:tcMar>
+          </w:tcPr>
+          <w:p>
+            <w:r>
+              <w:rPr>
+                <w:sz w:val="20"/>
+                <w:szCs w:val="20"/>
+              </w:rPr>
+              <w:t>E013</w:t>
+            </w:r>
+          </w:p>
+        </w:tc>
+      </w:tr>
+      <w:tr>
+        <w:tc>
+          <w:tcPr>
+            <w:tcW w:w="2500" w:type="dxa"/>
+            <w:tcBorders>
+              <w:top w:val="single" w:sz="4" w:space="0" w:color="C8D4E8"/>
+              <w:left w:val="single" w:sz="4" w:space="0" w:color="C8D4E8"/>
+              <w:bottom w:val="single" w:sz="4" w:space="0" w:color="C8D4E8"/>
+              <w:right w:val="single" w:sz="4" w:space="0" w:color="C8D4E8"/>
+            </w:tcBorders>
+            <w:shd w:val="clear" w:color="auto" w:fill="E8EEF7"/>
+            <w:tcMar>
+              <w:top w:w="60" w:type="dxa"/>
+              <w:left w:w="120" w:type="dxa"/>
+              <w:bottom w:w="60" w:type="dxa"/>
+              <w:right w:w="120" w:type="dxa"/>
+            </w:tcMar>
+          </w:tcPr>
+          <w:p>
+            <w:r>
+              <w:rPr>
+                <w:b/>
+                <w:bCs/>
+                <w:color w:val="1A3A6B"/>
+                <w:sz w:val="20"/>
+                <w:szCs w:val="20"/>
+              </w:rPr>
+              <w:t>Fichier</w:t>
+            </w:r>
+          </w:p>
+        </w:tc>
+        <w:tc>
+          <w:tcPr>
+            <w:tcW w:w="6526" w:type="dxa"/>
+            <w:tcBorders>
+              <w:top w:val="single" w:sz="4" w:space="0" w:color="C8D4E8"/>
+              <w:left w:val="single" w:sz="4" w:space="0" w:color="C8D4E8"/>
+              <w:bottom w:val="single" w:sz="4" w:space="0" w:color="C8D4E8"/>
+              <w:right w:val="single" w:sz="4" w:space="0" w:color="C8D4E8"/>
+            </w:tcBorders>
+            <w:tcMar>
+              <w:top w:w="60" w:type="dxa"/>
+              <w:left w:w="120" w:type="dxa"/>
+              <w:bottom w:w="60" w:type="dxa"/>
+              <w:right w:w="120" w:type="dxa"/>
+            </w:tcMar>
+          </w:tcPr>
+          <w:p>
+            <w:proofErr w:type="spellStart"/>
+            <w:r>
+              <w:rPr>
+                <w:sz w:val="20"/>
+                <w:szCs w:val="20"/>
+              </w:rPr>
+              <w:t>encours.php</w:t>
+            </w:r>
+            <w:proofErr w:type="spellEnd"/>
+          </w:p>
+        </w:tc>
+      </w:tr>
+      <w:tr>
+        <w:tc>
+          <w:tcPr>
+            <w:tcW w:w="2500" w:type="dxa"/>
+            <w:tcBorders>
+              <w:top w:val="single" w:sz="4" w:space="0" w:color="C8D4E8"/>
+              <w:left w:val="single" w:sz="4" w:space="0" w:color="C8D4E8"/>
+              <w:bottom w:val="single" w:sz="4" w:space="0" w:color="C8D4E8"/>
+              <w:right w:val="single" w:sz="4" w:space="0" w:color="C8D4E8"/>
+            </w:tcBorders>
+            <w:shd w:val="clear" w:color="auto" w:fill="E8EEF7"/>
+            <w:tcMar>
+              <w:top w:w="60" w:type="dxa"/>
+              <w:left w:w="120" w:type="dxa"/>
+              <w:bottom w:w="60" w:type="dxa"/>
+              <w:right w:w="120" w:type="dxa"/>
+            </w:tcMar>
+          </w:tcPr>
+          <w:p>
+            <w:r>
+              <w:rPr>
+                <w:b/>
+                <w:bCs/>
+                <w:color w:val="1A3A6B"/>
+                <w:sz w:val="20"/>
+                <w:szCs w:val="20"/>
+              </w:rPr>
+              <w:t>Accès</w:t>
+            </w:r>
+          </w:p>
+        </w:tc>
+        <w:tc>
+          <w:tcPr>
+            <w:tcW w:w="6526" w:type="dxa"/>
+            <w:tcBorders>
+              <w:top w:val="single" w:sz="4" w:space="0" w:color="C8D4E8"/>
+              <w:left w:val="single" w:sz="4" w:space="0" w:color="C8D4E8"/>
+              <w:bottom w:val="single" w:sz="4" w:space="0" w:color="C8D4E8"/>
+              <w:right w:val="single" w:sz="4" w:space="0" w:color="C8D4E8"/>
+            </w:tcBorders>
+            <w:tcMar>
+              <w:top w:w="60" w:type="dxa"/>
+              <w:left w:w="120" w:type="dxa"/>
+              <w:bottom w:w="60" w:type="dxa"/>
+              <w:right w:w="120" w:type="dxa"/>
+            </w:tcMar>
+          </w:tcPr>
+          <w:p>
+            <w:r>
+              <w:rPr>
+                <w:sz w:val="20"/>
+                <w:szCs w:val="20"/>
+              </w:rPr>
+              <w:t>Administrateur connecté</w:t>
+            </w:r>
+          </w:p>
+        </w:tc>
+      </w:tr>
+    </w:tbl>
+    <w:p>
+      <w:pPr>
+        <w:spacing w:before="100" w:after="100"/>
+      </w:pPr>
+    </w:p>
+    <w:p>
+      <w:pPr>
+        <w:pStyle w:val="Titre3"/>
+      </w:pPr>
+      <w:bookmarkStart w:id="65" w:name="_Toc232147300"/>
+      <w:r>
+        <w:t>Description</w:t>
+      </w:r>
+      <w:bookmarkEnd w:id="65"/>
+    </w:p>
+    <w:p>
+      <w:pPr>
+        <w:spacing w:before="60" w:after="60"/>
+      </w:pPr>
+      <w:r>
+        <w:t>Page générique affichée lorsqu'une fonctionnalité est planifiée mais pas encore implémentée. Actuellement utilisée par les écrans Saison (E014) et Configuration (E015). Affiche un message d'information et un bouton de retour au menu.</w:t>
+      </w:r>
+    </w:p>
+    <w:p>
+      <w:pPr>
+        <w:pStyle w:val="Titre3"/>
+      </w:pPr>
+      <w:bookmarkStart w:id="66" w:name="_Toc232147301"/>
+      <w:r>
+        <w:t>Champs et fonctionnalités</w:t>
+      </w:r>
+      <w:bookmarkEnd w:id="66"/>
+    </w:p>
+    <w:p>
+      <w:pPr>
+        <w:pStyle w:val="Paragraphedeliste"/>
+        <w:numPr>
+          <w:ilvl w:val="0"/>
+          <w:numId w:val="2"/>
+        </w:numPr>
+        <w:spacing w:before="40" w:after="40"/>
+      </w:pPr>
+      <w:r>
+        <w:t>Message d'information : "Le développement de cette fonctionnalité n'est pas encore terminé."</w:t>
+      </w:r>
+    </w:p>
+    <w:p>
+      <w:pPr>
+        <w:pStyle w:val="Paragraphedeliste"/>
+        <w:numPr>
+          <w:ilvl w:val="0"/>
+          <w:numId w:val="2"/>
+        </w:numPr>
+        <w:spacing w:before="40" w:after="40"/>
+      </w:pPr>
+      <w:r>
+        <w:t>Bouton Retour au menu : redirige vers le menu administrateur (E002)</w:t>
+      </w:r>
+    </w:p>
+    <w:p>
+      <w:pPr>
+        <w:pStyle w:val="Titre3"/>
+      </w:pPr>
+      <w:bookmarkStart w:id="67" w:name="_Toc232147302"/>
+      <w:r>
+        <w:t>Remarques</w:t>
+      </w:r>
+      <w:bookmarkEnd w:id="67"/>
+    </w:p>
+    <w:p>
+      <w:pPr>
+        <w:spacing w:before="60" w:after="60"/>
+      </w:pPr>
+      <w:r>
+        <w:rPr>
+          <w:i/>
+          <w:iCs/>
+          <w:color w:val="555555"/>
+        </w:rPr>
+        <w:t>Cette page sera remplacée par les écrans définitifs de gestion des saisons et de configuration générale au fur et à mesure du développement.</w:t>
+      </w:r>
+    </w:p>
+    <w:p>
+      <w:pPr>
+        <w:pStyle w:val="Titre3"/>
+      </w:pPr>
+      <w:bookmarkStart w:id="68" w:name="_Toc232147303"/>
+      <w:r>
+        <w:t>Copie d'écran</w:t>
+      </w:r>
+      <w:bookmarkEnd w:id="68"/>
     </w:p>
     <w:p>
       <w:pPr>
@@ -14389,10 +15144,10 @@
                 <w:noProof/>
               </w:rPr>
               <w:drawing>
-                <wp:inline distT="0" distB="0" distL="0" distR="0" wp14:anchorId="7BC1C4F1" wp14:editId="53AD4670">
-                  <wp:extent cx="5731510" cy="3470275"/>
-                  <wp:effectExtent l="0" t="0" r="2540" b="0"/>
-                  <wp:docPr id="20" name="Image 20"/>
+                <wp:inline distT="0" distB="0" distL="0" distR="0" wp14:anchorId="66054A9C" wp14:editId="740C414C">
+                  <wp:extent cx="5731510" cy="3557905"/>
+                  <wp:effectExtent l="0" t="0" r="2540" b="4445"/>
+                  <wp:docPr id="21" name="Image 21"/>
                   <wp:cNvGraphicFramePr>
                     <a:graphicFrameLocks xmlns:a="http://schemas.openxmlformats.org/drawingml/2006/main" noChangeAspect="1"/>
                   </wp:cNvGraphicFramePr>
@@ -14404,7 +15159,7 @@
                           <pic:cNvPicPr/>
                         </pic:nvPicPr>
                         <pic:blipFill>
-                          <a:blip r:embed="rId27"/>
+                          <a:blip r:embed="rId30"/>
                           <a:stretch>
                             <a:fillRect/>
                           </a:stretch>
@@ -14412,7 +15167,7 @@
                         <pic:spPr>
                           <a:xfrm>
                             <a:off x="0" y="0"/>
-                            <a:ext cx="5731510" cy="3470275"/>
+                            <a:ext cx="5731510" cy="3557905"/>
                           </a:xfrm>
                           <a:prstGeom prst="rect">
                             <a:avLst/>
@@ -14430,39 +15185,58 @@
     </w:tbl>
     <w:p>
       <w:pPr>
+        <w:sectPr>
+          <w:headerReference w:type="default" r:id="rId31"/>
+          <w:footerReference w:type="default" r:id="rId32"/>
+          <w:pgSz w:w="11906" w:h="16838"/>
+          <w:pgMar w:top="1440" w:right="1440" w:bottom="1440" w:left="1440" w:header="708" w:footer="708" w:gutter="0"/>
+          <w:cols w:space="720"/>
+          <w:docGrid w:linePitch="360"/>
+        </w:sectPr>
+      </w:pPr>
+    </w:p>
+    <w:p>
+      <w:pPr>
+        <w:pStyle w:val="Titre1"/>
+        <w:pageBreakBefore/>
+        <w:shd w:val="clear" w:color="auto" w:fill="1A3A6B"/>
+        <w:ind w:left="200"/>
+      </w:pPr>
+      <w:bookmarkStart w:id="69" w:name="_Toc232147304"/>
+      <w:r>
+        <w:lastRenderedPageBreak/>
+        <w:t>Partie Nominateur</w:t>
+      </w:r>
+      <w:bookmarkEnd w:id="69"/>
+    </w:p>
+    <w:p>
+      <w:pPr>
+        <w:spacing w:before="60" w:after="60"/>
+      </w:pPr>
+      <w:r>
+        <w:rPr>
+          <w:color w:val="444444"/>
+        </w:rPr>
+        <w:t>Cette partie regroupe les écrans dédiés au processus de nomination des Juges-Arbitres. Elle est accessible aux utilisateurs ayant le rôle "Nominateur" ou "Administrateur".</w:t>
+      </w:r>
+    </w:p>
+    <w:p>
+      <w:pPr>
+        <w:spacing w:before="100" w:after="100"/>
+      </w:pPr>
+    </w:p>
+    <w:p>
+      <w:pPr>
         <w:pStyle w:val="Titre2"/>
         <w:pBdr>
           <w:bottom w:val="single" w:sz="4" w:space="0" w:color="2557A7"/>
         </w:pBdr>
       </w:pPr>
-    </w:p>
-    <w:p>
-      <w:pPr>
-        <w:rPr>
-          <w:b/>
-          <w:bCs/>
-          <w:color w:val="1A3A6B"/>
-          <w:sz w:val="26"/>
-          <w:szCs w:val="26"/>
-        </w:rPr>
-      </w:pPr>
-      <w:r>
-        <w:br w:type="page"/>
-      </w:r>
-    </w:p>
-    <w:p>
-      <w:pPr>
-        <w:pStyle w:val="Titre2"/>
-        <w:pBdr>
-          <w:bottom w:val="single" w:sz="4" w:space="0" w:color="2557A7"/>
-        </w:pBdr>
-      </w:pPr>
-      <w:bookmarkStart w:id="64" w:name="_Toc232147299"/>
-      <w:r>
-        <w:lastRenderedPageBreak/>
-        <w:t>E013 – En cours de développement</w:t>
-      </w:r>
-      <w:bookmarkEnd w:id="64"/>
+      <w:bookmarkStart w:id="70" w:name="_Toc232147305"/>
+      <w:r>
+        <w:t>E020 – Menu nominateur</w:t>
+      </w:r>
+      <w:bookmarkEnd w:id="70"/>
     </w:p>
     <w:p>
       <w:pPr>
@@ -14543,7 +15317,7 @@
                 <w:sz w:val="20"/>
                 <w:szCs w:val="20"/>
               </w:rPr>
-              <w:t>E013</w:t>
+              <w:t>E020</w:t>
             </w:r>
           </w:p>
         </w:tc>
@@ -14601,8 +15375,17 @@
                 <w:sz w:val="20"/>
                 <w:szCs w:val="20"/>
               </w:rPr>
-              <w:t>encours.php</w:t>
-            </w:r>
+              <w:t>Nominateur/</w:t>
+            </w:r>
+            <w:proofErr w:type="spellStart"/>
+            <w:r>
+              <w:rPr>
+                <w:sz w:val="20"/>
+                <w:szCs w:val="20"/>
+              </w:rPr>
+              <w:t>menu.php</w:t>
+            </w:r>
+            <w:proofErr w:type="spellEnd"/>
           </w:p>
         </w:tc>
       </w:tr>
@@ -14659,7 +15442,7 @@
                 <w:sz w:val="20"/>
                 <w:szCs w:val="20"/>
               </w:rPr>
-              <w:t>Administrateur connecté</w:t>
+              <w:t>Utilisateur connecté (Nominateur ou Administrateur)</w:t>
             </w:r>
           </w:p>
         </w:tc>
@@ -14674,29 +15457,29 @@
       <w:pPr>
         <w:pStyle w:val="Titre3"/>
       </w:pPr>
-      <w:bookmarkStart w:id="65" w:name="_Toc232147300"/>
+      <w:bookmarkStart w:id="71" w:name="_Toc232147306"/>
       <w:r>
         <w:t>Description</w:t>
       </w:r>
-      <w:bookmarkEnd w:id="65"/>
+      <w:bookmarkEnd w:id="71"/>
     </w:p>
     <w:p>
       <w:pPr>
         <w:spacing w:before="60" w:after="60"/>
       </w:pPr>
       <w:r>
-        <w:t>Page générique affichée lorsqu'une fonctionnalité est planifiée mais pas encore implémentée. Actuellement utilisée par les écrans Saison (E014) et Configuration (E015). Affiche un message d'information et un bouton de retour au menu.</w:t>
+        <w:t>Menu principal de l'interface nominateur. Il donne accès aux fonctions de nomination des Juges-Arbitres. Les utilisateurs ayant le rôle "Administrateur" voient également le bouton "Menu administrateur" pour basculer vers l'interface de paramétrage.</w:t>
       </w:r>
     </w:p>
     <w:p>
       <w:pPr>
         <w:pStyle w:val="Titre3"/>
       </w:pPr>
-      <w:bookmarkStart w:id="66" w:name="_Toc232147301"/>
+      <w:bookmarkStart w:id="72" w:name="_Toc232147307"/>
       <w:r>
         <w:t>Champs et fonctionnalités</w:t>
       </w:r>
-      <w:bookmarkEnd w:id="66"/>
+      <w:bookmarkEnd w:id="72"/>
     </w:p>
     <w:p>
       <w:pPr>
@@ -14708,7 +15491,7 @@
         <w:spacing w:before="40" w:after="40"/>
       </w:pPr>
       <w:r>
-        <w:t>Message d'information : "Le développement de cette fonctionnalité n'est pas encore terminé."</w:t>
+        <w:t>Bouton Juge-Arbitre : accès à la gestion des fiches JA (E007)</w:t>
       </w:r>
     </w:p>
     <w:p>
@@ -14721,18 +15504,44 @@
         <w:spacing w:before="40" w:after="40"/>
       </w:pPr>
       <w:r>
-        <w:t>Bouton Retour au menu : redirige vers le menu administrateur (E002)</w:t>
+        <w:t>Bouton Disponibilités JA : saisie/consultation des disponibilités par département (E021)</w:t>
+      </w:r>
+    </w:p>
+    <w:p>
+      <w:pPr>
+        <w:pStyle w:val="Paragraphedeliste"/>
+        <w:numPr>
+          <w:ilvl w:val="0"/>
+          <w:numId w:val="2"/>
+        </w:numPr>
+        <w:spacing w:before="40" w:after="40"/>
+      </w:pPr>
+      <w:r>
+        <w:t>Bouton Nomination JA : interface de nomination automatique et manuelle (E022)</w:t>
+      </w:r>
+    </w:p>
+    <w:p>
+      <w:pPr>
+        <w:pStyle w:val="Paragraphedeliste"/>
+        <w:numPr>
+          <w:ilvl w:val="0"/>
+          <w:numId w:val="2"/>
+        </w:numPr>
+        <w:spacing w:before="40" w:after="40"/>
+      </w:pPr>
+      <w:r>
+        <w:t>Bouton Menu administrateur (visible admins seulement) : bascule vers E002</w:t>
       </w:r>
     </w:p>
     <w:p>
       <w:pPr>
         <w:pStyle w:val="Titre3"/>
       </w:pPr>
-      <w:bookmarkStart w:id="67" w:name="_Toc232147302"/>
+      <w:bookmarkStart w:id="73" w:name="_Toc232147308"/>
       <w:r>
         <w:t>Remarques</w:t>
       </w:r>
-      <w:bookmarkEnd w:id="67"/>
+      <w:bookmarkEnd w:id="73"/>
     </w:p>
     <w:p>
       <w:pPr>
@@ -14744,18 +15553,31 @@
           <w:iCs/>
           <w:color w:val="555555"/>
         </w:rPr>
-        <w:t>Cette page sera remplacée par les écrans définitifs de gestion des saisons et de configuration générale au fur et à mesure du développement.</w:t>
+        <w:t>Le fond vert du menu nominateur le distingue visuellement du menu administrateur (fond bleu marine).</w:t>
+      </w:r>
+    </w:p>
+    <w:p>
+      <w:pPr>
+        <w:rPr>
+          <w:b/>
+          <w:bCs/>
+          <w:color w:val="374151"/>
+        </w:rPr>
+      </w:pPr>
+      <w:r>
+        <w:br w:type="page"/>
       </w:r>
     </w:p>
     <w:p>
       <w:pPr>
         <w:pStyle w:val="Titre3"/>
       </w:pPr>
-      <w:bookmarkStart w:id="68" w:name="_Toc232147303"/>
-      <w:r>
+      <w:bookmarkStart w:id="74" w:name="_Toc232147309"/>
+      <w:r>
+        <w:lastRenderedPageBreak/>
         <w:t>Copie d'écran</w:t>
       </w:r>
-      <w:bookmarkEnd w:id="68"/>
+      <w:bookmarkEnd w:id="74"/>
     </w:p>
     <w:p>
       <w:pPr>
@@ -14811,10 +15633,10 @@
                 <w:noProof/>
               </w:rPr>
               <w:drawing>
-                <wp:inline distT="0" distB="0" distL="0" distR="0" wp14:anchorId="66054A9C" wp14:editId="740C414C">
-                  <wp:extent cx="5731510" cy="3557905"/>
-                  <wp:effectExtent l="0" t="0" r="2540" b="4445"/>
-                  <wp:docPr id="21" name="Image 21"/>
+                <wp:inline distT="0" distB="0" distL="0" distR="0" wp14:anchorId="6A1F3759" wp14:editId="4A9B3A28">
+                  <wp:extent cx="5731510" cy="4950460"/>
+                  <wp:effectExtent l="0" t="0" r="2540" b="2540"/>
+                  <wp:docPr id="22" name="Image 22"/>
                   <wp:cNvGraphicFramePr>
                     <a:graphicFrameLocks xmlns:a="http://schemas.openxmlformats.org/drawingml/2006/main" noChangeAspect="1"/>
                   </wp:cNvGraphicFramePr>
@@ -14826,7 +15648,7 @@
                           <pic:cNvPicPr/>
                         </pic:nvPicPr>
                         <pic:blipFill>
-                          <a:blip r:embed="rId28"/>
+                          <a:blip r:embed="rId33"/>
                           <a:stretch>
                             <a:fillRect/>
                           </a:stretch>
@@ -14834,7 +15656,7 @@
                         <pic:spPr>
                           <a:xfrm>
                             <a:off x="0" y="0"/>
-                            <a:ext cx="5731510" cy="3557905"/>
+                            <a:ext cx="5731510" cy="4950460"/>
                           </a:xfrm>
                           <a:prstGeom prst="rect">
                             <a:avLst/>
@@ -14852,58 +15674,39 @@
     </w:tbl>
     <w:p>
       <w:pPr>
-        <w:sectPr>
-          <w:headerReference w:type="default" r:id="rId29"/>
-          <w:footerReference w:type="default" r:id="rId30"/>
-          <w:pgSz w:w="11906" w:h="16838"/>
-          <w:pgMar w:top="1440" w:right="1440" w:bottom="1440" w:left="1440" w:header="708" w:footer="708" w:gutter="0"/>
-          <w:cols w:space="720"/>
-          <w:docGrid w:linePitch="360"/>
-        </w:sectPr>
-      </w:pPr>
-    </w:p>
-    <w:p>
-      <w:pPr>
-        <w:pStyle w:val="Titre1"/>
-        <w:pageBreakBefore/>
-        <w:shd w:val="clear" w:color="auto" w:fill="1A3A6B"/>
-        <w:ind w:left="200"/>
-      </w:pPr>
-      <w:bookmarkStart w:id="69" w:name="_Toc232147304"/>
-      <w:r>
-        <w:lastRenderedPageBreak/>
-        <w:t>Partie Nominateur</w:t>
-      </w:r>
-      <w:bookmarkEnd w:id="69"/>
-    </w:p>
-    <w:p>
-      <w:pPr>
-        <w:spacing w:before="60" w:after="60"/>
-      </w:pPr>
-      <w:r>
-        <w:rPr>
-          <w:color w:val="444444"/>
-        </w:rPr>
-        <w:t>Cette partie regroupe les écrans dédiés au processus de nomination des Juges-Arbitres. Elle est accessible aux utilisateurs ayant le rôle "Nominateur" ou "Administrateur".</w:t>
-      </w:r>
-    </w:p>
-    <w:p>
-      <w:pPr>
-        <w:spacing w:before="100" w:after="100"/>
-      </w:pPr>
-    </w:p>
-    <w:p>
-      <w:pPr>
         <w:pStyle w:val="Titre2"/>
         <w:pBdr>
           <w:bottom w:val="single" w:sz="4" w:space="0" w:color="2557A7"/>
         </w:pBdr>
       </w:pPr>
-      <w:bookmarkStart w:id="70" w:name="_Toc232147305"/>
-      <w:r>
-        <w:t>E020 – Menu nominateur</w:t>
-      </w:r>
-      <w:bookmarkEnd w:id="70"/>
+    </w:p>
+    <w:p>
+      <w:pPr>
+        <w:rPr>
+          <w:b/>
+          <w:bCs/>
+          <w:color w:val="1A3A6B"/>
+          <w:sz w:val="26"/>
+          <w:szCs w:val="26"/>
+        </w:rPr>
+      </w:pPr>
+      <w:r>
+        <w:br w:type="page"/>
+      </w:r>
+    </w:p>
+    <w:p>
+      <w:pPr>
+        <w:pStyle w:val="Titre2"/>
+        <w:pBdr>
+          <w:bottom w:val="single" w:sz="4" w:space="0" w:color="2557A7"/>
+        </w:pBdr>
+      </w:pPr>
+      <w:bookmarkStart w:id="75" w:name="_Toc232147310"/>
+      <w:r>
+        <w:lastRenderedPageBreak/>
+        <w:t>E021 – Disponibilités JA – Vue nominateur</w:t>
+      </w:r>
+      <w:bookmarkEnd w:id="75"/>
     </w:p>
     <w:p>
       <w:pPr>
@@ -14984,7 +15787,7 @@
                 <w:sz w:val="20"/>
                 <w:szCs w:val="20"/>
               </w:rPr>
-              <w:t>E020</w:t>
+              <w:t>E021</w:t>
             </w:r>
           </w:p>
         </w:tc>
@@ -15042,8 +15845,17 @@
                 <w:sz w:val="20"/>
                 <w:szCs w:val="20"/>
               </w:rPr>
-              <w:t>Nominateur/menu.php</w:t>
-            </w:r>
+              <w:t>Nominateur/</w:t>
+            </w:r>
+            <w:proofErr w:type="spellStart"/>
+            <w:r>
+              <w:rPr>
+                <w:sz w:val="20"/>
+                <w:szCs w:val="20"/>
+              </w:rPr>
+              <w:t>disponibilites.php</w:t>
+            </w:r>
+            <w:proofErr w:type="spellEnd"/>
           </w:p>
         </w:tc>
       </w:tr>
@@ -15115,29 +15927,29 @@
       <w:pPr>
         <w:pStyle w:val="Titre3"/>
       </w:pPr>
-      <w:bookmarkStart w:id="71" w:name="_Toc232147306"/>
+      <w:bookmarkStart w:id="76" w:name="_Toc232147311"/>
       <w:r>
         <w:t>Description</w:t>
       </w:r>
-      <w:bookmarkEnd w:id="71"/>
+      <w:bookmarkEnd w:id="76"/>
     </w:p>
     <w:p>
       <w:pPr>
         <w:spacing w:before="60" w:after="60"/>
       </w:pPr>
       <w:r>
-        <w:t>Menu principal de l'interface nominateur. Il donne accès aux fonctions de nomination des Juges-Arbitres. Les utilisateurs ayant le rôle "Administrateur" voient également le bouton "Menu administrateur" pour basculer vers l'interface de paramétrage.</w:t>
+        <w:t>Interface nominateur pour consulter et accéder aux disponibilités des JA par département. Permet au nominateur de visualiser rapidement l'état des déclarations de disponibilité et d'ouvrir la fiche de saisie d'un JA spécifique.</w:t>
       </w:r>
     </w:p>
     <w:p>
       <w:pPr>
         <w:pStyle w:val="Titre3"/>
       </w:pPr>
-      <w:bookmarkStart w:id="72" w:name="_Toc232147307"/>
+      <w:bookmarkStart w:id="77" w:name="_Toc232147312"/>
       <w:r>
         <w:t>Champs et fonctionnalités</w:t>
       </w:r>
-      <w:bookmarkEnd w:id="72"/>
+      <w:bookmarkEnd w:id="77"/>
     </w:p>
     <w:p>
       <w:pPr>
@@ -15149,7 +15961,7 @@
         <w:spacing w:before="40" w:after="40"/>
       </w:pPr>
       <w:r>
-        <w:t>Bouton Juge-Arbitre : accès à la gestion des fiches JA (E007)</w:t>
+        <w:t>Sélecteur de département : liste des départements Normandie (14, 27, 50, 61, 76)</w:t>
       </w:r>
     </w:p>
     <w:p>
@@ -15162,7 +15974,7 @@
         <w:spacing w:before="40" w:after="40"/>
       </w:pPr>
       <w:r>
-        <w:t>Bouton Disponibilités JA : saisie/consultation des disponibilités par département (E021)</w:t>
+        <w:t>Inclusion automatique de l'Eure (27) lors de la sélection de la Seine-Maritime (76)</w:t>
       </w:r>
     </w:p>
     <w:p>
@@ -15175,7 +15987,7 @@
         <w:spacing w:before="40" w:after="40"/>
       </w:pPr>
       <w:r>
-        <w:t>Bouton Nomination JA : interface de nomination automatique et manuelle (E022)</w:t>
+        <w:t>Grille de cartes JA : une carte par JA actif du département sélectionné</w:t>
       </w:r>
     </w:p>
     <w:p>
@@ -15188,30 +16000,129 @@
         <w:spacing w:before="40" w:after="40"/>
       </w:pPr>
       <w:r>
-        <w:t>Bouton Menu administrateur (visible admins seulement) : bascule vers E002</w:t>
+        <w:t>Carte JA : avatar (initiales), grade, nom/prénom, club, code postal/ville</w:t>
+      </w:r>
+    </w:p>
+    <w:p>
+      <w:pPr>
+        <w:pStyle w:val="Paragraphedeliste"/>
+        <w:numPr>
+          <w:ilvl w:val="0"/>
+          <w:numId w:val="2"/>
+        </w:numPr>
+        <w:spacing w:before="40" w:after="40"/>
+      </w:pPr>
+      <w:r>
+        <w:t>Couleur de l'avatar selon le grade : bleu (JA1), vert (JA2), orange (JA3)</w:t>
+      </w:r>
+    </w:p>
+    <w:p>
+      <w:pPr>
+        <w:pStyle w:val="Paragraphedeliste"/>
+        <w:numPr>
+          <w:ilvl w:val="0"/>
+          <w:numId w:val="2"/>
+        </w:numPr>
+        <w:spacing w:before="40" w:after="40"/>
+      </w:pPr>
+      <w:r>
+        <w:t>Avatar rouge : JA n'ayant déclaré aucune disponibilité</w:t>
+      </w:r>
+    </w:p>
+    <w:p>
+      <w:pPr>
+        <w:pStyle w:val="Paragraphedeliste"/>
+        <w:numPr>
+          <w:ilvl w:val="0"/>
+          <w:numId w:val="2"/>
+        </w:numPr>
+        <w:spacing w:before="40" w:after="40"/>
+      </w:pPr>
+      <w:r>
+        <w:t xml:space="preserve">Clic sur une carte : ouvre </w:t>
+      </w:r>
+      <w:proofErr w:type="spellStart"/>
+      <w:r>
+        <w:t>disponibilite_ja.php</w:t>
+      </w:r>
+      <w:proofErr w:type="spellEnd"/>
+      <w:r>
+        <w:t xml:space="preserve"> (E012) dans une nouvelle fenêtre</w:t>
       </w:r>
     </w:p>
     <w:p>
       <w:pPr>
         <w:pStyle w:val="Titre3"/>
       </w:pPr>
-      <w:bookmarkStart w:id="73" w:name="_Toc232147308"/>
+      <w:bookmarkStart w:id="78" w:name="_Toc232147313"/>
       <w:r>
         <w:t>Remarques</w:t>
       </w:r>
-      <w:bookmarkEnd w:id="73"/>
+      <w:bookmarkEnd w:id="78"/>
+    </w:p>
+    <w:p>
+      <w:pPr>
+        <w:rPr>
+          <w:i/>
+          <w:iCs/>
+        </w:rPr>
+      </w:pPr>
+      <w:r>
+        <w:rPr>
+          <w:i/>
+          <w:iCs/>
+        </w:rPr>
+        <w:t>Seul les JA Actif sont affiché</w:t>
+      </w:r>
+      <w:r>
+        <w:rPr>
+          <w:i/>
+          <w:iCs/>
+        </w:rPr>
+        <w:t>s</w:t>
+      </w:r>
     </w:p>
     <w:p>
       <w:pPr>
         <w:spacing w:before="60" w:after="60"/>
-      </w:pPr>
-      <w:r>
         <w:rPr>
           <w:i/>
           <w:iCs/>
           <w:color w:val="555555"/>
         </w:rPr>
-        <w:t>Le fond vert du menu nominateur le distingue visuellement du menu administrateur (fond bleu marine).</w:t>
+      </w:pPr>
+      <w:r>
+        <w:rPr>
+          <w:i/>
+          <w:iCs/>
+          <w:color w:val="555555"/>
+        </w:rPr>
+        <w:t xml:space="preserve">Les JA avec avatar rouge doivent être relancés pour qu'ils saisissent leurs disponibilités avant la nomination. L'absence de disponibilités peut bloquer le processus de nomination </w:t>
+      </w:r>
+      <w:r>
+        <w:rPr>
+          <w:i/>
+          <w:iCs/>
+          <w:color w:val="555555"/>
+        </w:rPr>
+        <w:t>automatique.</w:t>
+      </w:r>
+    </w:p>
+    <w:p>
+      <w:pPr>
+        <w:spacing w:before="60" w:after="60"/>
+        <w:rPr>
+          <w:i/>
+          <w:iCs/>
+        </w:rPr>
+      </w:pPr>
+      <w:r>
+        <w:rPr>
+          <w:i/>
+          <w:iCs/>
+          <w:color w:val="555555"/>
+        </w:rPr>
+        <w:t>Permet de saisie les choix d’un JA qui aurais oublié.</w:t>
       </w:r>
     </w:p>
     <w:p>
@@ -15230,12 +16141,12 @@
       <w:pPr>
         <w:pStyle w:val="Titre3"/>
       </w:pPr>
-      <w:bookmarkStart w:id="74" w:name="_Toc232147309"/>
+      <w:bookmarkStart w:id="79" w:name="_Toc232147314"/>
       <w:r>
         <w:lastRenderedPageBreak/>
         <w:t>Copie d'écran</w:t>
       </w:r>
-      <w:bookmarkEnd w:id="74"/>
+      <w:bookmarkEnd w:id="79"/>
     </w:p>
     <w:p>
       <w:pPr>
@@ -15291,10 +16202,10 @@
                 <w:noProof/>
               </w:rPr>
               <w:drawing>
-                <wp:inline distT="0" distB="0" distL="0" distR="0" wp14:anchorId="6A1F3759" wp14:editId="4A9B3A28">
-                  <wp:extent cx="5731510" cy="4950460"/>
-                  <wp:effectExtent l="0" t="0" r="2540" b="2540"/>
-                  <wp:docPr id="22" name="Image 22"/>
+                <wp:inline distT="0" distB="0" distL="0" distR="0" wp14:anchorId="3E14C62B" wp14:editId="3E0332DE">
+                  <wp:extent cx="5731510" cy="3647440"/>
+                  <wp:effectExtent l="0" t="0" r="2540" b="0"/>
+                  <wp:docPr id="23" name="Image 23"/>
                   <wp:cNvGraphicFramePr>
                     <a:graphicFrameLocks xmlns:a="http://schemas.openxmlformats.org/drawingml/2006/main" noChangeAspect="1"/>
                   </wp:cNvGraphicFramePr>
@@ -15306,7 +16217,7 @@
                           <pic:cNvPicPr/>
                         </pic:nvPicPr>
                         <pic:blipFill>
-                          <a:blip r:embed="rId31"/>
+                          <a:blip r:embed="rId34"/>
                           <a:stretch>
                             <a:fillRect/>
                           </a:stretch>
@@ -15314,7 +16225,7 @@
                         <pic:spPr>
                           <a:xfrm>
                             <a:off x="0" y="0"/>
-                            <a:ext cx="5731510" cy="4950460"/>
+                            <a:ext cx="5731510" cy="3647440"/>
                           </a:xfrm>
                           <a:prstGeom prst="rect">
                             <a:avLst/>
@@ -15337,6 +16248,101 @@
           <w:bottom w:val="single" w:sz="4" w:space="0" w:color="2557A7"/>
         </w:pBdr>
       </w:pPr>
+      <w:r>
+        <w:rPr>
+          <w:noProof/>
+        </w:rPr>
+        <w:drawing>
+          <wp:inline distT="0" distB="0" distL="0" distR="0" wp14:anchorId="02C07E4D" wp14:editId="1F77418F">
+            <wp:extent cx="6019800" cy="3264535"/>
+            <wp:effectExtent l="0" t="0" r="0" b="0"/>
+            <wp:docPr id="26" name="Image 26"/>
+            <wp:cNvGraphicFramePr>
+              <a:graphicFrameLocks xmlns:a="http://schemas.openxmlformats.org/drawingml/2006/main" noChangeAspect="1"/>
+            </wp:cNvGraphicFramePr>
+            <a:graphic xmlns:a="http://schemas.openxmlformats.org/drawingml/2006/main">
+              <a:graphicData uri="http://schemas.openxmlformats.org/drawingml/2006/picture">
+                <pic:pic xmlns:pic="http://schemas.openxmlformats.org/drawingml/2006/picture">
+                  <pic:nvPicPr>
+                    <pic:cNvPr id="1" name=""/>
+                    <pic:cNvPicPr/>
+                  </pic:nvPicPr>
+                  <pic:blipFill>
+                    <a:blip r:embed="rId35"/>
+                    <a:stretch>
+                      <a:fillRect/>
+                    </a:stretch>
+                  </pic:blipFill>
+                  <pic:spPr>
+                    <a:xfrm>
+                      <a:off x="0" y="0"/>
+                      <a:ext cx="6019800" cy="3264535"/>
+                    </a:xfrm>
+                    <a:prstGeom prst="rect">
+                      <a:avLst/>
+                    </a:prstGeom>
+                  </pic:spPr>
+                </pic:pic>
+              </a:graphicData>
+            </a:graphic>
+          </wp:inline>
+        </w:drawing>
+      </w:r>
+    </w:p>
+    <w:p/>
+    <w:p>
+      <w:r>
+        <w:t>L’appuyé sur le bouton Note pour afficher cet écran de saisie</w:t>
+      </w:r>
+    </w:p>
+    <w:p>
+      <w:pPr>
+        <w:pStyle w:val="Titre2"/>
+        <w:pBdr>
+          <w:bottom w:val="single" w:sz="4" w:space="0" w:color="2557A7"/>
+        </w:pBdr>
+      </w:pPr>
+      <w:r>
+        <w:rPr>
+          <w:noProof/>
+        </w:rPr>
+        <w:lastRenderedPageBreak/>
+        <w:drawing>
+          <wp:inline distT="0" distB="0" distL="0" distR="0" wp14:anchorId="1014862E" wp14:editId="7E6C407E">
+            <wp:extent cx="4829849" cy="3648584"/>
+            <wp:effectExtent l="0" t="0" r="8890" b="9525"/>
+            <wp:docPr id="27" name="Image 27"/>
+            <wp:cNvGraphicFramePr>
+              <a:graphicFrameLocks xmlns:a="http://schemas.openxmlformats.org/drawingml/2006/main" noChangeAspect="1"/>
+            </wp:cNvGraphicFramePr>
+            <a:graphic xmlns:a="http://schemas.openxmlformats.org/drawingml/2006/main">
+              <a:graphicData uri="http://schemas.openxmlformats.org/drawingml/2006/picture">
+                <pic:pic xmlns:pic="http://schemas.openxmlformats.org/drawingml/2006/picture">
+                  <pic:nvPicPr>
+                    <pic:cNvPr id="1" name=""/>
+                    <pic:cNvPicPr/>
+                  </pic:nvPicPr>
+                  <pic:blipFill>
+                    <a:blip r:embed="rId36"/>
+                    <a:stretch>
+                      <a:fillRect/>
+                    </a:stretch>
+                  </pic:blipFill>
+                  <pic:spPr>
+                    <a:xfrm>
+                      <a:off x="0" y="0"/>
+                      <a:ext cx="4829849" cy="3648584"/>
+                    </a:xfrm>
+                    <a:prstGeom prst="rect">
+                      <a:avLst/>
+                    </a:prstGeom>
+                  </pic:spPr>
+                </pic:pic>
+              </a:graphicData>
+            </a:graphic>
+          </wp:inline>
+        </w:drawing>
+      </w:r>
     </w:p>
     <w:p>
       <w:pPr>
@@ -15359,12 +16365,12 @@
           <w:bottom w:val="single" w:sz="4" w:space="0" w:color="2557A7"/>
         </w:pBdr>
       </w:pPr>
-      <w:bookmarkStart w:id="75" w:name="_Toc232147310"/>
+      <w:bookmarkStart w:id="80" w:name="_Toc232147315"/>
       <w:r>
         <w:lastRenderedPageBreak/>
-        <w:t>E021 – Disponibilités JA – Vue nominateur</w:t>
-      </w:r>
-      <w:bookmarkEnd w:id="75"/>
+        <w:t>E022 – Nomination des Juges-Arbitres</w:t>
+      </w:r>
+      <w:bookmarkEnd w:id="80"/>
     </w:p>
     <w:p>
       <w:pPr>
@@ -15445,7 +16451,7 @@
                 <w:sz w:val="20"/>
                 <w:szCs w:val="20"/>
               </w:rPr>
-              <w:t>E021</w:t>
+              <w:t>E022</w:t>
             </w:r>
           </w:p>
         </w:tc>
@@ -15503,8 +16509,17 @@
                 <w:sz w:val="20"/>
                 <w:szCs w:val="20"/>
               </w:rPr>
-              <w:t>Nominateur/disponibilites.php</w:t>
-            </w:r>
+              <w:t>Nominateur/</w:t>
+            </w:r>
+            <w:proofErr w:type="spellStart"/>
+            <w:r>
+              <w:rPr>
+                <w:sz w:val="20"/>
+                <w:szCs w:val="20"/>
+              </w:rPr>
+              <w:t>nomination.php</w:t>
+            </w:r>
+            <w:proofErr w:type="spellEnd"/>
           </w:p>
         </w:tc>
       </w:tr>
@@ -15576,29 +16591,29 @@
       <w:pPr>
         <w:pStyle w:val="Titre3"/>
       </w:pPr>
-      <w:bookmarkStart w:id="76" w:name="_Toc232147311"/>
+      <w:bookmarkStart w:id="81" w:name="_Toc232147316"/>
       <w:r>
         <w:t>Description</w:t>
       </w:r>
-      <w:bookmarkEnd w:id="76"/>
+      <w:bookmarkEnd w:id="81"/>
     </w:p>
     <w:p>
       <w:pPr>
         <w:spacing w:before="60" w:after="60"/>
       </w:pPr>
       <w:r>
-        <w:t>Interface nominateur pour consulter et accéder aux disponibilités des JA par département. Permet au nominateur de visualiser rapidement l'état des déclarations de disponibilité et d'ouvrir la fiche de saisie d'un JA spécifique.</w:t>
+        <w:t>Interface principale de nomination des JA aux rencontres de la saison. Applique les règles métier définies dans le cahier des charges (NOMINATION.md) pour proposer ou affecter automatiquement les JA disponibles aux rencontres.</w:t>
       </w:r>
     </w:p>
     <w:p>
       <w:pPr>
         <w:pStyle w:val="Titre3"/>
       </w:pPr>
-      <w:bookmarkStart w:id="77" w:name="_Toc232147312"/>
+      <w:bookmarkStart w:id="82" w:name="_Toc232147317"/>
       <w:r>
         <w:t>Champs et fonctionnalités</w:t>
       </w:r>
-      <w:bookmarkEnd w:id="77"/>
+      <w:bookmarkEnd w:id="82"/>
     </w:p>
     <w:p>
       <w:pPr>
@@ -15610,7 +16625,7 @@
         <w:spacing w:before="40" w:after="40"/>
       </w:pPr>
       <w:r>
-        <w:t>Sélecteur de département : liste des départements Normandie (14, 27, 50, 61, 76)</w:t>
+        <w:t>Sélecteur de saison : choix de la saison sportive</w:t>
       </w:r>
     </w:p>
     <w:p>
@@ -15623,7 +16638,7 @@
         <w:spacing w:before="40" w:after="40"/>
       </w:pPr>
       <w:r>
-        <w:t>Inclusion automatique de l'Eure (27) lors de la sélection de la Seine-Maritime (76)</w:t>
+        <w:t>Sélecteur de journée : choix de la journée à traiter</w:t>
       </w:r>
     </w:p>
     <w:p>
@@ -15636,7 +16651,7 @@
         <w:spacing w:before="40" w:after="40"/>
       </w:pPr>
       <w:r>
-        <w:t>Grille de cartes JA : une carte par JA actif du département sélectionné</w:t>
+        <w:t>Tableau des rencontres : liste des matchs de la journée avec leur statut de nomination</w:t>
       </w:r>
     </w:p>
     <w:p>
@@ -15648,8 +16663,13 @@
         </w:numPr>
         <w:spacing w:before="40" w:after="40"/>
       </w:pPr>
-      <w:r>
-        <w:t>Carte JA : avatar (initiales), grade, nom/prénom, club, code postal/ville</w:t>
+      <w:proofErr w:type="gramStart"/>
+      <w:r>
+        <w:t>Colonne JA nommé</w:t>
+      </w:r>
+      <w:proofErr w:type="gramEnd"/>
+      <w:r>
+        <w:t xml:space="preserve"> : JA actuellement affecté (ou "À nommer")</w:t>
       </w:r>
     </w:p>
     <w:p>
@@ -15662,7 +16682,7 @@
         <w:spacing w:before="40" w:after="40"/>
       </w:pPr>
       <w:r>
-        <w:t>Couleur de l'avatar selon le grade : bleu (JA1), vert (JA2), orange (JA3)</w:t>
+        <w:t>Bouton Nomination automatique : lance l'algorithme de nomination</w:t>
       </w:r>
     </w:p>
     <w:p>
@@ -15675,7 +16695,7 @@
         <w:spacing w:before="40" w:after="40"/>
       </w:pPr>
       <w:r>
-        <w:t>Avatar rouge : JA n'ayant déclaré aucune disponibilité</w:t>
+        <w:t>Modification manuelle : clic sur une rencontre pour affecter manuellement un JA</w:t>
       </w:r>
     </w:p>
     <w:p>
@@ -15688,82 +16708,120 @@
         <w:spacing w:before="40" w:after="40"/>
       </w:pPr>
       <w:r>
-        <w:t>Clic sur une carte : ouvre disponibilite_ja.php (E012) dans une nouvelle fenêtre</w:t>
+        <w:t>Liste des JA disponibles : filtrée selon les règles métier</w:t>
+      </w:r>
+    </w:p>
+    <w:p>
+      <w:pPr>
+        <w:pStyle w:val="Paragraphedeliste"/>
+        <w:numPr>
+          <w:ilvl w:val="0"/>
+          <w:numId w:val="2"/>
+        </w:numPr>
+        <w:spacing w:before="40" w:after="40"/>
+      </w:pPr>
+      <w:r>
+        <w:t>Bouton Envoyer les convocations : génère et envoie les convocations par email</w:t>
       </w:r>
     </w:p>
     <w:p>
       <w:pPr>
         <w:pStyle w:val="Titre3"/>
       </w:pPr>
-      <w:bookmarkStart w:id="78" w:name="_Toc232147313"/>
+      <w:bookmarkStart w:id="83" w:name="_Toc232147318"/>
       <w:r>
         <w:t>Remarques</w:t>
       </w:r>
-      <w:bookmarkEnd w:id="78"/>
-    </w:p>
-    <w:p>
-      <w:pPr>
+      <w:bookmarkEnd w:id="83"/>
+    </w:p>
+    <w:p>
+      <w:pPr>
+        <w:spacing w:before="60" w:after="60"/>
+      </w:pPr>
+      <w:r>
         <w:rPr>
-          <w:i/>
-          <w:iCs/>
+          <w:b/>
+          <w:bCs/>
         </w:rPr>
-      </w:pPr>
-      <w:r>
-        <w:rPr>
-          <w:i/>
-          <w:iCs/>
-        </w:rPr>
-        <w:t>Seul les JA Actif sont affiché</w:t>
-      </w:r>
-      <w:r>
-        <w:rPr>
-          <w:i/>
-          <w:iCs/>
-        </w:rPr>
-        <w:t>s</w:t>
-      </w:r>
-    </w:p>
-    <w:p>
-      <w:pPr>
-        <w:spacing w:before="60" w:after="60"/>
-        <w:rPr>
-          <w:i/>
-          <w:iCs/>
-          <w:color w:val="555555"/>
-        </w:rPr>
-      </w:pPr>
-      <w:r>
-        <w:rPr>
-          <w:i/>
-          <w:iCs/>
-          <w:color w:val="555555"/>
-        </w:rPr>
-        <w:t xml:space="preserve">Les JA avec avatar rouge doivent être relancés pour qu'ils saisissent leurs disponibilités avant la nomination. L'absence de disponibilités peut bloquer le processus de nomination </w:t>
-      </w:r>
-      <w:r>
-        <w:rPr>
-          <w:i/>
-          <w:iCs/>
-          <w:color w:val="555555"/>
-        </w:rPr>
-        <w:t>automatique.</w:t>
-      </w:r>
-    </w:p>
-    <w:p>
-      <w:pPr>
-        <w:spacing w:before="60" w:after="60"/>
-        <w:rPr>
-          <w:i/>
-          <w:iCs/>
-        </w:rPr>
-      </w:pPr>
-      <w:r>
-        <w:rPr>
-          <w:i/>
-          <w:iCs/>
-          <w:color w:val="555555"/>
-        </w:rPr>
-        <w:t>Permet de saisie les choix d’un JA qui aurais oublié.</w:t>
+        <w:t>Règles de nomination appliquées :</w:t>
+      </w:r>
+    </w:p>
+    <w:p>
+      <w:pPr>
+        <w:pStyle w:val="Paragraphedeliste"/>
+        <w:numPr>
+          <w:ilvl w:val="0"/>
+          <w:numId w:val="2"/>
+        </w:numPr>
+        <w:spacing w:before="40" w:after="40"/>
+      </w:pPr>
+      <w:r>
+        <w:t>Un JA ne peut pas arbitrer si son club est impliqué dans la rencontre</w:t>
+      </w:r>
+    </w:p>
+    <w:p>
+      <w:pPr>
+        <w:pStyle w:val="Paragraphedeliste"/>
+        <w:numPr>
+          <w:ilvl w:val="0"/>
+          <w:numId w:val="2"/>
+        </w:numPr>
+        <w:spacing w:before="40" w:after="40"/>
+      </w:pPr>
+      <w:r>
+        <w:t>Maximum 2 rencontres du même club par phase pour un même JA</w:t>
+      </w:r>
+    </w:p>
+    <w:p>
+      <w:pPr>
+        <w:pStyle w:val="Paragraphedeliste"/>
+        <w:numPr>
+          <w:ilvl w:val="0"/>
+          <w:numId w:val="2"/>
+        </w:numPr>
+        <w:spacing w:before="40" w:after="40"/>
+      </w:pPr>
+      <w:r>
+        <w:t>Un JA ne peut arbitrer qu'une seule fois par date</w:t>
+      </w:r>
+    </w:p>
+    <w:p>
+      <w:pPr>
+        <w:pStyle w:val="Paragraphedeliste"/>
+        <w:numPr>
+          <w:ilvl w:val="0"/>
+          <w:numId w:val="2"/>
+        </w:numPr>
+        <w:spacing w:before="40" w:after="40"/>
+      </w:pPr>
+      <w:r>
+        <w:t>Priorité aux rencontres choisies par le JA dans ses disponibilités</w:t>
+      </w:r>
+    </w:p>
+    <w:p>
+      <w:pPr>
+        <w:pStyle w:val="Paragraphedeliste"/>
+        <w:numPr>
+          <w:ilvl w:val="0"/>
+          <w:numId w:val="2"/>
+        </w:numPr>
+        <w:spacing w:before="40" w:after="40"/>
+      </w:pPr>
+      <w:r>
+        <w:t>Priorité à la rencontre la plus proche du domicile du JA</w:t>
+      </w:r>
+    </w:p>
+    <w:p>
+      <w:pPr>
+        <w:pStyle w:val="Paragraphedeliste"/>
+        <w:numPr>
+          <w:ilvl w:val="0"/>
+          <w:numId w:val="2"/>
+        </w:numPr>
+        <w:spacing w:before="40" w:after="40"/>
+      </w:pPr>
+      <w:r>
+        <w:t>Priorité au JA ayant le moins d'arbitrages sur la phase en cours</w:t>
       </w:r>
     </w:p>
     <w:p>
@@ -15782,12 +16840,12 @@
       <w:pPr>
         <w:pStyle w:val="Titre3"/>
       </w:pPr>
-      <w:bookmarkStart w:id="79" w:name="_Toc232147314"/>
+      <w:bookmarkStart w:id="84" w:name="_Toc232147319"/>
       <w:r>
         <w:lastRenderedPageBreak/>
         <w:t>Copie d'écran</w:t>
       </w:r>
-      <w:bookmarkEnd w:id="79"/>
+      <w:bookmarkEnd w:id="84"/>
     </w:p>
     <w:p>
       <w:pPr>
@@ -15843,10 +16901,10 @@
                 <w:noProof/>
               </w:rPr>
               <w:drawing>
-                <wp:inline distT="0" distB="0" distL="0" distR="0" wp14:anchorId="3E14C62B" wp14:editId="3E0332DE">
-                  <wp:extent cx="5731510" cy="3647440"/>
+                <wp:inline distT="0" distB="0" distL="0" distR="0" wp14:anchorId="35AF5CA0" wp14:editId="238130D5">
+                  <wp:extent cx="5731510" cy="3640455"/>
                   <wp:effectExtent l="0" t="0" r="2540" b="0"/>
-                  <wp:docPr id="23" name="Image 23"/>
+                  <wp:docPr id="24" name="Image 24"/>
                   <wp:cNvGraphicFramePr>
                     <a:graphicFrameLocks xmlns:a="http://schemas.openxmlformats.org/drawingml/2006/main" noChangeAspect="1"/>
                   </wp:cNvGraphicFramePr>
@@ -15858,7 +16916,7 @@
                           <pic:cNvPicPr/>
                         </pic:nvPicPr>
                         <pic:blipFill>
-                          <a:blip r:embed="rId32"/>
+                          <a:blip r:embed="rId37"/>
                           <a:stretch>
                             <a:fillRect/>
                           </a:stretch>
@@ -15866,7 +16924,7 @@
                         <pic:spPr>
                           <a:xfrm>
                             <a:off x="0" y="0"/>
-                            <a:ext cx="5731510" cy="3647440"/>
+                            <a:ext cx="5731510" cy="3640455"/>
                           </a:xfrm>
                           <a:prstGeom prst="rect">
                             <a:avLst/>
@@ -15884,17 +16942,82 @@
     </w:tbl>
     <w:p>
       <w:pPr>
-        <w:pStyle w:val="Titre2"/>
-        <w:pBdr>
-          <w:bottom w:val="single" w:sz="4" w:space="0" w:color="2557A7"/>
-        </w:pBdr>
-      </w:pPr>
-      <w:r>
+        <w:rPr>
+          <w:i/>
+          <w:iCs/>
+        </w:rPr>
+      </w:pPr>
+    </w:p>
+    <w:p>
+      <w:pPr>
+        <w:rPr>
+          <w:i/>
+          <w:iCs/>
+        </w:rPr>
+      </w:pPr>
+    </w:p>
+    <w:p>
+      <w:pPr>
+        <w:rPr>
+          <w:i/>
+          <w:iCs/>
+        </w:rPr>
+      </w:pPr>
+      <w:r>
+        <w:rPr>
+          <w:i/>
+          <w:iCs/>
+        </w:rPr>
+        <w:t>S</w:t>
+      </w:r>
+      <w:r>
+        <w:rPr>
+          <w:i/>
+          <w:iCs/>
+        </w:rPr>
+        <w:t xml:space="preserve">eul les </w:t>
+      </w:r>
+      <w:r>
+        <w:rPr>
+          <w:i/>
+          <w:iCs/>
+        </w:rPr>
+        <w:t>cinq</w:t>
+      </w:r>
+      <w:r>
+        <w:rPr>
+          <w:i/>
+          <w:iCs/>
+        </w:rPr>
+        <w:t xml:space="preserve"> premiers JA nominable sont affiché.</w:t>
+      </w:r>
+    </w:p>
+    <w:p>
+      <w:pPr>
+        <w:rPr>
+          <w:i/>
+          <w:iCs/>
+        </w:rPr>
+      </w:pPr>
+    </w:p>
+    <w:p>
+      <w:pPr>
+        <w:rPr>
+          <w:i/>
+          <w:iCs/>
+        </w:rPr>
+      </w:pPr>
+      <w:r>
+        <w:rPr>
+          <w:i/>
+          <w:iCs/>
+          <w:noProof/>
+        </w:rPr>
         <w:drawing>
-          <wp:inline distT="0" distB="0" distL="0" distR="0" wp14:anchorId="02C07E4D" wp14:editId="1F77418F">
-            <wp:extent cx="6019800" cy="3264535"/>
-            <wp:effectExtent l="0" t="0" r="0" b="0"/>
-            <wp:docPr id="26" name="Image 26"/>
+          <wp:inline distT="0" distB="0" distL="0" distR="0" wp14:anchorId="407ABCB8" wp14:editId="32AE1721">
+            <wp:extent cx="5731510" cy="704215"/>
+            <wp:effectExtent l="0" t="0" r="2540" b="635"/>
+            <wp:docPr id="28" name="Image 28"/>
             <wp:cNvGraphicFramePr>
               <a:graphicFrameLocks xmlns:a="http://schemas.openxmlformats.org/drawingml/2006/main" noChangeAspect="1"/>
             </wp:cNvGraphicFramePr>
@@ -15906,7 +17029,7 @@
                     <pic:cNvPicPr/>
                   </pic:nvPicPr>
                   <pic:blipFill>
-                    <a:blip r:embed="rId33"/>
+                    <a:blip r:embed="rId38"/>
                     <a:stretch>
                       <a:fillRect/>
                     </a:stretch>
@@ -15914,7 +17037,7 @@
                   <pic:spPr>
                     <a:xfrm>
                       <a:off x="0" y="0"/>
-                      <a:ext cx="6019800" cy="3264535"/>
+                      <a:ext cx="5731510" cy="704215"/>
                     </a:xfrm>
                     <a:prstGeom prst="rect">
                       <a:avLst/>
@@ -15927,26 +17050,32 @@
         </w:drawing>
       </w:r>
     </w:p>
-    <w:p/>
-    <w:p>
-      <w:r>
-        <w:t>L’appuyé sur le bouton Note pour afficher cet écran de saisie</w:t>
-      </w:r>
-    </w:p>
-    <w:p>
-      <w:pPr>
-        <w:pStyle w:val="Titre2"/>
-        <w:pBdr>
-          <w:bottom w:val="single" w:sz="4" w:space="0" w:color="2557A7"/>
-        </w:pBdr>
-      </w:pPr>
-      <w:r>
-        <w:lastRenderedPageBreak/>
+    <w:p>
+      <w:pPr>
+        <w:rPr>
+          <w:i/>
+          <w:iCs/>
+        </w:rPr>
+      </w:pPr>
+    </w:p>
+    <w:p>
+      <w:pPr>
+        <w:rPr>
+          <w:i/>
+          <w:iCs/>
+        </w:rPr>
+      </w:pPr>
+      <w:r>
+        <w:rPr>
+          <w:i/>
+          <w:iCs/>
+          <w:noProof/>
+        </w:rPr>
         <w:drawing>
-          <wp:inline distT="0" distB="0" distL="0" distR="0" wp14:anchorId="1014862E" wp14:editId="7E6C407E">
-            <wp:extent cx="4829849" cy="3648584"/>
-            <wp:effectExtent l="0" t="0" r="8890" b="9525"/>
-            <wp:docPr id="27" name="Image 27"/>
+          <wp:inline distT="0" distB="0" distL="0" distR="0" wp14:anchorId="1E053139" wp14:editId="10A0E8B6">
+            <wp:extent cx="2717515" cy="1214323"/>
+            <wp:effectExtent l="0" t="0" r="6985" b="5080"/>
+            <wp:docPr id="29" name="Image 29"/>
             <wp:cNvGraphicFramePr>
               <a:graphicFrameLocks xmlns:a="http://schemas.openxmlformats.org/drawingml/2006/main" noChangeAspect="1"/>
             </wp:cNvGraphicFramePr>
@@ -15958,7 +17087,7 @@
                     <pic:cNvPicPr/>
                   </pic:nvPicPr>
                   <pic:blipFill>
-                    <a:blip r:embed="rId34"/>
+                    <a:blip r:embed="rId39"/>
                     <a:stretch>
                       <a:fillRect/>
                     </a:stretch>
@@ -15966,7 +17095,7 @@
                   <pic:spPr>
                     <a:xfrm>
                       <a:off x="0" y="0"/>
-                      <a:ext cx="4829849" cy="3648584"/>
+                      <a:ext cx="2744743" cy="1226490"/>
                     </a:xfrm>
                     <a:prstGeom prst="rect">
                       <a:avLst/>
@@ -15982,6 +17111,22 @@
     <w:p>
       <w:pPr>
         <w:rPr>
+          <w:i/>
+          <w:iCs/>
+        </w:rPr>
+      </w:pPr>
+    </w:p>
+    <w:p>
+      <w:pPr>
+        <w:pStyle w:val="Titre2"/>
+        <w:pBdr>
+          <w:bottom w:val="single" w:sz="4" w:space="0" w:color="2557A7"/>
+        </w:pBdr>
+      </w:pPr>
+    </w:p>
+    <w:p>
+      <w:pPr>
+        <w:rPr>
           <w:b/>
           <w:bCs/>
           <w:color w:val="1A3A6B"/>
@@ -16000,12 +17145,12 @@
           <w:bottom w:val="single" w:sz="4" w:space="0" w:color="2557A7"/>
         </w:pBdr>
       </w:pPr>
-      <w:bookmarkStart w:id="80" w:name="_Toc232147315"/>
+      <w:bookmarkStart w:id="85" w:name="_Toc232147320"/>
       <w:r>
         <w:lastRenderedPageBreak/>
-        <w:t>E022 – Nomination des Juges-Arbitres</w:t>
-      </w:r>
-      <w:bookmarkEnd w:id="80"/>
+        <w:t>E023 – Convocation et frais JA</w:t>
+      </w:r>
+      <w:bookmarkEnd w:id="85"/>
     </w:p>
     <w:p>
       <w:pPr>
@@ -16086,7 +17231,7 @@
                 <w:sz w:val="20"/>
                 <w:szCs w:val="20"/>
               </w:rPr>
-              <w:t>E022</w:t>
+              <w:t>E023</w:t>
             </w:r>
           </w:p>
         </w:tc>
@@ -16144,8 +17289,17 @@
                 <w:sz w:val="20"/>
                 <w:szCs w:val="20"/>
               </w:rPr>
-              <w:t>Nominateur/nomination.php</w:t>
-            </w:r>
+              <w:t>Nominateur/</w:t>
+            </w:r>
+            <w:proofErr w:type="spellStart"/>
+            <w:r>
+              <w:rPr>
+                <w:sz w:val="20"/>
+                <w:szCs w:val="20"/>
+              </w:rPr>
+              <w:t>convocation_ja.php</w:t>
+            </w:r>
+            <w:proofErr w:type="spellEnd"/>
           </w:p>
         </w:tc>
       </w:tr>
@@ -16202,7 +17356,23 @@
                 <w:sz w:val="20"/>
                 <w:szCs w:val="20"/>
               </w:rPr>
-              <w:t>Utilisateur connecté (Nominateur ou Administrateur)</w:t>
+              <w:t xml:space="preserve">Public – accessible via lien </w:t>
+            </w:r>
+            <w:proofErr w:type="spellStart"/>
+            <w:r>
+              <w:rPr>
+                <w:sz w:val="20"/>
+                <w:szCs w:val="20"/>
+              </w:rPr>
+              <w:t>tokenisé</w:t>
+            </w:r>
+            <w:proofErr w:type="spellEnd"/>
+            <w:r>
+              <w:rPr>
+                <w:sz w:val="20"/>
+                <w:szCs w:val="20"/>
+              </w:rPr>
+              <w:t xml:space="preserve"> ou depuis l'interface nominateur</w:t>
             </w:r>
           </w:p>
         </w:tc>
@@ -16217,29 +17387,29 @@
       <w:pPr>
         <w:pStyle w:val="Titre3"/>
       </w:pPr>
-      <w:bookmarkStart w:id="81" w:name="_Toc232147316"/>
+      <w:bookmarkStart w:id="86" w:name="_Toc232147321"/>
       <w:r>
         <w:t>Description</w:t>
       </w:r>
-      <w:bookmarkEnd w:id="81"/>
+      <w:bookmarkEnd w:id="86"/>
     </w:p>
     <w:p>
       <w:pPr>
         <w:spacing w:before="60" w:after="60"/>
       </w:pPr>
       <w:r>
-        <w:t>Interface principale de nomination des JA aux rencontres de la saison. Applique les règles métier définies dans le cahier des charges (NOMINATION.md) pour proposer ou affecter automatiquement les JA disponibles aux rencontres.</w:t>
+        <w:t>Page de convocation officielle d'un Juge-Arbitre pour une rencontre donnée. Affiche les informations complètes de la rencontre et permet au JA de confirmer sa présence et de déclarer ses frais de déplacement après la rencontre.</w:t>
       </w:r>
     </w:p>
     <w:p>
       <w:pPr>
         <w:pStyle w:val="Titre3"/>
       </w:pPr>
-      <w:bookmarkStart w:id="82" w:name="_Toc232147317"/>
+      <w:bookmarkStart w:id="87" w:name="_Toc232147322"/>
       <w:r>
         <w:t>Champs et fonctionnalités</w:t>
       </w:r>
-      <w:bookmarkEnd w:id="82"/>
+      <w:bookmarkEnd w:id="87"/>
     </w:p>
     <w:p>
       <w:pPr>
@@ -16251,7 +17421,7 @@
         <w:spacing w:before="40" w:after="40"/>
       </w:pPr>
       <w:r>
-        <w:t>Sélecteur de saison : choix de la saison sportive</w:t>
+        <w:t>Informations de la rencontre : date, heure, équipes, salle, adresse</w:t>
       </w:r>
     </w:p>
     <w:p>
@@ -16264,7 +17434,7 @@
         <w:spacing w:before="40" w:after="40"/>
       </w:pPr>
       <w:r>
-        <w:t>Sélecteur de journée : choix de la journée à traiter</w:t>
+        <w:t>Informations du JA : nom, prénom, grade</w:t>
       </w:r>
     </w:p>
     <w:p>
@@ -16277,7 +17447,7 @@
         <w:spacing w:before="40" w:after="40"/>
       </w:pPr>
       <w:r>
-        <w:t>Tableau des rencontres : liste des matchs de la journée avec leur statut de nomination</w:t>
+        <w:t>Distance calculée : km entre le domicile du JA et la salle</w:t>
       </w:r>
     </w:p>
     <w:p>
@@ -16290,10 +17460,7 @@
         <w:spacing w:before="40" w:after="40"/>
       </w:pPr>
       <w:r>
-        <w:t>Colonne JA nommé</w:t>
-      </w:r>
-      <w:r>
-        <w:t xml:space="preserve"> : JA actuellement affecté (ou "À nommer")</w:t>
+        <w:t>Frais kilométriques : saisie du nombre de km réels (aller-retour)</w:t>
       </w:r>
     </w:p>
     <w:p>
@@ -16306,7 +17473,7 @@
         <w:spacing w:before="40" w:after="40"/>
       </w:pPr>
       <w:r>
-        <w:t>Bouton Nomination automatique : lance l'algorithme de nomination</w:t>
+        <w:t>Péages : montant des péages (si applicable)</w:t>
       </w:r>
     </w:p>
     <w:p>
@@ -16319,7 +17486,7 @@
         <w:spacing w:before="40" w:after="40"/>
       </w:pPr>
       <w:r>
-        <w:t>Modification manuelle : clic sur une rencontre pour affecter manuellement un JA</w:t>
+        <w:t>Indemnité forfaitaire : calculée automatiquement selon le type de compétition (E003)</w:t>
       </w:r>
     </w:p>
     <w:p>
@@ -16332,7 +17499,7 @@
         <w:spacing w:before="40" w:after="40"/>
       </w:pPr>
       <w:r>
-        <w:t>Liste des JA disponibles : filtrée selon les règles métier</w:t>
+        <w:t>Total des frais : calcul automatique</w:t>
       </w:r>
     </w:p>
     <w:p>
@@ -16345,770 +17512,6 @@
         <w:spacing w:before="40" w:after="40"/>
       </w:pPr>
       <w:r>
-        <w:t>Bouton Envoyer les convocations : génère et envoie les convocations par email</w:t>
-      </w:r>
-    </w:p>
-    <w:p>
-      <w:pPr>
-        <w:pStyle w:val="Titre3"/>
-      </w:pPr>
-      <w:bookmarkStart w:id="83" w:name="_Toc232147318"/>
-      <w:r>
-        <w:t>Remarques</w:t>
-      </w:r>
-      <w:bookmarkEnd w:id="83"/>
-    </w:p>
-    <w:p>
-      <w:pPr>
-        <w:spacing w:before="60" w:after="60"/>
-      </w:pPr>
-      <w:r>
-        <w:rPr>
-          <w:b/>
-          <w:bCs/>
-        </w:rPr>
-        <w:t>Règles de nomination appliquées :</w:t>
-      </w:r>
-    </w:p>
-    <w:p>
-      <w:pPr>
-        <w:pStyle w:val="Paragraphedeliste"/>
-        <w:numPr>
-          <w:ilvl w:val="0"/>
-          <w:numId w:val="2"/>
-        </w:numPr>
-        <w:spacing w:before="40" w:after="40"/>
-      </w:pPr>
-      <w:r>
-        <w:t>Un JA ne peut pas arbitrer si son club est impliqué dans la rencontre</w:t>
-      </w:r>
-    </w:p>
-    <w:p>
-      <w:pPr>
-        <w:pStyle w:val="Paragraphedeliste"/>
-        <w:numPr>
-          <w:ilvl w:val="0"/>
-          <w:numId w:val="2"/>
-        </w:numPr>
-        <w:spacing w:before="40" w:after="40"/>
-      </w:pPr>
-      <w:r>
-        <w:t>Maximum 2 rencontres du même club par phase pour un même JA</w:t>
-      </w:r>
-    </w:p>
-    <w:p>
-      <w:pPr>
-        <w:pStyle w:val="Paragraphedeliste"/>
-        <w:numPr>
-          <w:ilvl w:val="0"/>
-          <w:numId w:val="2"/>
-        </w:numPr>
-        <w:spacing w:before="40" w:after="40"/>
-      </w:pPr>
-      <w:r>
-        <w:t>Un JA ne peut arbitrer qu'une seule fois par date</w:t>
-      </w:r>
-    </w:p>
-    <w:p>
-      <w:pPr>
-        <w:pStyle w:val="Paragraphedeliste"/>
-        <w:numPr>
-          <w:ilvl w:val="0"/>
-          <w:numId w:val="2"/>
-        </w:numPr>
-        <w:spacing w:before="40" w:after="40"/>
-      </w:pPr>
-      <w:r>
-        <w:t>Priorité aux rencontres choisies par le JA dans ses disponibilités</w:t>
-      </w:r>
-    </w:p>
-    <w:p>
-      <w:pPr>
-        <w:pStyle w:val="Paragraphedeliste"/>
-        <w:numPr>
-          <w:ilvl w:val="0"/>
-          <w:numId w:val="2"/>
-        </w:numPr>
-        <w:spacing w:before="40" w:after="40"/>
-      </w:pPr>
-      <w:r>
-        <w:t>Priorité à la rencontre la plus proche du domicile du JA</w:t>
-      </w:r>
-    </w:p>
-    <w:p>
-      <w:pPr>
-        <w:pStyle w:val="Paragraphedeliste"/>
-        <w:numPr>
-          <w:ilvl w:val="0"/>
-          <w:numId w:val="2"/>
-        </w:numPr>
-        <w:spacing w:before="40" w:after="40"/>
-      </w:pPr>
-      <w:r>
-        <w:t>Priorité au JA ayant le moins d'arbitrages sur la phase en cours</w:t>
-      </w:r>
-    </w:p>
-    <w:p>
-      <w:pPr>
-        <w:rPr>
-          <w:b/>
-          <w:bCs/>
-          <w:color w:val="374151"/>
-        </w:rPr>
-      </w:pPr>
-      <w:r>
-        <w:br w:type="page"/>
-      </w:r>
-    </w:p>
-    <w:p>
-      <w:pPr>
-        <w:pStyle w:val="Titre3"/>
-      </w:pPr>
-      <w:bookmarkStart w:id="84" w:name="_Toc232147319"/>
-      <w:r>
-        <w:lastRenderedPageBreak/>
-        <w:t>Copie d'écran</w:t>
-      </w:r>
-      <w:bookmarkEnd w:id="84"/>
-    </w:p>
-    <w:p>
-      <w:pPr>
-        <w:spacing w:before="100" w:after="100"/>
-      </w:pPr>
-    </w:p>
-    <w:tbl>
-      <w:tblPr>
-        <w:tblW w:w="9026" w:type="dxa"/>
-        <w:tblBorders>
-          <w:top w:val="single" w:sz="4" w:space="0" w:color="auto"/>
-          <w:left w:val="single" w:sz="4" w:space="0" w:color="auto"/>
-          <w:bottom w:val="single" w:sz="4" w:space="0" w:color="auto"/>
-          <w:right w:val="single" w:sz="4" w:space="0" w:color="auto"/>
-          <w:insideH w:val="single" w:sz="4" w:space="0" w:color="auto"/>
-          <w:insideV w:val="single" w:sz="4" w:space="0" w:color="auto"/>
-        </w:tblBorders>
-        <w:tblCellMar>
-          <w:left w:w="10" w:type="dxa"/>
-          <w:right w:w="10" w:type="dxa"/>
-        </w:tblCellMar>
-        <w:tblLook w:val="0000" w:firstRow="0" w:lastRow="0" w:firstColumn="0" w:lastColumn="0" w:noHBand="0" w:noVBand="0"/>
-      </w:tblPr>
-      <w:tblGrid>
-        <w:gridCol w:w="9430"/>
-      </w:tblGrid>
-      <w:tr>
-        <w:tc>
-          <w:tcPr>
-            <w:tcW w:w="9026" w:type="dxa"/>
-            <w:tcBorders>
-              <w:top w:val="single" w:sz="4" w:space="0" w:color="AAAACC"/>
-              <w:left w:val="single" w:sz="4" w:space="0" w:color="AAAACC"/>
-              <w:bottom w:val="single" w:sz="4" w:space="0" w:color="AAAACC"/>
-              <w:right w:val="single" w:sz="4" w:space="0" w:color="AAAACC"/>
-            </w:tcBorders>
-            <w:shd w:val="clear" w:color="auto" w:fill="F5F5FF"/>
-            <w:tcMar>
-              <w:top w:w="200" w:type="dxa"/>
-              <w:left w:w="200" w:type="dxa"/>
-              <w:bottom w:w="200" w:type="dxa"/>
-              <w:right w:w="200" w:type="dxa"/>
-            </w:tcMar>
-            <w:vAlign w:val="center"/>
-          </w:tcPr>
-          <w:p>
-            <w:pPr>
-              <w:spacing w:before="400" w:after="400"/>
-              <w:jc w:val="center"/>
-            </w:pPr>
-            <w:r>
-              <w:rPr>
-                <w:noProof/>
-              </w:rPr>
-              <w:drawing>
-                <wp:inline distT="0" distB="0" distL="0" distR="0" wp14:anchorId="35AF5CA0" wp14:editId="238130D5">
-                  <wp:extent cx="5731510" cy="3640455"/>
-                  <wp:effectExtent l="0" t="0" r="2540" b="0"/>
-                  <wp:docPr id="24" name="Image 24"/>
-                  <wp:cNvGraphicFramePr>
-                    <a:graphicFrameLocks xmlns:a="http://schemas.openxmlformats.org/drawingml/2006/main" noChangeAspect="1"/>
-                  </wp:cNvGraphicFramePr>
-                  <a:graphic xmlns:a="http://schemas.openxmlformats.org/drawingml/2006/main">
-                    <a:graphicData uri="http://schemas.openxmlformats.org/drawingml/2006/picture">
-                      <pic:pic xmlns:pic="http://schemas.openxmlformats.org/drawingml/2006/picture">
-                        <pic:nvPicPr>
-                          <pic:cNvPr id="1" name=""/>
-                          <pic:cNvPicPr/>
-                        </pic:nvPicPr>
-                        <pic:blipFill>
-                          <a:blip r:embed="rId35"/>
-                          <a:stretch>
-                            <a:fillRect/>
-                          </a:stretch>
-                        </pic:blipFill>
-                        <pic:spPr>
-                          <a:xfrm>
-                            <a:off x="0" y="0"/>
-                            <a:ext cx="5731510" cy="3640455"/>
-                          </a:xfrm>
-                          <a:prstGeom prst="rect">
-                            <a:avLst/>
-                          </a:prstGeom>
-                        </pic:spPr>
-                      </pic:pic>
-                    </a:graphicData>
-                  </a:graphic>
-                </wp:inline>
-              </w:drawing>
-            </w:r>
-          </w:p>
-        </w:tc>
-      </w:tr>
-    </w:tbl>
-    <w:p>
-      <w:pPr>
-        <w:rPr>
-          <w:i/>
-          <w:iCs/>
-        </w:rPr>
-      </w:pPr>
-    </w:p>
-    <w:p>
-      <w:pPr>
-        <w:rPr>
-          <w:i/>
-          <w:iCs/>
-        </w:rPr>
-      </w:pPr>
-    </w:p>
-    <w:p>
-      <w:pPr>
-        <w:rPr>
-          <w:i/>
-          <w:iCs/>
-        </w:rPr>
-      </w:pPr>
-      <w:r>
-        <w:rPr>
-          <w:i/>
-          <w:iCs/>
-        </w:rPr>
-        <w:t>S</w:t>
-      </w:r>
-      <w:r>
-        <w:rPr>
-          <w:i/>
-          <w:iCs/>
-        </w:rPr>
-        <w:t xml:space="preserve">eul les </w:t>
-      </w:r>
-      <w:r>
-        <w:rPr>
-          <w:i/>
-          <w:iCs/>
-        </w:rPr>
-        <w:t>cinq</w:t>
-      </w:r>
-      <w:r>
-        <w:rPr>
-          <w:i/>
-          <w:iCs/>
-        </w:rPr>
-        <w:t xml:space="preserve"> premiers JA nominable sont affiché.</w:t>
-      </w:r>
-    </w:p>
-    <w:p>
-      <w:pPr>
-        <w:rPr>
-          <w:i/>
-          <w:iCs/>
-        </w:rPr>
-      </w:pPr>
-    </w:p>
-    <w:p>
-      <w:pPr>
-        <w:rPr>
-          <w:i/>
-          <w:iCs/>
-        </w:rPr>
-      </w:pPr>
-      <w:r>
-        <w:rPr>
-          <w:i/>
-          <w:iCs/>
-        </w:rPr>
-        <w:drawing>
-          <wp:inline distT="0" distB="0" distL="0" distR="0" wp14:anchorId="407ABCB8" wp14:editId="32AE1721">
-            <wp:extent cx="5731510" cy="704215"/>
-            <wp:effectExtent l="0" t="0" r="2540" b="635"/>
-            <wp:docPr id="28" name="Image 28"/>
-            <wp:cNvGraphicFramePr>
-              <a:graphicFrameLocks xmlns:a="http://schemas.openxmlformats.org/drawingml/2006/main" noChangeAspect="1"/>
-            </wp:cNvGraphicFramePr>
-            <a:graphic xmlns:a="http://schemas.openxmlformats.org/drawingml/2006/main">
-              <a:graphicData uri="http://schemas.openxmlformats.org/drawingml/2006/picture">
-                <pic:pic xmlns:pic="http://schemas.openxmlformats.org/drawingml/2006/picture">
-                  <pic:nvPicPr>
-                    <pic:cNvPr id="1" name=""/>
-                    <pic:cNvPicPr/>
-                  </pic:nvPicPr>
-                  <pic:blipFill>
-                    <a:blip r:embed="rId36"/>
-                    <a:stretch>
-                      <a:fillRect/>
-                    </a:stretch>
-                  </pic:blipFill>
-                  <pic:spPr>
-                    <a:xfrm>
-                      <a:off x="0" y="0"/>
-                      <a:ext cx="5731510" cy="704215"/>
-                    </a:xfrm>
-                    <a:prstGeom prst="rect">
-                      <a:avLst/>
-                    </a:prstGeom>
-                  </pic:spPr>
-                </pic:pic>
-              </a:graphicData>
-            </a:graphic>
-          </wp:inline>
-        </w:drawing>
-      </w:r>
-    </w:p>
-    <w:p>
-      <w:pPr>
-        <w:rPr>
-          <w:i/>
-          <w:iCs/>
-        </w:rPr>
-      </w:pPr>
-    </w:p>
-    <w:p>
-      <w:pPr>
-        <w:rPr>
-          <w:i/>
-          <w:iCs/>
-        </w:rPr>
-      </w:pPr>
-      <w:r>
-        <w:rPr>
-          <w:i/>
-          <w:iCs/>
-        </w:rPr>
-        <w:drawing>
-          <wp:inline distT="0" distB="0" distL="0" distR="0" wp14:anchorId="1E053139" wp14:editId="10A0E8B6">
-            <wp:extent cx="2717515" cy="1214323"/>
-            <wp:effectExtent l="0" t="0" r="6985" b="5080"/>
-            <wp:docPr id="29" name="Image 29"/>
-            <wp:cNvGraphicFramePr>
-              <a:graphicFrameLocks xmlns:a="http://schemas.openxmlformats.org/drawingml/2006/main" noChangeAspect="1"/>
-            </wp:cNvGraphicFramePr>
-            <a:graphic xmlns:a="http://schemas.openxmlformats.org/drawingml/2006/main">
-              <a:graphicData uri="http://schemas.openxmlformats.org/drawingml/2006/picture">
-                <pic:pic xmlns:pic="http://schemas.openxmlformats.org/drawingml/2006/picture">
-                  <pic:nvPicPr>
-                    <pic:cNvPr id="1" name=""/>
-                    <pic:cNvPicPr/>
-                  </pic:nvPicPr>
-                  <pic:blipFill>
-                    <a:blip r:embed="rId37"/>
-                    <a:stretch>
-                      <a:fillRect/>
-                    </a:stretch>
-                  </pic:blipFill>
-                  <pic:spPr>
-                    <a:xfrm>
-                      <a:off x="0" y="0"/>
-                      <a:ext cx="2744743" cy="1226490"/>
-                    </a:xfrm>
-                    <a:prstGeom prst="rect">
-                      <a:avLst/>
-                    </a:prstGeom>
-                  </pic:spPr>
-                </pic:pic>
-              </a:graphicData>
-            </a:graphic>
-          </wp:inline>
-        </w:drawing>
-      </w:r>
-    </w:p>
-    <w:p>
-      <w:pPr>
-        <w:rPr>
-          <w:i/>
-          <w:iCs/>
-        </w:rPr>
-      </w:pPr>
-    </w:p>
-    <w:p>
-      <w:pPr>
-        <w:pStyle w:val="Titre2"/>
-        <w:pBdr>
-          <w:bottom w:val="single" w:sz="4" w:space="0" w:color="2557A7"/>
-        </w:pBdr>
-      </w:pPr>
-    </w:p>
-    <w:p>
-      <w:pPr>
-        <w:rPr>
-          <w:b/>
-          <w:bCs/>
-          <w:color w:val="1A3A6B"/>
-          <w:sz w:val="26"/>
-          <w:szCs w:val="26"/>
-        </w:rPr>
-      </w:pPr>
-      <w:r>
-        <w:br w:type="page"/>
-      </w:r>
-    </w:p>
-    <w:p>
-      <w:pPr>
-        <w:pStyle w:val="Titre2"/>
-        <w:pBdr>
-          <w:bottom w:val="single" w:sz="4" w:space="0" w:color="2557A7"/>
-        </w:pBdr>
-      </w:pPr>
-      <w:bookmarkStart w:id="85" w:name="_Toc232147320"/>
-      <w:r>
-        <w:lastRenderedPageBreak/>
-        <w:t>E023 – Convocation et frais JA</w:t>
-      </w:r>
-      <w:bookmarkEnd w:id="85"/>
-    </w:p>
-    <w:p>
-      <w:pPr>
-        <w:spacing w:before="100" w:after="100"/>
-      </w:pPr>
-    </w:p>
-    <w:tbl>
-      <w:tblPr>
-        <w:tblW w:w="9026" w:type="dxa"/>
-        <w:tblBorders>
-          <w:top w:val="single" w:sz="4" w:space="0" w:color="auto"/>
-          <w:left w:val="single" w:sz="4" w:space="0" w:color="auto"/>
-          <w:bottom w:val="single" w:sz="4" w:space="0" w:color="auto"/>
-          <w:right w:val="single" w:sz="4" w:space="0" w:color="auto"/>
-          <w:insideH w:val="single" w:sz="4" w:space="0" w:color="auto"/>
-          <w:insideV w:val="single" w:sz="4" w:space="0" w:color="auto"/>
-        </w:tblBorders>
-        <w:tblCellMar>
-          <w:left w:w="10" w:type="dxa"/>
-          <w:right w:w="10" w:type="dxa"/>
-        </w:tblCellMar>
-        <w:tblLook w:val="0000" w:firstRow="0" w:lastRow="0" w:firstColumn="0" w:lastColumn="0" w:noHBand="0" w:noVBand="0"/>
-      </w:tblPr>
-      <w:tblGrid>
-        <w:gridCol w:w="2500"/>
-        <w:gridCol w:w="6526"/>
-      </w:tblGrid>
-      <w:tr>
-        <w:tc>
-          <w:tcPr>
-            <w:tcW w:w="2500" w:type="dxa"/>
-            <w:tcBorders>
-              <w:top w:val="single" w:sz="4" w:space="0" w:color="C8D4E8"/>
-              <w:left w:val="single" w:sz="4" w:space="0" w:color="C8D4E8"/>
-              <w:bottom w:val="single" w:sz="4" w:space="0" w:color="C8D4E8"/>
-              <w:right w:val="single" w:sz="4" w:space="0" w:color="C8D4E8"/>
-            </w:tcBorders>
-            <w:shd w:val="clear" w:color="auto" w:fill="E8EEF7"/>
-            <w:tcMar>
-              <w:top w:w="60" w:type="dxa"/>
-              <w:left w:w="120" w:type="dxa"/>
-              <w:bottom w:w="60" w:type="dxa"/>
-              <w:right w:w="120" w:type="dxa"/>
-            </w:tcMar>
-          </w:tcPr>
-          <w:p>
-            <w:r>
-              <w:rPr>
-                <w:b/>
-                <w:bCs/>
-                <w:color w:val="1A3A6B"/>
-                <w:sz w:val="20"/>
-                <w:szCs w:val="20"/>
-              </w:rPr>
-              <w:t>N° écran</w:t>
-            </w:r>
-          </w:p>
-        </w:tc>
-        <w:tc>
-          <w:tcPr>
-            <w:tcW w:w="6526" w:type="dxa"/>
-            <w:tcBorders>
-              <w:top w:val="single" w:sz="4" w:space="0" w:color="C8D4E8"/>
-              <w:left w:val="single" w:sz="4" w:space="0" w:color="C8D4E8"/>
-              <w:bottom w:val="single" w:sz="4" w:space="0" w:color="C8D4E8"/>
-              <w:right w:val="single" w:sz="4" w:space="0" w:color="C8D4E8"/>
-            </w:tcBorders>
-            <w:tcMar>
-              <w:top w:w="60" w:type="dxa"/>
-              <w:left w:w="120" w:type="dxa"/>
-              <w:bottom w:w="60" w:type="dxa"/>
-              <w:right w:w="120" w:type="dxa"/>
-            </w:tcMar>
-          </w:tcPr>
-          <w:p>
-            <w:r>
-              <w:rPr>
-                <w:sz w:val="20"/>
-                <w:szCs w:val="20"/>
-              </w:rPr>
-              <w:t>E023</w:t>
-            </w:r>
-          </w:p>
-        </w:tc>
-      </w:tr>
-      <w:tr>
-        <w:tc>
-          <w:tcPr>
-            <w:tcW w:w="2500" w:type="dxa"/>
-            <w:tcBorders>
-              <w:top w:val="single" w:sz="4" w:space="0" w:color="C8D4E8"/>
-              <w:left w:val="single" w:sz="4" w:space="0" w:color="C8D4E8"/>
-              <w:bottom w:val="single" w:sz="4" w:space="0" w:color="C8D4E8"/>
-              <w:right w:val="single" w:sz="4" w:space="0" w:color="C8D4E8"/>
-            </w:tcBorders>
-            <w:shd w:val="clear" w:color="auto" w:fill="E8EEF7"/>
-            <w:tcMar>
-              <w:top w:w="60" w:type="dxa"/>
-              <w:left w:w="120" w:type="dxa"/>
-              <w:bottom w:w="60" w:type="dxa"/>
-              <w:right w:w="120" w:type="dxa"/>
-            </w:tcMar>
-          </w:tcPr>
-          <w:p>
-            <w:r>
-              <w:rPr>
-                <w:b/>
-                <w:bCs/>
-                <w:color w:val="1A3A6B"/>
-                <w:sz w:val="20"/>
-                <w:szCs w:val="20"/>
-              </w:rPr>
-              <w:t>Fichier</w:t>
-            </w:r>
-          </w:p>
-        </w:tc>
-        <w:tc>
-          <w:tcPr>
-            <w:tcW w:w="6526" w:type="dxa"/>
-            <w:tcBorders>
-              <w:top w:val="single" w:sz="4" w:space="0" w:color="C8D4E8"/>
-              <w:left w:val="single" w:sz="4" w:space="0" w:color="C8D4E8"/>
-              <w:bottom w:val="single" w:sz="4" w:space="0" w:color="C8D4E8"/>
-              <w:right w:val="single" w:sz="4" w:space="0" w:color="C8D4E8"/>
-            </w:tcBorders>
-            <w:tcMar>
-              <w:top w:w="60" w:type="dxa"/>
-              <w:left w:w="120" w:type="dxa"/>
-              <w:bottom w:w="60" w:type="dxa"/>
-              <w:right w:w="120" w:type="dxa"/>
-            </w:tcMar>
-          </w:tcPr>
-          <w:p>
-            <w:r>
-              <w:rPr>
-                <w:sz w:val="20"/>
-                <w:szCs w:val="20"/>
-              </w:rPr>
-              <w:t>Nominateur/convocation_ja.php</w:t>
-            </w:r>
-          </w:p>
-        </w:tc>
-      </w:tr>
-      <w:tr>
-        <w:tc>
-          <w:tcPr>
-            <w:tcW w:w="2500" w:type="dxa"/>
-            <w:tcBorders>
-              <w:top w:val="single" w:sz="4" w:space="0" w:color="C8D4E8"/>
-              <w:left w:val="single" w:sz="4" w:space="0" w:color="C8D4E8"/>
-              <w:bottom w:val="single" w:sz="4" w:space="0" w:color="C8D4E8"/>
-              <w:right w:val="single" w:sz="4" w:space="0" w:color="C8D4E8"/>
-            </w:tcBorders>
-            <w:shd w:val="clear" w:color="auto" w:fill="E8EEF7"/>
-            <w:tcMar>
-              <w:top w:w="60" w:type="dxa"/>
-              <w:left w:w="120" w:type="dxa"/>
-              <w:bottom w:w="60" w:type="dxa"/>
-              <w:right w:w="120" w:type="dxa"/>
-            </w:tcMar>
-          </w:tcPr>
-          <w:p>
-            <w:r>
-              <w:rPr>
-                <w:b/>
-                <w:bCs/>
-                <w:color w:val="1A3A6B"/>
-                <w:sz w:val="20"/>
-                <w:szCs w:val="20"/>
-              </w:rPr>
-              <w:t>Accès</w:t>
-            </w:r>
-          </w:p>
-        </w:tc>
-        <w:tc>
-          <w:tcPr>
-            <w:tcW w:w="6526" w:type="dxa"/>
-            <w:tcBorders>
-              <w:top w:val="single" w:sz="4" w:space="0" w:color="C8D4E8"/>
-              <w:left w:val="single" w:sz="4" w:space="0" w:color="C8D4E8"/>
-              <w:bottom w:val="single" w:sz="4" w:space="0" w:color="C8D4E8"/>
-              <w:right w:val="single" w:sz="4" w:space="0" w:color="C8D4E8"/>
-            </w:tcBorders>
-            <w:tcMar>
-              <w:top w:w="60" w:type="dxa"/>
-              <w:left w:w="120" w:type="dxa"/>
-              <w:bottom w:w="60" w:type="dxa"/>
-              <w:right w:w="120" w:type="dxa"/>
-            </w:tcMar>
-          </w:tcPr>
-          <w:p>
-            <w:r>
-              <w:rPr>
-                <w:sz w:val="20"/>
-                <w:szCs w:val="20"/>
-              </w:rPr>
-              <w:t>Public – accessible via lien tokenisé ou depuis l'interface nominateur</w:t>
-            </w:r>
-          </w:p>
-        </w:tc>
-      </w:tr>
-    </w:tbl>
-    <w:p>
-      <w:pPr>
-        <w:spacing w:before="100" w:after="100"/>
-      </w:pPr>
-    </w:p>
-    <w:p>
-      <w:pPr>
-        <w:pStyle w:val="Titre3"/>
-      </w:pPr>
-      <w:bookmarkStart w:id="86" w:name="_Toc232147321"/>
-      <w:r>
-        <w:t>Description</w:t>
-      </w:r>
-      <w:bookmarkEnd w:id="86"/>
-    </w:p>
-    <w:p>
-      <w:pPr>
-        <w:spacing w:before="60" w:after="60"/>
-      </w:pPr>
-      <w:r>
-        <w:t>Page de convocation officielle d'un Juge-Arbitre pour une rencontre donnée. Affiche les informations complètes de la rencontre et permet au JA de confirmer sa présence et de déclarer ses frais de déplacement après la rencontre.</w:t>
-      </w:r>
-    </w:p>
-    <w:p>
-      <w:pPr>
-        <w:pStyle w:val="Titre3"/>
-      </w:pPr>
-      <w:bookmarkStart w:id="87" w:name="_Toc232147322"/>
-      <w:r>
-        <w:t>Champs et fonctionnalités</w:t>
-      </w:r>
-      <w:bookmarkEnd w:id="87"/>
-    </w:p>
-    <w:p>
-      <w:pPr>
-        <w:pStyle w:val="Paragraphedeliste"/>
-        <w:numPr>
-          <w:ilvl w:val="0"/>
-          <w:numId w:val="2"/>
-        </w:numPr>
-        <w:spacing w:before="40" w:after="40"/>
-      </w:pPr>
-      <w:r>
-        <w:t>Informations de la rencontre : date, heure, équipes, salle, adresse</w:t>
-      </w:r>
-    </w:p>
-    <w:p>
-      <w:pPr>
-        <w:pStyle w:val="Paragraphedeliste"/>
-        <w:numPr>
-          <w:ilvl w:val="0"/>
-          <w:numId w:val="2"/>
-        </w:numPr>
-        <w:spacing w:before="40" w:after="40"/>
-      </w:pPr>
-      <w:r>
-        <w:t>Informations du JA : nom, prénom, grade</w:t>
-      </w:r>
-    </w:p>
-    <w:p>
-      <w:pPr>
-        <w:pStyle w:val="Paragraphedeliste"/>
-        <w:numPr>
-          <w:ilvl w:val="0"/>
-          <w:numId w:val="2"/>
-        </w:numPr>
-        <w:spacing w:before="40" w:after="40"/>
-      </w:pPr>
-      <w:r>
-        <w:t>Distance calculée : km entre le domicile du JA et la salle</w:t>
-      </w:r>
-    </w:p>
-    <w:p>
-      <w:pPr>
-        <w:pStyle w:val="Paragraphedeliste"/>
-        <w:numPr>
-          <w:ilvl w:val="0"/>
-          <w:numId w:val="2"/>
-        </w:numPr>
-        <w:spacing w:before="40" w:after="40"/>
-      </w:pPr>
-      <w:r>
-        <w:t>Frais kilométriques : saisie du nombre de km réels (aller-retour)</w:t>
-      </w:r>
-    </w:p>
-    <w:p>
-      <w:pPr>
-        <w:pStyle w:val="Paragraphedeliste"/>
-        <w:numPr>
-          <w:ilvl w:val="0"/>
-          <w:numId w:val="2"/>
-        </w:numPr>
-        <w:spacing w:before="40" w:after="40"/>
-      </w:pPr>
-      <w:r>
-        <w:t>Péages : montant des péages (si applicable)</w:t>
-      </w:r>
-    </w:p>
-    <w:p>
-      <w:pPr>
-        <w:pStyle w:val="Paragraphedeliste"/>
-        <w:numPr>
-          <w:ilvl w:val="0"/>
-          <w:numId w:val="2"/>
-        </w:numPr>
-        <w:spacing w:before="40" w:after="40"/>
-      </w:pPr>
-      <w:r>
-        <w:t>Indemnité forfaitaire : calculée automatiquement selon le type de compétition (E003)</w:t>
-      </w:r>
-    </w:p>
-    <w:p>
-      <w:pPr>
-        <w:pStyle w:val="Paragraphedeliste"/>
-        <w:numPr>
-          <w:ilvl w:val="0"/>
-          <w:numId w:val="2"/>
-        </w:numPr>
-        <w:spacing w:before="40" w:after="40"/>
-      </w:pPr>
-      <w:r>
-        <w:t>Total des frais : calcul automatique</w:t>
-      </w:r>
-    </w:p>
-    <w:p>
-      <w:pPr>
-        <w:pStyle w:val="Paragraphedeliste"/>
-        <w:numPr>
-          <w:ilvl w:val="0"/>
-          <w:numId w:val="2"/>
-        </w:numPr>
-        <w:spacing w:before="40" w:after="40"/>
-      </w:pPr>
-      <w:r>
         <w:t>Bouton Enregistrer : sauvegarde les frais en base</w:t>
       </w:r>
     </w:p>
@@ -17132,7 +17535,43 @@
           <w:iCs/>
           <w:color w:val="555555"/>
         </w:rPr>
-        <w:t>La page est accessible via un token obfusqué inclus dans le lien email envoyé au JA, ou directement depuis l'interface nominateur (E022). Les frais sont pré-calculés et modifiables par le JA.</w:t>
+        <w:t xml:space="preserve">La page est accessible via un </w:t>
+      </w:r>
+      <w:proofErr w:type="spellStart"/>
+      <w:r>
+        <w:rPr>
+          <w:i/>
+          <w:iCs/>
+          <w:color w:val="555555"/>
+        </w:rPr>
+        <w:t>token</w:t>
+      </w:r>
+      <w:proofErr w:type="spellEnd"/>
+      <w:r>
+        <w:rPr>
+          <w:i/>
+          <w:iCs/>
+          <w:color w:val="555555"/>
+        </w:rPr>
+        <w:t xml:space="preserve"> obfusqué inclus dans le lien email envoyé au JA, ou directement depuis l'interface nominateur (E022). Les frais sont </w:t>
+      </w:r>
+      <w:proofErr w:type="spellStart"/>
+      <w:r>
+        <w:rPr>
+          <w:i/>
+          <w:iCs/>
+          <w:color w:val="555555"/>
+        </w:rPr>
+        <w:t>pré-calculés</w:t>
+      </w:r>
+      <w:proofErr w:type="spellEnd"/>
+      <w:r>
+        <w:rPr>
+          <w:i/>
+          <w:iCs/>
+          <w:color w:val="555555"/>
+        </w:rPr>
+        <w:t xml:space="preserve"> et modifiables par le JA.</w:t>
       </w:r>
     </w:p>
     <w:p>
@@ -17212,8 +17651,8 @@
     </w:tbl>
     <w:p/>
     <w:sectPr>
-      <w:headerReference w:type="default" r:id="rId38"/>
-      <w:footerReference w:type="default" r:id="rId39"/>
+      <w:headerReference w:type="default" r:id="rId40"/>
+      <w:footerReference w:type="default" r:id="rId41"/>
       <w:pgSz w:w="11906" w:h="16838"/>
       <w:pgMar w:top="1440" w:right="1440" w:bottom="1440" w:left="1440" w:header="708" w:footer="708" w:gutter="0"/>
       <w:cols w:space="720"/>
@@ -17384,7 +17823,25 @@
         <w:sz w:val="16"/>
         <w:szCs w:val="16"/>
       </w:rPr>
-      <w:t xml:space="preserve">© 2026 NIJAC – Tous droits réservés  |  Page </w:t>
+      <w:t xml:space="preserve">© 2026 NIJAC – Tous droits </w:t>
+    </w:r>
+    <w:proofErr w:type="gramStart"/>
+    <w:r>
+      <w:rPr>
+        <w:color w:val="888888"/>
+        <w:sz w:val="16"/>
+        <w:szCs w:val="16"/>
+      </w:rPr>
+      <w:t>réservés  |</w:t>
+    </w:r>
+    <w:proofErr w:type="gramEnd"/>
+    <w:r>
+      <w:rPr>
+        <w:color w:val="888888"/>
+        <w:sz w:val="16"/>
+        <w:szCs w:val="16"/>
+      </w:rPr>
+      <w:t xml:space="preserve">  Page </w:t>
     </w:r>
     <w:r>
       <w:rPr>

</xml_diff>

<commit_message>
Mise à jour de la documentation
</commit_message>
<xml_diff>
--- a/NIJAC_Documentation_Utilisateur.docx
+++ b/NIJAC_Documentation_Utilisateur.docx
@@ -33,23 +33,7 @@
           <w:sz w:val="40"/>
           <w:szCs w:val="40"/>
         </w:rPr>
-        <w:t>Nomination Informatisée des Juges-Arbitres</w:t>
-      </w:r>
-      <w:r>
-        <w:rPr>
-          <w:color w:val="2557A7"/>
-          <w:sz w:val="40"/>
-          <w:szCs w:val="40"/>
-        </w:rPr>
-        <w:t xml:space="preserve"> </w:t>
-      </w:r>
-      <w:r>
-        <w:rPr>
-          <w:color w:val="2557A7"/>
-          <w:sz w:val="40"/>
-          <w:szCs w:val="40"/>
-        </w:rPr>
-        <w:t>Championnat</w:t>
+        <w:t>Nomination Informatisée des Juges-Arbitres Championnat</w:t>
       </w:r>
     </w:p>
     <w:p>
@@ -112,7 +96,7 @@
           <w:sz w:val="24"/>
           <w:szCs w:val="24"/>
         </w:rPr>
-        <w:t xml:space="preserve">Version </w:t>
+        <w:t>Version 0.0</w:t>
       </w:r>
       <w:r>
         <w:rPr>
@@ -120,7 +104,23 @@
           <w:sz w:val="24"/>
           <w:szCs w:val="24"/>
         </w:rPr>
-        <w:t>0.03 – 12</w:t>
+        <w:t>6</w:t>
+      </w:r>
+      <w:r>
+        <w:rPr>
+          <w:color w:val="888888"/>
+          <w:sz w:val="24"/>
+          <w:szCs w:val="24"/>
+        </w:rPr>
+        <w:t xml:space="preserve"> – 1</w:t>
+      </w:r>
+      <w:r>
+        <w:rPr>
+          <w:color w:val="888888"/>
+          <w:sz w:val="24"/>
+          <w:szCs w:val="24"/>
+        </w:rPr>
+        <w:t xml:space="preserve">5 </w:t>
       </w:r>
       <w:r>
         <w:rPr>
@@ -3988,21 +3988,7 @@
                 <w:rStyle w:val="Lienhypertexte"/>
                 <w:noProof/>
               </w:rPr>
-              <w:t>E012 – Déclaration de dispo</w:t>
-            </w:r>
-            <w:r>
-              <w:rPr>
-                <w:rStyle w:val="Lienhypertexte"/>
-                <w:noProof/>
-              </w:rPr>
-              <w:t>n</w:t>
-            </w:r>
-            <w:r>
-              <w:rPr>
-                <w:rStyle w:val="Lienhypertexte"/>
-                <w:noProof/>
-              </w:rPr>
-              <w:t>ibilité JA</w:t>
+              <w:t>E012 – Déclaration de disponibilité JA</w:t>
             </w:r>
             <w:r>
               <w:rPr>
@@ -6403,9 +6389,9 @@
         <w:tblLook w:val="0000" w:firstRow="0" w:lastRow="0" w:firstColumn="0" w:lastColumn="0" w:noHBand="0" w:noVBand="0"/>
       </w:tblPr>
       <w:tblGrid>
-        <w:gridCol w:w="1400"/>
-        <w:gridCol w:w="3500"/>
-        <w:gridCol w:w="4126"/>
+        <w:gridCol w:w="1382"/>
+        <w:gridCol w:w="3724"/>
+        <w:gridCol w:w="3920"/>
       </w:tblGrid>
       <w:tr>
         <w:tc>
@@ -6575,7 +6561,6 @@
             </w:tcMar>
           </w:tcPr>
           <w:p>
-            <w:proofErr w:type="spellStart"/>
             <w:r>
               <w:rPr>
                 <w:color w:val="555555"/>
@@ -6584,7 +6569,6 @@
               </w:rPr>
               <w:t>index.php</w:t>
             </w:r>
-            <w:proofErr w:type="spellEnd"/>
           </w:p>
         </w:tc>
       </w:tr>
@@ -6664,7 +6648,6 @@
             </w:tcMar>
           </w:tcPr>
           <w:p>
-            <w:proofErr w:type="spellStart"/>
             <w:r>
               <w:rPr>
                 <w:color w:val="555555"/>
@@ -6673,7 +6656,6 @@
               </w:rPr>
               <w:t>admin_menu.php</w:t>
             </w:r>
-            <w:proofErr w:type="spellEnd"/>
           </w:p>
         </w:tc>
       </w:tr>
@@ -6753,7 +6735,6 @@
             </w:tcMar>
           </w:tcPr>
           <w:p>
-            <w:proofErr w:type="spellStart"/>
             <w:r>
               <w:rPr>
                 <w:color w:val="555555"/>
@@ -6762,7 +6743,6 @@
               </w:rPr>
               <w:t>competition.php</w:t>
             </w:r>
-            <w:proofErr w:type="spellEnd"/>
           </w:p>
         </w:tc>
       </w:tr>
@@ -6842,7 +6822,6 @@
             </w:tcMar>
           </w:tcPr>
           <w:p>
-            <w:proofErr w:type="spellStart"/>
             <w:r>
               <w:rPr>
                 <w:color w:val="555555"/>
@@ -6851,7 +6830,6 @@
               </w:rPr>
               <w:t>correspondant.php</w:t>
             </w:r>
-            <w:proofErr w:type="spellEnd"/>
           </w:p>
         </w:tc>
       </w:tr>
@@ -6931,7 +6909,6 @@
             </w:tcMar>
           </w:tcPr>
           <w:p>
-            <w:proofErr w:type="spellStart"/>
             <w:r>
               <w:rPr>
                 <w:color w:val="555555"/>
@@ -6940,7 +6917,6 @@
               </w:rPr>
               <w:t>salle.php</w:t>
             </w:r>
-            <w:proofErr w:type="spellEnd"/>
           </w:p>
         </w:tc>
       </w:tr>
@@ -7020,7 +6996,6 @@
             </w:tcMar>
           </w:tcPr>
           <w:p>
-            <w:proofErr w:type="spellStart"/>
             <w:r>
               <w:rPr>
                 <w:color w:val="555555"/>
@@ -7029,7 +7004,6 @@
               </w:rPr>
               <w:t>communes.php</w:t>
             </w:r>
-            <w:proofErr w:type="spellEnd"/>
           </w:p>
         </w:tc>
       </w:tr>
@@ -7109,7 +7083,6 @@
             </w:tcMar>
           </w:tcPr>
           <w:p>
-            <w:proofErr w:type="spellStart"/>
             <w:r>
               <w:rPr>
                 <w:color w:val="555555"/>
@@ -7118,7 +7091,6 @@
               </w:rPr>
               <w:t>jugearbitre.php</w:t>
             </w:r>
-            <w:proofErr w:type="spellEnd"/>
           </w:p>
         </w:tc>
       </w:tr>
@@ -7198,7 +7170,6 @@
             </w:tcMar>
           </w:tcPr>
           <w:p>
-            <w:proofErr w:type="spellStart"/>
             <w:r>
               <w:rPr>
                 <w:color w:val="555555"/>
@@ -7207,7 +7178,6 @@
               </w:rPr>
               <w:t>club.php</w:t>
             </w:r>
-            <w:proofErr w:type="spellEnd"/>
           </w:p>
         </w:tc>
       </w:tr>
@@ -7287,7 +7257,6 @@
             </w:tcMar>
           </w:tcPr>
           <w:p>
-            <w:proofErr w:type="spellStart"/>
             <w:r>
               <w:rPr>
                 <w:color w:val="555555"/>
@@ -7296,7 +7265,6 @@
               </w:rPr>
               <w:t>utilisateur.php</w:t>
             </w:r>
-            <w:proofErr w:type="spellEnd"/>
           </w:p>
         </w:tc>
       </w:tr>
@@ -7376,7 +7344,6 @@
             </w:tcMar>
           </w:tcPr>
           <w:p>
-            <w:proofErr w:type="spellStart"/>
             <w:r>
               <w:rPr>
                 <w:color w:val="555555"/>
@@ -7385,7 +7352,6 @@
               </w:rPr>
               <w:t>division.php</w:t>
             </w:r>
-            <w:proofErr w:type="spellEnd"/>
           </w:p>
         </w:tc>
       </w:tr>
@@ -7465,7 +7431,6 @@
             </w:tcMar>
           </w:tcPr>
           <w:p>
-            <w:proofErr w:type="spellStart"/>
             <w:r>
               <w:rPr>
                 <w:color w:val="555555"/>
@@ -7474,7 +7439,6 @@
               </w:rPr>
               <w:t>import_rencontres.php</w:t>
             </w:r>
-            <w:proofErr w:type="spellEnd"/>
           </w:p>
         </w:tc>
       </w:tr>
@@ -7554,7 +7518,6 @@
             </w:tcMar>
           </w:tcPr>
           <w:p>
-            <w:proofErr w:type="spellStart"/>
             <w:r>
               <w:rPr>
                 <w:color w:val="555555"/>
@@ -7563,7 +7526,6 @@
               </w:rPr>
               <w:t>disponibilite_ja.php</w:t>
             </w:r>
-            <w:proofErr w:type="spellEnd"/>
           </w:p>
         </w:tc>
       </w:tr>
@@ -7643,7 +7605,6 @@
             </w:tcMar>
           </w:tcPr>
           <w:p>
-            <w:proofErr w:type="spellStart"/>
             <w:r>
               <w:rPr>
                 <w:color w:val="555555"/>
@@ -7652,7 +7613,6 @@
               </w:rPr>
               <w:t>encours.php</w:t>
             </w:r>
-            <w:proofErr w:type="spellEnd"/>
           </w:p>
         </w:tc>
       </w:tr>
@@ -7738,18 +7698,8 @@
                 <w:sz w:val="18"/>
                 <w:szCs w:val="18"/>
               </w:rPr>
-              <w:t>Nominateur/</w:t>
-            </w:r>
-            <w:proofErr w:type="spellStart"/>
-            <w:r>
-              <w:rPr>
-                <w:color w:val="555555"/>
-                <w:sz w:val="18"/>
-                <w:szCs w:val="18"/>
-              </w:rPr>
-              <w:t>menu.php</w:t>
-            </w:r>
-            <w:proofErr w:type="spellEnd"/>
+              <w:t>Nominateur/menu.php</w:t>
+            </w:r>
           </w:p>
         </w:tc>
       </w:tr>
@@ -7835,18 +7785,8 @@
                 <w:sz w:val="18"/>
                 <w:szCs w:val="18"/>
               </w:rPr>
-              <w:t>Nominateur/</w:t>
-            </w:r>
-            <w:proofErr w:type="spellStart"/>
-            <w:r>
-              <w:rPr>
-                <w:color w:val="555555"/>
-                <w:sz w:val="18"/>
-                <w:szCs w:val="18"/>
-              </w:rPr>
-              <w:t>disponibilites.php</w:t>
-            </w:r>
-            <w:proofErr w:type="spellEnd"/>
+              <w:t>Nominateur/disponibilites.php</w:t>
+            </w:r>
           </w:p>
         </w:tc>
       </w:tr>
@@ -7932,18 +7872,8 @@
                 <w:sz w:val="18"/>
                 <w:szCs w:val="18"/>
               </w:rPr>
-              <w:t>Nominateur/</w:t>
-            </w:r>
-            <w:proofErr w:type="spellStart"/>
-            <w:r>
-              <w:rPr>
-                <w:color w:val="555555"/>
-                <w:sz w:val="18"/>
-                <w:szCs w:val="18"/>
-              </w:rPr>
-              <w:t>nomination.php</w:t>
-            </w:r>
-            <w:proofErr w:type="spellEnd"/>
+              <w:t>Nominateur/nomination.php</w:t>
+            </w:r>
           </w:p>
         </w:tc>
       </w:tr>
@@ -8029,18 +7959,168 @@
                 <w:sz w:val="18"/>
                 <w:szCs w:val="18"/>
               </w:rPr>
-              <w:t>Nominateur/</w:t>
-            </w:r>
-            <w:proofErr w:type="spellStart"/>
-            <w:r>
-              <w:rPr>
-                <w:color w:val="555555"/>
+              <w:t>Nominateur/convocation_ja.php</w:t>
+            </w:r>
+          </w:p>
+        </w:tc>
+      </w:tr>
+      <w:tr>
+        <w:tc>
+          <w:tcPr>
+            <w:tcW w:w="1500" w:type="dxa"/>
+            <w:tcBorders>
+              <w:top w:val="single" w:sz="4" w:space="0" w:color="C8D4E8"/>
+              <w:left w:val="single" w:sz="4" w:space="0" w:color="C8D4E8"/>
+              <w:bottom w:val="single" w:sz="4" w:space="0" w:color="C8D4E8"/>
+              <w:right w:val="single" w:sz="4" w:space="0" w:color="C8D4E8"/>
+            </w:tcBorders>
+            <w:tcMar>
+              <w:top w:w="60" w:type="dxa"/>
+              <w:left w:w="120" w:type="dxa"/>
+              <w:bottom w:w="60" w:type="dxa"/>
+              <w:right w:w="120" w:type="dxa"/>
+            </w:tcMar>
+          </w:tcPr>
+          <w:p>
+            <w:r>
+              <w:rPr>
                 <w:sz w:val="18"/>
                 <w:szCs w:val="18"/>
               </w:rPr>
-              <w:t>convocation_ja.php</w:t>
-            </w:r>
-            <w:proofErr w:type="spellEnd"/>
+              <w:t>E016</w:t>
+            </w:r>
+          </w:p>
+        </w:tc>
+        <w:tc>
+          <w:tcPr>
+            <w:tcW w:w="4126" w:type="dxa"/>
+            <w:tcBorders>
+              <w:top w:val="single" w:sz="4" w:space="0" w:color="C8D4E8"/>
+              <w:left w:val="single" w:sz="4" w:space="0" w:color="C8D4E8"/>
+              <w:bottom w:val="single" w:sz="4" w:space="0" w:color="C8D4E8"/>
+              <w:right w:val="single" w:sz="4" w:space="0" w:color="C8D4E8"/>
+            </w:tcBorders>
+            <w:tcMar>
+              <w:top w:w="60" w:type="dxa"/>
+              <w:left w:w="120" w:type="dxa"/>
+              <w:bottom w:w="60" w:type="dxa"/>
+              <w:right w:w="120" w:type="dxa"/>
+            </w:tcMar>
+          </w:tcPr>
+          <w:p>
+            <w:r>
+              <w:rPr>
+                <w:sz w:val="18"/>
+                <w:szCs w:val="18"/>
+              </w:rPr>
+              <w:t>Gestion des messages</w:t>
+            </w:r>
+          </w:p>
+        </w:tc>
+        <w:tc>
+          <w:tcPr>
+            <w:tcW w:w="3400" w:type="dxa"/>
+            <w:tcBorders>
+              <w:top w:val="single" w:sz="4" w:space="0" w:color="C8D4E8"/>
+              <w:left w:val="single" w:sz="4" w:space="0" w:color="C8D4E8"/>
+              <w:bottom w:val="single" w:sz="4" w:space="0" w:color="C8D4E8"/>
+              <w:right w:val="single" w:sz="4" w:space="0" w:color="C8D4E8"/>
+            </w:tcBorders>
+            <w:tcMar>
+              <w:top w:w="60" w:type="dxa"/>
+              <w:left w:w="120" w:type="dxa"/>
+              <w:bottom w:w="60" w:type="dxa"/>
+              <w:right w:w="120" w:type="dxa"/>
+            </w:tcMar>
+          </w:tcPr>
+          <w:p>
+            <w:r>
+              <w:rPr>
+                <w:sz w:val="18"/>
+                <w:szCs w:val="18"/>
+              </w:rPr>
+              <w:t>Nominateur/messagerie.php</w:t>
+            </w:r>
+          </w:p>
+        </w:tc>
+      </w:tr>
+      <w:tr>
+        <w:tc>
+          <w:tcPr>
+            <w:tcW w:w="1500" w:type="dxa"/>
+            <w:tcBorders>
+              <w:top w:val="single" w:sz="4" w:space="0" w:color="C8D4E8"/>
+              <w:left w:val="single" w:sz="4" w:space="0" w:color="C8D4E8"/>
+              <w:bottom w:val="single" w:sz="4" w:space="0" w:color="C8D4E8"/>
+              <w:right w:val="single" w:sz="4" w:space="0" w:color="C8D4E8"/>
+            </w:tcBorders>
+            <w:tcMar>
+              <w:top w:w="60" w:type="dxa"/>
+              <w:left w:w="120" w:type="dxa"/>
+              <w:bottom w:w="60" w:type="dxa"/>
+              <w:right w:w="120" w:type="dxa"/>
+            </w:tcMar>
+          </w:tcPr>
+          <w:p>
+            <w:r>
+              <w:rPr>
+                <w:sz w:val="18"/>
+                <w:szCs w:val="18"/>
+              </w:rPr>
+              <w:t>E024</w:t>
+            </w:r>
+          </w:p>
+        </w:tc>
+        <w:tc>
+          <w:tcPr>
+            <w:tcW w:w="4126" w:type="dxa"/>
+            <w:tcBorders>
+              <w:top w:val="single" w:sz="4" w:space="0" w:color="C8D4E8"/>
+              <w:left w:val="single" w:sz="4" w:space="0" w:color="C8D4E8"/>
+              <w:bottom w:val="single" w:sz="4" w:space="0" w:color="C8D4E8"/>
+              <w:right w:val="single" w:sz="4" w:space="0" w:color="C8D4E8"/>
+            </w:tcBorders>
+            <w:tcMar>
+              <w:top w:w="60" w:type="dxa"/>
+              <w:left w:w="120" w:type="dxa"/>
+              <w:bottom w:w="60" w:type="dxa"/>
+              <w:right w:w="120" w:type="dxa"/>
+            </w:tcMar>
+          </w:tcPr>
+          <w:p>
+            <w:r>
+              <w:rPr>
+                <w:sz w:val="18"/>
+                <w:szCs w:val="18"/>
+              </w:rPr>
+              <w:t>Centre d’envoi</w:t>
+            </w:r>
+          </w:p>
+        </w:tc>
+        <w:tc>
+          <w:tcPr>
+            <w:tcW w:w="3400" w:type="dxa"/>
+            <w:tcBorders>
+              <w:top w:val="single" w:sz="4" w:space="0" w:color="C8D4E8"/>
+              <w:left w:val="single" w:sz="4" w:space="0" w:color="C8D4E8"/>
+              <w:bottom w:val="single" w:sz="4" w:space="0" w:color="C8D4E8"/>
+              <w:right w:val="single" w:sz="4" w:space="0" w:color="C8D4E8"/>
+            </w:tcBorders>
+            <w:tcMar>
+              <w:top w:w="60" w:type="dxa"/>
+              <w:left w:w="120" w:type="dxa"/>
+              <w:bottom w:w="60" w:type="dxa"/>
+              <w:right w:w="120" w:type="dxa"/>
+            </w:tcMar>
+          </w:tcPr>
+          <w:p>
+            <w:r>
+              <w:rPr>
+                <w:sz w:val="18"/>
+                <w:szCs w:val="18"/>
+              </w:rPr>
+              <w:t>Nominateur/centrenvoye.php</w:t>
+            </w:r>
           </w:p>
         </w:tc>
       </w:tr>
@@ -8232,7 +8312,6 @@
             </w:tcMar>
           </w:tcPr>
           <w:p>
-            <w:proofErr w:type="spellStart"/>
             <w:r>
               <w:rPr>
                 <w:sz w:val="20"/>
@@ -8240,7 +8319,6 @@
               </w:rPr>
               <w:t>index.php</w:t>
             </w:r>
-            <w:proofErr w:type="spellEnd"/>
           </w:p>
         </w:tc>
       </w:tr>
@@ -8426,25 +8504,7 @@
           <w:iCs/>
           <w:color w:val="555555"/>
         </w:rPr>
-        <w:t xml:space="preserve">Les mots de passe sont stockés de manière sécurisée (hachage </w:t>
-      </w:r>
-      <w:proofErr w:type="spellStart"/>
-      <w:r>
-        <w:rPr>
-          <w:i/>
-          <w:iCs/>
-          <w:color w:val="555555"/>
-        </w:rPr>
-        <w:t>bcrypt</w:t>
-      </w:r>
-      <w:proofErr w:type="spellEnd"/>
-      <w:r>
-        <w:rPr>
-          <w:i/>
-          <w:iCs/>
-          <w:color w:val="555555"/>
-        </w:rPr>
-        <w:t>). En cas de compte inactif, la connexion est refusée même si le mot de passe est correct.</w:t>
+        <w:t>Les mots de passe sont stockés de manière sécurisée (hachage bcrypt). En cas de compte inactif, la connexion est refusée même si le mot de passe est correct.</w:t>
       </w:r>
     </w:p>
     <w:p>
@@ -8480,18 +8540,8 @@
           <w:iCs/>
           <w:color w:val="555555"/>
         </w:rPr>
-        <w:t>MDP : Change-</w:t>
-      </w:r>
-      <w:proofErr w:type="spellStart"/>
-      <w:r>
-        <w:rPr>
-          <w:i/>
-          <w:iCs/>
-          <w:color w:val="555555"/>
-        </w:rPr>
-        <w:t>On_Install</w:t>
-      </w:r>
-      <w:proofErr w:type="spellEnd"/>
+        <w:t>MDP : Change-On_Install</w:t>
+      </w:r>
     </w:p>
     <w:p>
       <w:pPr>
@@ -8508,25 +8558,7 @@
           <w:iCs/>
           <w:color w:val="555555"/>
         </w:rPr>
-        <w:t xml:space="preserve">L’utilisateur devra modifier celui-ci </w:t>
-      </w:r>
-      <w:proofErr w:type="spellStart"/>
-      <w:r>
-        <w:rPr>
-          <w:i/>
-          <w:iCs/>
-          <w:color w:val="555555"/>
-        </w:rPr>
-        <w:t>des</w:t>
-      </w:r>
-      <w:proofErr w:type="spellEnd"/>
-      <w:r>
-        <w:rPr>
-          <w:i/>
-          <w:iCs/>
-          <w:color w:val="555555"/>
-        </w:rPr>
-        <w:t xml:space="preserve"> sa première connexion, un message s’affiche sur chaque écran pour le rappeler.</w:t>
+        <w:t>L’utilisateur devra modifier celui-ci des sa première connexion, un message s’affiche sur chaque écran pour le rappeler.</w:t>
       </w:r>
     </w:p>
     <w:p>
@@ -8611,7 +8643,7 @@
                 <w:noProof/>
               </w:rPr>
               <w:drawing>
-                <wp:inline distT="0" distB="0" distL="0" distR="0" wp14:anchorId="32CBB3AD" wp14:editId="6E16D3BE">
+                <wp:inline distT="0" distB="0" distL="0" distR="0" wp14:anchorId="178C3D45" wp14:editId="7A173A0F">
                   <wp:extent cx="5770743" cy="3914775"/>
                   <wp:effectExtent l="0" t="0" r="1905" b="0"/>
                   <wp:docPr id="1" name="Image 1"/>
@@ -8650,11 +8682,6 @@
         </w:tc>
       </w:tr>
     </w:tbl>
-    <w:p>
-      <w:r>
-        <w:t>Actuellement V : 0.03</w:t>
-      </w:r>
-    </w:p>
     <w:p>
       <w:pPr>
         <w:pStyle w:val="Titre2"/>
@@ -8823,7 +8850,6 @@
             </w:tcMar>
           </w:tcPr>
           <w:p>
-            <w:proofErr w:type="spellStart"/>
             <w:r>
               <w:rPr>
                 <w:sz w:val="20"/>
@@ -8831,7 +8857,6 @@
               </w:rPr>
               <w:t>admin_menu.php</w:t>
             </w:r>
-            <w:proofErr w:type="spellEnd"/>
           </w:p>
         </w:tc>
       </w:tr>
@@ -9192,14 +9217,11 @@
               <w:jc w:val="center"/>
             </w:pPr>
             <w:r>
-              <w:rPr>
-                <w:noProof/>
-              </w:rPr>
               <w:drawing>
-                <wp:inline distT="0" distB="0" distL="0" distR="0" wp14:anchorId="7394CDE0" wp14:editId="2EAB0213">
-                  <wp:extent cx="5731510" cy="2639060"/>
-                  <wp:effectExtent l="0" t="0" r="2540" b="8890"/>
-                  <wp:docPr id="2" name="Image 2"/>
+                <wp:inline distT="0" distB="0" distL="0" distR="0" wp14:anchorId="41B2BF68" wp14:editId="0165C8A9">
+                  <wp:extent cx="5731510" cy="2676525"/>
+                  <wp:effectExtent l="0" t="0" r="2540" b="9525"/>
+                  <wp:docPr id="20" name="Image 20"/>
                   <wp:cNvGraphicFramePr>
                     <a:graphicFrameLocks xmlns:a="http://schemas.openxmlformats.org/drawingml/2006/main" noChangeAspect="1"/>
                   </wp:cNvGraphicFramePr>
@@ -9219,7 +9241,7 @@
                         <pic:spPr>
                           <a:xfrm>
                             <a:off x="0" y="0"/>
-                            <a:ext cx="5731510" cy="2639060"/>
+                            <a:ext cx="5731510" cy="2676525"/>
                           </a:xfrm>
                           <a:prstGeom prst="rect">
                             <a:avLst/>
@@ -9237,46 +9259,6 @@
               <w:spacing w:before="400" w:after="400"/>
               <w:jc w:val="center"/>
             </w:pPr>
-            <w:r>
-              <w:rPr>
-                <w:noProof/>
-              </w:rPr>
-              <w:drawing>
-                <wp:inline distT="0" distB="0" distL="0" distR="0" wp14:anchorId="7F040088" wp14:editId="57956C9F">
-                  <wp:extent cx="5731510" cy="935355"/>
-                  <wp:effectExtent l="0" t="0" r="2540" b="0"/>
-                  <wp:docPr id="3" name="Image 3"/>
-                  <wp:cNvGraphicFramePr>
-                    <a:graphicFrameLocks xmlns:a="http://schemas.openxmlformats.org/drawingml/2006/main" noChangeAspect="1"/>
-                  </wp:cNvGraphicFramePr>
-                  <a:graphic xmlns:a="http://schemas.openxmlformats.org/drawingml/2006/main">
-                    <a:graphicData uri="http://schemas.openxmlformats.org/drawingml/2006/picture">
-                      <pic:pic xmlns:pic="http://schemas.openxmlformats.org/drawingml/2006/picture">
-                        <pic:nvPicPr>
-                          <pic:cNvPr id="1" name=""/>
-                          <pic:cNvPicPr/>
-                        </pic:nvPicPr>
-                        <pic:blipFill>
-                          <a:blip r:embed="rId11"/>
-                          <a:stretch>
-                            <a:fillRect/>
-                          </a:stretch>
-                        </pic:blipFill>
-                        <pic:spPr>
-                          <a:xfrm>
-                            <a:off x="0" y="0"/>
-                            <a:ext cx="5731510" cy="935355"/>
-                          </a:xfrm>
-                          <a:prstGeom prst="rect">
-                            <a:avLst/>
-                          </a:prstGeom>
-                        </pic:spPr>
-                      </pic:pic>
-                    </a:graphicData>
-                  </a:graphic>
-                </wp:inline>
-              </w:drawing>
-            </w:r>
           </w:p>
         </w:tc>
       </w:tr>
@@ -9449,7 +9431,6 @@
             </w:tcMar>
           </w:tcPr>
           <w:p>
-            <w:proofErr w:type="spellStart"/>
             <w:r>
               <w:rPr>
                 <w:sz w:val="20"/>
@@ -9457,7 +9438,6 @@
               </w:rPr>
               <w:t>competition.php</w:t>
             </w:r>
-            <w:proofErr w:type="spellEnd"/>
           </w:p>
         </w:tc>
       </w:tr>
@@ -9700,7 +9680,7 @@
                 <w:noProof/>
               </w:rPr>
               <w:drawing>
-                <wp:inline distT="0" distB="0" distL="0" distR="0" wp14:anchorId="3CDD45DB" wp14:editId="0FCDBEA6">
+                <wp:inline distT="0" distB="0" distL="0" distR="0" wp14:anchorId="6037CDD3" wp14:editId="57E0057F">
                   <wp:extent cx="5731510" cy="3270250"/>
                   <wp:effectExtent l="0" t="0" r="2540" b="6350"/>
                   <wp:docPr id="4" name="Image 4"/>
@@ -9715,7 +9695,7 @@
                           <pic:cNvPicPr/>
                         </pic:nvPicPr>
                         <pic:blipFill>
-                          <a:blip r:embed="rId12"/>
+                          <a:blip r:embed="rId11"/>
                           <a:stretch>
                             <a:fillRect/>
                           </a:stretch>
@@ -9899,7 +9879,6 @@
             </w:tcMar>
           </w:tcPr>
           <w:p>
-            <w:proofErr w:type="spellStart"/>
             <w:r>
               <w:rPr>
                 <w:sz w:val="20"/>
@@ -9907,7 +9886,6 @@
               </w:rPr>
               <w:t>correspondant.php</w:t>
             </w:r>
-            <w:proofErr w:type="spellEnd"/>
           </w:p>
         </w:tc>
       </w:tr>
@@ -10194,7 +10172,7 @@
                 <w:noProof/>
               </w:rPr>
               <w:drawing>
-                <wp:inline distT="0" distB="0" distL="0" distR="0" wp14:anchorId="103812BE" wp14:editId="5233B440">
+                <wp:inline distT="0" distB="0" distL="0" distR="0" wp14:anchorId="483FBDEA" wp14:editId="50659F9C">
                   <wp:extent cx="5731510" cy="3434080"/>
                   <wp:effectExtent l="0" t="0" r="2540" b="0"/>
                   <wp:docPr id="7" name="Image 7"/>
@@ -10209,7 +10187,7 @@
                           <pic:cNvPicPr/>
                         </pic:nvPicPr>
                         <pic:blipFill>
-                          <a:blip r:embed="rId13"/>
+                          <a:blip r:embed="rId12"/>
                           <a:stretch>
                             <a:fillRect/>
                           </a:stretch>
@@ -10248,17 +10226,14 @@
         </w:numPr>
       </w:pPr>
       <w:r>
-        <w:t>Trier par ordre alphabétique les colonne</w:t>
-      </w:r>
-      <w:r>
-        <w:t xml:space="preserve">s </w:t>
+        <w:t xml:space="preserve">Trier par ordre alphabétique les colonnes </w:t>
       </w:r>
       <w:r>
         <w:rPr>
           <w:noProof/>
         </w:rPr>
         <w:drawing>
-          <wp:inline distT="0" distB="0" distL="0" distR="0" wp14:anchorId="1814B115" wp14:editId="6CDA2ECB">
+          <wp:inline distT="0" distB="0" distL="0" distR="0" wp14:anchorId="65A90933" wp14:editId="20D2C817">
             <wp:extent cx="266737" cy="266737"/>
             <wp:effectExtent l="0" t="0" r="0" b="0"/>
             <wp:docPr id="13" name="Image 13"/>
@@ -10273,7 +10248,7 @@
                     <pic:cNvPicPr/>
                   </pic:nvPicPr>
                   <pic:blipFill>
-                    <a:blip r:embed="rId14"/>
+                    <a:blip r:embed="rId13"/>
                     <a:stretch>
                       <a:fillRect/>
                     </a:stretch>
@@ -10313,7 +10288,7 @@
           <w:noProof/>
         </w:rPr>
         <w:drawing>
-          <wp:inline distT="0" distB="0" distL="0" distR="0" wp14:anchorId="522BC4CF" wp14:editId="742A0CBE">
+          <wp:inline distT="0" distB="0" distL="0" distR="0" wp14:anchorId="5152D6AC" wp14:editId="720266CA">
             <wp:extent cx="2238687" cy="381053"/>
             <wp:effectExtent l="0" t="0" r="9525" b="0"/>
             <wp:docPr id="14" name="Image 14"/>
@@ -10328,7 +10303,7 @@
                     <pic:cNvPicPr/>
                   </pic:nvPicPr>
                   <pic:blipFill>
-                    <a:blip r:embed="rId15"/>
+                    <a:blip r:embed="rId14"/>
                     <a:stretch>
                       <a:fillRect/>
                     </a:stretch>
@@ -10517,7 +10492,6 @@
             </w:tcMar>
           </w:tcPr>
           <w:p>
-            <w:proofErr w:type="spellStart"/>
             <w:r>
               <w:rPr>
                 <w:sz w:val="20"/>
@@ -10525,7 +10499,6 @@
               </w:rPr>
               <w:t>salle.php</w:t>
             </w:r>
-            <w:proofErr w:type="spellEnd"/>
           </w:p>
         </w:tc>
       </w:tr>
@@ -10670,15 +10643,7 @@
         <w:spacing w:before="40" w:after="40"/>
       </w:pPr>
       <w:r>
-        <w:t>Code postal / Ville : sélection depuis la base communes (</w:t>
-      </w:r>
-      <w:proofErr w:type="spellStart"/>
-      <w:r>
-        <w:t>autocomplétion</w:t>
-      </w:r>
-      <w:proofErr w:type="spellEnd"/>
-      <w:r>
-        <w:t>)</w:t>
+        <w:t>Code postal / Ville : sélection depuis la base communes (autocomplétion)</w:t>
       </w:r>
     </w:p>
     <w:p>
@@ -10820,7 +10785,7 @@
                 <w:noProof/>
               </w:rPr>
               <w:drawing>
-                <wp:inline distT="0" distB="0" distL="0" distR="0" wp14:anchorId="070277D1" wp14:editId="04BB4CB2">
+                <wp:inline distT="0" distB="0" distL="0" distR="0" wp14:anchorId="612E3935" wp14:editId="4555A0C3">
                   <wp:extent cx="5731510" cy="3435350"/>
                   <wp:effectExtent l="0" t="0" r="2540" b="0"/>
                   <wp:docPr id="6" name="Image 6"/>
@@ -10835,7 +10800,7 @@
                           <pic:cNvPicPr/>
                         </pic:nvPicPr>
                         <pic:blipFill>
-                          <a:blip r:embed="rId16"/>
+                          <a:blip r:embed="rId15"/>
                           <a:stretch>
                             <a:fillRect/>
                           </a:stretch>
@@ -11027,7 +10992,6 @@
             </w:tcMar>
           </w:tcPr>
           <w:p>
-            <w:proofErr w:type="spellStart"/>
             <w:r>
               <w:rPr>
                 <w:sz w:val="20"/>
@@ -11035,7 +10999,6 @@
               </w:rPr>
               <w:t>communes.php</w:t>
             </w:r>
-            <w:proofErr w:type="spellEnd"/>
           </w:p>
         </w:tc>
       </w:tr>
@@ -11226,25 +11189,7 @@
           <w:iCs/>
           <w:color w:val="555555"/>
         </w:rPr>
-        <w:t xml:space="preserve">La table est une </w:t>
-      </w:r>
-      <w:proofErr w:type="spellStart"/>
-      <w:r>
-        <w:rPr>
-          <w:i/>
-          <w:iCs/>
-          <w:color w:val="555555"/>
-        </w:rPr>
-        <w:t>copy</w:t>
-      </w:r>
-      <w:proofErr w:type="spellEnd"/>
-      <w:r>
-        <w:rPr>
-          <w:i/>
-          <w:iCs/>
-          <w:color w:val="555555"/>
-        </w:rPr>
-        <w:t xml:space="preserve"> de la table des communes de INSEE.</w:t>
+        <w:t>La table est une copy de la table des communes de INSEE.</w:t>
       </w:r>
     </w:p>
     <w:p>
@@ -11274,7 +11219,7 @@
           <w:noProof/>
         </w:rPr>
         <w:drawing>
-          <wp:inline distT="0" distB="0" distL="0" distR="0" wp14:anchorId="07E36B5A" wp14:editId="3A9A1CE2">
+          <wp:inline distT="0" distB="0" distL="0" distR="0" wp14:anchorId="01053202" wp14:editId="3F5C300C">
             <wp:extent cx="2819794" cy="1257475"/>
             <wp:effectExtent l="0" t="0" r="0" b="0"/>
             <wp:docPr id="9" name="Image 9"/>
@@ -11289,7 +11234,7 @@
                     <pic:cNvPicPr/>
                   </pic:nvPicPr>
                   <pic:blipFill>
-                    <a:blip r:embed="rId17"/>
+                    <a:blip r:embed="rId16"/>
                     <a:stretch>
                       <a:fillRect/>
                     </a:stretch>
@@ -11387,7 +11332,7 @@
                 <w:noProof/>
               </w:rPr>
               <w:drawing>
-                <wp:inline distT="0" distB="0" distL="0" distR="0" wp14:anchorId="73F1189B" wp14:editId="0349F609">
+                <wp:inline distT="0" distB="0" distL="0" distR="0" wp14:anchorId="4EAC147A" wp14:editId="3A9A62A3">
                   <wp:extent cx="5731510" cy="3448050"/>
                   <wp:effectExtent l="0" t="0" r="2540" b="0"/>
                   <wp:docPr id="8" name="Image 8"/>
@@ -11402,7 +11347,7 @@
                           <pic:cNvPicPr/>
                         </pic:nvPicPr>
                         <pic:blipFill>
-                          <a:blip r:embed="rId18"/>
+                          <a:blip r:embed="rId17"/>
                           <a:stretch>
                             <a:fillRect/>
                           </a:stretch>
@@ -11594,7 +11539,6 @@
             </w:tcMar>
           </w:tcPr>
           <w:p>
-            <w:proofErr w:type="spellStart"/>
             <w:r>
               <w:rPr>
                 <w:sz w:val="20"/>
@@ -11602,7 +11546,6 @@
               </w:rPr>
               <w:t>jugearbitre.php</w:t>
             </w:r>
-            <w:proofErr w:type="spellEnd"/>
           </w:p>
         </w:tc>
       </w:tr>
@@ -11685,13 +11628,7 @@
         <w:spacing w:before="60" w:after="60"/>
       </w:pPr>
       <w:r>
-        <w:t xml:space="preserve">Écran central de gestion des Juges-Arbitres. Permet d'importer la liste des JA depuis un fichier Excel FFTT, de visualiser et modifier leurs fiches, et de les activer ou désactiver. Les noms de villes sont normalisés automatiquement. Les coordonnées GPS sont enrichies depuis </w:t>
-      </w:r>
-      <w:r>
-        <w:t>la base commune</w:t>
-      </w:r>
-      <w:r>
-        <w:t>.</w:t>
+        <w:t>Écran central de gestion des Juges-Arbitres. Permet d'importer la liste des JA depuis un fichier Excel FFTT, de visualiser et modifier leurs fiches, et de les activer ou désactiver. Les noms de villes sont normalisés automatiquement. Les coordonnées GPS sont enrichies depuis la base commune.</w:t>
       </w:r>
     </w:p>
     <w:p>
@@ -11805,13 +11742,8 @@
         <w:spacing w:before="40" w:after="40"/>
       </w:pPr>
       <w:r>
-        <w:t xml:space="preserve">Code postal + Ville : avec résolution automatique depuis </w:t>
-      </w:r>
-      <w:proofErr w:type="gramStart"/>
-      <w:r>
-        <w:t>la base communes</w:t>
-      </w:r>
-      <w:proofErr w:type="gramEnd"/>
+        <w:t>Code postal + Ville : avec résolution automatique depuis la base communes</w:t>
+      </w:r>
     </w:p>
     <w:p>
       <w:pPr>
@@ -11951,25 +11883,7 @@
           <w:iCs/>
           <w:color w:val="555555"/>
         </w:rPr>
-        <w:t xml:space="preserve">Les Erreurs sur la ville, due le plus souvent à </w:t>
-      </w:r>
-      <w:proofErr w:type="gramStart"/>
-      <w:r>
-        <w:rPr>
-          <w:i/>
-          <w:iCs/>
-          <w:color w:val="555555"/>
-        </w:rPr>
-        <w:t>des rattachement</w:t>
-      </w:r>
-      <w:proofErr w:type="gramEnd"/>
-      <w:r>
-        <w:rPr>
-          <w:i/>
-          <w:iCs/>
-          <w:color w:val="555555"/>
-        </w:rPr>
-        <w:t xml:space="preserve"> de commune. </w:t>
+        <w:t xml:space="preserve">Les Erreurs sur la ville, due le plus souvent à des rattachement de commune. </w:t>
       </w:r>
     </w:p>
     <w:p>
@@ -12054,10 +11968,10 @@
                 <w:noProof/>
               </w:rPr>
               <w:drawing>
-                <wp:inline distT="0" distB="0" distL="0" distR="0" wp14:anchorId="66FE337B" wp14:editId="4109F117">
-                  <wp:extent cx="5731510" cy="2700655"/>
-                  <wp:effectExtent l="0" t="0" r="2540" b="4445"/>
-                  <wp:docPr id="10" name="Image 10"/>
+                <wp:inline distT="0" distB="0" distL="0" distR="0" wp14:anchorId="1785110A" wp14:editId="66EB7B9B">
+                  <wp:extent cx="5731510" cy="1779270"/>
+                  <wp:effectExtent l="0" t="0" r="2540" b="0"/>
+                  <wp:docPr id="31" name="Image 31"/>
                   <wp:cNvGraphicFramePr>
                     <a:graphicFrameLocks xmlns:a="http://schemas.openxmlformats.org/drawingml/2006/main" noChangeAspect="1"/>
                   </wp:cNvGraphicFramePr>
@@ -12069,7 +11983,7 @@
                           <pic:cNvPicPr/>
                         </pic:nvPicPr>
                         <pic:blipFill>
-                          <a:blip r:embed="rId19"/>
+                          <a:blip r:embed="rId18"/>
                           <a:stretch>
                             <a:fillRect/>
                           </a:stretch>
@@ -12077,7 +11991,7 @@
                         <pic:spPr>
                           <a:xfrm>
                             <a:off x="0" y="0"/>
-                            <a:ext cx="5731510" cy="2700655"/>
+                            <a:ext cx="5731510" cy="1779270"/>
                           </a:xfrm>
                           <a:prstGeom prst="rect">
                             <a:avLst/>
@@ -12100,7 +12014,7 @@
                 <w:noProof/>
               </w:rPr>
               <w:drawing>
-                <wp:inline distT="0" distB="0" distL="0" distR="0" wp14:anchorId="7A53719C" wp14:editId="6E3A78F6">
+                <wp:inline distT="0" distB="0" distL="0" distR="0" wp14:anchorId="1FC988E0" wp14:editId="1194AAD5">
                   <wp:extent cx="2848373" cy="342948"/>
                   <wp:effectExtent l="0" t="0" r="0" b="0"/>
                   <wp:docPr id="11" name="Image 11"/>
@@ -12115,7 +12029,7 @@
                           <pic:cNvPicPr/>
                         </pic:nvPicPr>
                         <pic:blipFill>
-                          <a:blip r:embed="rId20"/>
+                          <a:blip r:embed="rId19"/>
                           <a:stretch>
                             <a:fillRect/>
                           </a:stretch>
@@ -12307,7 +12221,6 @@
             </w:tcMar>
           </w:tcPr>
           <w:p>
-            <w:proofErr w:type="spellStart"/>
             <w:r>
               <w:rPr>
                 <w:sz w:val="20"/>
@@ -12315,7 +12228,6 @@
               </w:rPr>
               <w:t>club.php</w:t>
             </w:r>
-            <w:proofErr w:type="spellEnd"/>
           </w:p>
         </w:tc>
       </w:tr>
@@ -12398,15 +12310,7 @@
         <w:spacing w:before="60" w:after="60"/>
       </w:pPr>
       <w:r>
-        <w:t xml:space="preserve">Gestion de la liste des clubs affiliés à la ligue. Supporte l'import depuis un fichier Excel au format FFTT (édition 204, comité D76). L'import effectue un </w:t>
-      </w:r>
-      <w:proofErr w:type="spellStart"/>
-      <w:r>
-        <w:t>upsert</w:t>
-      </w:r>
-      <w:proofErr w:type="spellEnd"/>
-      <w:r>
-        <w:t xml:space="preserve"> : mise à jour si le club existe déjà, création sinon.</w:t>
+        <w:t>Gestion de la liste des clubs affiliés à la ligue. Supporte l'import depuis un fichier Excel au format FFTT (édition 204, comité D76). L'import effectue un upsert : mise à jour si le club existe déjà, création sinon.</w:t>
       </w:r>
     </w:p>
     <w:p>
@@ -12468,15 +12372,7 @@
         <w:spacing w:before="40" w:after="40"/>
       </w:pPr>
       <w:r>
-        <w:t>Tableau des clubs : N° FFTT (</w:t>
-      </w:r>
-      <w:proofErr w:type="spellStart"/>
-      <w:r>
-        <w:t>Id_Club</w:t>
-      </w:r>
-      <w:proofErr w:type="spellEnd"/>
-      <w:r>
-        <w:t>), Nom du club</w:t>
+        <w:t>Tableau des clubs : N° FFTT (Id_Club), Nom du club</w:t>
       </w:r>
     </w:p>
     <w:p>
@@ -12579,10 +12475,10 @@
                 <w:noProof/>
               </w:rPr>
               <w:drawing>
-                <wp:inline distT="0" distB="0" distL="0" distR="0" wp14:anchorId="5387EF3B" wp14:editId="20F18A0B">
-                  <wp:extent cx="5731510" cy="2690495"/>
-                  <wp:effectExtent l="0" t="0" r="2540" b="0"/>
-                  <wp:docPr id="12" name="Image 12"/>
+                <wp:inline distT="0" distB="0" distL="0" distR="0" wp14:anchorId="60FA3DF0" wp14:editId="7B271A51">
+                  <wp:extent cx="5731510" cy="3216275"/>
+                  <wp:effectExtent l="0" t="0" r="2540" b="3175"/>
+                  <wp:docPr id="32" name="Image 32"/>
                   <wp:cNvGraphicFramePr>
                     <a:graphicFrameLocks xmlns:a="http://schemas.openxmlformats.org/drawingml/2006/main" noChangeAspect="1"/>
                   </wp:cNvGraphicFramePr>
@@ -12594,7 +12490,7 @@
                           <pic:cNvPicPr/>
                         </pic:nvPicPr>
                         <pic:blipFill>
-                          <a:blip r:embed="rId21"/>
+                          <a:blip r:embed="rId20"/>
                           <a:stretch>
                             <a:fillRect/>
                           </a:stretch>
@@ -12602,7 +12498,7 @@
                         <pic:spPr>
                           <a:xfrm>
                             <a:off x="0" y="0"/>
-                            <a:ext cx="5731510" cy="2690495"/>
+                            <a:ext cx="5731510" cy="3216275"/>
                           </a:xfrm>
                           <a:prstGeom prst="rect">
                             <a:avLst/>
@@ -12786,7 +12682,6 @@
             </w:tcMar>
           </w:tcPr>
           <w:p>
-            <w:proofErr w:type="spellStart"/>
             <w:r>
               <w:rPr>
                 <w:sz w:val="20"/>
@@ -12794,7 +12689,6 @@
               </w:rPr>
               <w:t>utilisateur.php</w:t>
             </w:r>
-            <w:proofErr w:type="spellEnd"/>
           </w:p>
         </w:tc>
       </w:tr>
@@ -12877,15 +12771,7 @@
         <w:spacing w:before="60" w:after="60"/>
       </w:pPr>
       <w:r>
-        <w:t xml:space="preserve">Création et administration des comptes utilisateurs de l'application. Chaque compte possède un rôle (Administrateur, Nominateur ou Consultation) qui détermine les fonctionnalités accessibles. Les mots de passe sont stockés de manière sécurisée (hachage </w:t>
-      </w:r>
-      <w:proofErr w:type="spellStart"/>
-      <w:r>
-        <w:t>bcrypt</w:t>
-      </w:r>
-      <w:proofErr w:type="spellEnd"/>
-      <w:r>
-        <w:t>).</w:t>
+        <w:t>Création et administration des comptes utilisateurs de l'application. Chaque compte possède un rôle (Administrateur, Nominateur ou Consultation) qui détermine les fonctionnalités accessibles. Les mots de passe sont stockés de manière sécurisée (hachage bcrypt).</w:t>
       </w:r>
     </w:p>
     <w:p>
@@ -12973,15 +12859,7 @@
         <w:spacing w:before="40" w:after="40"/>
       </w:pPr>
       <w:r>
-        <w:t xml:space="preserve">Mot de passe : champ de saisie (laissé </w:t>
-      </w:r>
-      <w:proofErr w:type="spellStart"/>
-      <w:r>
-        <w:t>vide</w:t>
-      </w:r>
-      <w:proofErr w:type="spellEnd"/>
-      <w:r>
-        <w:t xml:space="preserve"> = pas de modification)</w:t>
+        <w:t>Mot de passe : champ de saisie (laissé vide = pas de modification)</w:t>
       </w:r>
     </w:p>
     <w:p>
@@ -13110,7 +12988,7 @@
                 <w:noProof/>
               </w:rPr>
               <w:drawing>
-                <wp:inline distT="0" distB="0" distL="0" distR="0" wp14:anchorId="730E5C2B" wp14:editId="08F2C075">
+                <wp:inline distT="0" distB="0" distL="0" distR="0" wp14:anchorId="2BC07663" wp14:editId="118A6BCA">
                   <wp:extent cx="5731510" cy="3205480"/>
                   <wp:effectExtent l="0" t="0" r="2540" b="0"/>
                   <wp:docPr id="15" name="Image 15"/>
@@ -13125,7 +13003,7 @@
                           <pic:cNvPicPr/>
                         </pic:nvPicPr>
                         <pic:blipFill>
-                          <a:blip r:embed="rId22"/>
+                          <a:blip r:embed="rId21"/>
                           <a:stretch>
                             <a:fillRect/>
                           </a:stretch>
@@ -13317,7 +13195,6 @@
             </w:tcMar>
           </w:tcPr>
           <w:p>
-            <w:proofErr w:type="spellStart"/>
             <w:r>
               <w:rPr>
                 <w:sz w:val="20"/>
@@ -13325,7 +13202,6 @@
               </w:rPr>
               <w:t>division.php</w:t>
             </w:r>
-            <w:proofErr w:type="spellEnd"/>
           </w:p>
         </w:tc>
       </w:tr>
@@ -13581,7 +13457,7 @@
                 <w:noProof/>
               </w:rPr>
               <w:drawing>
-                <wp:inline distT="0" distB="0" distL="0" distR="0" wp14:anchorId="5D573238" wp14:editId="752E69D4">
+                <wp:inline distT="0" distB="0" distL="0" distR="0" wp14:anchorId="0655E43A" wp14:editId="28212F42">
                   <wp:extent cx="5731510" cy="2575560"/>
                   <wp:effectExtent l="0" t="0" r="2540" b="0"/>
                   <wp:docPr id="16" name="Image 16"/>
@@ -13596,7 +13472,7 @@
                           <pic:cNvPicPr/>
                         </pic:nvPicPr>
                         <pic:blipFill>
-                          <a:blip r:embed="rId23"/>
+                          <a:blip r:embed="rId22"/>
                           <a:stretch>
                             <a:fillRect/>
                           </a:stretch>
@@ -13788,7 +13664,6 @@
             </w:tcMar>
           </w:tcPr>
           <w:p>
-            <w:proofErr w:type="spellStart"/>
             <w:r>
               <w:rPr>
                 <w:sz w:val="20"/>
@@ -13796,7 +13671,6 @@
               </w:rPr>
               <w:t>import_rencontres.php</w:t>
             </w:r>
-            <w:proofErr w:type="spellEnd"/>
           </w:p>
         </w:tc>
       </w:tr>
@@ -14044,10 +13918,10 @@
                 <w:noProof/>
               </w:rPr>
               <w:drawing>
-                <wp:inline distT="0" distB="0" distL="0" distR="0" wp14:anchorId="7D19D14E" wp14:editId="627F8B2E">
-                  <wp:extent cx="5731510" cy="3308985"/>
-                  <wp:effectExtent l="0" t="0" r="2540" b="5715"/>
-                  <wp:docPr id="17" name="Image 17"/>
+                <wp:inline distT="0" distB="0" distL="0" distR="0" wp14:anchorId="60CC7FA7" wp14:editId="204A21A1">
+                  <wp:extent cx="5731510" cy="2041525"/>
+                  <wp:effectExtent l="0" t="0" r="2540" b="0"/>
+                  <wp:docPr id="33" name="Image 33"/>
                   <wp:cNvGraphicFramePr>
                     <a:graphicFrameLocks xmlns:a="http://schemas.openxmlformats.org/drawingml/2006/main" noChangeAspect="1"/>
                   </wp:cNvGraphicFramePr>
@@ -14059,7 +13933,7 @@
                           <pic:cNvPicPr/>
                         </pic:nvPicPr>
                         <pic:blipFill>
-                          <a:blip r:embed="rId24"/>
+                          <a:blip r:embed="rId23"/>
                           <a:stretch>
                             <a:fillRect/>
                           </a:stretch>
@@ -14067,7 +13941,7 @@
                         <pic:spPr>
                           <a:xfrm>
                             <a:off x="0" y="0"/>
-                            <a:ext cx="5731510" cy="3308985"/>
+                            <a:ext cx="5731510" cy="2041525"/>
                           </a:xfrm>
                           <a:prstGeom prst="rect">
                             <a:avLst/>
@@ -14092,7 +13966,7 @@
           <w:noProof/>
         </w:rPr>
         <w:drawing>
-          <wp:inline distT="0" distB="0" distL="0" distR="0" wp14:anchorId="767CC670" wp14:editId="2BD59C4B">
+          <wp:inline distT="0" distB="0" distL="0" distR="0" wp14:anchorId="256DDD32" wp14:editId="02CB7B3E">
             <wp:extent cx="905001" cy="419158"/>
             <wp:effectExtent l="0" t="0" r="9525" b="0"/>
             <wp:docPr id="19" name="Image 19"/>
@@ -14107,7 +13981,7 @@
                     <pic:cNvPicPr/>
                   </pic:nvPicPr>
                   <pic:blipFill>
-                    <a:blip r:embed="rId25"/>
+                    <a:blip r:embed="rId24"/>
                     <a:stretch>
                       <a:fillRect/>
                     </a:stretch>
@@ -14134,7 +14008,7 @@
           <w:noProof/>
         </w:rPr>
         <w:drawing>
-          <wp:inline distT="0" distB="0" distL="0" distR="0" wp14:anchorId="6EFAAF16" wp14:editId="332C1CC9">
+          <wp:inline distT="0" distB="0" distL="0" distR="0" wp14:anchorId="5343B637" wp14:editId="67B23AC4">
             <wp:extent cx="5731510" cy="2597150"/>
             <wp:effectExtent l="0" t="0" r="2540" b="0"/>
             <wp:docPr id="18" name="Image 18"/>
@@ -14149,7 +14023,7 @@
                     <pic:cNvPicPr/>
                   </pic:nvPicPr>
                   <pic:blipFill>
-                    <a:blip r:embed="rId26"/>
+                    <a:blip r:embed="rId25"/>
                     <a:stretch>
                       <a:fillRect/>
                     </a:stretch>
@@ -14338,7 +14212,6 @@
             </w:tcMar>
           </w:tcPr>
           <w:p>
-            <w:proofErr w:type="spellStart"/>
             <w:r>
               <w:rPr>
                 <w:sz w:val="20"/>
@@ -14346,7 +14219,6 @@
               </w:rPr>
               <w:t>disponibilite_ja.php</w:t>
             </w:r>
-            <w:proofErr w:type="spellEnd"/>
           </w:p>
         </w:tc>
       </w:tr>
@@ -14403,23 +14275,7 @@
                 <w:sz w:val="20"/>
                 <w:szCs w:val="20"/>
               </w:rPr>
-              <w:t xml:space="preserve">Public – accessible via lien </w:t>
-            </w:r>
-            <w:proofErr w:type="spellStart"/>
-            <w:r>
-              <w:rPr>
-                <w:sz w:val="20"/>
-                <w:szCs w:val="20"/>
-              </w:rPr>
-              <w:t>tokenisé</w:t>
-            </w:r>
-            <w:proofErr w:type="spellEnd"/>
-            <w:r>
-              <w:rPr>
-                <w:sz w:val="20"/>
-                <w:szCs w:val="20"/>
-              </w:rPr>
-              <w:t xml:space="preserve"> envoyé par email</w:t>
+              <w:t>Public – accessible via lien tokenisé envoyé par email</w:t>
             </w:r>
           </w:p>
         </w:tc>
@@ -14445,15 +14301,7 @@
         <w:spacing w:before="60" w:after="60"/>
       </w:pPr>
       <w:r>
-        <w:t>Page publique (sans connexion requise) permettant à chaque Juge-Arbitre de déclarer ses disponibilités pour les journées de la saison en cours. Elle est accessible via un lien personnalisé (</w:t>
-      </w:r>
-      <w:proofErr w:type="spellStart"/>
-      <w:r>
-        <w:t>token</w:t>
-      </w:r>
-      <w:proofErr w:type="spellEnd"/>
-      <w:r>
-        <w:t xml:space="preserve"> obfusqué) envoyé par email au JA ou directement depuis l'interface nominateur.</w:t>
+        <w:t>Page publique (sans connexion requise) permettant à chaque Juge-Arbitre de déclarer ses disponibilités pour les journées de la saison en cours. Elle est accessible via un lien personnalisé (token obfusqué) envoyé par email au JA ou directement depuis l'interface nominateur.</w:t>
       </w:r>
     </w:p>
     <w:p>
@@ -14640,8 +14488,11 @@
               <w:jc w:val="center"/>
             </w:pPr>
             <w:r>
+              <w:rPr>
+                <w:noProof/>
+              </w:rPr>
               <w:drawing>
-                <wp:inline distT="0" distB="0" distL="0" distR="0" wp14:anchorId="70A27913" wp14:editId="240BD453">
+                <wp:inline distT="0" distB="0" distL="0" distR="0" wp14:anchorId="3B85596E" wp14:editId="05C49DD7">
                   <wp:extent cx="5731510" cy="4543425"/>
                   <wp:effectExtent l="0" t="0" r="2540" b="9525"/>
                   <wp:docPr id="5" name="Image 5"/>
@@ -14656,7 +14507,7 @@
                           <pic:cNvPicPr/>
                         </pic:nvPicPr>
                         <pic:blipFill>
-                          <a:blip r:embed="rId27"/>
+                          <a:blip r:embed="rId26"/>
                           <a:stretch>
                             <a:fillRect/>
                           </a:stretch>
@@ -14682,8 +14533,11 @@
     </w:tbl>
     <w:p>
       <w:r>
+        <w:rPr>
+          <w:noProof/>
+        </w:rPr>
         <w:drawing>
-          <wp:inline distT="0" distB="0" distL="0" distR="0" wp14:anchorId="21C7EE90" wp14:editId="6827BAF1">
+          <wp:inline distT="0" distB="0" distL="0" distR="0" wp14:anchorId="62E80284" wp14:editId="79B571BE">
             <wp:extent cx="3569818" cy="1637386"/>
             <wp:effectExtent l="0" t="0" r="0" b="1270"/>
             <wp:docPr id="25" name="Image 25"/>
@@ -14698,7 +14552,7 @@
                     <pic:cNvPicPr/>
                   </pic:nvPicPr>
                   <pic:blipFill>
-                    <a:blip r:embed="rId28"/>
+                    <a:blip r:embed="rId27"/>
                     <a:stretch>
                       <a:fillRect/>
                     </a:stretch>
@@ -14721,9 +14575,12 @@
     </w:p>
     <w:p>
       <w:r>
+        <w:rPr>
+          <w:noProof/>
+        </w:rPr>
         <w:lastRenderedPageBreak/>
         <w:drawing>
-          <wp:inline distT="0" distB="0" distL="0" distR="0" wp14:anchorId="379E0AC5" wp14:editId="3E9FEAE0">
+          <wp:inline distT="0" distB="0" distL="0" distR="0" wp14:anchorId="40D98687" wp14:editId="740AB04C">
             <wp:extent cx="2435962" cy="2469619"/>
             <wp:effectExtent l="0" t="0" r="2540" b="6985"/>
             <wp:docPr id="30" name="Image 30"/>
@@ -14738,7 +14595,7 @@
                     <pic:cNvPicPr/>
                   </pic:nvPicPr>
                   <pic:blipFill>
-                    <a:blip r:embed="rId29"/>
+                    <a:blip r:embed="rId28"/>
                     <a:stretch>
                       <a:fillRect/>
                     </a:stretch>
@@ -14927,7 +14784,6 @@
             </w:tcMar>
           </w:tcPr>
           <w:p>
-            <w:proofErr w:type="spellStart"/>
             <w:r>
               <w:rPr>
                 <w:sz w:val="20"/>
@@ -14935,7 +14791,6 @@
               </w:rPr>
               <w:t>encours.php</w:t>
             </w:r>
-            <w:proofErr w:type="spellEnd"/>
           </w:p>
         </w:tc>
       </w:tr>
@@ -15144,7 +14999,7 @@
                 <w:noProof/>
               </w:rPr>
               <w:drawing>
-                <wp:inline distT="0" distB="0" distL="0" distR="0" wp14:anchorId="66054A9C" wp14:editId="740C414C">
+                <wp:inline distT="0" distB="0" distL="0" distR="0" wp14:anchorId="591A49D8" wp14:editId="608FD595">
                   <wp:extent cx="5731510" cy="3557905"/>
                   <wp:effectExtent l="0" t="0" r="2540" b="4445"/>
                   <wp:docPr id="21" name="Image 21"/>
@@ -15159,7 +15014,7 @@
                           <pic:cNvPicPr/>
                         </pic:nvPicPr>
                         <pic:blipFill>
-                          <a:blip r:embed="rId30"/>
+                          <a:blip r:embed="rId29"/>
                           <a:stretch>
                             <a:fillRect/>
                           </a:stretch>
@@ -15185,58 +15040,17 @@
     </w:tbl>
     <w:p>
       <w:pPr>
-        <w:sectPr>
-          <w:headerReference w:type="default" r:id="rId31"/>
-          <w:footerReference w:type="default" r:id="rId32"/>
-          <w:pgSz w:w="11906" w:h="16838"/>
-          <w:pgMar w:top="1440" w:right="1440" w:bottom="1440" w:left="1440" w:header="708" w:footer="708" w:gutter="0"/>
-          <w:cols w:space="720"/>
-          <w:docGrid w:linePitch="360"/>
-        </w:sectPr>
-      </w:pPr>
-    </w:p>
-    <w:p>
-      <w:pPr>
-        <w:pStyle w:val="Titre1"/>
-        <w:pageBreakBefore/>
-        <w:shd w:val="clear" w:color="auto" w:fill="1A3A6B"/>
-        <w:ind w:left="200"/>
-      </w:pPr>
-      <w:bookmarkStart w:id="69" w:name="_Toc232147304"/>
-      <w:r>
-        <w:lastRenderedPageBreak/>
-        <w:t>Partie Nominateur</w:t>
-      </w:r>
-      <w:bookmarkEnd w:id="69"/>
-    </w:p>
-    <w:p>
-      <w:pPr>
-        <w:spacing w:before="60" w:after="60"/>
-      </w:pPr>
-      <w:r>
-        <w:rPr>
-          <w:color w:val="444444"/>
-        </w:rPr>
-        <w:t>Cette partie regroupe les écrans dédiés au processus de nomination des Juges-Arbitres. Elle est accessible aux utilisateurs ayant le rôle "Nominateur" ou "Administrateur".</w:t>
-      </w:r>
-    </w:p>
-    <w:p>
-      <w:pPr>
-        <w:spacing w:before="100" w:after="100"/>
-      </w:pPr>
-    </w:p>
-    <w:p>
-      <w:pPr>
         <w:pStyle w:val="Titre2"/>
         <w:pBdr>
           <w:bottom w:val="single" w:sz="4" w:space="0" w:color="2557A7"/>
         </w:pBdr>
       </w:pPr>
-      <w:bookmarkStart w:id="70" w:name="_Toc232147305"/>
-      <w:r>
-        <w:t>E020 – Menu nominateur</w:t>
-      </w:r>
-      <w:bookmarkEnd w:id="70"/>
+      <w:bookmarkStart w:id="69" w:name="_Toc_E016"/>
+      <w:r>
+        <w:lastRenderedPageBreak/>
+        <w:t>E016 – Gestion des messages</w:t>
+      </w:r>
+      <w:bookmarkEnd w:id="69"/>
     </w:p>
     <w:p>
       <w:pPr>
@@ -15317,7 +15131,7 @@
                 <w:sz w:val="20"/>
                 <w:szCs w:val="20"/>
               </w:rPr>
-              <w:t>E020</w:t>
+              <w:t>E016</w:t>
             </w:r>
           </w:p>
         </w:tc>
@@ -15375,17 +15189,8 @@
                 <w:sz w:val="20"/>
                 <w:szCs w:val="20"/>
               </w:rPr>
-              <w:t>Nominateur/</w:t>
-            </w:r>
-            <w:proofErr w:type="spellStart"/>
-            <w:r>
-              <w:rPr>
-                <w:sz w:val="20"/>
-                <w:szCs w:val="20"/>
-              </w:rPr>
-              <w:t>menu.php</w:t>
-            </w:r>
-            <w:proofErr w:type="spellEnd"/>
+              <w:t>Nominateur/messagerie.php</w:t>
+            </w:r>
           </w:p>
         </w:tc>
       </w:tr>
@@ -15442,7 +15247,7 @@
                 <w:sz w:val="20"/>
                 <w:szCs w:val="20"/>
               </w:rPr>
-              <w:t>Utilisateur connecté (Nominateur ou Administrateur)</w:t>
+              <w:t>Administrateur connecté</w:t>
             </w:r>
           </w:p>
         </w:tc>
@@ -15457,29 +15262,29 @@
       <w:pPr>
         <w:pStyle w:val="Titre3"/>
       </w:pPr>
-      <w:bookmarkStart w:id="71" w:name="_Toc232147306"/>
+      <w:bookmarkStart w:id="70" w:name="_Toc_E016_Desc"/>
       <w:r>
         <w:t>Description</w:t>
       </w:r>
+      <w:bookmarkEnd w:id="70"/>
+    </w:p>
+    <w:p>
+      <w:pPr>
+        <w:spacing w:before="60" w:after="60"/>
+      </w:pPr>
+      <w:r>
+        <w:t>Permet de créer, modifier et supprimer les modèles de messages utilisés pour l’envoi automatique aux Juges-Arbitres. Chaque modèle est associé à un type d’envoi et contient un sujet et un corps de message avec des marqueurs dynamiques.</w:t>
+      </w:r>
+    </w:p>
+    <w:p>
+      <w:pPr>
+        <w:pStyle w:val="Titre3"/>
+      </w:pPr>
+      <w:bookmarkStart w:id="71" w:name="_Toc_E016_Champs"/>
+      <w:r>
+        <w:t>Champs et fonctionnalités</w:t>
+      </w:r>
       <w:bookmarkEnd w:id="71"/>
-    </w:p>
-    <w:p>
-      <w:pPr>
-        <w:spacing w:before="60" w:after="60"/>
-      </w:pPr>
-      <w:r>
-        <w:t>Menu principal de l'interface nominateur. Il donne accès aux fonctions de nomination des Juges-Arbitres. Les utilisateurs ayant le rôle "Administrateur" voient également le bouton "Menu administrateur" pour basculer vers l'interface de paramétrage.</w:t>
-      </w:r>
-    </w:p>
-    <w:p>
-      <w:pPr>
-        <w:pStyle w:val="Titre3"/>
-      </w:pPr>
-      <w:bookmarkStart w:id="72" w:name="_Toc232147307"/>
-      <w:r>
-        <w:t>Champs et fonctionnalités</w:t>
-      </w:r>
-      <w:bookmarkEnd w:id="72"/>
     </w:p>
     <w:p>
       <w:pPr>
@@ -15491,7 +15296,7 @@
         <w:spacing w:before="40" w:after="40"/>
       </w:pPr>
       <w:r>
-        <w:t>Bouton Juge-Arbitre : accès à la gestion des fiches JA (E007)</w:t>
+        <w:t>Liste des messages : tableau (Type, Sujet, Utilisateur) avec sélection par clic</w:t>
       </w:r>
     </w:p>
     <w:p>
@@ -15504,7 +15309,7 @@
         <w:spacing w:before="40" w:after="40"/>
       </w:pPr>
       <w:r>
-        <w:t>Bouton Disponibilités JA : saisie/consultation des disponibilités par département (E021)</w:t>
+        <w:t>Id : identifiant unique (lecture seule, attribué automatiquement)</w:t>
       </w:r>
     </w:p>
     <w:p>
@@ -15517,7 +15322,7 @@
         <w:spacing w:before="40" w:after="40"/>
       </w:pPr>
       <w:r>
-        <w:t>Bouton Nomination JA : interface de nomination automatique et manuelle (E022)</w:t>
+        <w:t>Type : menu déroulant chargé depuis l’ENUM de la base de données (Disponibilites, Convocation, Rappel dispo, Liste nomination)</w:t>
       </w:r>
     </w:p>
     <w:p>
@@ -15530,6 +15335,571 @@
         <w:spacing w:before="40" w:after="40"/>
       </w:pPr>
       <w:r>
+        <w:t>Sujet : intitulé du message (150 caractères max)</w:t>
+      </w:r>
+    </w:p>
+    <w:p>
+      <w:pPr>
+        <w:pStyle w:val="Paragraphedeliste"/>
+        <w:numPr>
+          <w:ilvl w:val="0"/>
+          <w:numId w:val="2"/>
+        </w:numPr>
+        <w:spacing w:before="40" w:after="40"/>
+      </w:pPr>
+      <w:r>
+        <w:t>Message : corps du message avec prise en charge des marqueurs dynamiques</w:t>
+      </w:r>
+    </w:p>
+    <w:p>
+      <w:pPr>
+        <w:pStyle w:val="Paragraphedeliste"/>
+        <w:numPr>
+          <w:ilvl w:val="0"/>
+          <w:numId w:val="2"/>
+        </w:numPr>
+        <w:spacing w:before="40" w:after="40"/>
+      </w:pPr>
+      <w:r>
+        <w:t>Bouton Nouveau : vide le formulaire pour créer un nouveau modèle</w:t>
+      </w:r>
+    </w:p>
+    <w:p>
+      <w:pPr>
+        <w:pStyle w:val="Paragraphedeliste"/>
+        <w:numPr>
+          <w:ilvl w:val="0"/>
+          <w:numId w:val="2"/>
+        </w:numPr>
+        <w:spacing w:before="40" w:after="40"/>
+      </w:pPr>
+      <w:r>
+        <w:t>Bouton Enregistrer : sauvegarde en base de données (création ou mise à jour)</w:t>
+      </w:r>
+    </w:p>
+    <w:p>
+      <w:pPr>
+        <w:pStyle w:val="Paragraphedeliste"/>
+        <w:numPr>
+          <w:ilvl w:val="0"/>
+          <w:numId w:val="2"/>
+        </w:numPr>
+        <w:spacing w:before="40" w:after="40"/>
+      </w:pPr>
+      <w:r>
+        <w:t>Bouton Supprimer : supprime le modèle sélectionné (confirmation requise)</w:t>
+      </w:r>
+    </w:p>
+    <w:p>
+      <w:pPr>
+        <w:pStyle w:val="Paragraphedeliste"/>
+        <w:numPr>
+          <w:ilvl w:val="0"/>
+          <w:numId w:val="2"/>
+        </w:numPr>
+        <w:spacing w:before="40" w:after="40"/>
+      </w:pPr>
+      <w:r>
+        <w:t>Cartouche des marqueurs : liste cliquable des marqueurs disponibles groupés par type ; un clic insère le marqueur à la position du curseur dans le champ Sujet ou Message actif</w:t>
+      </w:r>
+    </w:p>
+    <w:p>
+      <w:pPr>
+        <w:pStyle w:val="Titre3"/>
+      </w:pPr>
+      <w:bookmarkStart w:id="72" w:name="_Toc_E016_Marqueurs"/>
+      <w:r>
+        <w:t>Marqueurs disponibles</w:t>
+      </w:r>
+      <w:bookmarkEnd w:id="72"/>
+    </w:p>
+    <w:p>
+      <w:pPr>
+        <w:spacing w:before="60" w:after="60"/>
+      </w:pPr>
+      <w:r>
+        <w:t>Communs à tous les types : {PRENOM}  {NOM}  {NOM_COMPLET}  {ID_JA}  {UTI_NOM}  {UTI_PRENOM}</w:t>
+      </w:r>
+    </w:p>
+    <w:p>
+      <w:pPr>
+        <w:spacing w:before="60" w:after="60"/>
+      </w:pPr>
+      <w:r>
+        <w:t>Convocation : {DATE}  {HEURE}  {JOURNEE}  {POULE}  {DIVISION}  {DOM}  {EXT}  {SALLE_NOM}  {SALLE_ADRESSE}  {SALLE_CP}  {SALLE_VILLE}  {CORR_NOM}  {CORR_EMAIL}  {CORR_TEL}</w:t>
+      </w:r>
+    </w:p>
+    <w:p>
+      <w:pPr>
+        <w:spacing w:before="60" w:after="60"/>
+      </w:pPr>
+      <w:r>
+        <w:t>Liste nomination : {LISTE_NOMINATIONS} (tableau HTML généré automatiquement)</w:t>
+      </w:r>
+    </w:p>
+    <w:p>
+      <w:pPr>
+        <w:pStyle w:val="Titre3"/>
+      </w:pPr>
+      <w:bookmarkStart w:id="73" w:name="_Toc_E016_Rem"/>
+      <w:r>
+        <w:t>Remarques</w:t>
+      </w:r>
+      <w:bookmarkEnd w:id="73"/>
+    </w:p>
+    <w:p>
+      <w:pPr>
+        <w:spacing w:before="60" w:after="60"/>
+      </w:pPr>
+      <w:r>
+        <w:t>Les marqueurs sont remplacés lors de l’envoi par les données réelles du JA destinataire. L’utilisateur associé au modèle est automatiquement celui de la session courante. Les types disponibles sont lus depuis l’ENUM de la table messagerie.</w:t>
+      </w:r>
+    </w:p>
+    <w:p>
+      <w:pPr>
+        <w:rPr>
+          <w:b/>
+          <w:bCs/>
+          <w:color w:val="374151"/>
+        </w:rPr>
+      </w:pPr>
+      <w:bookmarkStart w:id="74" w:name="_Toc_E016_Ecran"/>
+      <w:r>
+        <w:br w:type="page"/>
+      </w:r>
+    </w:p>
+    <w:p>
+      <w:pPr>
+        <w:pStyle w:val="Titre3"/>
+      </w:pPr>
+      <w:r>
+        <w:lastRenderedPageBreak/>
+        <w:t>Copie d’écran</w:t>
+      </w:r>
+      <w:bookmarkEnd w:id="74"/>
+    </w:p>
+    <w:p>
+      <w:pPr>
+        <w:spacing w:before="100" w:after="100"/>
+      </w:pPr>
+    </w:p>
+    <w:tbl>
+      <w:tblPr>
+        <w:tblW w:w="9026" w:type="dxa"/>
+        <w:tblBorders>
+          <w:top w:val="single" w:sz="4" w:space="0" w:color="auto"/>
+          <w:left w:val="single" w:sz="4" w:space="0" w:color="auto"/>
+          <w:bottom w:val="single" w:sz="4" w:space="0" w:color="auto"/>
+          <w:right w:val="single" w:sz="4" w:space="0" w:color="auto"/>
+        </w:tblBorders>
+        <w:tblLook w:val="04A0" w:firstRow="1" w:lastRow="0" w:firstColumn="1" w:lastColumn="0" w:noHBand="0" w:noVBand="1"/>
+      </w:tblPr>
+      <w:tblGrid>
+        <w:gridCol w:w="9430"/>
+      </w:tblGrid>
+      <w:tr>
+        <w:tc>
+          <w:tcPr>
+            <w:tcW w:w="9026" w:type="dxa"/>
+            <w:tcBorders>
+              <w:top w:val="single" w:sz="4" w:space="0" w:color="AAAACC"/>
+              <w:left w:val="single" w:sz="4" w:space="0" w:color="AAAACC"/>
+              <w:bottom w:val="single" w:sz="4" w:space="0" w:color="AAAACC"/>
+              <w:right w:val="single" w:sz="4" w:space="0" w:color="AAAACC"/>
+            </w:tcBorders>
+            <w:shd w:val="clear" w:color="auto" w:fill="F5F5FF"/>
+            <w:tcMar>
+              <w:top w:w="200" w:type="dxa"/>
+              <w:left w:w="200" w:type="dxa"/>
+              <w:bottom w:w="200" w:type="dxa"/>
+              <w:right w:w="200" w:type="dxa"/>
+            </w:tcMar>
+            <w:vAlign w:val="center"/>
+          </w:tcPr>
+          <w:p>
+            <w:pPr>
+              <w:spacing w:before="400" w:after="400"/>
+              <w:jc w:val="center"/>
+            </w:pPr>
+            <w:r>
+              <w:drawing>
+                <wp:inline distT="0" distB="0" distL="0" distR="0" wp14:anchorId="6F6A086F" wp14:editId="51D2855B">
+                  <wp:extent cx="5731510" cy="2979420"/>
+                  <wp:effectExtent l="0" t="0" r="2540" b="0"/>
+                  <wp:docPr id="34" name="Image 34"/>
+                  <wp:cNvGraphicFramePr>
+                    <a:graphicFrameLocks xmlns:a="http://schemas.openxmlformats.org/drawingml/2006/main" noChangeAspect="1"/>
+                  </wp:cNvGraphicFramePr>
+                  <a:graphic xmlns:a="http://schemas.openxmlformats.org/drawingml/2006/main">
+                    <a:graphicData uri="http://schemas.openxmlformats.org/drawingml/2006/picture">
+                      <pic:pic xmlns:pic="http://schemas.openxmlformats.org/drawingml/2006/picture">
+                        <pic:nvPicPr>
+                          <pic:cNvPr id="1" name=""/>
+                          <pic:cNvPicPr/>
+                        </pic:nvPicPr>
+                        <pic:blipFill>
+                          <a:blip r:embed="rId30"/>
+                          <a:stretch>
+                            <a:fillRect/>
+                          </a:stretch>
+                        </pic:blipFill>
+                        <pic:spPr>
+                          <a:xfrm>
+                            <a:off x="0" y="0"/>
+                            <a:ext cx="5731510" cy="2979420"/>
+                          </a:xfrm>
+                          <a:prstGeom prst="rect">
+                            <a:avLst/>
+                          </a:prstGeom>
+                        </pic:spPr>
+                      </pic:pic>
+                    </a:graphicData>
+                  </a:graphic>
+                </wp:inline>
+              </w:drawing>
+            </w:r>
+          </w:p>
+        </w:tc>
+      </w:tr>
+    </w:tbl>
+    <w:p>
+      <w:pPr>
+        <w:sectPr>
+          <w:headerReference w:type="default" r:id="rId31"/>
+          <w:footerReference w:type="default" r:id="rId32"/>
+          <w:pgSz w:w="11906" w:h="16838"/>
+          <w:pgMar w:top="1440" w:right="1440" w:bottom="1440" w:left="1440" w:header="708" w:footer="708" w:gutter="0"/>
+          <w:cols w:space="720"/>
+          <w:docGrid w:linePitch="360"/>
+        </w:sectPr>
+      </w:pPr>
+    </w:p>
+    <w:p>
+      <w:pPr>
+        <w:pStyle w:val="Titre1"/>
+        <w:pageBreakBefore/>
+        <w:shd w:val="clear" w:color="auto" w:fill="1A3A6B"/>
+        <w:ind w:left="200"/>
+      </w:pPr>
+      <w:bookmarkStart w:id="75" w:name="_Toc232147304"/>
+      <w:r>
+        <w:lastRenderedPageBreak/>
+        <w:t>Partie Nominateur</w:t>
+      </w:r>
+      <w:bookmarkEnd w:id="75"/>
+    </w:p>
+    <w:p>
+      <w:pPr>
+        <w:spacing w:before="60" w:after="60"/>
+      </w:pPr>
+      <w:r>
+        <w:rPr>
+          <w:color w:val="444444"/>
+        </w:rPr>
+        <w:t>Cette partie regroupe les écrans dédiés au processus de nomination des Juges-Arbitres. Elle est accessible aux utilisateurs ayant le rôle "Nominateur" ou "Administrateur".</w:t>
+      </w:r>
+    </w:p>
+    <w:p>
+      <w:pPr>
+        <w:spacing w:before="100" w:after="100"/>
+      </w:pPr>
+    </w:p>
+    <w:p>
+      <w:pPr>
+        <w:pStyle w:val="Titre2"/>
+        <w:pBdr>
+          <w:bottom w:val="single" w:sz="4" w:space="0" w:color="2557A7"/>
+        </w:pBdr>
+      </w:pPr>
+      <w:bookmarkStart w:id="76" w:name="_Toc232147305"/>
+      <w:r>
+        <w:t>E020 – Menu nominateur</w:t>
+      </w:r>
+      <w:bookmarkEnd w:id="76"/>
+    </w:p>
+    <w:p>
+      <w:pPr>
+        <w:spacing w:before="100" w:after="100"/>
+      </w:pPr>
+    </w:p>
+    <w:tbl>
+      <w:tblPr>
+        <w:tblW w:w="9026" w:type="dxa"/>
+        <w:tblBorders>
+          <w:top w:val="single" w:sz="4" w:space="0" w:color="auto"/>
+          <w:left w:val="single" w:sz="4" w:space="0" w:color="auto"/>
+          <w:bottom w:val="single" w:sz="4" w:space="0" w:color="auto"/>
+          <w:right w:val="single" w:sz="4" w:space="0" w:color="auto"/>
+          <w:insideH w:val="single" w:sz="4" w:space="0" w:color="auto"/>
+          <w:insideV w:val="single" w:sz="4" w:space="0" w:color="auto"/>
+        </w:tblBorders>
+        <w:tblCellMar>
+          <w:left w:w="10" w:type="dxa"/>
+          <w:right w:w="10" w:type="dxa"/>
+        </w:tblCellMar>
+        <w:tblLook w:val="0000" w:firstRow="0" w:lastRow="0" w:firstColumn="0" w:lastColumn="0" w:noHBand="0" w:noVBand="0"/>
+      </w:tblPr>
+      <w:tblGrid>
+        <w:gridCol w:w="2500"/>
+        <w:gridCol w:w="6526"/>
+      </w:tblGrid>
+      <w:tr>
+        <w:tc>
+          <w:tcPr>
+            <w:tcW w:w="2500" w:type="dxa"/>
+            <w:tcBorders>
+              <w:top w:val="single" w:sz="4" w:space="0" w:color="C8D4E8"/>
+              <w:left w:val="single" w:sz="4" w:space="0" w:color="C8D4E8"/>
+              <w:bottom w:val="single" w:sz="4" w:space="0" w:color="C8D4E8"/>
+              <w:right w:val="single" w:sz="4" w:space="0" w:color="C8D4E8"/>
+            </w:tcBorders>
+            <w:shd w:val="clear" w:color="auto" w:fill="E8EEF7"/>
+            <w:tcMar>
+              <w:top w:w="60" w:type="dxa"/>
+              <w:left w:w="120" w:type="dxa"/>
+              <w:bottom w:w="60" w:type="dxa"/>
+              <w:right w:w="120" w:type="dxa"/>
+            </w:tcMar>
+          </w:tcPr>
+          <w:p>
+            <w:r>
+              <w:rPr>
+                <w:b/>
+                <w:bCs/>
+                <w:color w:val="1A3A6B"/>
+                <w:sz w:val="20"/>
+                <w:szCs w:val="20"/>
+              </w:rPr>
+              <w:t>N° écran</w:t>
+            </w:r>
+          </w:p>
+        </w:tc>
+        <w:tc>
+          <w:tcPr>
+            <w:tcW w:w="6526" w:type="dxa"/>
+            <w:tcBorders>
+              <w:top w:val="single" w:sz="4" w:space="0" w:color="C8D4E8"/>
+              <w:left w:val="single" w:sz="4" w:space="0" w:color="C8D4E8"/>
+              <w:bottom w:val="single" w:sz="4" w:space="0" w:color="C8D4E8"/>
+              <w:right w:val="single" w:sz="4" w:space="0" w:color="C8D4E8"/>
+            </w:tcBorders>
+            <w:tcMar>
+              <w:top w:w="60" w:type="dxa"/>
+              <w:left w:w="120" w:type="dxa"/>
+              <w:bottom w:w="60" w:type="dxa"/>
+              <w:right w:w="120" w:type="dxa"/>
+            </w:tcMar>
+          </w:tcPr>
+          <w:p>
+            <w:r>
+              <w:rPr>
+                <w:sz w:val="20"/>
+                <w:szCs w:val="20"/>
+              </w:rPr>
+              <w:t>E020</w:t>
+            </w:r>
+          </w:p>
+        </w:tc>
+      </w:tr>
+      <w:tr>
+        <w:tc>
+          <w:tcPr>
+            <w:tcW w:w="2500" w:type="dxa"/>
+            <w:tcBorders>
+              <w:top w:val="single" w:sz="4" w:space="0" w:color="C8D4E8"/>
+              <w:left w:val="single" w:sz="4" w:space="0" w:color="C8D4E8"/>
+              <w:bottom w:val="single" w:sz="4" w:space="0" w:color="C8D4E8"/>
+              <w:right w:val="single" w:sz="4" w:space="0" w:color="C8D4E8"/>
+            </w:tcBorders>
+            <w:shd w:val="clear" w:color="auto" w:fill="E8EEF7"/>
+            <w:tcMar>
+              <w:top w:w="60" w:type="dxa"/>
+              <w:left w:w="120" w:type="dxa"/>
+              <w:bottom w:w="60" w:type="dxa"/>
+              <w:right w:w="120" w:type="dxa"/>
+            </w:tcMar>
+          </w:tcPr>
+          <w:p>
+            <w:r>
+              <w:rPr>
+                <w:b/>
+                <w:bCs/>
+                <w:color w:val="1A3A6B"/>
+                <w:sz w:val="20"/>
+                <w:szCs w:val="20"/>
+              </w:rPr>
+              <w:t>Fichier</w:t>
+            </w:r>
+          </w:p>
+        </w:tc>
+        <w:tc>
+          <w:tcPr>
+            <w:tcW w:w="6526" w:type="dxa"/>
+            <w:tcBorders>
+              <w:top w:val="single" w:sz="4" w:space="0" w:color="C8D4E8"/>
+              <w:left w:val="single" w:sz="4" w:space="0" w:color="C8D4E8"/>
+              <w:bottom w:val="single" w:sz="4" w:space="0" w:color="C8D4E8"/>
+              <w:right w:val="single" w:sz="4" w:space="0" w:color="C8D4E8"/>
+            </w:tcBorders>
+            <w:tcMar>
+              <w:top w:w="60" w:type="dxa"/>
+              <w:left w:w="120" w:type="dxa"/>
+              <w:bottom w:w="60" w:type="dxa"/>
+              <w:right w:w="120" w:type="dxa"/>
+            </w:tcMar>
+          </w:tcPr>
+          <w:p>
+            <w:r>
+              <w:rPr>
+                <w:sz w:val="20"/>
+                <w:szCs w:val="20"/>
+              </w:rPr>
+              <w:t>Nominateur/menu.php</w:t>
+            </w:r>
+          </w:p>
+        </w:tc>
+      </w:tr>
+      <w:tr>
+        <w:tc>
+          <w:tcPr>
+            <w:tcW w:w="2500" w:type="dxa"/>
+            <w:tcBorders>
+              <w:top w:val="single" w:sz="4" w:space="0" w:color="C8D4E8"/>
+              <w:left w:val="single" w:sz="4" w:space="0" w:color="C8D4E8"/>
+              <w:bottom w:val="single" w:sz="4" w:space="0" w:color="C8D4E8"/>
+              <w:right w:val="single" w:sz="4" w:space="0" w:color="C8D4E8"/>
+            </w:tcBorders>
+            <w:shd w:val="clear" w:color="auto" w:fill="E8EEF7"/>
+            <w:tcMar>
+              <w:top w:w="60" w:type="dxa"/>
+              <w:left w:w="120" w:type="dxa"/>
+              <w:bottom w:w="60" w:type="dxa"/>
+              <w:right w:w="120" w:type="dxa"/>
+            </w:tcMar>
+          </w:tcPr>
+          <w:p>
+            <w:r>
+              <w:rPr>
+                <w:b/>
+                <w:bCs/>
+                <w:color w:val="1A3A6B"/>
+                <w:sz w:val="20"/>
+                <w:szCs w:val="20"/>
+              </w:rPr>
+              <w:t>Accès</w:t>
+            </w:r>
+          </w:p>
+        </w:tc>
+        <w:tc>
+          <w:tcPr>
+            <w:tcW w:w="6526" w:type="dxa"/>
+            <w:tcBorders>
+              <w:top w:val="single" w:sz="4" w:space="0" w:color="C8D4E8"/>
+              <w:left w:val="single" w:sz="4" w:space="0" w:color="C8D4E8"/>
+              <w:bottom w:val="single" w:sz="4" w:space="0" w:color="C8D4E8"/>
+              <w:right w:val="single" w:sz="4" w:space="0" w:color="C8D4E8"/>
+            </w:tcBorders>
+            <w:tcMar>
+              <w:top w:w="60" w:type="dxa"/>
+              <w:left w:w="120" w:type="dxa"/>
+              <w:bottom w:w="60" w:type="dxa"/>
+              <w:right w:w="120" w:type="dxa"/>
+            </w:tcMar>
+          </w:tcPr>
+          <w:p>
+            <w:r>
+              <w:rPr>
+                <w:sz w:val="20"/>
+                <w:szCs w:val="20"/>
+              </w:rPr>
+              <w:t>Utilisateur connecté (Nominateur ou Administrateur)</w:t>
+            </w:r>
+          </w:p>
+        </w:tc>
+      </w:tr>
+    </w:tbl>
+    <w:p>
+      <w:pPr>
+        <w:spacing w:before="100" w:after="100"/>
+      </w:pPr>
+    </w:p>
+    <w:p>
+      <w:pPr>
+        <w:pStyle w:val="Titre3"/>
+      </w:pPr>
+      <w:bookmarkStart w:id="77" w:name="_Toc232147306"/>
+      <w:r>
+        <w:t>Description</w:t>
+      </w:r>
+      <w:bookmarkEnd w:id="77"/>
+    </w:p>
+    <w:p>
+      <w:pPr>
+        <w:spacing w:before="60" w:after="60"/>
+      </w:pPr>
+      <w:r>
+        <w:t>Menu principal de l'interface nominateur. Il donne accès aux fonctions de nomination des Juges-Arbitres. Les utilisateurs ayant le rôle "Administrateur" voient également le bouton "Menu administrateur" pour basculer vers l'interface de paramétrage.</w:t>
+      </w:r>
+    </w:p>
+    <w:p>
+      <w:pPr>
+        <w:pStyle w:val="Titre3"/>
+      </w:pPr>
+      <w:bookmarkStart w:id="78" w:name="_Toc232147307"/>
+      <w:r>
+        <w:t>Champs et fonctionnalités</w:t>
+      </w:r>
+      <w:bookmarkEnd w:id="78"/>
+    </w:p>
+    <w:p>
+      <w:pPr>
+        <w:pStyle w:val="Paragraphedeliste"/>
+        <w:numPr>
+          <w:ilvl w:val="0"/>
+          <w:numId w:val="2"/>
+        </w:numPr>
+        <w:spacing w:before="40" w:after="40"/>
+      </w:pPr>
+      <w:r>
+        <w:t>Bouton Juge-Arbitre : accès à la gestion des fiches JA (E007)</w:t>
+      </w:r>
+    </w:p>
+    <w:p>
+      <w:pPr>
+        <w:pStyle w:val="Paragraphedeliste"/>
+        <w:numPr>
+          <w:ilvl w:val="0"/>
+          <w:numId w:val="2"/>
+        </w:numPr>
+        <w:spacing w:before="40" w:after="40"/>
+      </w:pPr>
+      <w:r>
+        <w:t>Bouton Disponibilités JA : saisie/consultation des disponibilités par département (E021)</w:t>
+      </w:r>
+    </w:p>
+    <w:p>
+      <w:pPr>
+        <w:pStyle w:val="Paragraphedeliste"/>
+        <w:numPr>
+          <w:ilvl w:val="0"/>
+          <w:numId w:val="2"/>
+        </w:numPr>
+        <w:spacing w:before="40" w:after="40"/>
+      </w:pPr>
+      <w:r>
+        <w:t>Bouton Nomination JA : interface de nomination automatique et manuelle (E022)</w:t>
+      </w:r>
+    </w:p>
+    <w:p>
+      <w:pPr>
+        <w:pStyle w:val="Paragraphedeliste"/>
+        <w:numPr>
+          <w:ilvl w:val="0"/>
+          <w:numId w:val="2"/>
+        </w:numPr>
+        <w:spacing w:before="40" w:after="40"/>
+      </w:pPr>
+      <w:r>
         <w:t>Bouton Menu administrateur (visible admins seulement) : bascule vers E002</w:t>
       </w:r>
     </w:p>
@@ -15537,11 +15907,11 @@
       <w:pPr>
         <w:pStyle w:val="Titre3"/>
       </w:pPr>
-      <w:bookmarkStart w:id="73" w:name="_Toc232147308"/>
+      <w:bookmarkStart w:id="79" w:name="_Toc232147308"/>
       <w:r>
         <w:t>Remarques</w:t>
       </w:r>
-      <w:bookmarkEnd w:id="73"/>
+      <w:bookmarkEnd w:id="79"/>
     </w:p>
     <w:p>
       <w:pPr>
@@ -15572,12 +15942,12 @@
       <w:pPr>
         <w:pStyle w:val="Titre3"/>
       </w:pPr>
-      <w:bookmarkStart w:id="74" w:name="_Toc232147309"/>
+      <w:bookmarkStart w:id="80" w:name="_Toc232147309"/>
       <w:r>
         <w:lastRenderedPageBreak/>
         <w:t>Copie d'écran</w:t>
       </w:r>
-      <w:bookmarkEnd w:id="74"/>
+      <w:bookmarkEnd w:id="80"/>
     </w:p>
     <w:p>
       <w:pPr>
@@ -15629,14 +15999,11 @@
               <w:jc w:val="center"/>
             </w:pPr>
             <w:r>
-              <w:rPr>
-                <w:noProof/>
-              </w:rPr>
               <w:drawing>
-                <wp:inline distT="0" distB="0" distL="0" distR="0" wp14:anchorId="6A1F3759" wp14:editId="4A9B3A28">
-                  <wp:extent cx="5731510" cy="4950460"/>
-                  <wp:effectExtent l="0" t="0" r="2540" b="2540"/>
-                  <wp:docPr id="22" name="Image 22"/>
+                <wp:inline distT="0" distB="0" distL="0" distR="0" wp14:anchorId="2D14F4FC" wp14:editId="1807357A">
+                  <wp:extent cx="5731510" cy="2988945"/>
+                  <wp:effectExtent l="0" t="0" r="2540" b="1905"/>
+                  <wp:docPr id="35" name="Image 35"/>
                   <wp:cNvGraphicFramePr>
                     <a:graphicFrameLocks xmlns:a="http://schemas.openxmlformats.org/drawingml/2006/main" noChangeAspect="1"/>
                   </wp:cNvGraphicFramePr>
@@ -15656,7 +16023,7 @@
                         <pic:spPr>
                           <a:xfrm>
                             <a:off x="0" y="0"/>
-                            <a:ext cx="5731510" cy="4950460"/>
+                            <a:ext cx="5731510" cy="2988945"/>
                           </a:xfrm>
                           <a:prstGeom prst="rect">
                             <a:avLst/>
@@ -15701,12 +16068,12 @@
           <w:bottom w:val="single" w:sz="4" w:space="0" w:color="2557A7"/>
         </w:pBdr>
       </w:pPr>
-      <w:bookmarkStart w:id="75" w:name="_Toc232147310"/>
+      <w:bookmarkStart w:id="81" w:name="_Toc232147310"/>
       <w:r>
         <w:lastRenderedPageBreak/>
         <w:t>E021 – Disponibilités JA – Vue nominateur</w:t>
       </w:r>
-      <w:bookmarkEnd w:id="75"/>
+      <w:bookmarkEnd w:id="81"/>
     </w:p>
     <w:p>
       <w:pPr>
@@ -15845,17 +16212,8 @@
                 <w:sz w:val="20"/>
                 <w:szCs w:val="20"/>
               </w:rPr>
-              <w:t>Nominateur/</w:t>
-            </w:r>
-            <w:proofErr w:type="spellStart"/>
-            <w:r>
-              <w:rPr>
-                <w:sz w:val="20"/>
-                <w:szCs w:val="20"/>
-              </w:rPr>
-              <w:t>disponibilites.php</w:t>
-            </w:r>
-            <w:proofErr w:type="spellEnd"/>
+              <w:t>Nominateur/disponibilites.php</w:t>
+            </w:r>
           </w:p>
         </w:tc>
       </w:tr>
@@ -15927,11 +16285,11 @@
       <w:pPr>
         <w:pStyle w:val="Titre3"/>
       </w:pPr>
-      <w:bookmarkStart w:id="76" w:name="_Toc232147311"/>
+      <w:bookmarkStart w:id="82" w:name="_Toc232147311"/>
       <w:r>
         <w:t>Description</w:t>
       </w:r>
-      <w:bookmarkEnd w:id="76"/>
+      <w:bookmarkEnd w:id="82"/>
     </w:p>
     <w:p>
       <w:pPr>
@@ -15945,11 +16303,11 @@
       <w:pPr>
         <w:pStyle w:val="Titre3"/>
       </w:pPr>
-      <w:bookmarkStart w:id="77" w:name="_Toc232147312"/>
+      <w:bookmarkStart w:id="83" w:name="_Toc232147312"/>
       <w:r>
         <w:t>Champs et fonctionnalités</w:t>
       </w:r>
-      <w:bookmarkEnd w:id="77"/>
+      <w:bookmarkEnd w:id="83"/>
     </w:p>
     <w:p>
       <w:pPr>
@@ -16039,26 +16397,18 @@
         <w:spacing w:before="40" w:after="40"/>
       </w:pPr>
       <w:r>
-        <w:t xml:space="preserve">Clic sur une carte : ouvre </w:t>
-      </w:r>
-      <w:proofErr w:type="spellStart"/>
-      <w:r>
-        <w:t>disponibilite_ja.php</w:t>
-      </w:r>
-      <w:proofErr w:type="spellEnd"/>
-      <w:r>
-        <w:t xml:space="preserve"> (E012) dans une nouvelle fenêtre</w:t>
+        <w:t>Clic sur une carte : ouvre disponibilite_ja.php (E012) dans une nouvelle fenêtre</w:t>
       </w:r>
     </w:p>
     <w:p>
       <w:pPr>
         <w:pStyle w:val="Titre3"/>
       </w:pPr>
-      <w:bookmarkStart w:id="78" w:name="_Toc232147313"/>
+      <w:bookmarkStart w:id="84" w:name="_Toc232147313"/>
       <w:r>
         <w:t>Remarques</w:t>
       </w:r>
-      <w:bookmarkEnd w:id="78"/>
+      <w:bookmarkEnd w:id="84"/>
     </w:p>
     <w:p>
       <w:pPr>
@@ -16072,14 +16422,7 @@
           <w:i/>
           <w:iCs/>
         </w:rPr>
-        <w:t>Seul les JA Actif sont affiché</w:t>
-      </w:r>
-      <w:r>
-        <w:rPr>
-          <w:i/>
-          <w:iCs/>
-        </w:rPr>
-        <w:t>s</w:t>
+        <w:t>Seul les JA Actif sont affichés</w:t>
       </w:r>
     </w:p>
     <w:p>
@@ -16097,15 +16440,7 @@
           <w:iCs/>
           <w:color w:val="555555"/>
         </w:rPr>
-        <w:t xml:space="preserve">Les JA avec avatar rouge doivent être relancés pour qu'ils saisissent leurs disponibilités avant la nomination. L'absence de disponibilités peut bloquer le processus de nomination </w:t>
-      </w:r>
-      <w:r>
-        <w:rPr>
-          <w:i/>
-          <w:iCs/>
-          <w:color w:val="555555"/>
-        </w:rPr>
-        <w:t>automatique.</w:t>
+        <w:t>Les JA avec avatar rouge doivent être relancés pour qu'ils saisissent leurs disponibilités avant la nomination. L'absence de disponibilités peut bloquer le processus de nomination automatique.</w:t>
       </w:r>
     </w:p>
     <w:p>
@@ -16141,12 +16476,12 @@
       <w:pPr>
         <w:pStyle w:val="Titre3"/>
       </w:pPr>
-      <w:bookmarkStart w:id="79" w:name="_Toc232147314"/>
+      <w:bookmarkStart w:id="85" w:name="_Toc232147314"/>
       <w:r>
         <w:lastRenderedPageBreak/>
         <w:t>Copie d'écran</w:t>
       </w:r>
-      <w:bookmarkEnd w:id="79"/>
+      <w:bookmarkEnd w:id="85"/>
     </w:p>
     <w:p>
       <w:pPr>
@@ -16202,7 +16537,7 @@
                 <w:noProof/>
               </w:rPr>
               <w:drawing>
-                <wp:inline distT="0" distB="0" distL="0" distR="0" wp14:anchorId="3E14C62B" wp14:editId="3E0332DE">
+                <wp:inline distT="0" distB="0" distL="0" distR="0" wp14:anchorId="6D9427D6" wp14:editId="67C938BF">
                   <wp:extent cx="5731510" cy="3647440"/>
                   <wp:effectExtent l="0" t="0" r="2540" b="0"/>
                   <wp:docPr id="23" name="Image 23"/>
@@ -16253,7 +16588,7 @@
           <w:noProof/>
         </w:rPr>
         <w:drawing>
-          <wp:inline distT="0" distB="0" distL="0" distR="0" wp14:anchorId="02C07E4D" wp14:editId="1F77418F">
+          <wp:inline distT="0" distB="0" distL="0" distR="0" wp14:anchorId="2D92E8E8" wp14:editId="77FDC6DF">
             <wp:extent cx="6019800" cy="3264535"/>
             <wp:effectExtent l="0" t="0" r="0" b="0"/>
             <wp:docPr id="26" name="Image 26"/>
@@ -16308,7 +16643,7 @@
         </w:rPr>
         <w:lastRenderedPageBreak/>
         <w:drawing>
-          <wp:inline distT="0" distB="0" distL="0" distR="0" wp14:anchorId="1014862E" wp14:editId="7E6C407E">
+          <wp:inline distT="0" distB="0" distL="0" distR="0" wp14:anchorId="5DC35ADC" wp14:editId="2A81A1E2">
             <wp:extent cx="4829849" cy="3648584"/>
             <wp:effectExtent l="0" t="0" r="8890" b="9525"/>
             <wp:docPr id="27" name="Image 27"/>
@@ -16365,12 +16700,12 @@
           <w:bottom w:val="single" w:sz="4" w:space="0" w:color="2557A7"/>
         </w:pBdr>
       </w:pPr>
-      <w:bookmarkStart w:id="80" w:name="_Toc232147315"/>
+      <w:bookmarkStart w:id="86" w:name="_Toc232147315"/>
       <w:r>
         <w:lastRenderedPageBreak/>
         <w:t>E022 – Nomination des Juges-Arbitres</w:t>
       </w:r>
-      <w:bookmarkEnd w:id="80"/>
+      <w:bookmarkEnd w:id="86"/>
     </w:p>
     <w:p>
       <w:pPr>
@@ -16509,17 +16844,8 @@
                 <w:sz w:val="20"/>
                 <w:szCs w:val="20"/>
               </w:rPr>
-              <w:t>Nominateur/</w:t>
-            </w:r>
-            <w:proofErr w:type="spellStart"/>
-            <w:r>
-              <w:rPr>
-                <w:sz w:val="20"/>
-                <w:szCs w:val="20"/>
-              </w:rPr>
-              <w:t>nomination.php</w:t>
-            </w:r>
-            <w:proofErr w:type="spellEnd"/>
+              <w:t>Nominateur/nomination.php</w:t>
+            </w:r>
           </w:p>
         </w:tc>
       </w:tr>
@@ -16591,11 +16917,11 @@
       <w:pPr>
         <w:pStyle w:val="Titre3"/>
       </w:pPr>
-      <w:bookmarkStart w:id="81" w:name="_Toc232147316"/>
+      <w:bookmarkStart w:id="87" w:name="_Toc232147316"/>
       <w:r>
         <w:t>Description</w:t>
       </w:r>
-      <w:bookmarkEnd w:id="81"/>
+      <w:bookmarkEnd w:id="87"/>
     </w:p>
     <w:p>
       <w:pPr>
@@ -16609,11 +16935,11 @@
       <w:pPr>
         <w:pStyle w:val="Titre3"/>
       </w:pPr>
-      <w:bookmarkStart w:id="82" w:name="_Toc232147317"/>
+      <w:bookmarkStart w:id="88" w:name="_Toc232147317"/>
       <w:r>
         <w:t>Champs et fonctionnalités</w:t>
       </w:r>
-      <w:bookmarkEnd w:id="82"/>
+      <w:bookmarkEnd w:id="88"/>
     </w:p>
     <w:p>
       <w:pPr>
@@ -16663,13 +16989,8 @@
         </w:numPr>
         <w:spacing w:before="40" w:after="40"/>
       </w:pPr>
-      <w:proofErr w:type="gramStart"/>
-      <w:r>
-        <w:t>Colonne JA nommé</w:t>
-      </w:r>
-      <w:proofErr w:type="gramEnd"/>
-      <w:r>
-        <w:t xml:space="preserve"> : JA actuellement affecté (ou "À nommer")</w:t>
+      <w:r>
+        <w:t>Colonne JA nommé : JA actuellement affecté (ou "À nommer")</w:t>
       </w:r>
     </w:p>
     <w:p>
@@ -16728,11 +17049,11 @@
       <w:pPr>
         <w:pStyle w:val="Titre3"/>
       </w:pPr>
-      <w:bookmarkStart w:id="83" w:name="_Toc232147318"/>
+      <w:bookmarkStart w:id="89" w:name="_Toc232147318"/>
       <w:r>
         <w:t>Remarques</w:t>
       </w:r>
-      <w:bookmarkEnd w:id="83"/>
+      <w:bookmarkEnd w:id="89"/>
     </w:p>
     <w:p>
       <w:pPr>
@@ -16840,12 +17161,12 @@
       <w:pPr>
         <w:pStyle w:val="Titre3"/>
       </w:pPr>
-      <w:bookmarkStart w:id="84" w:name="_Toc232147319"/>
+      <w:bookmarkStart w:id="90" w:name="_Toc232147319"/>
       <w:r>
         <w:lastRenderedPageBreak/>
         <w:t>Copie d'écran</w:t>
       </w:r>
-      <w:bookmarkEnd w:id="84"/>
+      <w:bookmarkEnd w:id="90"/>
     </w:p>
     <w:p>
       <w:pPr>
@@ -16901,7 +17222,7 @@
                 <w:noProof/>
               </w:rPr>
               <w:drawing>
-                <wp:inline distT="0" distB="0" distL="0" distR="0" wp14:anchorId="35AF5CA0" wp14:editId="238130D5">
+                <wp:inline distT="0" distB="0" distL="0" distR="0" wp14:anchorId="4A2C2D86" wp14:editId="1BDB4007">
                   <wp:extent cx="5731510" cy="3640455"/>
                   <wp:effectExtent l="0" t="0" r="2540" b="0"/>
                   <wp:docPr id="24" name="Image 24"/>
@@ -16968,28 +17289,7 @@
           <w:i/>
           <w:iCs/>
         </w:rPr>
-        <w:t>S</w:t>
-      </w:r>
-      <w:r>
-        <w:rPr>
-          <w:i/>
-          <w:iCs/>
-        </w:rPr>
-        <w:t xml:space="preserve">eul les </w:t>
-      </w:r>
-      <w:r>
-        <w:rPr>
-          <w:i/>
-          <w:iCs/>
-        </w:rPr>
-        <w:t>cinq</w:t>
-      </w:r>
-      <w:r>
-        <w:rPr>
-          <w:i/>
-          <w:iCs/>
-        </w:rPr>
-        <w:t xml:space="preserve"> premiers JA nominable sont affiché.</w:t>
+        <w:t>Seul les cinq premiers JA nominable sont affiché.</w:t>
       </w:r>
     </w:p>
     <w:p>
@@ -17014,7 +17314,7 @@
           <w:noProof/>
         </w:rPr>
         <w:drawing>
-          <wp:inline distT="0" distB="0" distL="0" distR="0" wp14:anchorId="407ABCB8" wp14:editId="32AE1721">
+          <wp:inline distT="0" distB="0" distL="0" distR="0" wp14:anchorId="453417EC" wp14:editId="7A86883B">
             <wp:extent cx="5731510" cy="704215"/>
             <wp:effectExtent l="0" t="0" r="2540" b="635"/>
             <wp:docPr id="28" name="Image 28"/>
@@ -17072,7 +17372,7 @@
           <w:noProof/>
         </w:rPr>
         <w:drawing>
-          <wp:inline distT="0" distB="0" distL="0" distR="0" wp14:anchorId="1E053139" wp14:editId="10A0E8B6">
+          <wp:inline distT="0" distB="0" distL="0" distR="0" wp14:anchorId="162534ED" wp14:editId="2C6C1462">
             <wp:extent cx="2717515" cy="1214323"/>
             <wp:effectExtent l="0" t="0" r="6985" b="5080"/>
             <wp:docPr id="29" name="Image 29"/>
@@ -17145,12 +17445,12 @@
           <w:bottom w:val="single" w:sz="4" w:space="0" w:color="2557A7"/>
         </w:pBdr>
       </w:pPr>
-      <w:bookmarkStart w:id="85" w:name="_Toc232147320"/>
+      <w:bookmarkStart w:id="91" w:name="_Toc232147320"/>
       <w:r>
         <w:lastRenderedPageBreak/>
         <w:t>E023 – Convocation et frais JA</w:t>
       </w:r>
-      <w:bookmarkEnd w:id="85"/>
+      <w:bookmarkEnd w:id="91"/>
     </w:p>
     <w:p>
       <w:pPr>
@@ -17289,17 +17589,8 @@
                 <w:sz w:val="20"/>
                 <w:szCs w:val="20"/>
               </w:rPr>
-              <w:t>Nominateur/</w:t>
-            </w:r>
-            <w:proofErr w:type="spellStart"/>
-            <w:r>
-              <w:rPr>
-                <w:sz w:val="20"/>
-                <w:szCs w:val="20"/>
-              </w:rPr>
-              <w:t>convocation_ja.php</w:t>
-            </w:r>
-            <w:proofErr w:type="spellEnd"/>
+              <w:t>Nominateur/convocation_ja.php</w:t>
+            </w:r>
           </w:p>
         </w:tc>
       </w:tr>
@@ -17356,23 +17647,7 @@
                 <w:sz w:val="20"/>
                 <w:szCs w:val="20"/>
               </w:rPr>
-              <w:t xml:space="preserve">Public – accessible via lien </w:t>
-            </w:r>
-            <w:proofErr w:type="spellStart"/>
-            <w:r>
-              <w:rPr>
-                <w:sz w:val="20"/>
-                <w:szCs w:val="20"/>
-              </w:rPr>
-              <w:t>tokenisé</w:t>
-            </w:r>
-            <w:proofErr w:type="spellEnd"/>
-            <w:r>
-              <w:rPr>
-                <w:sz w:val="20"/>
-                <w:szCs w:val="20"/>
-              </w:rPr>
-              <w:t xml:space="preserve"> ou depuis l'interface nominateur</w:t>
+              <w:t>Public – accessible via lien tokenisé ou depuis l'interface nominateur</w:t>
             </w:r>
           </w:p>
         </w:tc>
@@ -17387,11 +17662,11 @@
       <w:pPr>
         <w:pStyle w:val="Titre3"/>
       </w:pPr>
-      <w:bookmarkStart w:id="86" w:name="_Toc232147321"/>
+      <w:bookmarkStart w:id="92" w:name="_Toc232147321"/>
       <w:r>
         <w:t>Description</w:t>
       </w:r>
-      <w:bookmarkEnd w:id="86"/>
+      <w:bookmarkEnd w:id="92"/>
     </w:p>
     <w:p>
       <w:pPr>
@@ -17405,11 +17680,11 @@
       <w:pPr>
         <w:pStyle w:val="Titre3"/>
       </w:pPr>
-      <w:bookmarkStart w:id="87" w:name="_Toc232147322"/>
+      <w:bookmarkStart w:id="93" w:name="_Toc232147322"/>
       <w:r>
         <w:t>Champs et fonctionnalités</w:t>
       </w:r>
-      <w:bookmarkEnd w:id="87"/>
+      <w:bookmarkEnd w:id="93"/>
     </w:p>
     <w:p>
       <w:pPr>
@@ -17519,11 +17794,11 @@
       <w:pPr>
         <w:pStyle w:val="Titre3"/>
       </w:pPr>
-      <w:bookmarkStart w:id="88" w:name="_Toc232147323"/>
+      <w:bookmarkStart w:id="94" w:name="_Toc232147323"/>
       <w:r>
         <w:t>Remarques</w:t>
       </w:r>
-      <w:bookmarkEnd w:id="88"/>
+      <w:bookmarkEnd w:id="94"/>
     </w:p>
     <w:p>
       <w:pPr>
@@ -17535,54 +17810,18 @@
           <w:iCs/>
           <w:color w:val="555555"/>
         </w:rPr>
-        <w:t xml:space="preserve">La page est accessible via un </w:t>
-      </w:r>
-      <w:proofErr w:type="spellStart"/>
-      <w:r>
-        <w:rPr>
-          <w:i/>
-          <w:iCs/>
-          <w:color w:val="555555"/>
-        </w:rPr>
-        <w:t>token</w:t>
-      </w:r>
-      <w:proofErr w:type="spellEnd"/>
-      <w:r>
-        <w:rPr>
-          <w:i/>
-          <w:iCs/>
-          <w:color w:val="555555"/>
-        </w:rPr>
-        <w:t xml:space="preserve"> obfusqué inclus dans le lien email envoyé au JA, ou directement depuis l'interface nominateur (E022). Les frais sont </w:t>
-      </w:r>
-      <w:proofErr w:type="spellStart"/>
-      <w:r>
-        <w:rPr>
-          <w:i/>
-          <w:iCs/>
-          <w:color w:val="555555"/>
-        </w:rPr>
-        <w:t>pré-calculés</w:t>
-      </w:r>
-      <w:proofErr w:type="spellEnd"/>
-      <w:r>
-        <w:rPr>
-          <w:i/>
-          <w:iCs/>
-          <w:color w:val="555555"/>
-        </w:rPr>
-        <w:t xml:space="preserve"> et modifiables par le JA.</w:t>
+        <w:t>La page est accessible via un token obfusqué inclus dans le lien email envoyé au JA, ou directement depuis l'interface nominateur (E022). Les frais sont pré-calculés et modifiables par le JA.</w:t>
       </w:r>
     </w:p>
     <w:p>
       <w:pPr>
         <w:pStyle w:val="Titre3"/>
       </w:pPr>
-      <w:bookmarkStart w:id="89" w:name="_Toc232147324"/>
+      <w:bookmarkStart w:id="95" w:name="_Toc232147324"/>
       <w:r>
         <w:t>Copie d'écran</w:t>
       </w:r>
-      <w:bookmarkEnd w:id="89"/>
+      <w:bookmarkEnd w:id="95"/>
     </w:p>
     <w:p>
       <w:pPr>
@@ -17634,7 +17873,22 @@
               <w:jc w:val="center"/>
             </w:pPr>
             <w:r>
-              <w:t>Un formulaire identique au format papier sera proposé.</w:t>
+              <w:t xml:space="preserve">Un formulaire </w:t>
+            </w:r>
+            <w:r>
+              <w:t xml:space="preserve">se </w:t>
+            </w:r>
+            <w:r>
+              <w:t>rapprochant</w:t>
+            </w:r>
+            <w:r>
+              <w:t xml:space="preserve"> au format papier </w:t>
+            </w:r>
+            <w:r>
+              <w:t>est</w:t>
+            </w:r>
+            <w:r>
+              <w:t xml:space="preserve"> proposé.</w:t>
             </w:r>
           </w:p>
           <w:p>
@@ -17649,10 +17903,792 @@
         </w:tc>
       </w:tr>
     </w:tbl>
+    <w:p>
+      <w:pPr>
+        <w:pStyle w:val="Titre2"/>
+        <w:pBdr>
+          <w:bottom w:val="single" w:sz="4" w:space="0" w:color="2557A7"/>
+        </w:pBdr>
+      </w:pPr>
+      <w:bookmarkStart w:id="96" w:name="_Toc_E024"/>
+    </w:p>
+    <w:p>
+      <w:pPr>
+        <w:rPr>
+          <w:b/>
+          <w:bCs/>
+          <w:color w:val="1A3A6B"/>
+          <w:sz w:val="26"/>
+          <w:szCs w:val="26"/>
+        </w:rPr>
+      </w:pPr>
+      <w:r>
+        <w:br w:type="page"/>
+      </w:r>
+    </w:p>
+    <w:p>
+      <w:pPr>
+        <w:pStyle w:val="Titre2"/>
+        <w:pBdr>
+          <w:bottom w:val="single" w:sz="4" w:space="0" w:color="2557A7"/>
+        </w:pBdr>
+      </w:pPr>
+      <w:r>
+        <w:lastRenderedPageBreak/>
+        <w:t>E024 – Centre d’envoi</w:t>
+      </w:r>
+      <w:bookmarkEnd w:id="96"/>
+    </w:p>
+    <w:p>
+      <w:pPr>
+        <w:spacing w:before="100" w:after="100"/>
+      </w:pPr>
+    </w:p>
+    <w:tbl>
+      <w:tblPr>
+        <w:tblW w:w="9026" w:type="dxa"/>
+        <w:tblBorders>
+          <w:top w:val="single" w:sz="4" w:space="0" w:color="auto"/>
+          <w:left w:val="single" w:sz="4" w:space="0" w:color="auto"/>
+          <w:bottom w:val="single" w:sz="4" w:space="0" w:color="auto"/>
+          <w:right w:val="single" w:sz="4" w:space="0" w:color="auto"/>
+          <w:insideH w:val="single" w:sz="4" w:space="0" w:color="auto"/>
+          <w:insideV w:val="single" w:sz="4" w:space="0" w:color="auto"/>
+        </w:tblBorders>
+        <w:tblCellMar>
+          <w:left w:w="10" w:type="dxa"/>
+          <w:right w:w="10" w:type="dxa"/>
+        </w:tblCellMar>
+        <w:tblLook w:val="0000" w:firstRow="0" w:lastRow="0" w:firstColumn="0" w:lastColumn="0" w:noHBand="0" w:noVBand="0"/>
+      </w:tblPr>
+      <w:tblGrid>
+        <w:gridCol w:w="2500"/>
+        <w:gridCol w:w="6526"/>
+      </w:tblGrid>
+      <w:tr>
+        <w:tc>
+          <w:tcPr>
+            <w:tcW w:w="2500" w:type="dxa"/>
+            <w:tcBorders>
+              <w:top w:val="single" w:sz="4" w:space="0" w:color="C8D4E8"/>
+              <w:left w:val="single" w:sz="4" w:space="0" w:color="C8D4E8"/>
+              <w:bottom w:val="single" w:sz="4" w:space="0" w:color="C8D4E8"/>
+              <w:right w:val="single" w:sz="4" w:space="0" w:color="C8D4E8"/>
+            </w:tcBorders>
+            <w:shd w:val="clear" w:color="auto" w:fill="E8EEF7"/>
+            <w:tcMar>
+              <w:top w:w="60" w:type="dxa"/>
+              <w:left w:w="120" w:type="dxa"/>
+              <w:bottom w:w="60" w:type="dxa"/>
+              <w:right w:w="120" w:type="dxa"/>
+            </w:tcMar>
+          </w:tcPr>
+          <w:p>
+            <w:r>
+              <w:rPr>
+                <w:b/>
+                <w:bCs/>
+                <w:color w:val="1A3A6B"/>
+                <w:sz w:val="20"/>
+                <w:szCs w:val="20"/>
+              </w:rPr>
+              <w:t>N° écran</w:t>
+            </w:r>
+          </w:p>
+        </w:tc>
+        <w:tc>
+          <w:tcPr>
+            <w:tcW w:w="6526" w:type="dxa"/>
+            <w:tcBorders>
+              <w:top w:val="single" w:sz="4" w:space="0" w:color="C8D4E8"/>
+              <w:left w:val="single" w:sz="4" w:space="0" w:color="C8D4E8"/>
+              <w:bottom w:val="single" w:sz="4" w:space="0" w:color="C8D4E8"/>
+              <w:right w:val="single" w:sz="4" w:space="0" w:color="C8D4E8"/>
+            </w:tcBorders>
+            <w:tcMar>
+              <w:top w:w="60" w:type="dxa"/>
+              <w:left w:w="120" w:type="dxa"/>
+              <w:bottom w:w="60" w:type="dxa"/>
+              <w:right w:w="120" w:type="dxa"/>
+            </w:tcMar>
+          </w:tcPr>
+          <w:p>
+            <w:r>
+              <w:rPr>
+                <w:sz w:val="20"/>
+                <w:szCs w:val="20"/>
+              </w:rPr>
+              <w:t>E024</w:t>
+            </w:r>
+          </w:p>
+        </w:tc>
+      </w:tr>
+      <w:tr>
+        <w:tc>
+          <w:tcPr>
+            <w:tcW w:w="2500" w:type="dxa"/>
+            <w:tcBorders>
+              <w:top w:val="single" w:sz="4" w:space="0" w:color="C8D4E8"/>
+              <w:left w:val="single" w:sz="4" w:space="0" w:color="C8D4E8"/>
+              <w:bottom w:val="single" w:sz="4" w:space="0" w:color="C8D4E8"/>
+              <w:right w:val="single" w:sz="4" w:space="0" w:color="C8D4E8"/>
+            </w:tcBorders>
+            <w:shd w:val="clear" w:color="auto" w:fill="E8EEF7"/>
+            <w:tcMar>
+              <w:top w:w="60" w:type="dxa"/>
+              <w:left w:w="120" w:type="dxa"/>
+              <w:bottom w:w="60" w:type="dxa"/>
+              <w:right w:w="120" w:type="dxa"/>
+            </w:tcMar>
+          </w:tcPr>
+          <w:p>
+            <w:r>
+              <w:rPr>
+                <w:b/>
+                <w:bCs/>
+                <w:color w:val="1A3A6B"/>
+                <w:sz w:val="20"/>
+                <w:szCs w:val="20"/>
+              </w:rPr>
+              <w:t>Fichier</w:t>
+            </w:r>
+          </w:p>
+        </w:tc>
+        <w:tc>
+          <w:tcPr>
+            <w:tcW w:w="6526" w:type="dxa"/>
+            <w:tcBorders>
+              <w:top w:val="single" w:sz="4" w:space="0" w:color="C8D4E8"/>
+              <w:left w:val="single" w:sz="4" w:space="0" w:color="C8D4E8"/>
+              <w:bottom w:val="single" w:sz="4" w:space="0" w:color="C8D4E8"/>
+              <w:right w:val="single" w:sz="4" w:space="0" w:color="C8D4E8"/>
+            </w:tcBorders>
+            <w:tcMar>
+              <w:top w:w="60" w:type="dxa"/>
+              <w:left w:w="120" w:type="dxa"/>
+              <w:bottom w:w="60" w:type="dxa"/>
+              <w:right w:w="120" w:type="dxa"/>
+            </w:tcMar>
+          </w:tcPr>
+          <w:p>
+            <w:r>
+              <w:rPr>
+                <w:sz w:val="20"/>
+                <w:szCs w:val="20"/>
+              </w:rPr>
+              <w:t>Nominateur/centrenvoye.php</w:t>
+            </w:r>
+          </w:p>
+        </w:tc>
+      </w:tr>
+      <w:tr>
+        <w:tc>
+          <w:tcPr>
+            <w:tcW w:w="2500" w:type="dxa"/>
+            <w:tcBorders>
+              <w:top w:val="single" w:sz="4" w:space="0" w:color="C8D4E8"/>
+              <w:left w:val="single" w:sz="4" w:space="0" w:color="C8D4E8"/>
+              <w:bottom w:val="single" w:sz="4" w:space="0" w:color="C8D4E8"/>
+              <w:right w:val="single" w:sz="4" w:space="0" w:color="C8D4E8"/>
+            </w:tcBorders>
+            <w:shd w:val="clear" w:color="auto" w:fill="E8EEF7"/>
+            <w:tcMar>
+              <w:top w:w="60" w:type="dxa"/>
+              <w:left w:w="120" w:type="dxa"/>
+              <w:bottom w:w="60" w:type="dxa"/>
+              <w:right w:w="120" w:type="dxa"/>
+            </w:tcMar>
+          </w:tcPr>
+          <w:p>
+            <w:r>
+              <w:rPr>
+                <w:b/>
+                <w:bCs/>
+                <w:color w:val="1A3A6B"/>
+                <w:sz w:val="20"/>
+                <w:szCs w:val="20"/>
+              </w:rPr>
+              <w:t>Accès</w:t>
+            </w:r>
+          </w:p>
+        </w:tc>
+        <w:tc>
+          <w:tcPr>
+            <w:tcW w:w="6526" w:type="dxa"/>
+            <w:tcBorders>
+              <w:top w:val="single" w:sz="4" w:space="0" w:color="C8D4E8"/>
+              <w:left w:val="single" w:sz="4" w:space="0" w:color="C8D4E8"/>
+              <w:bottom w:val="single" w:sz="4" w:space="0" w:color="C8D4E8"/>
+              <w:right w:val="single" w:sz="4" w:space="0" w:color="C8D4E8"/>
+            </w:tcBorders>
+            <w:tcMar>
+              <w:top w:w="60" w:type="dxa"/>
+              <w:left w:w="120" w:type="dxa"/>
+              <w:bottom w:w="60" w:type="dxa"/>
+              <w:right w:w="120" w:type="dxa"/>
+            </w:tcMar>
+          </w:tcPr>
+          <w:p>
+            <w:r>
+              <w:rPr>
+                <w:sz w:val="20"/>
+                <w:szCs w:val="20"/>
+              </w:rPr>
+              <w:t>Nominateur connecté</w:t>
+            </w:r>
+          </w:p>
+        </w:tc>
+      </w:tr>
+    </w:tbl>
+    <w:p>
+      <w:pPr>
+        <w:spacing w:before="100" w:after="100"/>
+      </w:pPr>
+    </w:p>
+    <w:p>
+      <w:pPr>
+        <w:pStyle w:val="Titre3"/>
+      </w:pPr>
+      <w:bookmarkStart w:id="97" w:name="_Toc_E024_Desc"/>
+      <w:r>
+        <w:t>Description</w:t>
+      </w:r>
+      <w:bookmarkEnd w:id="97"/>
+    </w:p>
+    <w:p>
+      <w:pPr>
+        <w:spacing w:before="60" w:after="60"/>
+      </w:pPr>
+      <w:r>
+        <w:t>Interface d’envoi groupé de messages aux Juges-Arbitres du département. Organisée en 4 onglets correspondant aux 4 types de messages, avec un panneau de composition à gauche (55 %) et la liste des destinataires à droite.</w:t>
+      </w:r>
+    </w:p>
+    <w:p>
+      <w:pPr>
+        <w:pStyle w:val="Titre3"/>
+      </w:pPr>
+      <w:bookmarkStart w:id="98" w:name="_Toc_E024_Onglets"/>
+      <w:r>
+        <w:t>Onglets disponibles</w:t>
+      </w:r>
+      <w:bookmarkEnd w:id="98"/>
+    </w:p>
+    <w:p>
+      <w:pPr>
+        <w:pStyle w:val="Paragraphedeliste"/>
+        <w:numPr>
+          <w:ilvl w:val="0"/>
+          <w:numId w:val="2"/>
+        </w:numPr>
+        <w:spacing w:before="40" w:after="40"/>
+      </w:pPr>
+      <w:r>
+        <w:t>Disponibilités : envoie un message à tous les JA actifs du département pour recueillir leurs disponibilités</w:t>
+      </w:r>
+    </w:p>
+    <w:p>
+      <w:pPr>
+        <w:pStyle w:val="Paragraphedeliste"/>
+        <w:numPr>
+          <w:ilvl w:val="0"/>
+          <w:numId w:val="2"/>
+        </w:numPr>
+        <w:spacing w:before="40" w:after="40"/>
+      </w:pPr>
+      <w:r>
+        <w:t>Rappel dispo : envoie un rappel uniquement aux JA actifs n’ayant saisi aucune disponibilité pour la saison en cours</w:t>
+      </w:r>
+    </w:p>
+    <w:p>
+      <w:pPr>
+        <w:pStyle w:val="Paragraphedeliste"/>
+        <w:numPr>
+          <w:ilvl w:val="0"/>
+          <w:numId w:val="2"/>
+        </w:numPr>
+        <w:spacing w:before="40" w:after="40"/>
+      </w:pPr>
+      <w:r>
+        <w:t>Convocation : envoie les convocations aux JA nominés pour une journée sélectionnable, avec les informations du match (date, salle, équipes, correspondant du JA)</w:t>
+      </w:r>
+    </w:p>
+    <w:p>
+      <w:pPr>
+        <w:pStyle w:val="Paragraphedeliste"/>
+        <w:numPr>
+          <w:ilvl w:val="0"/>
+          <w:numId w:val="2"/>
+        </w:numPr>
+        <w:spacing w:before="40" w:after="40"/>
+      </w:pPr>
+      <w:r>
+        <w:t>Liste nomination : envoie à chaque JA la liste complète de ses nominations pour la phase en cours sous forme de tableau HTML</w:t>
+      </w:r>
+    </w:p>
+    <w:p>
+      <w:pPr>
+        <w:pStyle w:val="Titre3"/>
+      </w:pPr>
+      <w:bookmarkStart w:id="99" w:name="_Toc_E024_Champs"/>
+      <w:r>
+        <w:t>Champs et fonctionnalités</w:t>
+      </w:r>
+      <w:bookmarkEnd w:id="99"/>
+    </w:p>
+    <w:p>
+      <w:pPr>
+        <w:pStyle w:val="Paragraphedeliste"/>
+        <w:numPr>
+          <w:ilvl w:val="0"/>
+          <w:numId w:val="2"/>
+        </w:numPr>
+        <w:spacing w:before="40" w:after="40"/>
+      </w:pPr>
+      <w:r>
+        <w:t>Onglets de type : sélectionnent le type d’envoi et rechargent automatiquement la liste des destinataires et les marqueurs disponibles</w:t>
+      </w:r>
+    </w:p>
+    <w:p>
+      <w:pPr>
+        <w:pStyle w:val="Paragraphedeliste"/>
+        <w:numPr>
+          <w:ilvl w:val="0"/>
+          <w:numId w:val="2"/>
+        </w:numPr>
+        <w:spacing w:before="40" w:after="40"/>
+      </w:pPr>
+      <w:r>
+        <w:t>Zone Sujet : sujet de l’email (pré-rempli depuis le modèle correspondant en E016)</w:t>
+      </w:r>
+    </w:p>
+    <w:p>
+      <w:pPr>
+        <w:pStyle w:val="Paragraphedeliste"/>
+        <w:numPr>
+          <w:ilvl w:val="0"/>
+          <w:numId w:val="2"/>
+        </w:numPr>
+        <w:spacing w:before="40" w:after="40"/>
+      </w:pPr>
+      <w:r>
+        <w:t>Zone Message : corps du message (pré-rempli depuis le modèle correspondant en E016)</w:t>
+      </w:r>
+    </w:p>
+    <w:p>
+      <w:pPr>
+        <w:pStyle w:val="Paragraphedeliste"/>
+        <w:numPr>
+          <w:ilvl w:val="0"/>
+          <w:numId w:val="2"/>
+        </w:numPr>
+        <w:spacing w:before="40" w:after="40"/>
+      </w:pPr>
+      <w:r>
+        <w:t>Cartouche des marqueurs : marqueurs disponibles selon l’onglet actif ; un clic insère le marqueur au curseur dans Sujet ou Message</w:t>
+      </w:r>
+    </w:p>
+    <w:p>
+      <w:pPr>
+        <w:pStyle w:val="Paragraphedeliste"/>
+        <w:numPr>
+          <w:ilvl w:val="0"/>
+          <w:numId w:val="2"/>
+        </w:numPr>
+        <w:spacing w:before="40" w:after="40"/>
+      </w:pPr>
+      <w:r>
+        <w:t>Sélecteur de journée (onglet Convocation uniquement) : charge les journées de la saison courante avec le nombre de JA nominés</w:t>
+      </w:r>
+    </w:p>
+    <w:p>
+      <w:pPr>
+        <w:pStyle w:val="Paragraphedeliste"/>
+        <w:numPr>
+          <w:ilvl w:val="0"/>
+          <w:numId w:val="2"/>
+        </w:numPr>
+        <w:spacing w:before="40" w:after="40"/>
+      </w:pPr>
+      <w:r>
+        <w:t>Liste des JA : tableau avec cases à cocher, tri par Nom/Prénom (clic sur en-tête), recherche en temps réel avec compteur</w:t>
+      </w:r>
+    </w:p>
+    <w:p>
+      <w:pPr>
+        <w:pStyle w:val="Paragraphedeliste"/>
+        <w:numPr>
+          <w:ilvl w:val="0"/>
+          <w:numId w:val="2"/>
+        </w:numPr>
+        <w:spacing w:before="40" w:after="40"/>
+      </w:pPr>
+      <w:r>
+        <w:t>Bouton Envoyer : envoi après confirmation affichant prénom et nom de chaque destinataire</w:t>
+      </w:r>
+    </w:p>
+    <w:p>
+      <w:pPr>
+        <w:pStyle w:val="Titre3"/>
+      </w:pPr>
+      <w:bookmarkStart w:id="100" w:name="_Toc_E024_Rem"/>
+      <w:r>
+        <w:t>Remarques</w:t>
+      </w:r>
+      <w:bookmarkEnd w:id="100"/>
+    </w:p>
+    <w:p>
+      <w:pPr>
+        <w:spacing w:before="60" w:after="60"/>
+      </w:pPr>
+      <w:r>
+        <w:t>Les emails sont envoyés via SMTP (paramétré dans la table configuration). En mode Développement, tous les emails sont redirigés vers l’adresse configurée et le sujet est préfixé [DEV]. Les erreurs d’envoi sont affichées par destinataire avec le détail de l’erreur SMTP. Le marqueur {LISTE_NOMINATIONS} génère un tableau HTML avec en-tête bleu NIJAC, lignes alternées et dates au format français (jj/mm/aaaa).</w:t>
+      </w:r>
+    </w:p>
+    <w:p>
+      <w:pPr>
+        <w:pStyle w:val="Titre3"/>
+      </w:pPr>
+      <w:bookmarkStart w:id="101" w:name="_Toc_E024_Ecran"/>
+      <w:r>
+        <w:t>Copie d’écran</w:t>
+      </w:r>
+      <w:bookmarkEnd w:id="101"/>
+    </w:p>
+    <w:p>
+      <w:pPr>
+        <w:spacing w:before="100" w:after="100"/>
+      </w:pPr>
+    </w:p>
+    <w:tbl>
+      <w:tblPr>
+        <w:tblW w:w="9026" w:type="dxa"/>
+        <w:tblBorders>
+          <w:top w:val="single" w:sz="4" w:space="0" w:color="auto"/>
+          <w:left w:val="single" w:sz="4" w:space="0" w:color="auto"/>
+          <w:bottom w:val="single" w:sz="4" w:space="0" w:color="auto"/>
+          <w:right w:val="single" w:sz="4" w:space="0" w:color="auto"/>
+        </w:tblBorders>
+        <w:tblLook w:val="04A0" w:firstRow="1" w:lastRow="0" w:firstColumn="1" w:lastColumn="0" w:noHBand="0" w:noVBand="1"/>
+      </w:tblPr>
+      <w:tblGrid>
+        <w:gridCol w:w="9430"/>
+      </w:tblGrid>
+      <w:tr>
+        <w:tc>
+          <w:tcPr>
+            <w:tcW w:w="9026" w:type="dxa"/>
+            <w:tcBorders>
+              <w:top w:val="single" w:sz="4" w:space="0" w:color="AAAACC"/>
+              <w:left w:val="single" w:sz="4" w:space="0" w:color="AAAACC"/>
+              <w:bottom w:val="single" w:sz="4" w:space="0" w:color="AAAACC"/>
+              <w:right w:val="single" w:sz="4" w:space="0" w:color="AAAACC"/>
+            </w:tcBorders>
+            <w:shd w:val="clear" w:color="auto" w:fill="F5F5FF"/>
+            <w:tcMar>
+              <w:top w:w="200" w:type="dxa"/>
+              <w:left w:w="200" w:type="dxa"/>
+              <w:bottom w:w="200" w:type="dxa"/>
+              <w:right w:w="200" w:type="dxa"/>
+            </w:tcMar>
+            <w:vAlign w:val="center"/>
+          </w:tcPr>
+          <w:p>
+            <w:pPr>
+              <w:spacing w:before="400" w:after="400"/>
+              <w:jc w:val="center"/>
+            </w:pPr>
+            <w:r>
+              <w:lastRenderedPageBreak/>
+              <w:drawing>
+                <wp:inline distT="0" distB="0" distL="0" distR="0" wp14:anchorId="3964ECFD" wp14:editId="6FE4807F">
+                  <wp:extent cx="5731510" cy="2987675"/>
+                  <wp:effectExtent l="0" t="0" r="2540" b="3175"/>
+                  <wp:docPr id="36" name="Image 36"/>
+                  <wp:cNvGraphicFramePr>
+                    <a:graphicFrameLocks xmlns:a="http://schemas.openxmlformats.org/drawingml/2006/main" noChangeAspect="1"/>
+                  </wp:cNvGraphicFramePr>
+                  <a:graphic xmlns:a="http://schemas.openxmlformats.org/drawingml/2006/main">
+                    <a:graphicData uri="http://schemas.openxmlformats.org/drawingml/2006/picture">
+                      <pic:pic xmlns:pic="http://schemas.openxmlformats.org/drawingml/2006/picture">
+                        <pic:nvPicPr>
+                          <pic:cNvPr id="1" name=""/>
+                          <pic:cNvPicPr/>
+                        </pic:nvPicPr>
+                        <pic:blipFill>
+                          <a:blip r:embed="rId40"/>
+                          <a:stretch>
+                            <a:fillRect/>
+                          </a:stretch>
+                        </pic:blipFill>
+                        <pic:spPr>
+                          <a:xfrm>
+                            <a:off x="0" y="0"/>
+                            <a:ext cx="5731510" cy="2987675"/>
+                          </a:xfrm>
+                          <a:prstGeom prst="rect">
+                            <a:avLst/>
+                          </a:prstGeom>
+                        </pic:spPr>
+                      </pic:pic>
+                    </a:graphicData>
+                  </a:graphic>
+                </wp:inline>
+              </w:drawing>
+            </w:r>
+          </w:p>
+        </w:tc>
+      </w:tr>
+      <w:tr>
+        <w:tc>
+          <w:tcPr>
+            <w:tcW w:w="9026" w:type="dxa"/>
+            <w:tcBorders>
+              <w:top w:val="single" w:sz="4" w:space="0" w:color="AAAACC"/>
+              <w:left w:val="single" w:sz="4" w:space="0" w:color="AAAACC"/>
+              <w:bottom w:val="single" w:sz="4" w:space="0" w:color="AAAACC"/>
+              <w:right w:val="single" w:sz="4" w:space="0" w:color="AAAACC"/>
+            </w:tcBorders>
+            <w:shd w:val="clear" w:color="auto" w:fill="F5F5FF"/>
+            <w:tcMar>
+              <w:top w:w="200" w:type="dxa"/>
+              <w:left w:w="200" w:type="dxa"/>
+              <w:bottom w:w="200" w:type="dxa"/>
+              <w:right w:w="200" w:type="dxa"/>
+            </w:tcMar>
+            <w:vAlign w:val="center"/>
+          </w:tcPr>
+          <w:p>
+            <w:pPr>
+              <w:spacing w:before="400" w:after="400"/>
+              <w:jc w:val="center"/>
+            </w:pPr>
+            <w:r>
+              <w:lastRenderedPageBreak/>
+              <w:drawing>
+                <wp:inline distT="0" distB="0" distL="0" distR="0" wp14:anchorId="0699A680" wp14:editId="4F9539DE">
+                  <wp:extent cx="5731510" cy="5116195"/>
+                  <wp:effectExtent l="0" t="0" r="2540" b="8255"/>
+                  <wp:docPr id="37" name="Image 37"/>
+                  <wp:cNvGraphicFramePr>
+                    <a:graphicFrameLocks xmlns:a="http://schemas.openxmlformats.org/drawingml/2006/main" noChangeAspect="1"/>
+                  </wp:cNvGraphicFramePr>
+                  <a:graphic xmlns:a="http://schemas.openxmlformats.org/drawingml/2006/main">
+                    <a:graphicData uri="http://schemas.openxmlformats.org/drawingml/2006/picture">
+                      <pic:pic xmlns:pic="http://schemas.openxmlformats.org/drawingml/2006/picture">
+                        <pic:nvPicPr>
+                          <pic:cNvPr id="1" name=""/>
+                          <pic:cNvPicPr/>
+                        </pic:nvPicPr>
+                        <pic:blipFill>
+                          <a:blip r:embed="rId41"/>
+                          <a:stretch>
+                            <a:fillRect/>
+                          </a:stretch>
+                        </pic:blipFill>
+                        <pic:spPr>
+                          <a:xfrm>
+                            <a:off x="0" y="0"/>
+                            <a:ext cx="5731510" cy="5116195"/>
+                          </a:xfrm>
+                          <a:prstGeom prst="rect">
+                            <a:avLst/>
+                          </a:prstGeom>
+                        </pic:spPr>
+                      </pic:pic>
+                    </a:graphicData>
+                  </a:graphic>
+                </wp:inline>
+              </w:drawing>
+            </w:r>
+          </w:p>
+        </w:tc>
+      </w:tr>
+      <w:tr>
+        <w:tc>
+          <w:tcPr>
+            <w:tcW w:w="9026" w:type="dxa"/>
+            <w:tcBorders>
+              <w:top w:val="single" w:sz="4" w:space="0" w:color="AAAACC"/>
+              <w:left w:val="single" w:sz="4" w:space="0" w:color="AAAACC"/>
+              <w:bottom w:val="single" w:sz="4" w:space="0" w:color="AAAACC"/>
+              <w:right w:val="single" w:sz="4" w:space="0" w:color="AAAACC"/>
+            </w:tcBorders>
+            <w:shd w:val="clear" w:color="auto" w:fill="F5F5FF"/>
+            <w:tcMar>
+              <w:top w:w="200" w:type="dxa"/>
+              <w:left w:w="200" w:type="dxa"/>
+              <w:bottom w:w="200" w:type="dxa"/>
+              <w:right w:w="200" w:type="dxa"/>
+            </w:tcMar>
+            <w:vAlign w:val="center"/>
+          </w:tcPr>
+          <w:p>
+            <w:pPr>
+              <w:spacing w:before="400" w:after="400"/>
+              <w:jc w:val="center"/>
+            </w:pPr>
+            <w:r>
+              <w:lastRenderedPageBreak/>
+              <w:drawing>
+                <wp:inline distT="0" distB="0" distL="0" distR="0" wp14:anchorId="341F6E85" wp14:editId="34DFACD9">
+                  <wp:extent cx="5731510" cy="5222875"/>
+                  <wp:effectExtent l="0" t="0" r="2540" b="0"/>
+                  <wp:docPr id="38" name="Image 38"/>
+                  <wp:cNvGraphicFramePr>
+                    <a:graphicFrameLocks xmlns:a="http://schemas.openxmlformats.org/drawingml/2006/main" noChangeAspect="1"/>
+                  </wp:cNvGraphicFramePr>
+                  <a:graphic xmlns:a="http://schemas.openxmlformats.org/drawingml/2006/main">
+                    <a:graphicData uri="http://schemas.openxmlformats.org/drawingml/2006/picture">
+                      <pic:pic xmlns:pic="http://schemas.openxmlformats.org/drawingml/2006/picture">
+                        <pic:nvPicPr>
+                          <pic:cNvPr id="1" name=""/>
+                          <pic:cNvPicPr/>
+                        </pic:nvPicPr>
+                        <pic:blipFill>
+                          <a:blip r:embed="rId42"/>
+                          <a:stretch>
+                            <a:fillRect/>
+                          </a:stretch>
+                        </pic:blipFill>
+                        <pic:spPr>
+                          <a:xfrm>
+                            <a:off x="0" y="0"/>
+                            <a:ext cx="5731510" cy="5222875"/>
+                          </a:xfrm>
+                          <a:prstGeom prst="rect">
+                            <a:avLst/>
+                          </a:prstGeom>
+                        </pic:spPr>
+                      </pic:pic>
+                    </a:graphicData>
+                  </a:graphic>
+                </wp:inline>
+              </w:drawing>
+            </w:r>
+          </w:p>
+        </w:tc>
+      </w:tr>
+      <w:tr>
+        <w:tc>
+          <w:tcPr>
+            <w:tcW w:w="9026" w:type="dxa"/>
+            <w:tcBorders>
+              <w:top w:val="single" w:sz="4" w:space="0" w:color="AAAACC"/>
+              <w:left w:val="single" w:sz="4" w:space="0" w:color="AAAACC"/>
+              <w:bottom w:val="single" w:sz="4" w:space="0" w:color="AAAACC"/>
+              <w:right w:val="single" w:sz="4" w:space="0" w:color="AAAACC"/>
+            </w:tcBorders>
+            <w:shd w:val="clear" w:color="auto" w:fill="F5F5FF"/>
+            <w:tcMar>
+              <w:top w:w="200" w:type="dxa"/>
+              <w:left w:w="200" w:type="dxa"/>
+              <w:bottom w:w="200" w:type="dxa"/>
+              <w:right w:w="200" w:type="dxa"/>
+            </w:tcMar>
+            <w:vAlign w:val="center"/>
+          </w:tcPr>
+          <w:p>
+            <w:pPr>
+              <w:spacing w:before="400" w:after="400"/>
+              <w:jc w:val="center"/>
+            </w:pPr>
+            <w:r>
+              <w:lastRenderedPageBreak/>
+              <w:drawing>
+                <wp:inline distT="0" distB="0" distL="0" distR="0" wp14:anchorId="17784881" wp14:editId="7C823A4D">
+                  <wp:extent cx="5731510" cy="5381625"/>
+                  <wp:effectExtent l="0" t="0" r="2540" b="9525"/>
+                  <wp:docPr id="39" name="Image 39"/>
+                  <wp:cNvGraphicFramePr>
+                    <a:graphicFrameLocks xmlns:a="http://schemas.openxmlformats.org/drawingml/2006/main" noChangeAspect="1"/>
+                  </wp:cNvGraphicFramePr>
+                  <a:graphic xmlns:a="http://schemas.openxmlformats.org/drawingml/2006/main">
+                    <a:graphicData uri="http://schemas.openxmlformats.org/drawingml/2006/picture">
+                      <pic:pic xmlns:pic="http://schemas.openxmlformats.org/drawingml/2006/picture">
+                        <pic:nvPicPr>
+                          <pic:cNvPr id="1" name=""/>
+                          <pic:cNvPicPr/>
+                        </pic:nvPicPr>
+                        <pic:blipFill>
+                          <a:blip r:embed="rId43"/>
+                          <a:stretch>
+                            <a:fillRect/>
+                          </a:stretch>
+                        </pic:blipFill>
+                        <pic:spPr>
+                          <a:xfrm>
+                            <a:off x="0" y="0"/>
+                            <a:ext cx="5731510" cy="5381625"/>
+                          </a:xfrm>
+                          <a:prstGeom prst="rect">
+                            <a:avLst/>
+                          </a:prstGeom>
+                        </pic:spPr>
+                      </pic:pic>
+                    </a:graphicData>
+                  </a:graphic>
+                </wp:inline>
+              </w:drawing>
+            </w:r>
+          </w:p>
+        </w:tc>
+      </w:tr>
+    </w:tbl>
     <w:p/>
+    <w:p/>
+    <w:p>
+      <w:r>
+        <w:br w:type="page"/>
+      </w:r>
+    </w:p>
+    <w:p>
+      <w:r>
+        <w:lastRenderedPageBreak/>
+        <w:t>Exemple : Liste Nominations</w:t>
+      </w:r>
+    </w:p>
+    <w:p>
+      <w:r>
+        <w:drawing>
+          <wp:inline distT="0" distB="0" distL="0" distR="0" wp14:anchorId="476F7DD7" wp14:editId="1B3B8BCE">
+            <wp:extent cx="4820323" cy="3134162"/>
+            <wp:effectExtent l="0" t="0" r="0" b="9525"/>
+            <wp:docPr id="40" name="Image 40"/>
+            <wp:cNvGraphicFramePr>
+              <a:graphicFrameLocks xmlns:a="http://schemas.openxmlformats.org/drawingml/2006/main" noChangeAspect="1"/>
+            </wp:cNvGraphicFramePr>
+            <a:graphic xmlns:a="http://schemas.openxmlformats.org/drawingml/2006/main">
+              <a:graphicData uri="http://schemas.openxmlformats.org/drawingml/2006/picture">
+                <pic:pic xmlns:pic="http://schemas.openxmlformats.org/drawingml/2006/picture">
+                  <pic:nvPicPr>
+                    <pic:cNvPr id="1" name=""/>
+                    <pic:cNvPicPr/>
+                  </pic:nvPicPr>
+                  <pic:blipFill>
+                    <a:blip r:embed="rId44"/>
+                    <a:stretch>
+                      <a:fillRect/>
+                    </a:stretch>
+                  </pic:blipFill>
+                  <pic:spPr>
+                    <a:xfrm>
+                      <a:off x="0" y="0"/>
+                      <a:ext cx="4820323" cy="3134162"/>
+                    </a:xfrm>
+                    <a:prstGeom prst="rect">
+                      <a:avLst/>
+                    </a:prstGeom>
+                  </pic:spPr>
+                </pic:pic>
+              </a:graphicData>
+            </a:graphic>
+          </wp:inline>
+        </w:drawing>
+      </w:r>
+    </w:p>
     <w:sectPr>
-      <w:headerReference w:type="default" r:id="rId40"/>
-      <w:footerReference w:type="default" r:id="rId41"/>
+      <w:headerReference w:type="default" r:id="rId45"/>
+      <w:footerReference w:type="default" r:id="rId46"/>
       <w:pgSz w:w="11906" w:h="16838"/>
       <w:pgMar w:top="1440" w:right="1440" w:bottom="1440" w:left="1440" w:header="708" w:footer="708" w:gutter="0"/>
       <w:cols w:space="720"/>

</xml_diff>

<commit_message>
Modification de la documentation
</commit_message>
<xml_diff>
--- a/NIJAC_Documentation_Utilisateur.docx
+++ b/NIJAC_Documentation_Utilisateur.docx
@@ -8540,7 +8540,23 @@
           <w:iCs/>
           <w:color w:val="555555"/>
         </w:rPr>
-        <w:t>MDP : Change-On_Install</w:t>
+        <w:t>MDP : Change</w:t>
+      </w:r>
+      <w:r>
+        <w:rPr>
+          <w:i/>
+          <w:iCs/>
+          <w:color w:val="555555"/>
+        </w:rPr>
+        <w:t>_</w:t>
+      </w:r>
+      <w:r>
+        <w:rPr>
+          <w:i/>
+          <w:iCs/>
+          <w:color w:val="555555"/>
+        </w:rPr>
+        <w:t>On_Install</w:t>
       </w:r>
     </w:p>
     <w:p>
@@ -9217,6 +9233,9 @@
               <w:jc w:val="center"/>
             </w:pPr>
             <w:r>
+              <w:rPr>
+                <w:noProof/>
+              </w:rPr>
               <w:drawing>
                 <wp:inline distT="0" distB="0" distL="0" distR="0" wp14:anchorId="41B2BF68" wp14:editId="0165C8A9">
                   <wp:extent cx="5731510" cy="2676525"/>
@@ -15522,6 +15541,9 @@
               <w:jc w:val="center"/>
             </w:pPr>
             <w:r>
+              <w:rPr>
+                <w:noProof/>
+              </w:rPr>
               <w:drawing>
                 <wp:inline distT="0" distB="0" distL="0" distR="0" wp14:anchorId="6F6A086F" wp14:editId="51D2855B">
                   <wp:extent cx="5731510" cy="2979420"/>
@@ -15999,6 +16021,9 @@
               <w:jc w:val="center"/>
             </w:pPr>
             <w:r>
+              <w:rPr>
+                <w:noProof/>
+              </w:rPr>
               <w:drawing>
                 <wp:inline distT="0" distB="0" distL="0" distR="0" wp14:anchorId="2D14F4FC" wp14:editId="1807357A">
                   <wp:extent cx="5731510" cy="2988945"/>
@@ -18398,6 +18423,9 @@
               <w:jc w:val="center"/>
             </w:pPr>
             <w:r>
+              <w:rPr>
+                <w:noProof/>
+              </w:rPr>
               <w:lastRenderedPageBreak/>
               <w:drawing>
                 <wp:inline distT="0" distB="0" distL="0" distR="0" wp14:anchorId="3964ECFD" wp14:editId="6FE4807F">
@@ -18463,6 +18491,9 @@
               <w:jc w:val="center"/>
             </w:pPr>
             <w:r>
+              <w:rPr>
+                <w:noProof/>
+              </w:rPr>
               <w:lastRenderedPageBreak/>
               <w:drawing>
                 <wp:inline distT="0" distB="0" distL="0" distR="0" wp14:anchorId="0699A680" wp14:editId="4F9539DE">
@@ -18528,6 +18559,9 @@
               <w:jc w:val="center"/>
             </w:pPr>
             <w:r>
+              <w:rPr>
+                <w:noProof/>
+              </w:rPr>
               <w:lastRenderedPageBreak/>
               <w:drawing>
                 <wp:inline distT="0" distB="0" distL="0" distR="0" wp14:anchorId="341F6E85" wp14:editId="34DFACD9">
@@ -18593,6 +18627,9 @@
               <w:jc w:val="center"/>
             </w:pPr>
             <w:r>
+              <w:rPr>
+                <w:noProof/>
+              </w:rPr>
               <w:lastRenderedPageBreak/>
               <w:drawing>
                 <wp:inline distT="0" distB="0" distL="0" distR="0" wp14:anchorId="17784881" wp14:editId="7C823A4D">
@@ -18649,6 +18686,9 @@
     </w:p>
     <w:p>
       <w:r>
+        <w:rPr>
+          <w:noProof/>
+        </w:rPr>
         <w:drawing>
           <wp:inline distT="0" distB="0" distL="0" distR="0" wp14:anchorId="476F7DD7" wp14:editId="1B3B8BCE">
             <wp:extent cx="4820323" cy="3134162"/>
@@ -18859,25 +18899,7 @@
         <w:sz w:val="16"/>
         <w:szCs w:val="16"/>
       </w:rPr>
-      <w:t xml:space="preserve">© 2026 NIJAC – Tous droits </w:t>
-    </w:r>
-    <w:proofErr w:type="gramStart"/>
-    <w:r>
-      <w:rPr>
-        <w:color w:val="888888"/>
-        <w:sz w:val="16"/>
-        <w:szCs w:val="16"/>
-      </w:rPr>
-      <w:t>réservés  |</w:t>
-    </w:r>
-    <w:proofErr w:type="gramEnd"/>
-    <w:r>
-      <w:rPr>
-        <w:color w:val="888888"/>
-        <w:sz w:val="16"/>
-        <w:szCs w:val="16"/>
-      </w:rPr>
-      <w:t xml:space="preserve">  Page </w:t>
+      <w:t xml:space="preserve">© 2026 NIJAC – Tous droits réservés  |  Page </w:t>
     </w:r>
     <w:r>
       <w:rPr>

</xml_diff>

<commit_message>
Mise a jour du n° de version
</commit_message>
<xml_diff>
--- a/NIJAC_Documentation_Utilisateur.docx
+++ b/NIJAC_Documentation_Utilisateur.docx
@@ -104,7 +104,7 @@
           <w:sz w:val="24"/>
           <w:szCs w:val="24"/>
         </w:rPr>
-        <w:t>6</w:t>
+        <w:t>.10</w:t>
       </w:r>
       <w:r>
         <w:rPr>
@@ -120,7 +120,15 @@
           <w:sz w:val="24"/>
           <w:szCs w:val="24"/>
         </w:rPr>
-        <w:t xml:space="preserve">5 </w:t>
+        <w:t>6</w:t>
+      </w:r>
+      <w:r>
+        <w:rPr>
+          <w:color w:val="888888"/>
+          <w:sz w:val="24"/>
+          <w:szCs w:val="24"/>
+        </w:rPr>
+        <w:t xml:space="preserve"> </w:t>
       </w:r>
       <w:r>
         <w:rPr>
@@ -13933,14 +13941,11 @@
               <w:jc w:val="center"/>
             </w:pPr>
             <w:r>
-              <w:rPr>
-                <w:noProof/>
-              </w:rPr>
               <w:drawing>
-                <wp:inline distT="0" distB="0" distL="0" distR="0" wp14:anchorId="60CC7FA7" wp14:editId="204A21A1">
-                  <wp:extent cx="5731510" cy="2041525"/>
+                <wp:inline distT="0" distB="0" distL="0" distR="0" wp14:anchorId="47B0E1BA" wp14:editId="67D07FB3">
+                  <wp:extent cx="5731510" cy="1924685"/>
                   <wp:effectExtent l="0" t="0" r="2540" b="0"/>
-                  <wp:docPr id="33" name="Image 33"/>
+                  <wp:docPr id="2" name="Image 2"/>
                   <wp:cNvGraphicFramePr>
                     <a:graphicFrameLocks xmlns:a="http://schemas.openxmlformats.org/drawingml/2006/main" noChangeAspect="1"/>
                   </wp:cNvGraphicFramePr>
@@ -13960,7 +13965,7 @@
                         <pic:spPr>
                           <a:xfrm>
                             <a:off x="0" y="0"/>
-                            <a:ext cx="5731510" cy="2041525"/>
+                            <a:ext cx="5731510" cy="1924685"/>
                           </a:xfrm>
                           <a:prstGeom prst="rect">
                             <a:avLst/>

</xml_diff>

<commit_message>
Stat Ok, Supp champ distanceMaxKm
</commit_message>
<xml_diff>
--- a/NIJAC_Documentation_Utilisateur.docx
+++ b/NIJAC_Documentation_Utilisateur.docx
@@ -96,47 +96,7 @@
           <w:sz w:val="24"/>
           <w:szCs w:val="24"/>
         </w:rPr>
-        <w:t>Version 0.0</w:t>
-      </w:r>
-      <w:r>
-        <w:rPr>
-          <w:color w:val="888888"/>
-          <w:sz w:val="24"/>
-          <w:szCs w:val="24"/>
-        </w:rPr>
-        <w:t>.10</w:t>
-      </w:r>
-      <w:r>
-        <w:rPr>
-          <w:color w:val="888888"/>
-          <w:sz w:val="24"/>
-          <w:szCs w:val="24"/>
-        </w:rPr>
-        <w:t xml:space="preserve"> – 1</w:t>
-      </w:r>
-      <w:r>
-        <w:rPr>
-          <w:color w:val="888888"/>
-          <w:sz w:val="24"/>
-          <w:szCs w:val="24"/>
-        </w:rPr>
-        <w:t>6</w:t>
-      </w:r>
-      <w:r>
-        <w:rPr>
-          <w:color w:val="888888"/>
-          <w:sz w:val="24"/>
-          <w:szCs w:val="24"/>
-        </w:rPr>
-        <w:t xml:space="preserve"> </w:t>
-      </w:r>
-      <w:r>
-        <w:rPr>
-          <w:color w:val="888888"/>
-          <w:sz w:val="24"/>
-          <w:szCs w:val="24"/>
-        </w:rPr>
-        <w:t>Juin 2026</w:t>
+        <w:t>Version 0.0.12 – 19 Juin 2026</w:t>
       </w:r>
     </w:p>
     <w:p>
@@ -207,11 +167,7 @@
           </w:pPr>
           <w:r>
             <w:fldChar w:fldCharType="begin"/>
-          </w:r>
-          <w:r>
             <w:instrText>TOC \h \o "1-3"</w:instrText>
-          </w:r>
-          <w:r>
             <w:fldChar w:fldCharType="separate"/>
           </w:r>
           <w:hyperlink w:anchor="_Toc232147235" w:history="1">
@@ -227,40 +183,10 @@
                 <w:noProof/>
               </w:rPr>
               <w:tab/>
-            </w:r>
-            <w:r>
-              <w:rPr>
-                <w:noProof/>
-              </w:rPr>
               <w:fldChar w:fldCharType="begin"/>
-            </w:r>
-            <w:r>
-              <w:rPr>
-                <w:noProof/>
-              </w:rPr>
               <w:instrText xml:space="preserve"> PAGEREF _Toc232147235 \h </w:instrText>
-            </w:r>
-            <w:r>
-              <w:rPr>
-                <w:noProof/>
-              </w:rPr>
-            </w:r>
-            <w:r>
-              <w:rPr>
-                <w:noProof/>
-              </w:rPr>
               <w:fldChar w:fldCharType="separate"/>
-            </w:r>
-            <w:r>
-              <w:rPr>
-                <w:noProof/>
-              </w:rPr>
               <w:t>5</w:t>
-            </w:r>
-            <w:r>
-              <w:rPr>
-                <w:noProof/>
-              </w:rPr>
               <w:fldChar w:fldCharType="end"/>
             </w:r>
           </w:hyperlink>
@@ -291,40 +217,10 @@
                 <w:noProof/>
               </w:rPr>
               <w:tab/>
-            </w:r>
-            <w:r>
-              <w:rPr>
-                <w:noProof/>
-              </w:rPr>
               <w:fldChar w:fldCharType="begin"/>
-            </w:r>
-            <w:r>
-              <w:rPr>
-                <w:noProof/>
-              </w:rPr>
               <w:instrText xml:space="preserve"> PAGEREF _Toc232147236 \h </w:instrText>
-            </w:r>
-            <w:r>
-              <w:rPr>
-                <w:noProof/>
-              </w:rPr>
-            </w:r>
-            <w:r>
-              <w:rPr>
-                <w:noProof/>
-              </w:rPr>
               <w:fldChar w:fldCharType="separate"/>
-            </w:r>
-            <w:r>
-              <w:rPr>
-                <w:noProof/>
-              </w:rPr>
               <w:t>5</w:t>
-            </w:r>
-            <w:r>
-              <w:rPr>
-                <w:noProof/>
-              </w:rPr>
               <w:fldChar w:fldCharType="end"/>
             </w:r>
           </w:hyperlink>
@@ -355,40 +251,10 @@
                 <w:noProof/>
               </w:rPr>
               <w:tab/>
-            </w:r>
-            <w:r>
-              <w:rPr>
-                <w:noProof/>
-              </w:rPr>
               <w:fldChar w:fldCharType="begin"/>
-            </w:r>
-            <w:r>
-              <w:rPr>
-                <w:noProof/>
-              </w:rPr>
               <w:instrText xml:space="preserve"> PAGEREF _Toc232147237 \h </w:instrText>
-            </w:r>
-            <w:r>
-              <w:rPr>
-                <w:noProof/>
-              </w:rPr>
-            </w:r>
-            <w:r>
-              <w:rPr>
-                <w:noProof/>
-              </w:rPr>
               <w:fldChar w:fldCharType="separate"/>
-            </w:r>
-            <w:r>
-              <w:rPr>
-                <w:noProof/>
-              </w:rPr>
               <w:t>5</w:t>
-            </w:r>
-            <w:r>
-              <w:rPr>
-                <w:noProof/>
-              </w:rPr>
               <w:fldChar w:fldCharType="end"/>
             </w:r>
           </w:hyperlink>
@@ -419,40 +285,10 @@
                 <w:noProof/>
               </w:rPr>
               <w:tab/>
-            </w:r>
-            <w:r>
-              <w:rPr>
-                <w:noProof/>
-              </w:rPr>
               <w:fldChar w:fldCharType="begin"/>
-            </w:r>
-            <w:r>
-              <w:rPr>
-                <w:noProof/>
-              </w:rPr>
               <w:instrText xml:space="preserve"> PAGEREF _Toc232147238 \h </w:instrText>
-            </w:r>
-            <w:r>
-              <w:rPr>
-                <w:noProof/>
-              </w:rPr>
-            </w:r>
-            <w:r>
-              <w:rPr>
-                <w:noProof/>
-              </w:rPr>
               <w:fldChar w:fldCharType="separate"/>
-            </w:r>
-            <w:r>
-              <w:rPr>
-                <w:noProof/>
-              </w:rPr>
               <w:t>5</w:t>
-            </w:r>
-            <w:r>
-              <w:rPr>
-                <w:noProof/>
-              </w:rPr>
               <w:fldChar w:fldCharType="end"/>
             </w:r>
           </w:hyperlink>
@@ -483,40 +319,10 @@
                 <w:noProof/>
               </w:rPr>
               <w:tab/>
-            </w:r>
-            <w:r>
-              <w:rPr>
-                <w:noProof/>
-              </w:rPr>
               <w:fldChar w:fldCharType="begin"/>
-            </w:r>
-            <w:r>
-              <w:rPr>
-                <w:noProof/>
-              </w:rPr>
               <w:instrText xml:space="preserve"> PAGEREF _Toc232147239 \h </w:instrText>
-            </w:r>
-            <w:r>
-              <w:rPr>
-                <w:noProof/>
-              </w:rPr>
-            </w:r>
-            <w:r>
-              <w:rPr>
-                <w:noProof/>
-              </w:rPr>
               <w:fldChar w:fldCharType="separate"/>
-            </w:r>
-            <w:r>
-              <w:rPr>
-                <w:noProof/>
-              </w:rPr>
               <w:t>6</w:t>
-            </w:r>
-            <w:r>
-              <w:rPr>
-                <w:noProof/>
-              </w:rPr>
               <w:fldChar w:fldCharType="end"/>
             </w:r>
           </w:hyperlink>
@@ -547,40 +353,10 @@
                 <w:noProof/>
               </w:rPr>
               <w:tab/>
-            </w:r>
-            <w:r>
-              <w:rPr>
-                <w:noProof/>
-              </w:rPr>
               <w:fldChar w:fldCharType="begin"/>
-            </w:r>
-            <w:r>
-              <w:rPr>
-                <w:noProof/>
-              </w:rPr>
               <w:instrText xml:space="preserve"> PAGEREF _Toc232147240 \h </w:instrText>
-            </w:r>
-            <w:r>
-              <w:rPr>
-                <w:noProof/>
-              </w:rPr>
-            </w:r>
-            <w:r>
-              <w:rPr>
-                <w:noProof/>
-              </w:rPr>
               <w:fldChar w:fldCharType="separate"/>
-            </w:r>
-            <w:r>
-              <w:rPr>
-                <w:noProof/>
-              </w:rPr>
               <w:t>7</w:t>
-            </w:r>
-            <w:r>
-              <w:rPr>
-                <w:noProof/>
-              </w:rPr>
               <w:fldChar w:fldCharType="end"/>
             </w:r>
           </w:hyperlink>
@@ -611,40 +387,10 @@
                 <w:noProof/>
               </w:rPr>
               <w:tab/>
-            </w:r>
-            <w:r>
-              <w:rPr>
-                <w:noProof/>
-              </w:rPr>
               <w:fldChar w:fldCharType="begin"/>
-            </w:r>
-            <w:r>
-              <w:rPr>
-                <w:noProof/>
-              </w:rPr>
               <w:instrText xml:space="preserve"> PAGEREF _Toc232147241 \h </w:instrText>
-            </w:r>
-            <w:r>
-              <w:rPr>
-                <w:noProof/>
-              </w:rPr>
-            </w:r>
-            <w:r>
-              <w:rPr>
-                <w:noProof/>
-              </w:rPr>
               <w:fldChar w:fldCharType="separate"/>
-            </w:r>
-            <w:r>
-              <w:rPr>
-                <w:noProof/>
-              </w:rPr>
               <w:t>7</w:t>
-            </w:r>
-            <w:r>
-              <w:rPr>
-                <w:noProof/>
-              </w:rPr>
               <w:fldChar w:fldCharType="end"/>
             </w:r>
           </w:hyperlink>
@@ -675,40 +421,10 @@
                 <w:noProof/>
               </w:rPr>
               <w:tab/>
-            </w:r>
-            <w:r>
-              <w:rPr>
-                <w:noProof/>
-              </w:rPr>
               <w:fldChar w:fldCharType="begin"/>
-            </w:r>
-            <w:r>
-              <w:rPr>
-                <w:noProof/>
-              </w:rPr>
               <w:instrText xml:space="preserve"> PAGEREF _Toc232147242 \h </w:instrText>
-            </w:r>
-            <w:r>
-              <w:rPr>
-                <w:noProof/>
-              </w:rPr>
-            </w:r>
-            <w:r>
-              <w:rPr>
-                <w:noProof/>
-              </w:rPr>
               <w:fldChar w:fldCharType="separate"/>
-            </w:r>
-            <w:r>
-              <w:rPr>
-                <w:noProof/>
-              </w:rPr>
               <w:t>7</w:t>
-            </w:r>
-            <w:r>
-              <w:rPr>
-                <w:noProof/>
-              </w:rPr>
               <w:fldChar w:fldCharType="end"/>
             </w:r>
           </w:hyperlink>
@@ -739,40 +455,10 @@
                 <w:noProof/>
               </w:rPr>
               <w:tab/>
-            </w:r>
-            <w:r>
-              <w:rPr>
-                <w:noProof/>
-              </w:rPr>
               <w:fldChar w:fldCharType="begin"/>
-            </w:r>
-            <w:r>
-              <w:rPr>
-                <w:noProof/>
-              </w:rPr>
               <w:instrText xml:space="preserve"> PAGEREF _Toc232147243 \h </w:instrText>
-            </w:r>
-            <w:r>
-              <w:rPr>
-                <w:noProof/>
-              </w:rPr>
-            </w:r>
-            <w:r>
-              <w:rPr>
-                <w:noProof/>
-              </w:rPr>
               <w:fldChar w:fldCharType="separate"/>
-            </w:r>
-            <w:r>
-              <w:rPr>
-                <w:noProof/>
-              </w:rPr>
               <w:t>7</w:t>
-            </w:r>
-            <w:r>
-              <w:rPr>
-                <w:noProof/>
-              </w:rPr>
               <w:fldChar w:fldCharType="end"/>
             </w:r>
           </w:hyperlink>
@@ -803,40 +489,10 @@
                 <w:noProof/>
               </w:rPr>
               <w:tab/>
-            </w:r>
-            <w:r>
-              <w:rPr>
-                <w:noProof/>
-              </w:rPr>
               <w:fldChar w:fldCharType="begin"/>
-            </w:r>
-            <w:r>
-              <w:rPr>
-                <w:noProof/>
-              </w:rPr>
               <w:instrText xml:space="preserve"> PAGEREF _Toc232147244 \h </w:instrText>
-            </w:r>
-            <w:r>
-              <w:rPr>
-                <w:noProof/>
-              </w:rPr>
-            </w:r>
-            <w:r>
-              <w:rPr>
-                <w:noProof/>
-              </w:rPr>
               <w:fldChar w:fldCharType="separate"/>
-            </w:r>
-            <w:r>
-              <w:rPr>
-                <w:noProof/>
-              </w:rPr>
               <w:t>7</w:t>
-            </w:r>
-            <w:r>
-              <w:rPr>
-                <w:noProof/>
-              </w:rPr>
               <w:fldChar w:fldCharType="end"/>
             </w:r>
           </w:hyperlink>
@@ -867,40 +523,10 @@
                 <w:noProof/>
               </w:rPr>
               <w:tab/>
-            </w:r>
-            <w:r>
-              <w:rPr>
-                <w:noProof/>
-              </w:rPr>
               <w:fldChar w:fldCharType="begin"/>
-            </w:r>
-            <w:r>
-              <w:rPr>
-                <w:noProof/>
-              </w:rPr>
               <w:instrText xml:space="preserve"> PAGEREF _Toc232147245 \h </w:instrText>
-            </w:r>
-            <w:r>
-              <w:rPr>
-                <w:noProof/>
-              </w:rPr>
-            </w:r>
-            <w:r>
-              <w:rPr>
-                <w:noProof/>
-              </w:rPr>
               <w:fldChar w:fldCharType="separate"/>
-            </w:r>
-            <w:r>
-              <w:rPr>
-                <w:noProof/>
-              </w:rPr>
               <w:t>8</w:t>
-            </w:r>
-            <w:r>
-              <w:rPr>
-                <w:noProof/>
-              </w:rPr>
               <w:fldChar w:fldCharType="end"/>
             </w:r>
           </w:hyperlink>
@@ -931,40 +557,10 @@
                 <w:noProof/>
               </w:rPr>
               <w:tab/>
-            </w:r>
-            <w:r>
-              <w:rPr>
-                <w:noProof/>
-              </w:rPr>
               <w:fldChar w:fldCharType="begin"/>
-            </w:r>
-            <w:r>
-              <w:rPr>
-                <w:noProof/>
-              </w:rPr>
               <w:instrText xml:space="preserve"> PAGEREF _Toc232147246 \h </w:instrText>
-            </w:r>
-            <w:r>
-              <w:rPr>
-                <w:noProof/>
-              </w:rPr>
-            </w:r>
-            <w:r>
-              <w:rPr>
-                <w:noProof/>
-              </w:rPr>
               <w:fldChar w:fldCharType="separate"/>
-            </w:r>
-            <w:r>
-              <w:rPr>
-                <w:noProof/>
-              </w:rPr>
               <w:t>9</w:t>
-            </w:r>
-            <w:r>
-              <w:rPr>
-                <w:noProof/>
-              </w:rPr>
               <w:fldChar w:fldCharType="end"/>
             </w:r>
           </w:hyperlink>
@@ -995,40 +591,10 @@
                 <w:noProof/>
               </w:rPr>
               <w:tab/>
-            </w:r>
-            <w:r>
-              <w:rPr>
-                <w:noProof/>
-              </w:rPr>
               <w:fldChar w:fldCharType="begin"/>
-            </w:r>
-            <w:r>
-              <w:rPr>
-                <w:noProof/>
-              </w:rPr>
               <w:instrText xml:space="preserve"> PAGEREF _Toc232147247 \h </w:instrText>
-            </w:r>
-            <w:r>
-              <w:rPr>
-                <w:noProof/>
-              </w:rPr>
-            </w:r>
-            <w:r>
-              <w:rPr>
-                <w:noProof/>
-              </w:rPr>
               <w:fldChar w:fldCharType="separate"/>
-            </w:r>
-            <w:r>
-              <w:rPr>
-                <w:noProof/>
-              </w:rPr>
               <w:t>9</w:t>
-            </w:r>
-            <w:r>
-              <w:rPr>
-                <w:noProof/>
-              </w:rPr>
               <w:fldChar w:fldCharType="end"/>
             </w:r>
           </w:hyperlink>
@@ -1059,40 +625,10 @@
                 <w:noProof/>
               </w:rPr>
               <w:tab/>
-            </w:r>
-            <w:r>
-              <w:rPr>
-                <w:noProof/>
-              </w:rPr>
               <w:fldChar w:fldCharType="begin"/>
-            </w:r>
-            <w:r>
-              <w:rPr>
-                <w:noProof/>
-              </w:rPr>
               <w:instrText xml:space="preserve"> PAGEREF _Toc232147248 \h </w:instrText>
-            </w:r>
-            <w:r>
-              <w:rPr>
-                <w:noProof/>
-              </w:rPr>
-            </w:r>
-            <w:r>
-              <w:rPr>
-                <w:noProof/>
-              </w:rPr>
               <w:fldChar w:fldCharType="separate"/>
-            </w:r>
-            <w:r>
-              <w:rPr>
-                <w:noProof/>
-              </w:rPr>
               <w:t>9</w:t>
-            </w:r>
-            <w:r>
-              <w:rPr>
-                <w:noProof/>
-              </w:rPr>
               <w:fldChar w:fldCharType="end"/>
             </w:r>
           </w:hyperlink>
@@ -1123,40 +659,10 @@
                 <w:noProof/>
               </w:rPr>
               <w:tab/>
-            </w:r>
-            <w:r>
-              <w:rPr>
-                <w:noProof/>
-              </w:rPr>
               <w:fldChar w:fldCharType="begin"/>
-            </w:r>
-            <w:r>
-              <w:rPr>
-                <w:noProof/>
-              </w:rPr>
               <w:instrText xml:space="preserve"> PAGEREF _Toc232147249 \h </w:instrText>
-            </w:r>
-            <w:r>
-              <w:rPr>
-                <w:noProof/>
-              </w:rPr>
-            </w:r>
-            <w:r>
-              <w:rPr>
-                <w:noProof/>
-              </w:rPr>
               <w:fldChar w:fldCharType="separate"/>
-            </w:r>
-            <w:r>
-              <w:rPr>
-                <w:noProof/>
-              </w:rPr>
               <w:t>9</w:t>
-            </w:r>
-            <w:r>
-              <w:rPr>
-                <w:noProof/>
-              </w:rPr>
               <w:fldChar w:fldCharType="end"/>
             </w:r>
           </w:hyperlink>
@@ -1187,40 +693,10 @@
                 <w:noProof/>
               </w:rPr>
               <w:tab/>
-            </w:r>
-            <w:r>
-              <w:rPr>
-                <w:noProof/>
-              </w:rPr>
               <w:fldChar w:fldCharType="begin"/>
-            </w:r>
-            <w:r>
-              <w:rPr>
-                <w:noProof/>
-              </w:rPr>
               <w:instrText xml:space="preserve"> PAGEREF _Toc232147250 \h </w:instrText>
-            </w:r>
-            <w:r>
-              <w:rPr>
-                <w:noProof/>
-              </w:rPr>
-            </w:r>
-            <w:r>
-              <w:rPr>
-                <w:noProof/>
-              </w:rPr>
               <w:fldChar w:fldCharType="separate"/>
-            </w:r>
-            <w:r>
-              <w:rPr>
-                <w:noProof/>
-              </w:rPr>
               <w:t>10</w:t>
-            </w:r>
-            <w:r>
-              <w:rPr>
-                <w:noProof/>
-              </w:rPr>
               <w:fldChar w:fldCharType="end"/>
             </w:r>
           </w:hyperlink>
@@ -1251,40 +727,10 @@
                 <w:noProof/>
               </w:rPr>
               <w:tab/>
-            </w:r>
-            <w:r>
-              <w:rPr>
-                <w:noProof/>
-              </w:rPr>
               <w:fldChar w:fldCharType="begin"/>
-            </w:r>
-            <w:r>
-              <w:rPr>
-                <w:noProof/>
-              </w:rPr>
               <w:instrText xml:space="preserve"> PAGEREF _Toc232147251 \h </w:instrText>
-            </w:r>
-            <w:r>
-              <w:rPr>
-                <w:noProof/>
-              </w:rPr>
-            </w:r>
-            <w:r>
-              <w:rPr>
-                <w:noProof/>
-              </w:rPr>
               <w:fldChar w:fldCharType="separate"/>
-            </w:r>
-            <w:r>
-              <w:rPr>
-                <w:noProof/>
-              </w:rPr>
               <w:t>11</w:t>
-            </w:r>
-            <w:r>
-              <w:rPr>
-                <w:noProof/>
-              </w:rPr>
               <w:fldChar w:fldCharType="end"/>
             </w:r>
           </w:hyperlink>
@@ -1315,40 +761,10 @@
                 <w:noProof/>
               </w:rPr>
               <w:tab/>
-            </w:r>
-            <w:r>
-              <w:rPr>
-                <w:noProof/>
-              </w:rPr>
               <w:fldChar w:fldCharType="begin"/>
-            </w:r>
-            <w:r>
-              <w:rPr>
-                <w:noProof/>
-              </w:rPr>
               <w:instrText xml:space="preserve"> PAGEREF _Toc232147252 \h </w:instrText>
-            </w:r>
-            <w:r>
-              <w:rPr>
-                <w:noProof/>
-              </w:rPr>
-            </w:r>
-            <w:r>
-              <w:rPr>
-                <w:noProof/>
-              </w:rPr>
               <w:fldChar w:fldCharType="separate"/>
-            </w:r>
-            <w:r>
-              <w:rPr>
-                <w:noProof/>
-              </w:rPr>
               <w:t>11</w:t>
-            </w:r>
-            <w:r>
-              <w:rPr>
-                <w:noProof/>
-              </w:rPr>
               <w:fldChar w:fldCharType="end"/>
             </w:r>
           </w:hyperlink>
@@ -1379,40 +795,10 @@
                 <w:noProof/>
               </w:rPr>
               <w:tab/>
-            </w:r>
-            <w:r>
-              <w:rPr>
-                <w:noProof/>
-              </w:rPr>
               <w:fldChar w:fldCharType="begin"/>
-            </w:r>
-            <w:r>
-              <w:rPr>
-                <w:noProof/>
-              </w:rPr>
               <w:instrText xml:space="preserve"> PAGEREF _Toc232147253 \h </w:instrText>
-            </w:r>
-            <w:r>
-              <w:rPr>
-                <w:noProof/>
-              </w:rPr>
-            </w:r>
-            <w:r>
-              <w:rPr>
-                <w:noProof/>
-              </w:rPr>
               <w:fldChar w:fldCharType="separate"/>
-            </w:r>
-            <w:r>
-              <w:rPr>
-                <w:noProof/>
-              </w:rPr>
               <w:t>11</w:t>
-            </w:r>
-            <w:r>
-              <w:rPr>
-                <w:noProof/>
-              </w:rPr>
               <w:fldChar w:fldCharType="end"/>
             </w:r>
           </w:hyperlink>
@@ -1443,40 +829,10 @@
                 <w:noProof/>
               </w:rPr>
               <w:tab/>
-            </w:r>
-            <w:r>
-              <w:rPr>
-                <w:noProof/>
-              </w:rPr>
               <w:fldChar w:fldCharType="begin"/>
-            </w:r>
-            <w:r>
-              <w:rPr>
-                <w:noProof/>
-              </w:rPr>
               <w:instrText xml:space="preserve"> PAGEREF _Toc232147254 \h </w:instrText>
-            </w:r>
-            <w:r>
-              <w:rPr>
-                <w:noProof/>
-              </w:rPr>
-            </w:r>
-            <w:r>
-              <w:rPr>
-                <w:noProof/>
-              </w:rPr>
               <w:fldChar w:fldCharType="separate"/>
-            </w:r>
-            <w:r>
-              <w:rPr>
-                <w:noProof/>
-              </w:rPr>
               <w:t>11</w:t>
-            </w:r>
-            <w:r>
-              <w:rPr>
-                <w:noProof/>
-              </w:rPr>
               <w:fldChar w:fldCharType="end"/>
             </w:r>
           </w:hyperlink>
@@ -1507,40 +863,10 @@
                 <w:noProof/>
               </w:rPr>
               <w:tab/>
-            </w:r>
-            <w:r>
-              <w:rPr>
-                <w:noProof/>
-              </w:rPr>
               <w:fldChar w:fldCharType="begin"/>
-            </w:r>
-            <w:r>
-              <w:rPr>
-                <w:noProof/>
-              </w:rPr>
               <w:instrText xml:space="preserve"> PAGEREF _Toc232147255 \h </w:instrText>
-            </w:r>
-            <w:r>
-              <w:rPr>
-                <w:noProof/>
-              </w:rPr>
-            </w:r>
-            <w:r>
-              <w:rPr>
-                <w:noProof/>
-              </w:rPr>
               <w:fldChar w:fldCharType="separate"/>
-            </w:r>
-            <w:r>
-              <w:rPr>
-                <w:noProof/>
-              </w:rPr>
               <w:t>11</w:t>
-            </w:r>
-            <w:r>
-              <w:rPr>
-                <w:noProof/>
-              </w:rPr>
               <w:fldChar w:fldCharType="end"/>
             </w:r>
           </w:hyperlink>
@@ -1571,40 +897,10 @@
                 <w:noProof/>
               </w:rPr>
               <w:tab/>
-            </w:r>
-            <w:r>
-              <w:rPr>
-                <w:noProof/>
-              </w:rPr>
               <w:fldChar w:fldCharType="begin"/>
-            </w:r>
-            <w:r>
-              <w:rPr>
-                <w:noProof/>
-              </w:rPr>
               <w:instrText xml:space="preserve"> PAGEREF _Toc232147256 \h </w:instrText>
-            </w:r>
-            <w:r>
-              <w:rPr>
-                <w:noProof/>
-              </w:rPr>
-            </w:r>
-            <w:r>
-              <w:rPr>
-                <w:noProof/>
-              </w:rPr>
               <w:fldChar w:fldCharType="separate"/>
-            </w:r>
-            <w:r>
-              <w:rPr>
-                <w:noProof/>
-              </w:rPr>
               <w:t>12</w:t>
-            </w:r>
-            <w:r>
-              <w:rPr>
-                <w:noProof/>
-              </w:rPr>
               <w:fldChar w:fldCharType="end"/>
             </w:r>
           </w:hyperlink>
@@ -1635,40 +931,10 @@
                 <w:noProof/>
               </w:rPr>
               <w:tab/>
-            </w:r>
-            <w:r>
-              <w:rPr>
-                <w:noProof/>
-              </w:rPr>
               <w:fldChar w:fldCharType="begin"/>
-            </w:r>
-            <w:r>
-              <w:rPr>
-                <w:noProof/>
-              </w:rPr>
               <w:instrText xml:space="preserve"> PAGEREF _Toc232147257 \h </w:instrText>
-            </w:r>
-            <w:r>
-              <w:rPr>
-                <w:noProof/>
-              </w:rPr>
-            </w:r>
-            <w:r>
-              <w:rPr>
-                <w:noProof/>
-              </w:rPr>
               <w:fldChar w:fldCharType="separate"/>
-            </w:r>
-            <w:r>
-              <w:rPr>
-                <w:noProof/>
-              </w:rPr>
               <w:t>12</w:t>
-            </w:r>
-            <w:r>
-              <w:rPr>
-                <w:noProof/>
-              </w:rPr>
               <w:fldChar w:fldCharType="end"/>
             </w:r>
           </w:hyperlink>
@@ -1699,40 +965,10 @@
                 <w:noProof/>
               </w:rPr>
               <w:tab/>
-            </w:r>
-            <w:r>
-              <w:rPr>
-                <w:noProof/>
-              </w:rPr>
               <w:fldChar w:fldCharType="begin"/>
-            </w:r>
-            <w:r>
-              <w:rPr>
-                <w:noProof/>
-              </w:rPr>
               <w:instrText xml:space="preserve"> PAGEREF _Toc232147258 \h </w:instrText>
-            </w:r>
-            <w:r>
-              <w:rPr>
-                <w:noProof/>
-              </w:rPr>
-            </w:r>
-            <w:r>
-              <w:rPr>
-                <w:noProof/>
-              </w:rPr>
               <w:fldChar w:fldCharType="separate"/>
-            </w:r>
-            <w:r>
-              <w:rPr>
-                <w:noProof/>
-              </w:rPr>
               <w:t>12</w:t>
-            </w:r>
-            <w:r>
-              <w:rPr>
-                <w:noProof/>
-              </w:rPr>
               <w:fldChar w:fldCharType="end"/>
             </w:r>
           </w:hyperlink>
@@ -1763,40 +999,10 @@
                 <w:noProof/>
               </w:rPr>
               <w:tab/>
-            </w:r>
-            <w:r>
-              <w:rPr>
-                <w:noProof/>
-              </w:rPr>
               <w:fldChar w:fldCharType="begin"/>
-            </w:r>
-            <w:r>
-              <w:rPr>
-                <w:noProof/>
-              </w:rPr>
               <w:instrText xml:space="preserve"> PAGEREF _Toc232147259 \h </w:instrText>
-            </w:r>
-            <w:r>
-              <w:rPr>
-                <w:noProof/>
-              </w:rPr>
-            </w:r>
-            <w:r>
-              <w:rPr>
-                <w:noProof/>
-              </w:rPr>
               <w:fldChar w:fldCharType="separate"/>
-            </w:r>
-            <w:r>
-              <w:rPr>
-                <w:noProof/>
-              </w:rPr>
               <w:t>12</w:t>
-            </w:r>
-            <w:r>
-              <w:rPr>
-                <w:noProof/>
-              </w:rPr>
               <w:fldChar w:fldCharType="end"/>
             </w:r>
           </w:hyperlink>
@@ -1827,40 +1033,10 @@
                 <w:noProof/>
               </w:rPr>
               <w:tab/>
-            </w:r>
-            <w:r>
-              <w:rPr>
-                <w:noProof/>
-              </w:rPr>
               <w:fldChar w:fldCharType="begin"/>
-            </w:r>
-            <w:r>
-              <w:rPr>
-                <w:noProof/>
-              </w:rPr>
               <w:instrText xml:space="preserve"> PAGEREF _Toc232147260 \h </w:instrText>
-            </w:r>
-            <w:r>
-              <w:rPr>
-                <w:noProof/>
-              </w:rPr>
-            </w:r>
-            <w:r>
-              <w:rPr>
-                <w:noProof/>
-              </w:rPr>
               <w:fldChar w:fldCharType="separate"/>
-            </w:r>
-            <w:r>
-              <w:rPr>
-                <w:noProof/>
-              </w:rPr>
               <w:t>13</w:t>
-            </w:r>
-            <w:r>
-              <w:rPr>
-                <w:noProof/>
-              </w:rPr>
               <w:fldChar w:fldCharType="end"/>
             </w:r>
           </w:hyperlink>
@@ -1891,40 +1067,10 @@
                 <w:noProof/>
               </w:rPr>
               <w:tab/>
-            </w:r>
-            <w:r>
-              <w:rPr>
-                <w:noProof/>
-              </w:rPr>
               <w:fldChar w:fldCharType="begin"/>
-            </w:r>
-            <w:r>
-              <w:rPr>
-                <w:noProof/>
-              </w:rPr>
               <w:instrText xml:space="preserve"> PAGEREF _Toc232147261 \h </w:instrText>
-            </w:r>
-            <w:r>
-              <w:rPr>
-                <w:noProof/>
-              </w:rPr>
-            </w:r>
-            <w:r>
-              <w:rPr>
-                <w:noProof/>
-              </w:rPr>
               <w:fldChar w:fldCharType="separate"/>
-            </w:r>
-            <w:r>
-              <w:rPr>
-                <w:noProof/>
-              </w:rPr>
               <w:t>14</w:t>
-            </w:r>
-            <w:r>
-              <w:rPr>
-                <w:noProof/>
-              </w:rPr>
               <w:fldChar w:fldCharType="end"/>
             </w:r>
           </w:hyperlink>
@@ -1955,40 +1101,10 @@
                 <w:noProof/>
               </w:rPr>
               <w:tab/>
-            </w:r>
-            <w:r>
-              <w:rPr>
-                <w:noProof/>
-              </w:rPr>
               <w:fldChar w:fldCharType="begin"/>
-            </w:r>
-            <w:r>
-              <w:rPr>
-                <w:noProof/>
-              </w:rPr>
               <w:instrText xml:space="preserve"> PAGEREF _Toc232147262 \h </w:instrText>
-            </w:r>
-            <w:r>
-              <w:rPr>
-                <w:noProof/>
-              </w:rPr>
-            </w:r>
-            <w:r>
-              <w:rPr>
-                <w:noProof/>
-              </w:rPr>
               <w:fldChar w:fldCharType="separate"/>
-            </w:r>
-            <w:r>
-              <w:rPr>
-                <w:noProof/>
-              </w:rPr>
               <w:t>14</w:t>
-            </w:r>
-            <w:r>
-              <w:rPr>
-                <w:noProof/>
-              </w:rPr>
               <w:fldChar w:fldCharType="end"/>
             </w:r>
           </w:hyperlink>
@@ -2019,40 +1135,10 @@
                 <w:noProof/>
               </w:rPr>
               <w:tab/>
-            </w:r>
-            <w:r>
-              <w:rPr>
-                <w:noProof/>
-              </w:rPr>
               <w:fldChar w:fldCharType="begin"/>
-            </w:r>
-            <w:r>
-              <w:rPr>
-                <w:noProof/>
-              </w:rPr>
               <w:instrText xml:space="preserve"> PAGEREF _Toc232147263 \h </w:instrText>
-            </w:r>
-            <w:r>
-              <w:rPr>
-                <w:noProof/>
-              </w:rPr>
-            </w:r>
-            <w:r>
-              <w:rPr>
-                <w:noProof/>
-              </w:rPr>
               <w:fldChar w:fldCharType="separate"/>
-            </w:r>
-            <w:r>
-              <w:rPr>
-                <w:noProof/>
-              </w:rPr>
               <w:t>14</w:t>
-            </w:r>
-            <w:r>
-              <w:rPr>
-                <w:noProof/>
-              </w:rPr>
               <w:fldChar w:fldCharType="end"/>
             </w:r>
           </w:hyperlink>
@@ -2083,40 +1169,10 @@
                 <w:noProof/>
               </w:rPr>
               <w:tab/>
-            </w:r>
-            <w:r>
-              <w:rPr>
-                <w:noProof/>
-              </w:rPr>
               <w:fldChar w:fldCharType="begin"/>
-            </w:r>
-            <w:r>
-              <w:rPr>
-                <w:noProof/>
-              </w:rPr>
               <w:instrText xml:space="preserve"> PAGEREF _Toc232147264 \h </w:instrText>
-            </w:r>
-            <w:r>
-              <w:rPr>
-                <w:noProof/>
-              </w:rPr>
-            </w:r>
-            <w:r>
-              <w:rPr>
-                <w:noProof/>
-              </w:rPr>
               <w:fldChar w:fldCharType="separate"/>
-            </w:r>
-            <w:r>
-              <w:rPr>
-                <w:noProof/>
-              </w:rPr>
               <w:t>14</w:t>
-            </w:r>
-            <w:r>
-              <w:rPr>
-                <w:noProof/>
-              </w:rPr>
               <w:fldChar w:fldCharType="end"/>
             </w:r>
           </w:hyperlink>
@@ -2147,40 +1203,10 @@
                 <w:noProof/>
               </w:rPr>
               <w:tab/>
-            </w:r>
-            <w:r>
-              <w:rPr>
-                <w:noProof/>
-              </w:rPr>
               <w:fldChar w:fldCharType="begin"/>
-            </w:r>
-            <w:r>
-              <w:rPr>
-                <w:noProof/>
-              </w:rPr>
               <w:instrText xml:space="preserve"> PAGEREF _Toc232147265 \h </w:instrText>
-            </w:r>
-            <w:r>
-              <w:rPr>
-                <w:noProof/>
-              </w:rPr>
-            </w:r>
-            <w:r>
-              <w:rPr>
-                <w:noProof/>
-              </w:rPr>
               <w:fldChar w:fldCharType="separate"/>
-            </w:r>
-            <w:r>
-              <w:rPr>
-                <w:noProof/>
-              </w:rPr>
               <w:t>15</w:t>
-            </w:r>
-            <w:r>
-              <w:rPr>
-                <w:noProof/>
-              </w:rPr>
               <w:fldChar w:fldCharType="end"/>
             </w:r>
           </w:hyperlink>
@@ -2211,40 +1237,10 @@
                 <w:noProof/>
               </w:rPr>
               <w:tab/>
-            </w:r>
-            <w:r>
-              <w:rPr>
-                <w:noProof/>
-              </w:rPr>
               <w:fldChar w:fldCharType="begin"/>
-            </w:r>
-            <w:r>
-              <w:rPr>
-                <w:noProof/>
-              </w:rPr>
               <w:instrText xml:space="preserve"> PAGEREF _Toc232147266 \h </w:instrText>
-            </w:r>
-            <w:r>
-              <w:rPr>
-                <w:noProof/>
-              </w:rPr>
-            </w:r>
-            <w:r>
-              <w:rPr>
-                <w:noProof/>
-              </w:rPr>
               <w:fldChar w:fldCharType="separate"/>
-            </w:r>
-            <w:r>
-              <w:rPr>
-                <w:noProof/>
-              </w:rPr>
               <w:t>16</w:t>
-            </w:r>
-            <w:r>
-              <w:rPr>
-                <w:noProof/>
-              </w:rPr>
               <w:fldChar w:fldCharType="end"/>
             </w:r>
           </w:hyperlink>
@@ -2275,40 +1271,10 @@
                 <w:noProof/>
               </w:rPr>
               <w:tab/>
-            </w:r>
-            <w:r>
-              <w:rPr>
-                <w:noProof/>
-              </w:rPr>
               <w:fldChar w:fldCharType="begin"/>
-            </w:r>
-            <w:r>
-              <w:rPr>
-                <w:noProof/>
-              </w:rPr>
               <w:instrText xml:space="preserve"> PAGEREF _Toc232147267 \h </w:instrText>
-            </w:r>
-            <w:r>
-              <w:rPr>
-                <w:noProof/>
-              </w:rPr>
-            </w:r>
-            <w:r>
-              <w:rPr>
-                <w:noProof/>
-              </w:rPr>
               <w:fldChar w:fldCharType="separate"/>
-            </w:r>
-            <w:r>
-              <w:rPr>
-                <w:noProof/>
-              </w:rPr>
               <w:t>16</w:t>
-            </w:r>
-            <w:r>
-              <w:rPr>
-                <w:noProof/>
-              </w:rPr>
               <w:fldChar w:fldCharType="end"/>
             </w:r>
           </w:hyperlink>
@@ -2339,40 +1305,10 @@
                 <w:noProof/>
               </w:rPr>
               <w:tab/>
-            </w:r>
-            <w:r>
-              <w:rPr>
-                <w:noProof/>
-              </w:rPr>
               <w:fldChar w:fldCharType="begin"/>
-            </w:r>
-            <w:r>
-              <w:rPr>
-                <w:noProof/>
-              </w:rPr>
               <w:instrText xml:space="preserve"> PAGEREF _Toc232147268 \h </w:instrText>
-            </w:r>
-            <w:r>
-              <w:rPr>
-                <w:noProof/>
-              </w:rPr>
-            </w:r>
-            <w:r>
-              <w:rPr>
-                <w:noProof/>
-              </w:rPr>
               <w:fldChar w:fldCharType="separate"/>
-            </w:r>
-            <w:r>
-              <w:rPr>
-                <w:noProof/>
-              </w:rPr>
               <w:t>16</w:t>
-            </w:r>
-            <w:r>
-              <w:rPr>
-                <w:noProof/>
-              </w:rPr>
               <w:fldChar w:fldCharType="end"/>
             </w:r>
           </w:hyperlink>
@@ -2403,40 +1339,10 @@
                 <w:noProof/>
               </w:rPr>
               <w:tab/>
-            </w:r>
-            <w:r>
-              <w:rPr>
-                <w:noProof/>
-              </w:rPr>
               <w:fldChar w:fldCharType="begin"/>
-            </w:r>
-            <w:r>
-              <w:rPr>
-                <w:noProof/>
-              </w:rPr>
               <w:instrText xml:space="preserve"> PAGEREF _Toc232147269 \h </w:instrText>
-            </w:r>
-            <w:r>
-              <w:rPr>
-                <w:noProof/>
-              </w:rPr>
-            </w:r>
-            <w:r>
-              <w:rPr>
-                <w:noProof/>
-              </w:rPr>
               <w:fldChar w:fldCharType="separate"/>
-            </w:r>
-            <w:r>
-              <w:rPr>
-                <w:noProof/>
-              </w:rPr>
               <w:t>16</w:t>
-            </w:r>
-            <w:r>
-              <w:rPr>
-                <w:noProof/>
-              </w:rPr>
               <w:fldChar w:fldCharType="end"/>
             </w:r>
           </w:hyperlink>
@@ -2467,40 +1373,10 @@
                 <w:noProof/>
               </w:rPr>
               <w:tab/>
-            </w:r>
-            <w:r>
-              <w:rPr>
-                <w:noProof/>
-              </w:rPr>
               <w:fldChar w:fldCharType="begin"/>
-            </w:r>
-            <w:r>
-              <w:rPr>
-                <w:noProof/>
-              </w:rPr>
               <w:instrText xml:space="preserve"> PAGEREF _Toc232147270 \h </w:instrText>
-            </w:r>
-            <w:r>
-              <w:rPr>
-                <w:noProof/>
-              </w:rPr>
-            </w:r>
-            <w:r>
-              <w:rPr>
-                <w:noProof/>
-              </w:rPr>
               <w:fldChar w:fldCharType="separate"/>
-            </w:r>
-            <w:r>
-              <w:rPr>
-                <w:noProof/>
-              </w:rPr>
               <w:t>17</w:t>
-            </w:r>
-            <w:r>
-              <w:rPr>
-                <w:noProof/>
-              </w:rPr>
               <w:fldChar w:fldCharType="end"/>
             </w:r>
           </w:hyperlink>
@@ -2531,40 +1407,10 @@
                 <w:noProof/>
               </w:rPr>
               <w:tab/>
-            </w:r>
-            <w:r>
-              <w:rPr>
-                <w:noProof/>
-              </w:rPr>
               <w:fldChar w:fldCharType="begin"/>
-            </w:r>
-            <w:r>
-              <w:rPr>
-                <w:noProof/>
-              </w:rPr>
               <w:instrText xml:space="preserve"> PAGEREF _Toc232147271 \h </w:instrText>
-            </w:r>
-            <w:r>
-              <w:rPr>
-                <w:noProof/>
-              </w:rPr>
-            </w:r>
-            <w:r>
-              <w:rPr>
-                <w:noProof/>
-              </w:rPr>
               <w:fldChar w:fldCharType="separate"/>
-            </w:r>
-            <w:r>
-              <w:rPr>
-                <w:noProof/>
-              </w:rPr>
               <w:t>18</w:t>
-            </w:r>
-            <w:r>
-              <w:rPr>
-                <w:noProof/>
-              </w:rPr>
               <w:fldChar w:fldCharType="end"/>
             </w:r>
           </w:hyperlink>
@@ -2595,40 +1441,10 @@
                 <w:noProof/>
               </w:rPr>
               <w:tab/>
-            </w:r>
-            <w:r>
-              <w:rPr>
-                <w:noProof/>
-              </w:rPr>
               <w:fldChar w:fldCharType="begin"/>
-            </w:r>
-            <w:r>
-              <w:rPr>
-                <w:noProof/>
-              </w:rPr>
               <w:instrText xml:space="preserve"> PAGEREF _Toc232147272 \h </w:instrText>
-            </w:r>
-            <w:r>
-              <w:rPr>
-                <w:noProof/>
-              </w:rPr>
-            </w:r>
-            <w:r>
-              <w:rPr>
-                <w:noProof/>
-              </w:rPr>
               <w:fldChar w:fldCharType="separate"/>
-            </w:r>
-            <w:r>
-              <w:rPr>
-                <w:noProof/>
-              </w:rPr>
               <w:t>18</w:t>
-            </w:r>
-            <w:r>
-              <w:rPr>
-                <w:noProof/>
-              </w:rPr>
               <w:fldChar w:fldCharType="end"/>
             </w:r>
           </w:hyperlink>
@@ -2659,40 +1475,10 @@
                 <w:noProof/>
               </w:rPr>
               <w:tab/>
-            </w:r>
-            <w:r>
-              <w:rPr>
-                <w:noProof/>
-              </w:rPr>
               <w:fldChar w:fldCharType="begin"/>
-            </w:r>
-            <w:r>
-              <w:rPr>
-                <w:noProof/>
-              </w:rPr>
               <w:instrText xml:space="preserve"> PAGEREF _Toc232147273 \h </w:instrText>
-            </w:r>
-            <w:r>
-              <w:rPr>
-                <w:noProof/>
-              </w:rPr>
-            </w:r>
-            <w:r>
-              <w:rPr>
-                <w:noProof/>
-              </w:rPr>
               <w:fldChar w:fldCharType="separate"/>
-            </w:r>
-            <w:r>
-              <w:rPr>
-                <w:noProof/>
-              </w:rPr>
               <w:t>18</w:t>
-            </w:r>
-            <w:r>
-              <w:rPr>
-                <w:noProof/>
-              </w:rPr>
               <w:fldChar w:fldCharType="end"/>
             </w:r>
           </w:hyperlink>
@@ -2723,40 +1509,10 @@
                 <w:noProof/>
               </w:rPr>
               <w:tab/>
-            </w:r>
-            <w:r>
-              <w:rPr>
-                <w:noProof/>
-              </w:rPr>
               <w:fldChar w:fldCharType="begin"/>
-            </w:r>
-            <w:r>
-              <w:rPr>
-                <w:noProof/>
-              </w:rPr>
               <w:instrText xml:space="preserve"> PAGEREF _Toc232147274 \h </w:instrText>
-            </w:r>
-            <w:r>
-              <w:rPr>
-                <w:noProof/>
-              </w:rPr>
-            </w:r>
-            <w:r>
-              <w:rPr>
-                <w:noProof/>
-              </w:rPr>
               <w:fldChar w:fldCharType="separate"/>
-            </w:r>
-            <w:r>
-              <w:rPr>
-                <w:noProof/>
-              </w:rPr>
               <w:t>18</w:t>
-            </w:r>
-            <w:r>
-              <w:rPr>
-                <w:noProof/>
-              </w:rPr>
               <w:fldChar w:fldCharType="end"/>
             </w:r>
           </w:hyperlink>
@@ -2787,40 +1543,10 @@
                 <w:noProof/>
               </w:rPr>
               <w:tab/>
-            </w:r>
-            <w:r>
-              <w:rPr>
-                <w:noProof/>
-              </w:rPr>
               <w:fldChar w:fldCharType="begin"/>
-            </w:r>
-            <w:r>
-              <w:rPr>
-                <w:noProof/>
-              </w:rPr>
               <w:instrText xml:space="preserve"> PAGEREF _Toc232147275 \h </w:instrText>
-            </w:r>
-            <w:r>
-              <w:rPr>
-                <w:noProof/>
-              </w:rPr>
-            </w:r>
-            <w:r>
-              <w:rPr>
-                <w:noProof/>
-              </w:rPr>
               <w:fldChar w:fldCharType="separate"/>
-            </w:r>
-            <w:r>
-              <w:rPr>
-                <w:noProof/>
-              </w:rPr>
               <w:t>20</w:t>
-            </w:r>
-            <w:r>
-              <w:rPr>
-                <w:noProof/>
-              </w:rPr>
               <w:fldChar w:fldCharType="end"/>
             </w:r>
           </w:hyperlink>
@@ -2851,40 +1577,10 @@
                 <w:noProof/>
               </w:rPr>
               <w:tab/>
-            </w:r>
-            <w:r>
-              <w:rPr>
-                <w:noProof/>
-              </w:rPr>
               <w:fldChar w:fldCharType="begin"/>
-            </w:r>
-            <w:r>
-              <w:rPr>
-                <w:noProof/>
-              </w:rPr>
               <w:instrText xml:space="preserve"> PAGEREF _Toc232147276 \h </w:instrText>
-            </w:r>
-            <w:r>
-              <w:rPr>
-                <w:noProof/>
-              </w:rPr>
-            </w:r>
-            <w:r>
-              <w:rPr>
-                <w:noProof/>
-              </w:rPr>
               <w:fldChar w:fldCharType="separate"/>
-            </w:r>
-            <w:r>
-              <w:rPr>
-                <w:noProof/>
-              </w:rPr>
               <w:t>20</w:t>
-            </w:r>
-            <w:r>
-              <w:rPr>
-                <w:noProof/>
-              </w:rPr>
               <w:fldChar w:fldCharType="end"/>
             </w:r>
           </w:hyperlink>
@@ -2915,40 +1611,10 @@
                 <w:noProof/>
               </w:rPr>
               <w:tab/>
-            </w:r>
-            <w:r>
-              <w:rPr>
-                <w:noProof/>
-              </w:rPr>
               <w:fldChar w:fldCharType="begin"/>
-            </w:r>
-            <w:r>
-              <w:rPr>
-                <w:noProof/>
-              </w:rPr>
               <w:instrText xml:space="preserve"> PAGEREF _Toc232147277 \h </w:instrText>
-            </w:r>
-            <w:r>
-              <w:rPr>
-                <w:noProof/>
-              </w:rPr>
-            </w:r>
-            <w:r>
-              <w:rPr>
-                <w:noProof/>
-              </w:rPr>
               <w:fldChar w:fldCharType="separate"/>
-            </w:r>
-            <w:r>
-              <w:rPr>
-                <w:noProof/>
-              </w:rPr>
               <w:t>20</w:t>
-            </w:r>
-            <w:r>
-              <w:rPr>
-                <w:noProof/>
-              </w:rPr>
               <w:fldChar w:fldCharType="end"/>
             </w:r>
           </w:hyperlink>
@@ -2979,40 +1645,10 @@
                 <w:noProof/>
               </w:rPr>
               <w:tab/>
-            </w:r>
-            <w:r>
-              <w:rPr>
-                <w:noProof/>
-              </w:rPr>
               <w:fldChar w:fldCharType="begin"/>
-            </w:r>
-            <w:r>
-              <w:rPr>
-                <w:noProof/>
-              </w:rPr>
               <w:instrText xml:space="preserve"> PAGEREF _Toc232147278 \h </w:instrText>
-            </w:r>
-            <w:r>
-              <w:rPr>
-                <w:noProof/>
-              </w:rPr>
-            </w:r>
-            <w:r>
-              <w:rPr>
-                <w:noProof/>
-              </w:rPr>
               <w:fldChar w:fldCharType="separate"/>
-            </w:r>
-            <w:r>
-              <w:rPr>
-                <w:noProof/>
-              </w:rPr>
               <w:t>20</w:t>
-            </w:r>
-            <w:r>
-              <w:rPr>
-                <w:noProof/>
-              </w:rPr>
               <w:fldChar w:fldCharType="end"/>
             </w:r>
           </w:hyperlink>
@@ -3043,40 +1679,10 @@
                 <w:noProof/>
               </w:rPr>
               <w:tab/>
-            </w:r>
-            <w:r>
-              <w:rPr>
-                <w:noProof/>
-              </w:rPr>
               <w:fldChar w:fldCharType="begin"/>
-            </w:r>
-            <w:r>
-              <w:rPr>
-                <w:noProof/>
-              </w:rPr>
               <w:instrText xml:space="preserve"> PAGEREF _Toc232147279 \h </w:instrText>
-            </w:r>
-            <w:r>
-              <w:rPr>
-                <w:noProof/>
-              </w:rPr>
-            </w:r>
-            <w:r>
-              <w:rPr>
-                <w:noProof/>
-              </w:rPr>
               <w:fldChar w:fldCharType="separate"/>
-            </w:r>
-            <w:r>
-              <w:rPr>
-                <w:noProof/>
-              </w:rPr>
               <w:t>20</w:t>
-            </w:r>
-            <w:r>
-              <w:rPr>
-                <w:noProof/>
-              </w:rPr>
               <w:fldChar w:fldCharType="end"/>
             </w:r>
           </w:hyperlink>
@@ -3107,40 +1713,10 @@
                 <w:noProof/>
               </w:rPr>
               <w:tab/>
-            </w:r>
-            <w:r>
-              <w:rPr>
-                <w:noProof/>
-              </w:rPr>
               <w:fldChar w:fldCharType="begin"/>
-            </w:r>
-            <w:r>
-              <w:rPr>
-                <w:noProof/>
-              </w:rPr>
               <w:instrText xml:space="preserve"> PAGEREF _Toc232147280 \h </w:instrText>
-            </w:r>
-            <w:r>
-              <w:rPr>
-                <w:noProof/>
-              </w:rPr>
-            </w:r>
-            <w:r>
-              <w:rPr>
-                <w:noProof/>
-              </w:rPr>
               <w:fldChar w:fldCharType="separate"/>
-            </w:r>
-            <w:r>
-              <w:rPr>
-                <w:noProof/>
-              </w:rPr>
               <w:t>21</w:t>
-            </w:r>
-            <w:r>
-              <w:rPr>
-                <w:noProof/>
-              </w:rPr>
               <w:fldChar w:fldCharType="end"/>
             </w:r>
           </w:hyperlink>
@@ -3171,40 +1747,10 @@
                 <w:noProof/>
               </w:rPr>
               <w:tab/>
-            </w:r>
-            <w:r>
-              <w:rPr>
-                <w:noProof/>
-              </w:rPr>
               <w:fldChar w:fldCharType="begin"/>
-            </w:r>
-            <w:r>
-              <w:rPr>
-                <w:noProof/>
-              </w:rPr>
               <w:instrText xml:space="preserve"> PAGEREF _Toc232147281 \h </w:instrText>
-            </w:r>
-            <w:r>
-              <w:rPr>
-                <w:noProof/>
-              </w:rPr>
-            </w:r>
-            <w:r>
-              <w:rPr>
-                <w:noProof/>
-              </w:rPr>
               <w:fldChar w:fldCharType="separate"/>
-            </w:r>
-            <w:r>
-              <w:rPr>
-                <w:noProof/>
-              </w:rPr>
               <w:t>21</w:t>
-            </w:r>
-            <w:r>
-              <w:rPr>
-                <w:noProof/>
-              </w:rPr>
               <w:fldChar w:fldCharType="end"/>
             </w:r>
           </w:hyperlink>
@@ -3235,40 +1781,10 @@
                 <w:noProof/>
               </w:rPr>
               <w:tab/>
-            </w:r>
-            <w:r>
-              <w:rPr>
-                <w:noProof/>
-              </w:rPr>
               <w:fldChar w:fldCharType="begin"/>
-            </w:r>
-            <w:r>
-              <w:rPr>
-                <w:noProof/>
-              </w:rPr>
               <w:instrText xml:space="preserve"> PAGEREF _Toc232147282 \h </w:instrText>
-            </w:r>
-            <w:r>
-              <w:rPr>
-                <w:noProof/>
-              </w:rPr>
-            </w:r>
-            <w:r>
-              <w:rPr>
-                <w:noProof/>
-              </w:rPr>
               <w:fldChar w:fldCharType="separate"/>
-            </w:r>
-            <w:r>
-              <w:rPr>
-                <w:noProof/>
-              </w:rPr>
               <w:t>21</w:t>
-            </w:r>
-            <w:r>
-              <w:rPr>
-                <w:noProof/>
-              </w:rPr>
               <w:fldChar w:fldCharType="end"/>
             </w:r>
           </w:hyperlink>
@@ -3299,40 +1815,10 @@
                 <w:noProof/>
               </w:rPr>
               <w:tab/>
-            </w:r>
-            <w:r>
-              <w:rPr>
-                <w:noProof/>
-              </w:rPr>
               <w:fldChar w:fldCharType="begin"/>
-            </w:r>
-            <w:r>
-              <w:rPr>
-                <w:noProof/>
-              </w:rPr>
               <w:instrText xml:space="preserve"> PAGEREF _Toc232147283 \h </w:instrText>
-            </w:r>
-            <w:r>
-              <w:rPr>
-                <w:noProof/>
-              </w:rPr>
-            </w:r>
-            <w:r>
-              <w:rPr>
-                <w:noProof/>
-              </w:rPr>
               <w:fldChar w:fldCharType="separate"/>
-            </w:r>
-            <w:r>
-              <w:rPr>
-                <w:noProof/>
-              </w:rPr>
               <w:t>21</w:t>
-            </w:r>
-            <w:r>
-              <w:rPr>
-                <w:noProof/>
-              </w:rPr>
               <w:fldChar w:fldCharType="end"/>
             </w:r>
           </w:hyperlink>
@@ -3363,40 +1849,10 @@
                 <w:noProof/>
               </w:rPr>
               <w:tab/>
-            </w:r>
-            <w:r>
-              <w:rPr>
-                <w:noProof/>
-              </w:rPr>
               <w:fldChar w:fldCharType="begin"/>
-            </w:r>
-            <w:r>
-              <w:rPr>
-                <w:noProof/>
-              </w:rPr>
               <w:instrText xml:space="preserve"> PAGEREF _Toc232147284 \h </w:instrText>
-            </w:r>
-            <w:r>
-              <w:rPr>
-                <w:noProof/>
-              </w:rPr>
-            </w:r>
-            <w:r>
-              <w:rPr>
-                <w:noProof/>
-              </w:rPr>
               <w:fldChar w:fldCharType="separate"/>
-            </w:r>
-            <w:r>
-              <w:rPr>
-                <w:noProof/>
-              </w:rPr>
               <w:t>22</w:t>
-            </w:r>
-            <w:r>
-              <w:rPr>
-                <w:noProof/>
-              </w:rPr>
               <w:fldChar w:fldCharType="end"/>
             </w:r>
           </w:hyperlink>
@@ -3427,40 +1883,10 @@
                 <w:noProof/>
               </w:rPr>
               <w:tab/>
-            </w:r>
-            <w:r>
-              <w:rPr>
-                <w:noProof/>
-              </w:rPr>
               <w:fldChar w:fldCharType="begin"/>
-            </w:r>
-            <w:r>
-              <w:rPr>
-                <w:noProof/>
-              </w:rPr>
               <w:instrText xml:space="preserve"> PAGEREF _Toc232147285 \h </w:instrText>
-            </w:r>
-            <w:r>
-              <w:rPr>
-                <w:noProof/>
-              </w:rPr>
-            </w:r>
-            <w:r>
-              <w:rPr>
-                <w:noProof/>
-              </w:rPr>
               <w:fldChar w:fldCharType="separate"/>
-            </w:r>
-            <w:r>
-              <w:rPr>
-                <w:noProof/>
-              </w:rPr>
               <w:t>23</w:t>
-            </w:r>
-            <w:r>
-              <w:rPr>
-                <w:noProof/>
-              </w:rPr>
               <w:fldChar w:fldCharType="end"/>
             </w:r>
           </w:hyperlink>
@@ -3491,40 +1917,10 @@
                 <w:noProof/>
               </w:rPr>
               <w:tab/>
-            </w:r>
-            <w:r>
-              <w:rPr>
-                <w:noProof/>
-              </w:rPr>
               <w:fldChar w:fldCharType="begin"/>
-            </w:r>
-            <w:r>
-              <w:rPr>
-                <w:noProof/>
-              </w:rPr>
               <w:instrText xml:space="preserve"> PAGEREF _Toc232147286 \h </w:instrText>
-            </w:r>
-            <w:r>
-              <w:rPr>
-                <w:noProof/>
-              </w:rPr>
-            </w:r>
-            <w:r>
-              <w:rPr>
-                <w:noProof/>
-              </w:rPr>
               <w:fldChar w:fldCharType="separate"/>
-            </w:r>
-            <w:r>
-              <w:rPr>
-                <w:noProof/>
-              </w:rPr>
               <w:t>23</w:t>
-            </w:r>
-            <w:r>
-              <w:rPr>
-                <w:noProof/>
-              </w:rPr>
               <w:fldChar w:fldCharType="end"/>
             </w:r>
           </w:hyperlink>
@@ -3555,40 +1951,10 @@
                 <w:noProof/>
               </w:rPr>
               <w:tab/>
-            </w:r>
-            <w:r>
-              <w:rPr>
-                <w:noProof/>
-              </w:rPr>
               <w:fldChar w:fldCharType="begin"/>
-            </w:r>
-            <w:r>
-              <w:rPr>
-                <w:noProof/>
-              </w:rPr>
               <w:instrText xml:space="preserve"> PAGEREF _Toc232147287 \h </w:instrText>
-            </w:r>
-            <w:r>
-              <w:rPr>
-                <w:noProof/>
-              </w:rPr>
-            </w:r>
-            <w:r>
-              <w:rPr>
-                <w:noProof/>
-              </w:rPr>
               <w:fldChar w:fldCharType="separate"/>
-            </w:r>
-            <w:r>
-              <w:rPr>
-                <w:noProof/>
-              </w:rPr>
               <w:t>23</w:t>
-            </w:r>
-            <w:r>
-              <w:rPr>
-                <w:noProof/>
-              </w:rPr>
               <w:fldChar w:fldCharType="end"/>
             </w:r>
           </w:hyperlink>
@@ -3619,40 +1985,10 @@
                 <w:noProof/>
               </w:rPr>
               <w:tab/>
-            </w:r>
-            <w:r>
-              <w:rPr>
-                <w:noProof/>
-              </w:rPr>
               <w:fldChar w:fldCharType="begin"/>
-            </w:r>
-            <w:r>
-              <w:rPr>
-                <w:noProof/>
-              </w:rPr>
               <w:instrText xml:space="preserve"> PAGEREF _Toc232147288 \h </w:instrText>
-            </w:r>
-            <w:r>
-              <w:rPr>
-                <w:noProof/>
-              </w:rPr>
-            </w:r>
-            <w:r>
-              <w:rPr>
-                <w:noProof/>
-              </w:rPr>
               <w:fldChar w:fldCharType="separate"/>
-            </w:r>
-            <w:r>
-              <w:rPr>
-                <w:noProof/>
-              </w:rPr>
               <w:t>23</w:t>
-            </w:r>
-            <w:r>
-              <w:rPr>
-                <w:noProof/>
-              </w:rPr>
               <w:fldChar w:fldCharType="end"/>
             </w:r>
           </w:hyperlink>
@@ -3683,40 +2019,10 @@
                 <w:noProof/>
               </w:rPr>
               <w:tab/>
-            </w:r>
-            <w:r>
-              <w:rPr>
-                <w:noProof/>
-              </w:rPr>
               <w:fldChar w:fldCharType="begin"/>
-            </w:r>
-            <w:r>
-              <w:rPr>
-                <w:noProof/>
-              </w:rPr>
               <w:instrText xml:space="preserve"> PAGEREF _Toc232147289 \h </w:instrText>
-            </w:r>
-            <w:r>
-              <w:rPr>
-                <w:noProof/>
-              </w:rPr>
-            </w:r>
-            <w:r>
-              <w:rPr>
-                <w:noProof/>
-              </w:rPr>
               <w:fldChar w:fldCharType="separate"/>
-            </w:r>
-            <w:r>
-              <w:rPr>
-                <w:noProof/>
-              </w:rPr>
               <w:t>24</w:t>
-            </w:r>
-            <w:r>
-              <w:rPr>
-                <w:noProof/>
-              </w:rPr>
               <w:fldChar w:fldCharType="end"/>
             </w:r>
           </w:hyperlink>
@@ -3747,40 +2053,10 @@
                 <w:noProof/>
               </w:rPr>
               <w:tab/>
-            </w:r>
-            <w:r>
-              <w:rPr>
-                <w:noProof/>
-              </w:rPr>
               <w:fldChar w:fldCharType="begin"/>
-            </w:r>
-            <w:r>
-              <w:rPr>
-                <w:noProof/>
-              </w:rPr>
               <w:instrText xml:space="preserve"> PAGEREF _Toc232147290 \h </w:instrText>
-            </w:r>
-            <w:r>
-              <w:rPr>
-                <w:noProof/>
-              </w:rPr>
-            </w:r>
-            <w:r>
-              <w:rPr>
-                <w:noProof/>
-              </w:rPr>
               <w:fldChar w:fldCharType="separate"/>
-            </w:r>
-            <w:r>
-              <w:rPr>
-                <w:noProof/>
-              </w:rPr>
               <w:t>24</w:t>
-            </w:r>
-            <w:r>
-              <w:rPr>
-                <w:noProof/>
-              </w:rPr>
               <w:fldChar w:fldCharType="end"/>
             </w:r>
           </w:hyperlink>
@@ -3811,40 +2087,10 @@
                 <w:noProof/>
               </w:rPr>
               <w:tab/>
-            </w:r>
-            <w:r>
-              <w:rPr>
-                <w:noProof/>
-              </w:rPr>
               <w:fldChar w:fldCharType="begin"/>
-            </w:r>
-            <w:r>
-              <w:rPr>
-                <w:noProof/>
-              </w:rPr>
               <w:instrText xml:space="preserve"> PAGEREF _Toc232147291 \h </w:instrText>
-            </w:r>
-            <w:r>
-              <w:rPr>
-                <w:noProof/>
-              </w:rPr>
-            </w:r>
-            <w:r>
-              <w:rPr>
-                <w:noProof/>
-              </w:rPr>
               <w:fldChar w:fldCharType="separate"/>
-            </w:r>
-            <w:r>
-              <w:rPr>
-                <w:noProof/>
-              </w:rPr>
               <w:t>24</w:t>
-            </w:r>
-            <w:r>
-              <w:rPr>
-                <w:noProof/>
-              </w:rPr>
               <w:fldChar w:fldCharType="end"/>
             </w:r>
           </w:hyperlink>
@@ -3875,40 +2121,10 @@
                 <w:noProof/>
               </w:rPr>
               <w:tab/>
-            </w:r>
-            <w:r>
-              <w:rPr>
-                <w:noProof/>
-              </w:rPr>
               <w:fldChar w:fldCharType="begin"/>
-            </w:r>
-            <w:r>
-              <w:rPr>
-                <w:noProof/>
-              </w:rPr>
               <w:instrText xml:space="preserve"> PAGEREF _Toc232147292 \h </w:instrText>
-            </w:r>
-            <w:r>
-              <w:rPr>
-                <w:noProof/>
-              </w:rPr>
-            </w:r>
-            <w:r>
-              <w:rPr>
-                <w:noProof/>
-              </w:rPr>
               <w:fldChar w:fldCharType="separate"/>
-            </w:r>
-            <w:r>
-              <w:rPr>
-                <w:noProof/>
-              </w:rPr>
               <w:t>24</w:t>
-            </w:r>
-            <w:r>
-              <w:rPr>
-                <w:noProof/>
-              </w:rPr>
               <w:fldChar w:fldCharType="end"/>
             </w:r>
           </w:hyperlink>
@@ -3939,40 +2155,10 @@
                 <w:noProof/>
               </w:rPr>
               <w:tab/>
-            </w:r>
-            <w:r>
-              <w:rPr>
-                <w:noProof/>
-              </w:rPr>
               <w:fldChar w:fldCharType="begin"/>
-            </w:r>
-            <w:r>
-              <w:rPr>
-                <w:noProof/>
-              </w:rPr>
               <w:instrText xml:space="preserve"> PAGEREF _Toc232147293 \h </w:instrText>
-            </w:r>
-            <w:r>
-              <w:rPr>
-                <w:noProof/>
-              </w:rPr>
-            </w:r>
-            <w:r>
-              <w:rPr>
-                <w:noProof/>
-              </w:rPr>
               <w:fldChar w:fldCharType="separate"/>
-            </w:r>
-            <w:r>
-              <w:rPr>
-                <w:noProof/>
-              </w:rPr>
               <w:t>25</w:t>
-            </w:r>
-            <w:r>
-              <w:rPr>
-                <w:noProof/>
-              </w:rPr>
               <w:fldChar w:fldCharType="end"/>
             </w:r>
           </w:hyperlink>
@@ -4003,40 +2189,10 @@
                 <w:noProof/>
               </w:rPr>
               <w:tab/>
-            </w:r>
-            <w:r>
-              <w:rPr>
-                <w:noProof/>
-              </w:rPr>
               <w:fldChar w:fldCharType="begin"/>
-            </w:r>
-            <w:r>
-              <w:rPr>
-                <w:noProof/>
-              </w:rPr>
               <w:instrText xml:space="preserve"> PAGEREF _Toc232147294 \h </w:instrText>
-            </w:r>
-            <w:r>
-              <w:rPr>
-                <w:noProof/>
-              </w:rPr>
-            </w:r>
-            <w:r>
-              <w:rPr>
-                <w:noProof/>
-              </w:rPr>
               <w:fldChar w:fldCharType="separate"/>
-            </w:r>
-            <w:r>
-              <w:rPr>
-                <w:noProof/>
-              </w:rPr>
               <w:t>26</w:t>
-            </w:r>
-            <w:r>
-              <w:rPr>
-                <w:noProof/>
-              </w:rPr>
               <w:fldChar w:fldCharType="end"/>
             </w:r>
           </w:hyperlink>
@@ -4067,40 +2223,10 @@
                 <w:noProof/>
               </w:rPr>
               <w:tab/>
-            </w:r>
-            <w:r>
-              <w:rPr>
-                <w:noProof/>
-              </w:rPr>
               <w:fldChar w:fldCharType="begin"/>
-            </w:r>
-            <w:r>
-              <w:rPr>
-                <w:noProof/>
-              </w:rPr>
               <w:instrText xml:space="preserve"> PAGEREF _Toc232147295 \h </w:instrText>
-            </w:r>
-            <w:r>
-              <w:rPr>
-                <w:noProof/>
-              </w:rPr>
-            </w:r>
-            <w:r>
-              <w:rPr>
-                <w:noProof/>
-              </w:rPr>
               <w:fldChar w:fldCharType="separate"/>
-            </w:r>
-            <w:r>
-              <w:rPr>
-                <w:noProof/>
-              </w:rPr>
               <w:t>26</w:t>
-            </w:r>
-            <w:r>
-              <w:rPr>
-                <w:noProof/>
-              </w:rPr>
               <w:fldChar w:fldCharType="end"/>
             </w:r>
           </w:hyperlink>
@@ -4131,40 +2257,10 @@
                 <w:noProof/>
               </w:rPr>
               <w:tab/>
-            </w:r>
-            <w:r>
-              <w:rPr>
-                <w:noProof/>
-              </w:rPr>
               <w:fldChar w:fldCharType="begin"/>
-            </w:r>
-            <w:r>
-              <w:rPr>
-                <w:noProof/>
-              </w:rPr>
               <w:instrText xml:space="preserve"> PAGEREF _Toc232147296 \h </w:instrText>
-            </w:r>
-            <w:r>
-              <w:rPr>
-                <w:noProof/>
-              </w:rPr>
-            </w:r>
-            <w:r>
-              <w:rPr>
-                <w:noProof/>
-              </w:rPr>
               <w:fldChar w:fldCharType="separate"/>
-            </w:r>
-            <w:r>
-              <w:rPr>
-                <w:noProof/>
-              </w:rPr>
               <w:t>26</w:t>
-            </w:r>
-            <w:r>
-              <w:rPr>
-                <w:noProof/>
-              </w:rPr>
               <w:fldChar w:fldCharType="end"/>
             </w:r>
           </w:hyperlink>
@@ -4195,40 +2291,10 @@
                 <w:noProof/>
               </w:rPr>
               <w:tab/>
-            </w:r>
-            <w:r>
-              <w:rPr>
-                <w:noProof/>
-              </w:rPr>
               <w:fldChar w:fldCharType="begin"/>
-            </w:r>
-            <w:r>
-              <w:rPr>
-                <w:noProof/>
-              </w:rPr>
               <w:instrText xml:space="preserve"> PAGEREF _Toc232147297 \h </w:instrText>
-            </w:r>
-            <w:r>
-              <w:rPr>
-                <w:noProof/>
-              </w:rPr>
-            </w:r>
-            <w:r>
-              <w:rPr>
-                <w:noProof/>
-              </w:rPr>
               <w:fldChar w:fldCharType="separate"/>
-            </w:r>
-            <w:r>
-              <w:rPr>
-                <w:noProof/>
-              </w:rPr>
               <w:t>26</w:t>
-            </w:r>
-            <w:r>
-              <w:rPr>
-                <w:noProof/>
-              </w:rPr>
               <w:fldChar w:fldCharType="end"/>
             </w:r>
           </w:hyperlink>
@@ -4259,40 +2325,10 @@
                 <w:noProof/>
               </w:rPr>
               <w:tab/>
-            </w:r>
-            <w:r>
-              <w:rPr>
-                <w:noProof/>
-              </w:rPr>
               <w:fldChar w:fldCharType="begin"/>
-            </w:r>
-            <w:r>
-              <w:rPr>
-                <w:noProof/>
-              </w:rPr>
               <w:instrText xml:space="preserve"> PAGEREF _Toc232147298 \h </w:instrText>
-            </w:r>
-            <w:r>
-              <w:rPr>
-                <w:noProof/>
-              </w:rPr>
-            </w:r>
-            <w:r>
-              <w:rPr>
-                <w:noProof/>
-              </w:rPr>
               <w:fldChar w:fldCharType="separate"/>
-            </w:r>
-            <w:r>
-              <w:rPr>
-                <w:noProof/>
-              </w:rPr>
               <w:t>27</w:t>
-            </w:r>
-            <w:r>
-              <w:rPr>
-                <w:noProof/>
-              </w:rPr>
               <w:fldChar w:fldCharType="end"/>
             </w:r>
           </w:hyperlink>
@@ -4323,40 +2359,10 @@
                 <w:noProof/>
               </w:rPr>
               <w:tab/>
-            </w:r>
-            <w:r>
-              <w:rPr>
-                <w:noProof/>
-              </w:rPr>
               <w:fldChar w:fldCharType="begin"/>
-            </w:r>
-            <w:r>
-              <w:rPr>
-                <w:noProof/>
-              </w:rPr>
               <w:instrText xml:space="preserve"> PAGEREF _Toc232147299 \h </w:instrText>
-            </w:r>
-            <w:r>
-              <w:rPr>
-                <w:noProof/>
-              </w:rPr>
-            </w:r>
-            <w:r>
-              <w:rPr>
-                <w:noProof/>
-              </w:rPr>
               <w:fldChar w:fldCharType="separate"/>
-            </w:r>
-            <w:r>
-              <w:rPr>
-                <w:noProof/>
-              </w:rPr>
               <w:t>28</w:t>
-            </w:r>
-            <w:r>
-              <w:rPr>
-                <w:noProof/>
-              </w:rPr>
               <w:fldChar w:fldCharType="end"/>
             </w:r>
           </w:hyperlink>
@@ -4387,40 +2393,10 @@
                 <w:noProof/>
               </w:rPr>
               <w:tab/>
-            </w:r>
-            <w:r>
-              <w:rPr>
-                <w:noProof/>
-              </w:rPr>
               <w:fldChar w:fldCharType="begin"/>
-            </w:r>
-            <w:r>
-              <w:rPr>
-                <w:noProof/>
-              </w:rPr>
               <w:instrText xml:space="preserve"> PAGEREF _Toc232147300 \h </w:instrText>
-            </w:r>
-            <w:r>
-              <w:rPr>
-                <w:noProof/>
-              </w:rPr>
-            </w:r>
-            <w:r>
-              <w:rPr>
-                <w:noProof/>
-              </w:rPr>
               <w:fldChar w:fldCharType="separate"/>
-            </w:r>
-            <w:r>
-              <w:rPr>
-                <w:noProof/>
-              </w:rPr>
               <w:t>28</w:t>
-            </w:r>
-            <w:r>
-              <w:rPr>
-                <w:noProof/>
-              </w:rPr>
               <w:fldChar w:fldCharType="end"/>
             </w:r>
           </w:hyperlink>
@@ -4451,40 +2427,10 @@
                 <w:noProof/>
               </w:rPr>
               <w:tab/>
-            </w:r>
-            <w:r>
-              <w:rPr>
-                <w:noProof/>
-              </w:rPr>
               <w:fldChar w:fldCharType="begin"/>
-            </w:r>
-            <w:r>
-              <w:rPr>
-                <w:noProof/>
-              </w:rPr>
               <w:instrText xml:space="preserve"> PAGEREF _Toc232147301 \h </w:instrText>
-            </w:r>
-            <w:r>
-              <w:rPr>
-                <w:noProof/>
-              </w:rPr>
-            </w:r>
-            <w:r>
-              <w:rPr>
-                <w:noProof/>
-              </w:rPr>
               <w:fldChar w:fldCharType="separate"/>
-            </w:r>
-            <w:r>
-              <w:rPr>
-                <w:noProof/>
-              </w:rPr>
               <w:t>28</w:t>
-            </w:r>
-            <w:r>
-              <w:rPr>
-                <w:noProof/>
-              </w:rPr>
               <w:fldChar w:fldCharType="end"/>
             </w:r>
           </w:hyperlink>
@@ -4515,40 +2461,10 @@
                 <w:noProof/>
               </w:rPr>
               <w:tab/>
-            </w:r>
-            <w:r>
-              <w:rPr>
-                <w:noProof/>
-              </w:rPr>
               <w:fldChar w:fldCharType="begin"/>
-            </w:r>
-            <w:r>
-              <w:rPr>
-                <w:noProof/>
-              </w:rPr>
               <w:instrText xml:space="preserve"> PAGEREF _Toc232147302 \h </w:instrText>
-            </w:r>
-            <w:r>
-              <w:rPr>
-                <w:noProof/>
-              </w:rPr>
-            </w:r>
-            <w:r>
-              <w:rPr>
-                <w:noProof/>
-              </w:rPr>
               <w:fldChar w:fldCharType="separate"/>
-            </w:r>
-            <w:r>
-              <w:rPr>
-                <w:noProof/>
-              </w:rPr>
               <w:t>28</w:t>
-            </w:r>
-            <w:r>
-              <w:rPr>
-                <w:noProof/>
-              </w:rPr>
               <w:fldChar w:fldCharType="end"/>
             </w:r>
           </w:hyperlink>
@@ -4579,40 +2495,10 @@
                 <w:noProof/>
               </w:rPr>
               <w:tab/>
-            </w:r>
-            <w:r>
-              <w:rPr>
-                <w:noProof/>
-              </w:rPr>
               <w:fldChar w:fldCharType="begin"/>
-            </w:r>
-            <w:r>
-              <w:rPr>
-                <w:noProof/>
-              </w:rPr>
               <w:instrText xml:space="preserve"> PAGEREF _Toc232147303 \h </w:instrText>
-            </w:r>
-            <w:r>
-              <w:rPr>
-                <w:noProof/>
-              </w:rPr>
-            </w:r>
-            <w:r>
-              <w:rPr>
-                <w:noProof/>
-              </w:rPr>
               <w:fldChar w:fldCharType="separate"/>
-            </w:r>
-            <w:r>
-              <w:rPr>
-                <w:noProof/>
-              </w:rPr>
               <w:t>28</w:t>
-            </w:r>
-            <w:r>
-              <w:rPr>
-                <w:noProof/>
-              </w:rPr>
               <w:fldChar w:fldCharType="end"/>
             </w:r>
           </w:hyperlink>
@@ -4643,40 +2529,10 @@
                 <w:noProof/>
               </w:rPr>
               <w:tab/>
-            </w:r>
-            <w:r>
-              <w:rPr>
-                <w:noProof/>
-              </w:rPr>
               <w:fldChar w:fldCharType="begin"/>
-            </w:r>
-            <w:r>
-              <w:rPr>
-                <w:noProof/>
-              </w:rPr>
               <w:instrText xml:space="preserve"> PAGEREF _Toc232147304 \h </w:instrText>
-            </w:r>
-            <w:r>
-              <w:rPr>
-                <w:noProof/>
-              </w:rPr>
-            </w:r>
-            <w:r>
-              <w:rPr>
-                <w:noProof/>
-              </w:rPr>
               <w:fldChar w:fldCharType="separate"/>
-            </w:r>
-            <w:r>
-              <w:rPr>
-                <w:noProof/>
-              </w:rPr>
               <w:t>29</w:t>
-            </w:r>
-            <w:r>
-              <w:rPr>
-                <w:noProof/>
-              </w:rPr>
               <w:fldChar w:fldCharType="end"/>
             </w:r>
           </w:hyperlink>
@@ -4707,40 +2563,10 @@
                 <w:noProof/>
               </w:rPr>
               <w:tab/>
-            </w:r>
-            <w:r>
-              <w:rPr>
-                <w:noProof/>
-              </w:rPr>
               <w:fldChar w:fldCharType="begin"/>
-            </w:r>
-            <w:r>
-              <w:rPr>
-                <w:noProof/>
-              </w:rPr>
               <w:instrText xml:space="preserve"> PAGEREF _Toc232147305 \h </w:instrText>
-            </w:r>
-            <w:r>
-              <w:rPr>
-                <w:noProof/>
-              </w:rPr>
-            </w:r>
-            <w:r>
-              <w:rPr>
-                <w:noProof/>
-              </w:rPr>
               <w:fldChar w:fldCharType="separate"/>
-            </w:r>
-            <w:r>
-              <w:rPr>
-                <w:noProof/>
-              </w:rPr>
               <w:t>29</w:t>
-            </w:r>
-            <w:r>
-              <w:rPr>
-                <w:noProof/>
-              </w:rPr>
               <w:fldChar w:fldCharType="end"/>
             </w:r>
           </w:hyperlink>
@@ -4771,40 +2597,10 @@
                 <w:noProof/>
               </w:rPr>
               <w:tab/>
-            </w:r>
-            <w:r>
-              <w:rPr>
-                <w:noProof/>
-              </w:rPr>
               <w:fldChar w:fldCharType="begin"/>
-            </w:r>
-            <w:r>
-              <w:rPr>
-                <w:noProof/>
-              </w:rPr>
               <w:instrText xml:space="preserve"> PAGEREF _Toc232147306 \h </w:instrText>
-            </w:r>
-            <w:r>
-              <w:rPr>
-                <w:noProof/>
-              </w:rPr>
-            </w:r>
-            <w:r>
-              <w:rPr>
-                <w:noProof/>
-              </w:rPr>
               <w:fldChar w:fldCharType="separate"/>
-            </w:r>
-            <w:r>
-              <w:rPr>
-                <w:noProof/>
-              </w:rPr>
               <w:t>29</w:t>
-            </w:r>
-            <w:r>
-              <w:rPr>
-                <w:noProof/>
-              </w:rPr>
               <w:fldChar w:fldCharType="end"/>
             </w:r>
           </w:hyperlink>
@@ -4835,40 +2631,10 @@
                 <w:noProof/>
               </w:rPr>
               <w:tab/>
-            </w:r>
-            <w:r>
-              <w:rPr>
-                <w:noProof/>
-              </w:rPr>
               <w:fldChar w:fldCharType="begin"/>
-            </w:r>
-            <w:r>
-              <w:rPr>
-                <w:noProof/>
-              </w:rPr>
               <w:instrText xml:space="preserve"> PAGEREF _Toc232147307 \h </w:instrText>
-            </w:r>
-            <w:r>
-              <w:rPr>
-                <w:noProof/>
-              </w:rPr>
-            </w:r>
-            <w:r>
-              <w:rPr>
-                <w:noProof/>
-              </w:rPr>
               <w:fldChar w:fldCharType="separate"/>
-            </w:r>
-            <w:r>
-              <w:rPr>
-                <w:noProof/>
-              </w:rPr>
               <w:t>29</w:t>
-            </w:r>
-            <w:r>
-              <w:rPr>
-                <w:noProof/>
-              </w:rPr>
               <w:fldChar w:fldCharType="end"/>
             </w:r>
           </w:hyperlink>
@@ -4899,40 +2665,10 @@
                 <w:noProof/>
               </w:rPr>
               <w:tab/>
-            </w:r>
-            <w:r>
-              <w:rPr>
-                <w:noProof/>
-              </w:rPr>
               <w:fldChar w:fldCharType="begin"/>
-            </w:r>
-            <w:r>
-              <w:rPr>
-                <w:noProof/>
-              </w:rPr>
               <w:instrText xml:space="preserve"> PAGEREF _Toc232147308 \h </w:instrText>
-            </w:r>
-            <w:r>
-              <w:rPr>
-                <w:noProof/>
-              </w:rPr>
-            </w:r>
-            <w:r>
-              <w:rPr>
-                <w:noProof/>
-              </w:rPr>
               <w:fldChar w:fldCharType="separate"/>
-            </w:r>
-            <w:r>
-              <w:rPr>
-                <w:noProof/>
-              </w:rPr>
               <w:t>29</w:t>
-            </w:r>
-            <w:r>
-              <w:rPr>
-                <w:noProof/>
-              </w:rPr>
               <w:fldChar w:fldCharType="end"/>
             </w:r>
           </w:hyperlink>
@@ -4963,40 +2699,10 @@
                 <w:noProof/>
               </w:rPr>
               <w:tab/>
-            </w:r>
-            <w:r>
-              <w:rPr>
-                <w:noProof/>
-              </w:rPr>
               <w:fldChar w:fldCharType="begin"/>
-            </w:r>
-            <w:r>
-              <w:rPr>
-                <w:noProof/>
-              </w:rPr>
               <w:instrText xml:space="preserve"> PAGEREF _Toc232147309 \h </w:instrText>
-            </w:r>
-            <w:r>
-              <w:rPr>
-                <w:noProof/>
-              </w:rPr>
-            </w:r>
-            <w:r>
-              <w:rPr>
-                <w:noProof/>
-              </w:rPr>
               <w:fldChar w:fldCharType="separate"/>
-            </w:r>
-            <w:r>
-              <w:rPr>
-                <w:noProof/>
-              </w:rPr>
               <w:t>30</w:t>
-            </w:r>
-            <w:r>
-              <w:rPr>
-                <w:noProof/>
-              </w:rPr>
               <w:fldChar w:fldCharType="end"/>
             </w:r>
           </w:hyperlink>
@@ -5027,40 +2733,10 @@
                 <w:noProof/>
               </w:rPr>
               <w:tab/>
-            </w:r>
-            <w:r>
-              <w:rPr>
-                <w:noProof/>
-              </w:rPr>
               <w:fldChar w:fldCharType="begin"/>
-            </w:r>
-            <w:r>
-              <w:rPr>
-                <w:noProof/>
-              </w:rPr>
               <w:instrText xml:space="preserve"> PAGEREF _Toc232147310 \h </w:instrText>
-            </w:r>
-            <w:r>
-              <w:rPr>
-                <w:noProof/>
-              </w:rPr>
-            </w:r>
-            <w:r>
-              <w:rPr>
-                <w:noProof/>
-              </w:rPr>
               <w:fldChar w:fldCharType="separate"/>
-            </w:r>
-            <w:r>
-              <w:rPr>
-                <w:noProof/>
-              </w:rPr>
               <w:t>31</w:t>
-            </w:r>
-            <w:r>
-              <w:rPr>
-                <w:noProof/>
-              </w:rPr>
               <w:fldChar w:fldCharType="end"/>
             </w:r>
           </w:hyperlink>
@@ -5091,40 +2767,10 @@
                 <w:noProof/>
               </w:rPr>
               <w:tab/>
-            </w:r>
-            <w:r>
-              <w:rPr>
-                <w:noProof/>
-              </w:rPr>
               <w:fldChar w:fldCharType="begin"/>
-            </w:r>
-            <w:r>
-              <w:rPr>
-                <w:noProof/>
-              </w:rPr>
               <w:instrText xml:space="preserve"> PAGEREF _Toc232147311 \h </w:instrText>
-            </w:r>
-            <w:r>
-              <w:rPr>
-                <w:noProof/>
-              </w:rPr>
-            </w:r>
-            <w:r>
-              <w:rPr>
-                <w:noProof/>
-              </w:rPr>
               <w:fldChar w:fldCharType="separate"/>
-            </w:r>
-            <w:r>
-              <w:rPr>
-                <w:noProof/>
-              </w:rPr>
               <w:t>31</w:t>
-            </w:r>
-            <w:r>
-              <w:rPr>
-                <w:noProof/>
-              </w:rPr>
               <w:fldChar w:fldCharType="end"/>
             </w:r>
           </w:hyperlink>
@@ -5155,40 +2801,10 @@
                 <w:noProof/>
               </w:rPr>
               <w:tab/>
-            </w:r>
-            <w:r>
-              <w:rPr>
-                <w:noProof/>
-              </w:rPr>
               <w:fldChar w:fldCharType="begin"/>
-            </w:r>
-            <w:r>
-              <w:rPr>
-                <w:noProof/>
-              </w:rPr>
               <w:instrText xml:space="preserve"> PAGEREF _Toc232147312 \h </w:instrText>
-            </w:r>
-            <w:r>
-              <w:rPr>
-                <w:noProof/>
-              </w:rPr>
-            </w:r>
-            <w:r>
-              <w:rPr>
-                <w:noProof/>
-              </w:rPr>
               <w:fldChar w:fldCharType="separate"/>
-            </w:r>
-            <w:r>
-              <w:rPr>
-                <w:noProof/>
-              </w:rPr>
               <w:t>31</w:t>
-            </w:r>
-            <w:r>
-              <w:rPr>
-                <w:noProof/>
-              </w:rPr>
               <w:fldChar w:fldCharType="end"/>
             </w:r>
           </w:hyperlink>
@@ -5219,40 +2835,10 @@
                 <w:noProof/>
               </w:rPr>
               <w:tab/>
-            </w:r>
-            <w:r>
-              <w:rPr>
-                <w:noProof/>
-              </w:rPr>
               <w:fldChar w:fldCharType="begin"/>
-            </w:r>
-            <w:r>
-              <w:rPr>
-                <w:noProof/>
-              </w:rPr>
               <w:instrText xml:space="preserve"> PAGEREF _Toc232147313 \h </w:instrText>
-            </w:r>
-            <w:r>
-              <w:rPr>
-                <w:noProof/>
-              </w:rPr>
-            </w:r>
-            <w:r>
-              <w:rPr>
-                <w:noProof/>
-              </w:rPr>
               <w:fldChar w:fldCharType="separate"/>
-            </w:r>
-            <w:r>
-              <w:rPr>
-                <w:noProof/>
-              </w:rPr>
               <w:t>31</w:t>
-            </w:r>
-            <w:r>
-              <w:rPr>
-                <w:noProof/>
-              </w:rPr>
               <w:fldChar w:fldCharType="end"/>
             </w:r>
           </w:hyperlink>
@@ -5283,40 +2869,10 @@
                 <w:noProof/>
               </w:rPr>
               <w:tab/>
-            </w:r>
-            <w:r>
-              <w:rPr>
-                <w:noProof/>
-              </w:rPr>
               <w:fldChar w:fldCharType="begin"/>
-            </w:r>
-            <w:r>
-              <w:rPr>
-                <w:noProof/>
-              </w:rPr>
               <w:instrText xml:space="preserve"> PAGEREF _Toc232147314 \h </w:instrText>
-            </w:r>
-            <w:r>
-              <w:rPr>
-                <w:noProof/>
-              </w:rPr>
-            </w:r>
-            <w:r>
-              <w:rPr>
-                <w:noProof/>
-              </w:rPr>
               <w:fldChar w:fldCharType="separate"/>
-            </w:r>
-            <w:r>
-              <w:rPr>
-                <w:noProof/>
-              </w:rPr>
               <w:t>32</w:t>
-            </w:r>
-            <w:r>
-              <w:rPr>
-                <w:noProof/>
-              </w:rPr>
               <w:fldChar w:fldCharType="end"/>
             </w:r>
           </w:hyperlink>
@@ -5347,40 +2903,10 @@
                 <w:noProof/>
               </w:rPr>
               <w:tab/>
-            </w:r>
-            <w:r>
-              <w:rPr>
-                <w:noProof/>
-              </w:rPr>
               <w:fldChar w:fldCharType="begin"/>
-            </w:r>
-            <w:r>
-              <w:rPr>
-                <w:noProof/>
-              </w:rPr>
               <w:instrText xml:space="preserve"> PAGEREF _Toc232147315 \h </w:instrText>
-            </w:r>
-            <w:r>
-              <w:rPr>
-                <w:noProof/>
-              </w:rPr>
-            </w:r>
-            <w:r>
-              <w:rPr>
-                <w:noProof/>
-              </w:rPr>
               <w:fldChar w:fldCharType="separate"/>
-            </w:r>
-            <w:r>
-              <w:rPr>
-                <w:noProof/>
-              </w:rPr>
               <w:t>33</w:t>
-            </w:r>
-            <w:r>
-              <w:rPr>
-                <w:noProof/>
-              </w:rPr>
               <w:fldChar w:fldCharType="end"/>
             </w:r>
           </w:hyperlink>
@@ -5411,40 +2937,10 @@
                 <w:noProof/>
               </w:rPr>
               <w:tab/>
-            </w:r>
-            <w:r>
-              <w:rPr>
-                <w:noProof/>
-              </w:rPr>
               <w:fldChar w:fldCharType="begin"/>
-            </w:r>
-            <w:r>
-              <w:rPr>
-                <w:noProof/>
-              </w:rPr>
               <w:instrText xml:space="preserve"> PAGEREF _Toc232147316 \h </w:instrText>
-            </w:r>
-            <w:r>
-              <w:rPr>
-                <w:noProof/>
-              </w:rPr>
-            </w:r>
-            <w:r>
-              <w:rPr>
-                <w:noProof/>
-              </w:rPr>
               <w:fldChar w:fldCharType="separate"/>
-            </w:r>
-            <w:r>
-              <w:rPr>
-                <w:noProof/>
-              </w:rPr>
               <w:t>33</w:t>
-            </w:r>
-            <w:r>
-              <w:rPr>
-                <w:noProof/>
-              </w:rPr>
               <w:fldChar w:fldCharType="end"/>
             </w:r>
           </w:hyperlink>
@@ -5475,40 +2971,10 @@
                 <w:noProof/>
               </w:rPr>
               <w:tab/>
-            </w:r>
-            <w:r>
-              <w:rPr>
-                <w:noProof/>
-              </w:rPr>
               <w:fldChar w:fldCharType="begin"/>
-            </w:r>
-            <w:r>
-              <w:rPr>
-                <w:noProof/>
-              </w:rPr>
               <w:instrText xml:space="preserve"> PAGEREF _Toc232147317 \h </w:instrText>
-            </w:r>
-            <w:r>
-              <w:rPr>
-                <w:noProof/>
-              </w:rPr>
-            </w:r>
-            <w:r>
-              <w:rPr>
-                <w:noProof/>
-              </w:rPr>
               <w:fldChar w:fldCharType="separate"/>
-            </w:r>
-            <w:r>
-              <w:rPr>
-                <w:noProof/>
-              </w:rPr>
               <w:t>33</w:t>
-            </w:r>
-            <w:r>
-              <w:rPr>
-                <w:noProof/>
-              </w:rPr>
               <w:fldChar w:fldCharType="end"/>
             </w:r>
           </w:hyperlink>
@@ -5539,40 +3005,10 @@
                 <w:noProof/>
               </w:rPr>
               <w:tab/>
-            </w:r>
-            <w:r>
-              <w:rPr>
-                <w:noProof/>
-              </w:rPr>
               <w:fldChar w:fldCharType="begin"/>
-            </w:r>
-            <w:r>
-              <w:rPr>
-                <w:noProof/>
-              </w:rPr>
               <w:instrText xml:space="preserve"> PAGEREF _Toc232147318 \h </w:instrText>
-            </w:r>
-            <w:r>
-              <w:rPr>
-                <w:noProof/>
-              </w:rPr>
-            </w:r>
-            <w:r>
-              <w:rPr>
-                <w:noProof/>
-              </w:rPr>
               <w:fldChar w:fldCharType="separate"/>
-            </w:r>
-            <w:r>
-              <w:rPr>
-                <w:noProof/>
-              </w:rPr>
               <w:t>33</w:t>
-            </w:r>
-            <w:r>
-              <w:rPr>
-                <w:noProof/>
-              </w:rPr>
               <w:fldChar w:fldCharType="end"/>
             </w:r>
           </w:hyperlink>
@@ -5603,40 +3039,10 @@
                 <w:noProof/>
               </w:rPr>
               <w:tab/>
-            </w:r>
-            <w:r>
-              <w:rPr>
-                <w:noProof/>
-              </w:rPr>
               <w:fldChar w:fldCharType="begin"/>
-            </w:r>
-            <w:r>
-              <w:rPr>
-                <w:noProof/>
-              </w:rPr>
               <w:instrText xml:space="preserve"> PAGEREF _Toc232147319 \h </w:instrText>
-            </w:r>
-            <w:r>
-              <w:rPr>
-                <w:noProof/>
-              </w:rPr>
-            </w:r>
-            <w:r>
-              <w:rPr>
-                <w:noProof/>
-              </w:rPr>
               <w:fldChar w:fldCharType="separate"/>
-            </w:r>
-            <w:r>
-              <w:rPr>
-                <w:noProof/>
-              </w:rPr>
               <w:t>34</w:t>
-            </w:r>
-            <w:r>
-              <w:rPr>
-                <w:noProof/>
-              </w:rPr>
               <w:fldChar w:fldCharType="end"/>
             </w:r>
           </w:hyperlink>
@@ -5667,40 +3073,10 @@
                 <w:noProof/>
               </w:rPr>
               <w:tab/>
-            </w:r>
-            <w:r>
-              <w:rPr>
-                <w:noProof/>
-              </w:rPr>
               <w:fldChar w:fldCharType="begin"/>
-            </w:r>
-            <w:r>
-              <w:rPr>
-                <w:noProof/>
-              </w:rPr>
               <w:instrText xml:space="preserve"> PAGEREF _Toc232147320 \h </w:instrText>
-            </w:r>
-            <w:r>
-              <w:rPr>
-                <w:noProof/>
-              </w:rPr>
-            </w:r>
-            <w:r>
-              <w:rPr>
-                <w:noProof/>
-              </w:rPr>
               <w:fldChar w:fldCharType="separate"/>
-            </w:r>
-            <w:r>
-              <w:rPr>
-                <w:noProof/>
-              </w:rPr>
               <w:t>35</w:t>
-            </w:r>
-            <w:r>
-              <w:rPr>
-                <w:noProof/>
-              </w:rPr>
               <w:fldChar w:fldCharType="end"/>
             </w:r>
           </w:hyperlink>
@@ -5731,40 +3107,10 @@
                 <w:noProof/>
               </w:rPr>
               <w:tab/>
-            </w:r>
-            <w:r>
-              <w:rPr>
-                <w:noProof/>
-              </w:rPr>
               <w:fldChar w:fldCharType="begin"/>
-            </w:r>
-            <w:r>
-              <w:rPr>
-                <w:noProof/>
-              </w:rPr>
               <w:instrText xml:space="preserve"> PAGEREF _Toc232147321 \h </w:instrText>
-            </w:r>
-            <w:r>
-              <w:rPr>
-                <w:noProof/>
-              </w:rPr>
-            </w:r>
-            <w:r>
-              <w:rPr>
-                <w:noProof/>
-              </w:rPr>
               <w:fldChar w:fldCharType="separate"/>
-            </w:r>
-            <w:r>
-              <w:rPr>
-                <w:noProof/>
-              </w:rPr>
               <w:t>35</w:t>
-            </w:r>
-            <w:r>
-              <w:rPr>
-                <w:noProof/>
-              </w:rPr>
               <w:fldChar w:fldCharType="end"/>
             </w:r>
           </w:hyperlink>
@@ -5795,40 +3141,10 @@
                 <w:noProof/>
               </w:rPr>
               <w:tab/>
-            </w:r>
-            <w:r>
-              <w:rPr>
-                <w:noProof/>
-              </w:rPr>
               <w:fldChar w:fldCharType="begin"/>
-            </w:r>
-            <w:r>
-              <w:rPr>
-                <w:noProof/>
-              </w:rPr>
               <w:instrText xml:space="preserve"> PAGEREF _Toc232147322 \h </w:instrText>
-            </w:r>
-            <w:r>
-              <w:rPr>
-                <w:noProof/>
-              </w:rPr>
-            </w:r>
-            <w:r>
-              <w:rPr>
-                <w:noProof/>
-              </w:rPr>
               <w:fldChar w:fldCharType="separate"/>
-            </w:r>
-            <w:r>
-              <w:rPr>
-                <w:noProof/>
-              </w:rPr>
               <w:t>35</w:t>
-            </w:r>
-            <w:r>
-              <w:rPr>
-                <w:noProof/>
-              </w:rPr>
               <w:fldChar w:fldCharType="end"/>
             </w:r>
           </w:hyperlink>
@@ -5859,40 +3175,10 @@
                 <w:noProof/>
               </w:rPr>
               <w:tab/>
-            </w:r>
-            <w:r>
-              <w:rPr>
-                <w:noProof/>
-              </w:rPr>
               <w:fldChar w:fldCharType="begin"/>
-            </w:r>
-            <w:r>
-              <w:rPr>
-                <w:noProof/>
-              </w:rPr>
               <w:instrText xml:space="preserve"> PAGEREF _Toc232147323 \h </w:instrText>
-            </w:r>
-            <w:r>
-              <w:rPr>
-                <w:noProof/>
-              </w:rPr>
-            </w:r>
-            <w:r>
-              <w:rPr>
-                <w:noProof/>
-              </w:rPr>
               <w:fldChar w:fldCharType="separate"/>
-            </w:r>
-            <w:r>
-              <w:rPr>
-                <w:noProof/>
-              </w:rPr>
               <w:t>35</w:t>
-            </w:r>
-            <w:r>
-              <w:rPr>
-                <w:noProof/>
-              </w:rPr>
               <w:fldChar w:fldCharType="end"/>
             </w:r>
           </w:hyperlink>
@@ -5923,40 +3209,10 @@
                 <w:noProof/>
               </w:rPr>
               <w:tab/>
-            </w:r>
-            <w:r>
-              <w:rPr>
-                <w:noProof/>
-              </w:rPr>
               <w:fldChar w:fldCharType="begin"/>
-            </w:r>
-            <w:r>
-              <w:rPr>
-                <w:noProof/>
-              </w:rPr>
               <w:instrText xml:space="preserve"> PAGEREF _Toc232147324 \h </w:instrText>
-            </w:r>
-            <w:r>
-              <w:rPr>
-                <w:noProof/>
-              </w:rPr>
-            </w:r>
-            <w:r>
-              <w:rPr>
-                <w:noProof/>
-              </w:rPr>
               <w:fldChar w:fldCharType="separate"/>
-            </w:r>
-            <w:r>
-              <w:rPr>
-                <w:noProof/>
-              </w:rPr>
               <w:t>35</w:t>
-            </w:r>
-            <w:r>
-              <w:rPr>
-                <w:noProof/>
-              </w:rPr>
               <w:fldChar w:fldCharType="end"/>
             </w:r>
           </w:hyperlink>
@@ -6057,7 +3313,7 @@
         <w:spacing w:before="40" w:after="40"/>
       </w:pPr>
       <w:r>
-        <w:t>Partie Nominateur (E020–E023) : interface de nomination, consultation des disponibilités et édition des convocations.</w:t>
+        <w:t>Partie Nominateur (E020–E024) : interface de nomination, consultation des disponibilités, édition des convocations et centre d’envoi.</w:t>
       </w:r>
     </w:p>
     <w:p>
@@ -6270,7 +3526,7 @@
                 <w:sz w:val="20"/>
                 <w:szCs w:val="20"/>
               </w:rPr>
-              <w:t>Accès à la partie nominateur uniquement (E020–E023)</w:t>
+              <w:t>Accès à la partie nominateur uniquement (E020–E024)</w:t>
             </w:r>
           </w:p>
         </w:tc>
@@ -7532,7 +4788,7 @@
                 <w:sz w:val="18"/>
                 <w:szCs w:val="18"/>
               </w:rPr>
-              <w:t>disponibilite_ja.php</w:t>
+              <w:t>Nominateur/disponibilite_ja.php</w:t>
             </w:r>
           </w:p>
         </w:tc>
@@ -8128,6 +5384,93 @@
                 <w:szCs w:val="18"/>
               </w:rPr>
               <w:t>Nominateur/centrenvoye.php</w:t>
+            </w:r>
+          </w:p>
+        </w:tc>
+      </w:tr>
+      <w:tr>
+        <w:tc>
+          <w:tcPr>
+            <w:tcW w:w="1500" w:type="dxa"/>
+            <w:tcBorders>
+              <w:top w:val="single" w:sz="4" w:space="0" w:color="C8D4E8"/>
+              <w:left w:val="single" w:sz="4" w:space="0" w:color="C8D4E8"/>
+              <w:bottom w:val="single" w:sz="4" w:space="0" w:color="C8D4E8"/>
+              <w:right w:val="single" w:sz="4" w:space="0" w:color="C8D4E8"/>
+            </w:tcBorders>
+            <w:shd w:val="clear" w:color="auto" w:fill="F5F5F5"/>
+            <w:tcMar>
+              <w:top w:w="60" w:type="dxa"/>
+              <w:left w:w="120" w:type="dxa"/>
+              <w:bottom w:w="60" w:type="dxa"/>
+              <w:right w:w="120" w:type="dxa"/>
+            </w:tcMar>
+          </w:tcPr>
+          <w:p>
+            <w:r>
+              <w:rPr>
+                <w:b/>
+                <w:bCs/>
+                <w:color w:val="1A3A6B"/>
+                <w:sz w:val="18"/>
+                <w:szCs w:val="18"/>
+              </w:rPr>
+              <w:t>E025</w:t>
+            </w:r>
+          </w:p>
+        </w:tc>
+        <w:tc>
+          <w:tcPr>
+            <w:tcW w:w="3500" w:type="dxa"/>
+            <w:tcBorders>
+              <w:top w:val="single" w:sz="4" w:space="0" w:color="C8D4E8"/>
+              <w:left w:val="single" w:sz="4" w:space="0" w:color="C8D4E8"/>
+              <w:bottom w:val="single" w:sz="4" w:space="0" w:color="C8D4E8"/>
+              <w:right w:val="single" w:sz="4" w:space="0" w:color="C8D4E8"/>
+            </w:tcBorders>
+            <w:shd w:val="clear" w:color="auto" w:fill="F5F5F5"/>
+            <w:tcMar>
+              <w:top w:w="60" w:type="dxa"/>
+              <w:left w:w="120" w:type="dxa"/>
+              <w:bottom w:w="60" w:type="dxa"/>
+              <w:right w:w="120" w:type="dxa"/>
+            </w:tcMar>
+          </w:tcPr>
+          <w:p>
+            <w:r>
+              <w:rPr>
+                <w:sz w:val="18"/>
+                <w:szCs w:val="18"/>
+              </w:rPr>
+              <w:t>Demandes JA R3/R4</w:t>
+            </w:r>
+          </w:p>
+        </w:tc>
+        <w:tc>
+          <w:tcPr>
+            <w:tcW w:w="4126" w:type="dxa"/>
+            <w:tcBorders>
+              <w:top w:val="single" w:sz="4" w:space="0" w:color="C8D4E8"/>
+              <w:left w:val="single" w:sz="4" w:space="0" w:color="C8D4E8"/>
+              <w:bottom w:val="single" w:sz="4" w:space="0" w:color="C8D4E8"/>
+              <w:right w:val="single" w:sz="4" w:space="0" w:color="C8D4E8"/>
+            </w:tcBorders>
+            <w:shd w:val="clear" w:color="auto" w:fill="F5F5F5"/>
+            <w:tcMar>
+              <w:top w:w="60" w:type="dxa"/>
+              <w:left w:w="120" w:type="dxa"/>
+              <w:bottom w:w="60" w:type="dxa"/>
+              <w:right w:w="120" w:type="dxa"/>
+            </w:tcMar>
+          </w:tcPr>
+          <w:p>
+            <w:r>
+              <w:rPr>
+                <w:color w:val="555555"/>
+                <w:sz w:val="18"/>
+                <w:szCs w:val="18"/>
+              </w:rPr>
+              <w:t>JA_R3R4.php</w:t>
             </w:r>
           </w:p>
         </w:tc>
@@ -8548,23 +5891,7 @@
           <w:iCs/>
           <w:color w:val="555555"/>
         </w:rPr>
-        <w:t>MDP : Change</w:t>
-      </w:r>
-      <w:r>
-        <w:rPr>
-          <w:i/>
-          <w:iCs/>
-          <w:color w:val="555555"/>
-        </w:rPr>
-        <w:t>_</w:t>
-      </w:r>
-      <w:r>
-        <w:rPr>
-          <w:i/>
-          <w:iCs/>
-          <w:color w:val="555555"/>
-        </w:rPr>
-        <w:t>On_Install</w:t>
+        <w:t>MDP : Change_On_Install</w:t>
       </w:r>
     </w:p>
     <w:p>
@@ -11800,6 +9127,19 @@
     </w:p>
     <w:p>
       <w:pPr>
+        <w:pStyle w:val="Paragraphedeliste"/>
+        <w:numPr>
+          <w:ilvl w:val="0"/>
+          <w:numId w:val="2"/>
+        </w:numPr>
+        <w:spacing w:before="40" w:after="40"/>
+      </w:pPr>
+      <w:r>
+        <w:t>Nationale : case à cocher Oui/Non – indique si le JA est habilité à arbitrer des rencontres nationales</w:t>
+      </w:r>
+    </w:p>
+    <w:p>
+      <w:pPr>
         <w:pStyle w:val="Titre3"/>
       </w:pPr>
       <w:bookmarkStart w:id="39" w:name="_Toc232147274"/>
@@ -14241,7 +11581,7 @@
                 <w:sz w:val="20"/>
                 <w:szCs w:val="20"/>
               </w:rPr>
-              <w:t>disponibilite_ja.php</w:t>
+              <w:t>Nominateur/disponibilite_ja.php</w:t>
             </w:r>
           </w:p>
         </w:tc>
@@ -15589,6 +12929,369 @@
         </w:tc>
       </w:tr>
     </w:tbl>
+    <w:p>
+      <w:pPr>
+        <w:pStyle w:val="Titre2"/>
+        <w:pageBreakBefore/>
+        <w:pBdr>
+          <w:bottom w:val="single" w:sz="4" w:space="0" w:color="2557A7"/>
+        </w:pBdr>
+      </w:pPr>
+      <w:bookmarkStart w:id="110" w:name="_Toc_E012"/>
+      <w:r>
+        <w:t>E012 – Déclaration de disponibilités JA</w:t>
+      </w:r>
+      <w:bookmarkEnd w:id="110"/>
+    </w:p>
+    <w:tbl>
+      <w:tblPr>
+        <w:tblW w:w="9026" w:type="dxa"/>
+        <w:tblBorders>
+          <w:top w:val="single" w:sz="4" w:space="0" w:color="auto"/>
+          <w:left w:val="single" w:sz="4" w:space="0" w:color="auto"/>
+          <w:bottom w:val="single" w:sz="4" w:space="0" w:color="auto"/>
+          <w:right w:val="single" w:sz="4" w:space="0" w:color="auto"/>
+          <w:insideH w:val="single" w:sz="4" w:space="0" w:color="auto"/>
+          <w:insideV w:val="single" w:sz="4" w:space="0" w:color="auto"/>
+        </w:tblBorders>
+        <w:tblCellMar>
+          <w:left w:w="10" w:type="dxa"/>
+          <w:right w:w="10" w:type="dxa"/>
+        </w:tblCellMar>
+        <w:tblLook w:val="0000" w:firstRow="0" w:lastRow="0" w:firstColumn="0" w:lastColumn="0" w:noHBand="0" w:noVBand="0"/>
+      </w:tblPr>
+      <w:tblGrid>
+        <w:gridCol w:w="2500"/>
+        <w:gridCol w:w="6526"/>
+      </w:tblGrid>
+      <w:tr>
+        <w:tc>
+          <w:tcPr>
+            <w:tcW w:w="2500" w:type="dxa"/>
+            <w:tcBorders>
+              <w:top w:val="single" w:sz="4" w:space="0" w:color="C8D4E8"/>
+              <w:left w:val="single" w:sz="4" w:space="0" w:color="C8D4E8"/>
+              <w:bottom w:val="single" w:sz="4" w:space="0" w:color="C8D4E8"/>
+              <w:right w:val="single" w:sz="4" w:space="0" w:color="C8D4E8"/>
+            </w:tcBorders>
+            <w:shd w:val="clear" w:color="auto" w:fill="E8EEF7"/>
+            <w:tcMar>
+              <w:top w:w="60" w:type="dxa"/>
+              <w:left w:w="120" w:type="dxa"/>
+              <w:bottom w:w="60" w:type="dxa"/>
+              <w:right w:w="120" w:type="dxa"/>
+            </w:tcMar>
+          </w:tcPr>
+          <w:p>
+            <w:r>
+              <w:rPr>
+                <w:b/>
+                <w:bCs/>
+                <w:color w:val="1A3A6B"/>
+                <w:sz w:val="20"/>
+                <w:szCs w:val="20"/>
+              </w:rPr>
+              <w:t>N° écran</w:t>
+            </w:r>
+          </w:p>
+        </w:tc>
+        <w:tc>
+          <w:tcPr>
+            <w:tcW w:w="6526" w:type="dxa"/>
+            <w:tcBorders>
+              <w:top w:val="single" w:sz="4" w:space="0" w:color="C8D4E8"/>
+              <w:left w:val="single" w:sz="4" w:space="0" w:color="C8D4E8"/>
+              <w:bottom w:val="single" w:sz="4" w:space="0" w:color="C8D4E8"/>
+              <w:right w:val="single" w:sz="4" w:space="0" w:color="C8D4E8"/>
+            </w:tcBorders>
+            <w:tcMar>
+              <w:top w:w="60" w:type="dxa"/>
+              <w:left w:w="120" w:type="dxa"/>
+              <w:bottom w:w="60" w:type="dxa"/>
+              <w:right w:w="120" w:type="dxa"/>
+            </w:tcMar>
+          </w:tcPr>
+          <w:p>
+            <w:r>
+              <w:rPr>
+                <w:sz w:val="20"/>
+                <w:szCs w:val="20"/>
+              </w:rPr>
+              <w:t>E012</w:t>
+            </w:r>
+          </w:p>
+        </w:tc>
+      </w:tr>
+      <w:tr>
+        <w:tc>
+          <w:tcPr>
+            <w:tcW w:w="2500" w:type="dxa"/>
+            <w:tcBorders>
+              <w:top w:val="single" w:sz="4" w:space="0" w:color="C8D4E8"/>
+              <w:left w:val="single" w:sz="4" w:space="0" w:color="C8D4E8"/>
+              <w:bottom w:val="single" w:sz="4" w:space="0" w:color="C8D4E8"/>
+              <w:right w:val="single" w:sz="4" w:space="0" w:color="C8D4E8"/>
+            </w:tcBorders>
+            <w:shd w:val="clear" w:color="auto" w:fill="E8EEF7"/>
+            <w:tcMar>
+              <w:top w:w="60" w:type="dxa"/>
+              <w:left w:w="120" w:type="dxa"/>
+              <w:bottom w:w="60" w:type="dxa"/>
+              <w:right w:w="120" w:type="dxa"/>
+            </w:tcMar>
+          </w:tcPr>
+          <w:p>
+            <w:r>
+              <w:rPr>
+                <w:b/>
+                <w:bCs/>
+                <w:color w:val="1A3A6B"/>
+                <w:sz w:val="20"/>
+                <w:szCs w:val="20"/>
+              </w:rPr>
+              <w:t>Fichier</w:t>
+            </w:r>
+          </w:p>
+        </w:tc>
+        <w:tc>
+          <w:tcPr>
+            <w:tcW w:w="6526" w:type="dxa"/>
+            <w:tcBorders>
+              <w:top w:val="single" w:sz="4" w:space="0" w:color="C8D4E8"/>
+              <w:left w:val="single" w:sz="4" w:space="0" w:color="C8D4E8"/>
+              <w:bottom w:val="single" w:sz="4" w:space="0" w:color="C8D4E8"/>
+              <w:right w:val="single" w:sz="4" w:space="0" w:color="C8D4E8"/>
+            </w:tcBorders>
+            <w:tcMar>
+              <w:top w:w="60" w:type="dxa"/>
+              <w:left w:w="120" w:type="dxa"/>
+              <w:bottom w:w="60" w:type="dxa"/>
+              <w:right w:w="120" w:type="dxa"/>
+            </w:tcMar>
+          </w:tcPr>
+          <w:p>
+            <w:r>
+              <w:rPr>
+                <w:sz w:val="20"/>
+                <w:szCs w:val="20"/>
+              </w:rPr>
+              <w:t>Nominateur/disponibilite_ja.php</w:t>
+            </w:r>
+          </w:p>
+        </w:tc>
+      </w:tr>
+      <w:tr>
+        <w:tc>
+          <w:tcPr>
+            <w:tcW w:w="2500" w:type="dxa"/>
+            <w:tcBorders>
+              <w:top w:val="single" w:sz="4" w:space="0" w:color="C8D4E8"/>
+              <w:left w:val="single" w:sz="4" w:space="0" w:color="C8D4E8"/>
+              <w:bottom w:val="single" w:sz="4" w:space="0" w:color="C8D4E8"/>
+              <w:right w:val="single" w:sz="4" w:space="0" w:color="C8D4E8"/>
+            </w:tcBorders>
+            <w:shd w:val="clear" w:color="auto" w:fill="E8EEF7"/>
+            <w:tcMar>
+              <w:top w:w="60" w:type="dxa"/>
+              <w:left w:w="120" w:type="dxa"/>
+              <w:bottom w:w="60" w:type="dxa"/>
+              <w:right w:w="120" w:type="dxa"/>
+            </w:tcMar>
+          </w:tcPr>
+          <w:p>
+            <w:r>
+              <w:rPr>
+                <w:b/>
+                <w:bCs/>
+                <w:color w:val="1A3A6B"/>
+                <w:sz w:val="20"/>
+                <w:szCs w:val="20"/>
+              </w:rPr>
+              <w:t>Accès</w:t>
+            </w:r>
+          </w:p>
+        </w:tc>
+        <w:tc>
+          <w:tcPr>
+            <w:tcW w:w="6526" w:type="dxa"/>
+            <w:tcBorders>
+              <w:top w:val="single" w:sz="4" w:space="0" w:color="C8D4E8"/>
+              <w:left w:val="single" w:sz="4" w:space="0" w:color="C8D4E8"/>
+              <w:bottom w:val="single" w:sz="4" w:space="0" w:color="C8D4E8"/>
+              <w:right w:val="single" w:sz="4" w:space="0" w:color="C8D4E8"/>
+            </w:tcBorders>
+            <w:tcMar>
+              <w:top w:w="60" w:type="dxa"/>
+              <w:left w:w="120" w:type="dxa"/>
+              <w:bottom w:w="60" w:type="dxa"/>
+              <w:right w:w="120" w:type="dxa"/>
+            </w:tcMar>
+          </w:tcPr>
+          <w:p>
+            <w:r>
+              <w:rPr>
+                <w:sz w:val="20"/>
+                <w:szCs w:val="20"/>
+              </w:rPr>
+              <w:t>Public – via lien email tokenisé ; ou utilisateur connecté (nominateur/admin)</w:t>
+            </w:r>
+          </w:p>
+        </w:tc>
+      </w:tr>
+    </w:tbl>
+    <w:p>
+      <w:pPr>
+        <w:pStyle w:val="Titre3"/>
+      </w:pPr>
+      <w:bookmarkStart w:id="111" w:name="_Toc_E012_Desc"/>
+      <w:r>
+        <w:t>Description</w:t>
+      </w:r>
+      <w:bookmarkEnd w:id="111"/>
+    </w:p>
+    <w:p>
+      <w:pPr>
+        <w:spacing w:before="60" w:after="60"/>
+      </w:pPr>
+      <w:r>
+        <w:t>Page de déclaration de disponibilité d’un Juge-Arbitre pour les journées de la saison en cours. Le JA indique pour chaque journée son statut (Disponible, Partiel ou Non disponible). En cas de disponibilité partielle, il peut sélectionner les lieux de rencontres souhaités. La page est accessible via un lien tokenisé envoyé par email, ou directement depuis l’interface nominateur (E021).</w:t>
+      </w:r>
+    </w:p>
+    <w:p>
+      <w:pPr>
+        <w:pStyle w:val="Titre3"/>
+      </w:pPr>
+      <w:bookmarkStart w:id="112" w:name="_Toc_E012_Champs"/>
+      <w:r>
+        <w:t>Champs et fonctionnalités</w:t>
+      </w:r>
+      <w:bookmarkEnd w:id="112"/>
+    </w:p>
+    <w:p>
+      <w:pPr>
+        <w:pStyle w:val="Paragraphedeliste"/>
+        <w:numPr>
+          <w:ilvl w:val="0"/>
+          <w:numId w:val="2"/>
+        </w:numPr>
+        <w:spacing w:before="40" w:after="40"/>
+      </w:pPr>
+      <w:r>
+        <w:t>Sélecteur de JA : liste déroulante des JA actifs (visible si aucun token JA passé en paramètre)</w:t>
+      </w:r>
+    </w:p>
+    <w:p>
+      <w:pPr>
+        <w:pStyle w:val="Paragraphedeliste"/>
+        <w:numPr>
+          <w:ilvl w:val="0"/>
+          <w:numId w:val="2"/>
+        </w:numPr>
+        <w:spacing w:before="40" w:after="40"/>
+      </w:pPr>
+      <w:r>
+        <w:t>Calendrier des journées : affiche toutes les journées de la saison avec leur date et le statut de disponibilité du JA sélectionné</w:t>
+      </w:r>
+    </w:p>
+    <w:p>
+      <w:pPr>
+        <w:pStyle w:val="Paragraphedeliste"/>
+        <w:numPr>
+          <w:ilvl w:val="0"/>
+          <w:numId w:val="2"/>
+        </w:numPr>
+        <w:spacing w:before="40" w:after="40"/>
+      </w:pPr>
+      <w:r>
+        <w:t>Statuts disponibilité : Disponible (vert), Partiel (orange), Non disponible (rouge), ou non saisi (gris)</w:t>
+      </w:r>
+    </w:p>
+    <w:p>
+      <w:pPr>
+        <w:pStyle w:val="Paragraphedeliste"/>
+        <w:numPr>
+          <w:ilvl w:val="0"/>
+          <w:numId w:val="2"/>
+        </w:numPr>
+        <w:spacing w:before="40" w:after="40"/>
+      </w:pPr>
+      <w:r>
+        <w:t>Sélection des lieux (si Partiel) : le JA choisit les salles de rencontres où il accepte de se déplacer</w:t>
+      </w:r>
+    </w:p>
+    <w:p>
+      <w:pPr>
+        <w:pStyle w:val="Paragraphedeliste"/>
+        <w:numPr>
+          <w:ilvl w:val="0"/>
+          <w:numId w:val="2"/>
+        </w:numPr>
+        <w:spacing w:before="40" w:after="40"/>
+      </w:pPr>
+      <w:r>
+        <w:t>Défiscalisation : case à cocher permettant au JA d’indiquer qu’il renonce à ses indemnités (visible quand un JA est chargé)</w:t>
+      </w:r>
+    </w:p>
+    <w:p>
+      <w:pPr>
+        <w:pStyle w:val="Paragraphedeliste"/>
+        <w:numPr>
+          <w:ilvl w:val="0"/>
+          <w:numId w:val="2"/>
+        </w:numPr>
+        <w:spacing w:before="40" w:after="40"/>
+      </w:pPr>
+      <w:r>
+        <w:t>Note JA : champ libre permettant au JA de laisser un commentaire à destination des nominateurs</w:t>
+      </w:r>
+    </w:p>
+    <w:p>
+      <w:pPr>
+        <w:pStyle w:val="Titre3"/>
+      </w:pPr>
+      <w:bookmarkStart w:id="113" w:name="_Toc_E012_Rem"/>
+      <w:r>
+        <w:t>Remarques</w:t>
+      </w:r>
+      <w:bookmarkEnd w:id="113"/>
+    </w:p>
+    <w:p>
+      <w:pPr>
+        <w:spacing w:before="60" w:after="60"/>
+      </w:pPr>
+      <w:r>
+        <w:t>La page est publique : elle ne nécessite pas de session utilisateur lorsqu’elle est accédée via un lien email (token obfusqué passé en paramètre ?ja=TOKEN). La toolbar (barre utilisateur) est affichée uniquement si une session est active. Le token est généré par la classe Obfuscator à partir de l’identifiant du JA. Les disponibilités sont enregistrées en base à chaque modification (pas de bouton Enregistrer global).</w:t>
+      </w:r>
+    </w:p>
+    <w:p>
+      <w:pPr>
+        <w:pStyle w:val="Titre3"/>
+      </w:pPr>
+      <w:bookmarkStart w:id="114" w:name="_Toc_E012_Ecran"/>
+      <w:r>
+        <w:t>Copie d’écran</w:t>
+      </w:r>
+      <w:bookmarkEnd w:id="114"/>
+    </w:p>
+    <w:p>
+      <w:pPr>
+        <w:spacing w:before="100" w:after="400"/>
+        <w:jc w:val="center"/>
+        <w:rPr>
+          <w:color w:val="888888"/>
+          <w:i/>
+          <w:iCs/>
+        </w:rPr>
+      </w:pPr>
+      <w:r>
+        <w:rPr>
+          <w:color w:val="888888"/>
+          <w:i/>
+          <w:iCs/>
+        </w:rPr>
+        <w:t>Copie d’écran à insérer</w:t>
+      </w:r>
+    </w:p>
     <w:p>
       <w:pPr>
         <w:sectPr>
@@ -17903,22 +15606,7 @@
               <w:jc w:val="center"/>
             </w:pPr>
             <w:r>
-              <w:t xml:space="preserve">Un formulaire </w:t>
-            </w:r>
-            <w:r>
-              <w:t xml:space="preserve">se </w:t>
-            </w:r>
-            <w:r>
-              <w:t>rapprochant</w:t>
-            </w:r>
-            <w:r>
-              <w:t xml:space="preserve"> au format papier </w:t>
-            </w:r>
-            <w:r>
-              <w:t>est</w:t>
-            </w:r>
-            <w:r>
-              <w:t xml:space="preserve"> proposé.</w:t>
+              <w:t>Un formulaire se rapprochant au format papier est proposé.</w:t>
             </w:r>
           </w:p>
           <w:p>
@@ -18729,6 +16417,343 @@
             </a:graphic>
           </wp:inline>
         </w:drawing>
+      </w:r>
+    </w:p>
+    <w:p>
+      <w:pPr>
+        <w:pStyle w:val="Titre2"/>
+        <w:pageBreakBefore/>
+        <w:pBdr>
+          <w:bottom w:val="single" w:sz="4" w:space="0" w:color="2557A7"/>
+        </w:pBdr>
+      </w:pPr>
+      <w:bookmarkStart w:id="102" w:name="_Toc_E025"/>
+      <w:r>
+        <w:t>E025 – Demandes JA R3/R4</w:t>
+      </w:r>
+      <w:bookmarkEnd w:id="102"/>
+    </w:p>
+    <w:tbl>
+      <w:tblPr>
+        <w:tblW w:w="9026" w:type="dxa"/>
+        <w:tblBorders>
+          <w:top w:val="single" w:sz="4" w:space="0" w:color="auto"/>
+          <w:left w:val="single" w:sz="4" w:space="0" w:color="auto"/>
+          <w:bottom w:val="single" w:sz="4" w:space="0" w:color="auto"/>
+          <w:right w:val="single" w:sz="4" w:space="0" w:color="auto"/>
+          <w:insideH w:val="single" w:sz="4" w:space="0" w:color="auto"/>
+          <w:insideV w:val="single" w:sz="4" w:space="0" w:color="auto"/>
+        </w:tblBorders>
+        <w:tblCellMar>
+          <w:left w:w="10" w:type="dxa"/>
+          <w:right w:w="10" w:type="dxa"/>
+        </w:tblCellMar>
+        <w:tblLook w:val="0000" w:firstRow="0" w:lastRow="0" w:firstColumn="0" w:lastColumn="0" w:noHBand="0" w:noVBand="0"/>
+      </w:tblPr>
+      <w:tblGrid>
+        <w:gridCol w:w="2500"/>
+        <w:gridCol w:w="6526"/>
+      </w:tblGrid>
+      <w:tr>
+        <w:tc>
+          <w:tcPr>
+            <w:tcW w:w="2500" w:type="dxa"/>
+            <w:tcBorders>
+              <w:top w:val="single" w:sz="4" w:space="0" w:color="C8D4E8"/>
+              <w:left w:val="single" w:sz="4" w:space="0" w:color="C8D4E8"/>
+              <w:bottom w:val="single" w:sz="4" w:space="0" w:color="C8D4E8"/>
+              <w:right w:val="single" w:sz="4" w:space="0" w:color="C8D4E8"/>
+            </w:tcBorders>
+            <w:shd w:val="clear" w:color="auto" w:fill="E8EEF7"/>
+            <w:tcMar>
+              <w:top w:w="60" w:type="dxa"/>
+              <w:left w:w="120" w:type="dxa"/>
+              <w:bottom w:w="60" w:type="dxa"/>
+              <w:right w:w="120" w:type="dxa"/>
+            </w:tcMar>
+          </w:tcPr>
+          <w:p>
+            <w:r>
+              <w:rPr>
+                <w:b/>
+                <w:bCs/>
+                <w:color w:val="1A3A6B"/>
+                <w:sz w:val="20"/>
+                <w:szCs w:val="20"/>
+              </w:rPr>
+              <w:t>N° écran</w:t>
+            </w:r>
+          </w:p>
+        </w:tc>
+        <w:tc>
+          <w:tcPr>
+            <w:tcW w:w="6526" w:type="dxa"/>
+            <w:tcBorders>
+              <w:top w:val="single" w:sz="4" w:space="0" w:color="C8D4E8"/>
+              <w:left w:val="single" w:sz="4" w:space="0" w:color="C8D4E8"/>
+              <w:bottom w:val="single" w:sz="4" w:space="0" w:color="C8D4E8"/>
+              <w:right w:val="single" w:sz="4" w:space="0" w:color="C8D4E8"/>
+            </w:tcBorders>
+            <w:tcMar>
+              <w:top w:w="60" w:type="dxa"/>
+              <w:left w:w="120" w:type="dxa"/>
+              <w:bottom w:w="60" w:type="dxa"/>
+              <w:right w:w="120" w:type="dxa"/>
+            </w:tcMar>
+          </w:tcPr>
+          <w:p>
+            <w:r>
+              <w:rPr>
+                <w:sz w:val="20"/>
+                <w:szCs w:val="20"/>
+              </w:rPr>
+              <w:t>E025</w:t>
+            </w:r>
+          </w:p>
+        </w:tc>
+      </w:tr>
+      <w:tr>
+        <w:tc>
+          <w:tcPr>
+            <w:tcW w:w="2500" w:type="dxa"/>
+            <w:tcBorders>
+              <w:top w:val="single" w:sz="4" w:space="0" w:color="C8D4E8"/>
+              <w:left w:val="single" w:sz="4" w:space="0" w:color="C8D4E8"/>
+              <w:bottom w:val="single" w:sz="4" w:space="0" w:color="C8D4E8"/>
+              <w:right w:val="single" w:sz="4" w:space="0" w:color="C8D4E8"/>
+            </w:tcBorders>
+            <w:shd w:val="clear" w:color="auto" w:fill="E8EEF7"/>
+            <w:tcMar>
+              <w:top w:w="60" w:type="dxa"/>
+              <w:left w:w="120" w:type="dxa"/>
+              <w:bottom w:w="60" w:type="dxa"/>
+              <w:right w:w="120" w:type="dxa"/>
+            </w:tcMar>
+          </w:tcPr>
+          <w:p>
+            <w:r>
+              <w:rPr>
+                <w:b/>
+                <w:bCs/>
+                <w:color w:val="1A3A6B"/>
+                <w:sz w:val="20"/>
+                <w:szCs w:val="20"/>
+              </w:rPr>
+              <w:t>Fichier</w:t>
+            </w:r>
+          </w:p>
+        </w:tc>
+        <w:tc>
+          <w:tcPr>
+            <w:tcW w:w="6526" w:type="dxa"/>
+            <w:tcBorders>
+              <w:top w:val="single" w:sz="4" w:space="0" w:color="C8D4E8"/>
+              <w:left w:val="single" w:sz="4" w:space="0" w:color="C8D4E8"/>
+              <w:bottom w:val="single" w:sz="4" w:space="0" w:color="C8D4E8"/>
+              <w:right w:val="single" w:sz="4" w:space="0" w:color="C8D4E8"/>
+            </w:tcBorders>
+            <w:tcMar>
+              <w:top w:w="60" w:type="dxa"/>
+              <w:left w:w="120" w:type="dxa"/>
+              <w:bottom w:w="60" w:type="dxa"/>
+              <w:right w:w="120" w:type="dxa"/>
+            </w:tcMar>
+          </w:tcPr>
+          <w:p>
+            <w:r>
+              <w:rPr>
+                <w:sz w:val="20"/>
+                <w:szCs w:val="20"/>
+              </w:rPr>
+              <w:t>JA_R3R4.php</w:t>
+            </w:r>
+          </w:p>
+        </w:tc>
+      </w:tr>
+      <w:tr>
+        <w:tc>
+          <w:tcPr>
+            <w:tcW w:w="2500" w:type="dxa"/>
+            <w:tcBorders>
+              <w:top w:val="single" w:sz="4" w:space="0" w:color="C8D4E8"/>
+              <w:left w:val="single" w:sz="4" w:space="0" w:color="C8D4E8"/>
+              <w:bottom w:val="single" w:sz="4" w:space="0" w:color="C8D4E8"/>
+              <w:right w:val="single" w:sz="4" w:space="0" w:color="C8D4E8"/>
+            </w:tcBorders>
+            <w:shd w:val="clear" w:color="auto" w:fill="E8EEF7"/>
+            <w:tcMar>
+              <w:top w:w="60" w:type="dxa"/>
+              <w:left w:w="120" w:type="dxa"/>
+              <w:bottom w:w="60" w:type="dxa"/>
+              <w:right w:w="120" w:type="dxa"/>
+            </w:tcMar>
+          </w:tcPr>
+          <w:p>
+            <w:r>
+              <w:rPr>
+                <w:b/>
+                <w:bCs/>
+                <w:color w:val="1A3A6B"/>
+                <w:sz w:val="20"/>
+                <w:szCs w:val="20"/>
+              </w:rPr>
+              <w:t>Accès</w:t>
+            </w:r>
+          </w:p>
+        </w:tc>
+        <w:tc>
+          <w:tcPr>
+            <w:tcW w:w="6526" w:type="dxa"/>
+            <w:tcBorders>
+              <w:top w:val="single" w:sz="4" w:space="0" w:color="C8D4E8"/>
+              <w:left w:val="single" w:sz="4" w:space="0" w:color="C8D4E8"/>
+              <w:bottom w:val="single" w:sz="4" w:space="0" w:color="C8D4E8"/>
+              <w:right w:val="single" w:sz="4" w:space="0" w:color="C8D4E8"/>
+            </w:tcBorders>
+            <w:tcMar>
+              <w:top w:w="60" w:type="dxa"/>
+              <w:left w:w="120" w:type="dxa"/>
+              <w:bottom w:w="60" w:type="dxa"/>
+              <w:right w:w="120" w:type="dxa"/>
+            </w:tcMar>
+          </w:tcPr>
+          <w:p>
+            <w:r>
+              <w:rPr>
+                <w:sz w:val="20"/>
+                <w:szCs w:val="20"/>
+              </w:rPr>
+              <w:t>Administrateur uniquement</w:t>
+            </w:r>
+          </w:p>
+        </w:tc>
+      </w:tr>
+    </w:tbl>
+    <w:p>
+      <w:pPr>
+        <w:pStyle w:val="Titre3"/>
+      </w:pPr>
+      <w:bookmarkStart w:id="103" w:name="_Toc_E025_Desc"/>
+      <w:r>
+        <w:t>Description</w:t>
+      </w:r>
+      <w:bookmarkEnd w:id="103"/>
+    </w:p>
+    <w:p>
+      <w:pPr>
+        <w:spacing w:before="60" w:after="60"/>
+      </w:pPr>
+      <w:r>
+        <w:t>Tableau de gestion des équipes R3 et R4 demandant un Juge-Arbitre. Lorsqu’une équipe est marquée comme « JA demandé », toutes ses rencontres à domicile passent automatiquement en arbitrage obligatoire (ArbitrageObligatoire = 1). Les équipes concernées sont identifiées par club et division (R3 ou R4).</w:t>
+      </w:r>
+    </w:p>
+    <w:p>
+      <w:pPr>
+        <w:pStyle w:val="Titre3"/>
+      </w:pPr>
+      <w:bookmarkStart w:id="104" w:name="_Toc_E025_Champs"/>
+      <w:r>
+        <w:t>Champs et fonctionnalités</w:t>
+      </w:r>
+      <w:bookmarkEnd w:id="104"/>
+    </w:p>
+    <w:p>
+      <w:pPr>
+        <w:pStyle w:val="Paragraphedeliste"/>
+        <w:numPr>
+          <w:ilvl w:val="0"/>
+          <w:numId w:val="2"/>
+        </w:numPr>
+        <w:spacing w:before="40" w:after="40"/>
+      </w:pPr>
+      <w:r>
+        <w:t>Tableau des équipes : liste toutes les équipes des divisions régionales avec leur club et la saison en cours</w:t>
+      </w:r>
+    </w:p>
+    <w:p>
+      <w:pPr>
+        <w:pStyle w:val="Paragraphedeliste"/>
+        <w:numPr>
+          <w:ilvl w:val="0"/>
+          <w:numId w:val="2"/>
+        </w:numPr>
+        <w:spacing w:before="40" w:after="40"/>
+      </w:pPr>
+      <w:r>
+        <w:t>Case « JA demandé » : bascule en un clic l’indicateur JAdemande (0/1) pour chaque équipe</w:t>
+      </w:r>
+    </w:p>
+    <w:p>
+      <w:pPr>
+        <w:pStyle w:val="Paragraphedeliste"/>
+        <w:numPr>
+          <w:ilvl w:val="0"/>
+          <w:numId w:val="2"/>
+        </w:numPr>
+        <w:spacing w:before="40" w:after="40"/>
+      </w:pPr>
+      <w:r>
+        <w:t>Mise à jour automatique : dès qu’une équipe est activée, toutes ses rencontres à domicile sont marquées ArbitrageObligatoire = 1 et apparaissent dans la liste de nomination</w:t>
+      </w:r>
+    </w:p>
+    <w:p>
+      <w:pPr>
+        <w:pStyle w:val="Paragraphedeliste"/>
+        <w:numPr>
+          <w:ilvl w:val="0"/>
+          <w:numId w:val="2"/>
+        </w:numPr>
+        <w:spacing w:before="40" w:after="40"/>
+      </w:pPr>
+      <w:r>
+        <w:t>Filtre par division : permet d’afficher uniquement les R3 ou uniquement les R4</w:t>
+      </w:r>
+    </w:p>
+    <w:p>
+      <w:pPr>
+        <w:pStyle w:val="Titre3"/>
+      </w:pPr>
+      <w:bookmarkStart w:id="105" w:name="_Toc_E025_Rem"/>
+      <w:r>
+        <w:t>Remarques</w:t>
+      </w:r>
+      <w:bookmarkEnd w:id="105"/>
+    </w:p>
+    <w:p>
+      <w:pPr>
+        <w:spacing w:before="60" w:after="60"/>
+      </w:pPr>
+      <w:r>
+        <w:t>Cet écran est accessible aux administrateurs uniquement. La mise à jour d’ArbitrageObligatoire est immédiate et affecte toutes les rencontres à domicile de l’équipe pour la saison en cours. La désactivation (JAdemande = 0) repasse les rencontres concernées en arbitrage non obligatoire, sauf si une autre règle l’impose.</w:t>
+      </w:r>
+    </w:p>
+    <w:p>
+      <w:pPr>
+        <w:pStyle w:val="Titre3"/>
+      </w:pPr>
+      <w:bookmarkStart w:id="106" w:name="_Toc_E025_Ecran"/>
+      <w:r>
+        <w:t>Copie d’écran</w:t>
+      </w:r>
+      <w:bookmarkEnd w:id="106"/>
+    </w:p>
+    <w:p>
+      <w:pPr>
+        <w:spacing w:before="100" w:after="400"/>
+        <w:jc w:val="center"/>
+        <w:rPr>
+          <w:color w:val="888888"/>
+          <w:i/>
+          <w:iCs/>
+        </w:rPr>
+      </w:pPr>
+      <w:r>
+        <w:rPr>
+          <w:color w:val="888888"/>
+          <w:i/>
+          <w:iCs/>
+        </w:rPr>
+        <w:t>Copie d’écran à insérer</w:t>
       </w:r>
     </w:p>
     <w:sectPr>

</xml_diff>